<commit_message>
feat: dynamically generate signature date, remove Daily Test appendix, and add AI context
</commit_message>
<xml_diff>
--- a/template.docx
+++ b/template.docx
@@ -5229,13 +5229,7 @@
         </w:rPr>
       </w:pPr>
       <w:r>
-        <w:rPr>
-          <w:rFonts w:ascii="Arial Nova" w:eastAsia="Times New Roman" w:hAnsi="Arial Nova" w:cs="Times New Roman"/>
-          <w:sz w:val="20"/>
-          <w:szCs w:val="20"/>
-          <w:lang w:val="id-ID" w:eastAsia="en-ID"/>
-        </w:rPr>
-        <w:t xml:space="preserve">  Pontianak, 28 Aug 2025</w:t>
+        <w:t>Pontianak, {tanggal_generasi}</w:t>
       </w:r>
     </w:p>
     <w:p>
@@ -5553,4596 +5547,10 @@
       </w:r>
     </w:p>
     <w:p>
-      <w:pPr>
-        <w:pStyle w:val="ListParagraph"/>
-        <w:spacing w:after="0" w:line="276" w:lineRule="auto"/>
-        <w:ind w:left="0"/>
-        <w:rPr>
-          <w:rFonts w:ascii="Arial" w:hAnsi="Arial" w:cs="Arial"/>
-          <w:b/>
-          <w:bCs/>
-          <w:sz w:val="24"/>
-          <w:szCs w:val="24"/>
-          <w:lang w:val="id-ID"/>
-        </w:rPr>
-      </w:pPr>
       <w:r>
-        <w:rPr>
-          <w:rFonts w:ascii="Arial" w:hAnsi="Arial" w:cs="Arial"/>
-          <w:b/>
-          <w:bCs/>
-          <w:noProof/>
-          <w:sz w:val="24"/>
-          <w:szCs w:val="24"/>
-          <w:lang w:val="id-ID"/>
-        </w:rPr>
-        <w:drawing>
-          <wp:anchor distT="0" distB="0" distL="0" distR="0" simplePos="0" relativeHeight="11" behindDoc="0" locked="0" layoutInCell="0" allowOverlap="1" wp14:anchorId="46317F7C" wp14:editId="73F4952E">
-            <wp:simplePos x="0" y="0"/>
-            <wp:positionH relativeFrom="column">
-              <wp:align>center</wp:align>
-            </wp:positionH>
-            <wp:positionV relativeFrom="paragraph">
-              <wp:posOffset>635</wp:posOffset>
-            </wp:positionV>
-            <wp:extent cx="6335395" cy="2276475"/>
-            <wp:effectExtent l="0" t="0" r="0" b="0"/>
-            <wp:wrapSquare wrapText="largest"/>
-            <wp:docPr id="4" name="Image1"/>
-            <wp:cNvGraphicFramePr>
-              <a:graphicFrameLocks xmlns:a="http://schemas.openxmlformats.org/drawingml/2006/main" noChangeAspect="1"/>
-            </wp:cNvGraphicFramePr>
-            <a:graphic xmlns:a="http://schemas.openxmlformats.org/drawingml/2006/main">
-              <a:graphicData uri="http://schemas.openxmlformats.org/drawingml/2006/picture">
-                <pic:pic xmlns:pic="http://schemas.openxmlformats.org/drawingml/2006/picture">
-                  <pic:nvPicPr>
-                    <pic:cNvPr id="4" name="Image1"/>
-                    <pic:cNvPicPr>
-                      <a:picLocks noChangeAspect="1" noChangeArrowheads="1"/>
-                    </pic:cNvPicPr>
-                  </pic:nvPicPr>
-                  <pic:blipFill>
-                    <a:blip r:embed="rId8"/>
-                    <a:stretch>
-                      <a:fillRect/>
-                    </a:stretch>
-                  </pic:blipFill>
-                  <pic:spPr bwMode="auto">
-                    <a:xfrm>
-                      <a:off x="0" y="0"/>
-                      <a:ext cx="6335395" cy="2276475"/>
-                    </a:xfrm>
-                    <a:prstGeom prst="rect">
-                      <a:avLst/>
-                    </a:prstGeom>
-                    <a:noFill/>
-                  </pic:spPr>
-                </pic:pic>
-              </a:graphicData>
-            </a:graphic>
-          </wp:anchor>
-        </w:drawing>
-      </w:r>
-    </w:p>
-    <w:p>
-      <w:pPr>
-        <w:pStyle w:val="NormalWeb"/>
-        <w:spacing w:before="280" w:after="280" w:line="276" w:lineRule="auto"/>
-        <w:rPr>
-          <w:rFonts w:ascii="Arial" w:hAnsi="Arial" w:cs="Arial"/>
-          <w:color w:val="333333"/>
-          <w:lang w:val="id-ID"/>
-        </w:rPr>
-      </w:pPr>
-      <w:r>
-        <w:rPr>
-          <w:rFonts w:ascii="Arial" w:hAnsi="Arial" w:cs="Arial"/>
-          <w:noProof/>
-          <w:color w:val="333333"/>
-          <w:lang w:val="id-ID"/>
-        </w:rPr>
-        <w:drawing>
-          <wp:anchor distT="0" distB="0" distL="0" distR="0" simplePos="0" relativeHeight="12" behindDoc="0" locked="0" layoutInCell="0" allowOverlap="1" wp14:anchorId="090BFD73" wp14:editId="2C06E272">
-            <wp:simplePos x="0" y="0"/>
-            <wp:positionH relativeFrom="column">
-              <wp:align>center</wp:align>
-            </wp:positionH>
-            <wp:positionV relativeFrom="paragraph">
-              <wp:posOffset>635</wp:posOffset>
-            </wp:positionV>
-            <wp:extent cx="6335395" cy="2635885"/>
-            <wp:effectExtent l="0" t="0" r="0" b="0"/>
-            <wp:wrapSquare wrapText="largest"/>
-            <wp:docPr id="5" name="Image2"/>
-            <wp:cNvGraphicFramePr>
-              <a:graphicFrameLocks xmlns:a="http://schemas.openxmlformats.org/drawingml/2006/main" noChangeAspect="1"/>
-            </wp:cNvGraphicFramePr>
-            <a:graphic xmlns:a="http://schemas.openxmlformats.org/drawingml/2006/main">
-              <a:graphicData uri="http://schemas.openxmlformats.org/drawingml/2006/picture">
-                <pic:pic xmlns:pic="http://schemas.openxmlformats.org/drawingml/2006/picture">
-                  <pic:nvPicPr>
-                    <pic:cNvPr id="5" name="Image2"/>
-                    <pic:cNvPicPr>
-                      <a:picLocks noChangeAspect="1" noChangeArrowheads="1"/>
-                    </pic:cNvPicPr>
-                  </pic:nvPicPr>
-                  <pic:blipFill>
-                    <a:blip r:embed="rId9"/>
-                    <a:stretch>
-                      <a:fillRect/>
-                    </a:stretch>
-                  </pic:blipFill>
-                  <pic:spPr bwMode="auto">
-                    <a:xfrm>
-                      <a:off x="0" y="0"/>
-                      <a:ext cx="6335395" cy="2635885"/>
-                    </a:xfrm>
-                    <a:prstGeom prst="rect">
-                      <a:avLst/>
-                    </a:prstGeom>
-                    <a:noFill/>
-                  </pic:spPr>
-                </pic:pic>
-              </a:graphicData>
-            </a:graphic>
-          </wp:anchor>
-        </w:drawing>
-      </w:r>
-    </w:p>
-    <w:p>
-      <w:pPr>
-        <w:pStyle w:val="center"/>
-        <w:spacing w:before="280" w:after="280" w:line="276" w:lineRule="auto"/>
-        <w:rPr>
-          <w:rFonts w:ascii="Arial" w:hAnsi="Arial" w:cs="Arial"/>
-          <w:color w:val="333333"/>
-          <w:lang w:val="id-ID"/>
-        </w:rPr>
-      </w:pPr>
-      <w:r>
-        <w:rPr>
-          <w:rFonts w:ascii="Arial" w:hAnsi="Arial" w:cs="Arial"/>
-          <w:noProof/>
-          <w:color w:val="333333"/>
-          <w:lang w:val="id-ID"/>
-        </w:rPr>
-        <w:drawing>
-          <wp:anchor distT="0" distB="0" distL="0" distR="0" simplePos="0" relativeHeight="13" behindDoc="0" locked="0" layoutInCell="0" allowOverlap="1" wp14:anchorId="1F29F5B3" wp14:editId="27C3960A">
-            <wp:simplePos x="0" y="0"/>
-            <wp:positionH relativeFrom="column">
-              <wp:align>center</wp:align>
-            </wp:positionH>
-            <wp:positionV relativeFrom="paragraph">
-              <wp:posOffset>635</wp:posOffset>
-            </wp:positionV>
-            <wp:extent cx="6335395" cy="1877060"/>
-            <wp:effectExtent l="0" t="0" r="0" b="0"/>
-            <wp:wrapSquare wrapText="largest"/>
-            <wp:docPr id="6" name="Image3"/>
-            <wp:cNvGraphicFramePr>
-              <a:graphicFrameLocks xmlns:a="http://schemas.openxmlformats.org/drawingml/2006/main" noChangeAspect="1"/>
-            </wp:cNvGraphicFramePr>
-            <a:graphic xmlns:a="http://schemas.openxmlformats.org/drawingml/2006/main">
-              <a:graphicData uri="http://schemas.openxmlformats.org/drawingml/2006/picture">
-                <pic:pic xmlns:pic="http://schemas.openxmlformats.org/drawingml/2006/picture">
-                  <pic:nvPicPr>
-                    <pic:cNvPr id="6" name="Image3"/>
-                    <pic:cNvPicPr>
-                      <a:picLocks noChangeAspect="1" noChangeArrowheads="1"/>
-                    </pic:cNvPicPr>
-                  </pic:nvPicPr>
-                  <pic:blipFill>
-                    <a:blip r:embed="rId10"/>
-                    <a:stretch>
-                      <a:fillRect/>
-                    </a:stretch>
-                  </pic:blipFill>
-                  <pic:spPr bwMode="auto">
-                    <a:xfrm>
-                      <a:off x="0" y="0"/>
-                      <a:ext cx="6335395" cy="1877060"/>
-                    </a:xfrm>
-                    <a:prstGeom prst="rect">
-                      <a:avLst/>
-                    </a:prstGeom>
-                    <a:noFill/>
-                  </pic:spPr>
-                </pic:pic>
-              </a:graphicData>
-            </a:graphic>
-          </wp:anchor>
-        </w:drawing>
-      </w:r>
-    </w:p>
-    <w:p>
-      <w:pPr>
-        <w:pStyle w:val="center"/>
-        <w:spacing w:before="280" w:after="280" w:line="276" w:lineRule="auto"/>
-        <w:rPr>
-          <w:rFonts w:ascii="Arial" w:hAnsi="Arial" w:cs="Arial"/>
-          <w:color w:val="333333"/>
-          <w:lang w:val="id-ID"/>
-        </w:rPr>
-      </w:pPr>
-      <w:r>
-        <w:rPr>
-          <w:rFonts w:ascii="Arial" w:hAnsi="Arial" w:cs="Arial"/>
-          <w:noProof/>
-          <w:color w:val="333333"/>
-          <w:lang w:val="id-ID"/>
-        </w:rPr>
-        <w:lastRenderedPageBreak/>
-        <w:drawing>
-          <wp:anchor distT="0" distB="0" distL="0" distR="0" simplePos="0" relativeHeight="14" behindDoc="0" locked="0" layoutInCell="0" allowOverlap="1" wp14:anchorId="155FD873" wp14:editId="18FF6CF3">
-            <wp:simplePos x="0" y="0"/>
-            <wp:positionH relativeFrom="column">
-              <wp:align>center</wp:align>
-            </wp:positionH>
-            <wp:positionV relativeFrom="paragraph">
-              <wp:posOffset>635</wp:posOffset>
-            </wp:positionV>
-            <wp:extent cx="6335395" cy="4801235"/>
-            <wp:effectExtent l="0" t="0" r="0" b="0"/>
-            <wp:wrapSquare wrapText="largest"/>
-            <wp:docPr id="7" name="Image4"/>
-            <wp:cNvGraphicFramePr>
-              <a:graphicFrameLocks xmlns:a="http://schemas.openxmlformats.org/drawingml/2006/main" noChangeAspect="1"/>
-            </wp:cNvGraphicFramePr>
-            <a:graphic xmlns:a="http://schemas.openxmlformats.org/drawingml/2006/main">
-              <a:graphicData uri="http://schemas.openxmlformats.org/drawingml/2006/picture">
-                <pic:pic xmlns:pic="http://schemas.openxmlformats.org/drawingml/2006/picture">
-                  <pic:nvPicPr>
-                    <pic:cNvPr id="7" name="Image4"/>
-                    <pic:cNvPicPr>
-                      <a:picLocks noChangeAspect="1" noChangeArrowheads="1"/>
-                    </pic:cNvPicPr>
-                  </pic:nvPicPr>
-                  <pic:blipFill>
-                    <a:blip r:embed="rId11"/>
-                    <a:stretch>
-                      <a:fillRect/>
-                    </a:stretch>
-                  </pic:blipFill>
-                  <pic:spPr bwMode="auto">
-                    <a:xfrm>
-                      <a:off x="0" y="0"/>
-                      <a:ext cx="6335395" cy="4801235"/>
-                    </a:xfrm>
-                    <a:prstGeom prst="rect">
-                      <a:avLst/>
-                    </a:prstGeom>
-                    <a:noFill/>
-                  </pic:spPr>
-                </pic:pic>
-              </a:graphicData>
-            </a:graphic>
-          </wp:anchor>
-        </w:drawing>
-      </w:r>
-    </w:p>
-    <w:p>
-      <w:pPr>
-        <w:spacing w:line="276" w:lineRule="auto"/>
-        <w:jc w:val="center"/>
-        <w:rPr>
-          <w:rFonts w:ascii="Arial" w:hAnsi="Arial" w:cs="Arial"/>
-          <w:sz w:val="24"/>
-          <w:szCs w:val="24"/>
-          <w:lang w:val="id-ID"/>
-        </w:rPr>
-      </w:pPr>
-    </w:p>
-    <w:p>
-      <w:pPr>
-        <w:shd w:val="clear" w:color="auto" w:fill="FFFFFF"/>
-        <w:spacing w:before="180" w:after="180" w:line="276" w:lineRule="auto"/>
-        <w:jc w:val="center"/>
-        <w:rPr>
-          <w:rFonts w:ascii="Arial" w:hAnsi="Arial" w:cs="Arial"/>
-          <w:color w:val="2D3B45"/>
-          <w:lang w:val="id-ID"/>
-        </w:rPr>
-      </w:pPr>
-      <w:bookmarkStart w:id="0" w:name="_Hlk147910150"/>
-      <w:bookmarkStart w:id="1" w:name="docs-internal-guid-82487508-7fff-d897-3e"/>
-      <w:bookmarkEnd w:id="0"/>
-      <w:bookmarkEnd w:id="1"/>
-      <w:r>
-        <w:rPr>
-          <w:noProof/>
-          <w:lang w:val="id-ID"/>
-        </w:rPr>
-        <w:drawing>
-          <wp:inline distT="0" distB="0" distL="0" distR="0" wp14:anchorId="1A037076" wp14:editId="10FE0B9A">
-            <wp:extent cx="6648450" cy="1028700"/>
-            <wp:effectExtent l="0" t="0" r="0" b="0"/>
-            <wp:docPr id="8" name="Image5"/>
-            <wp:cNvGraphicFramePr>
-              <a:graphicFrameLocks xmlns:a="http://schemas.openxmlformats.org/drawingml/2006/main" noChangeAspect="1"/>
-            </wp:cNvGraphicFramePr>
-            <a:graphic xmlns:a="http://schemas.openxmlformats.org/drawingml/2006/main">
-              <a:graphicData uri="http://schemas.openxmlformats.org/drawingml/2006/picture">
-                <pic:pic xmlns:pic="http://schemas.openxmlformats.org/drawingml/2006/picture">
-                  <pic:nvPicPr>
-                    <pic:cNvPr id="8" name="Image5"/>
-                    <pic:cNvPicPr>
-                      <a:picLocks noChangeAspect="1" noChangeArrowheads="1"/>
-                    </pic:cNvPicPr>
-                  </pic:nvPicPr>
-                  <pic:blipFill>
-                    <a:blip r:embed="rId12"/>
-                    <a:stretch>
-                      <a:fillRect/>
-                    </a:stretch>
-                  </pic:blipFill>
-                  <pic:spPr bwMode="auto">
-                    <a:xfrm>
-                      <a:off x="0" y="0"/>
-                      <a:ext cx="6648450" cy="1028700"/>
-                    </a:xfrm>
-                    <a:prstGeom prst="rect">
-                      <a:avLst/>
-                    </a:prstGeom>
-                    <a:noFill/>
-                  </pic:spPr>
-                </pic:pic>
-              </a:graphicData>
-            </a:graphic>
-          </wp:inline>
-        </w:drawing>
-      </w:r>
-    </w:p>
-    <w:p>
-      <w:pPr>
-        <w:spacing w:after="0" w:line="276" w:lineRule="auto"/>
-        <w:rPr>
-          <w:rFonts w:ascii="Arial" w:hAnsi="Arial" w:cs="Arial"/>
-          <w:sz w:val="24"/>
-          <w:szCs w:val="24"/>
-          <w:lang w:val="id-ID"/>
-        </w:rPr>
-      </w:pPr>
-    </w:p>
-    <w:p>
-      <w:pPr>
-        <w:spacing w:after="0" w:line="276" w:lineRule="auto"/>
-        <w:rPr>
-          <w:rFonts w:ascii="Arial" w:hAnsi="Arial" w:cs="Arial"/>
-          <w:sz w:val="24"/>
-          <w:szCs w:val="24"/>
-          <w:lang w:val="id-ID"/>
-        </w:rPr>
-      </w:pPr>
-    </w:p>
-    <w:p>
-      <w:pPr>
-        <w:tabs>
-          <w:tab w:val="left" w:pos="8640"/>
-        </w:tabs>
-        <w:spacing w:after="0" w:line="276" w:lineRule="auto"/>
-        <w:rPr>
-          <w:rFonts w:ascii="Arial" w:hAnsi="Arial" w:cs="Arial"/>
-          <w:sz w:val="24"/>
-          <w:szCs w:val="24"/>
-          <w:lang w:val="id-ID"/>
-        </w:rPr>
-      </w:pPr>
-    </w:p>
-    <w:p>
-      <w:pPr>
-        <w:tabs>
-          <w:tab w:val="left" w:pos="8640"/>
-        </w:tabs>
-        <w:spacing w:after="0" w:line="276" w:lineRule="auto"/>
-        <w:rPr>
-          <w:rFonts w:ascii="Arial" w:hAnsi="Arial" w:cs="Arial"/>
-          <w:sz w:val="24"/>
-          <w:szCs w:val="24"/>
-          <w:lang w:val="id-ID"/>
-        </w:rPr>
-      </w:pPr>
-    </w:p>
-    <w:p>
-      <w:pPr>
-        <w:tabs>
-          <w:tab w:val="left" w:pos="8640"/>
-        </w:tabs>
-        <w:spacing w:line="276" w:lineRule="auto"/>
-        <w:rPr>
-          <w:rFonts w:ascii="Arial" w:hAnsi="Arial" w:cs="Arial"/>
-          <w:sz w:val="24"/>
-          <w:szCs w:val="24"/>
-          <w:lang w:val="id-ID"/>
-        </w:rPr>
-        <w:sectPr>
-          <w:pgSz w:w="11906" w:h="16838"/>
-          <w:pgMar w:top="709" w:right="849" w:bottom="1276" w:left="1080" w:header="0" w:footer="0" w:gutter="0"/>
-          <w:cols w:space="720"/>
-          <w:formProt w:val="0"/>
-          <w:docGrid w:linePitch="360"/>
-        </w:sectPr>
-      </w:pPr>
-      <w:r>
-        <w:rPr>
-          <w:lang w:val="id-ID"/>
-        </w:rPr>
         <w:br w:type="page"/>
       </w:r>
     </w:p>
-    <w:p>
-      <w:pPr>
-        <w:pStyle w:val="ListParagraph"/>
-        <w:spacing w:after="0" w:line="276" w:lineRule="auto"/>
-        <w:ind w:left="0"/>
-        <w:rPr>
-          <w:rFonts w:ascii="Arial" w:hAnsi="Arial" w:cs="Arial"/>
-          <w:b/>
-          <w:bCs/>
-          <w:sz w:val="24"/>
-          <w:szCs w:val="24"/>
-          <w:lang w:val="id-ID"/>
-        </w:rPr>
-      </w:pPr>
-      <w:bookmarkStart w:id="2" w:name="_Hlk147910421"/>
-      <w:bookmarkEnd w:id="2"/>
-    </w:p>
-    <w:p>
-      <w:pPr>
-        <w:pStyle w:val="ListParagraph"/>
-        <w:spacing w:after="0" w:line="276" w:lineRule="auto"/>
-        <w:ind w:left="0"/>
-        <w:rPr>
-          <w:rFonts w:ascii="Arial" w:hAnsi="Arial" w:cs="Arial"/>
-          <w:b/>
-          <w:bCs/>
-          <w:sz w:val="24"/>
-          <w:szCs w:val="24"/>
-          <w:lang w:val="id-ID"/>
-        </w:rPr>
-      </w:pPr>
-    </w:p>
-    <w:p>
-      <w:pPr>
-        <w:pStyle w:val="ListParagraph"/>
-        <w:spacing w:after="0" w:line="276" w:lineRule="auto"/>
-        <w:ind w:left="0"/>
-        <w:rPr>
-          <w:rFonts w:ascii="Arial" w:hAnsi="Arial" w:cs="Arial"/>
-          <w:b/>
-          <w:bCs/>
-          <w:sz w:val="24"/>
-          <w:szCs w:val="24"/>
-          <w:lang w:val="id-ID"/>
-        </w:rPr>
-      </w:pPr>
-    </w:p>
-    <w:p>
-      <w:pPr>
-        <w:pStyle w:val="NormalWeb"/>
-        <w:spacing w:before="280" w:after="280" w:line="276" w:lineRule="auto"/>
-        <w:jc w:val="both"/>
-        <w:rPr>
-          <w:rFonts w:ascii="Arial" w:hAnsi="Arial" w:cs="Arial"/>
-          <w:color w:val="333333"/>
-          <w:lang w:val="id-ID"/>
-        </w:rPr>
-      </w:pPr>
-    </w:p>
-    <w:p>
-      <w:pPr>
-        <w:pStyle w:val="ListParagraph"/>
-        <w:spacing w:after="0" w:line="276" w:lineRule="auto"/>
-        <w:ind w:left="0"/>
-        <w:rPr>
-          <w:rFonts w:ascii="Arial" w:hAnsi="Arial" w:cs="Arial"/>
-          <w:b/>
-          <w:bCs/>
-          <w:sz w:val="24"/>
-          <w:szCs w:val="24"/>
-          <w:lang w:val="id-ID"/>
-        </w:rPr>
-      </w:pPr>
-    </w:p>
-    <w:p>
-      <w:pPr>
-        <w:pStyle w:val="ListParagraph"/>
-        <w:spacing w:after="0" w:line="276" w:lineRule="auto"/>
-        <w:ind w:left="0"/>
-        <w:rPr>
-          <w:rFonts w:ascii="Arial" w:hAnsi="Arial" w:cs="Arial"/>
-          <w:b/>
-          <w:bCs/>
-          <w:sz w:val="24"/>
-          <w:szCs w:val="24"/>
-          <w:lang w:val="id-ID"/>
-        </w:rPr>
-      </w:pPr>
-    </w:p>
-    <w:p>
-      <w:pPr>
-        <w:pStyle w:val="ListParagraph"/>
-        <w:spacing w:after="0" w:line="276" w:lineRule="auto"/>
-        <w:ind w:left="0"/>
-        <w:rPr>
-          <w:rFonts w:ascii="Arial" w:hAnsi="Arial" w:cs="Arial"/>
-          <w:b/>
-          <w:bCs/>
-          <w:sz w:val="24"/>
-          <w:szCs w:val="24"/>
-          <w:lang w:val="id-ID"/>
-        </w:rPr>
-      </w:pPr>
-    </w:p>
-    <w:p>
-      <w:pPr>
-        <w:pStyle w:val="NormalWeb"/>
-        <w:spacing w:before="280" w:after="280" w:line="276" w:lineRule="auto"/>
-        <w:jc w:val="both"/>
-        <w:rPr>
-          <w:rFonts w:ascii="Arial" w:hAnsi="Arial" w:cs="Arial"/>
-          <w:color w:val="333333"/>
-          <w:lang w:val="id-ID"/>
-        </w:rPr>
-      </w:pPr>
-    </w:p>
-    <w:p>
-      <w:pPr>
-        <w:pStyle w:val="ListParagraph"/>
-        <w:spacing w:after="0" w:line="276" w:lineRule="auto"/>
-        <w:ind w:left="0"/>
-        <w:rPr>
-          <w:rFonts w:ascii="Arial" w:hAnsi="Arial" w:cs="Arial"/>
-          <w:b/>
-          <w:bCs/>
-          <w:sz w:val="24"/>
-          <w:szCs w:val="24"/>
-          <w:lang w:val="id-ID"/>
-        </w:rPr>
-      </w:pPr>
-    </w:p>
-    <w:p>
-      <w:pPr>
-        <w:pStyle w:val="ListParagraph"/>
-        <w:spacing w:after="0" w:line="276" w:lineRule="auto"/>
-        <w:ind w:left="0"/>
-        <w:rPr>
-          <w:rFonts w:ascii="Arial" w:hAnsi="Arial" w:cs="Arial"/>
-          <w:b/>
-          <w:bCs/>
-          <w:sz w:val="24"/>
-          <w:szCs w:val="24"/>
-          <w:lang w:val="id-ID"/>
-        </w:rPr>
-      </w:pPr>
-    </w:p>
-    <w:p>
-      <w:pPr>
-        <w:pStyle w:val="ListParagraph"/>
-        <w:spacing w:after="0" w:line="276" w:lineRule="auto"/>
-        <w:ind w:left="0"/>
-        <w:rPr>
-          <w:rFonts w:ascii="Arial" w:hAnsi="Arial" w:cs="Arial"/>
-          <w:b/>
-          <w:bCs/>
-          <w:sz w:val="24"/>
-          <w:szCs w:val="24"/>
-          <w:lang w:val="id-ID"/>
-        </w:rPr>
-      </w:pPr>
-    </w:p>
-    <w:p>
-      <w:pPr>
-        <w:pStyle w:val="NormalWeb"/>
-        <w:spacing w:before="280" w:after="280" w:line="276" w:lineRule="auto"/>
-        <w:jc w:val="both"/>
-        <w:rPr>
-          <w:rFonts w:ascii="Arial" w:hAnsi="Arial" w:cs="Arial"/>
-          <w:color w:val="333333"/>
-          <w:lang w:val="id-ID"/>
-        </w:rPr>
-      </w:pPr>
-    </w:p>
-    <w:p>
-      <w:pPr>
-        <w:spacing w:line="276" w:lineRule="auto"/>
-        <w:rPr>
-          <w:rFonts w:ascii="Arial" w:hAnsi="Arial" w:cs="Arial"/>
-          <w:sz w:val="24"/>
-          <w:szCs w:val="24"/>
-          <w:lang w:val="id-ID"/>
-        </w:rPr>
-      </w:pPr>
-    </w:p>
-    <w:p>
-      <w:pPr>
-        <w:spacing w:after="0" w:line="240" w:lineRule="auto"/>
-        <w:jc w:val="center"/>
-        <w:rPr>
-          <w:rFonts w:ascii="Times New Roman" w:hAnsi="Times New Roman" w:cs="Times New Roman"/>
-          <w:lang w:val="id-ID"/>
-        </w:rPr>
-      </w:pPr>
-      <w:r>
-        <w:rPr>
-          <w:noProof/>
-          <w:lang w:val="id-ID"/>
-        </w:rPr>
-        <w:drawing>
-          <wp:anchor distT="0" distB="0" distL="0" distR="114300" simplePos="0" relativeHeight="9" behindDoc="0" locked="0" layoutInCell="0" allowOverlap="1" wp14:anchorId="7D0FD747" wp14:editId="63C2B1CE">
-            <wp:simplePos x="0" y="0"/>
-            <wp:positionH relativeFrom="margin">
-              <wp:align>left</wp:align>
-            </wp:positionH>
-            <wp:positionV relativeFrom="paragraph">
-              <wp:posOffset>7620</wp:posOffset>
-            </wp:positionV>
-            <wp:extent cx="807720" cy="800100"/>
-            <wp:effectExtent l="0" t="0" r="0" b="0"/>
-            <wp:wrapTight wrapText="bothSides">
-              <wp:wrapPolygon edited="0">
-                <wp:start x="-777" y="0"/>
-                <wp:lineTo x="-777" y="20258"/>
-                <wp:lineTo x="20931" y="20258"/>
-                <wp:lineTo x="20931" y="0"/>
-                <wp:lineTo x="-777" y="0"/>
-              </wp:wrapPolygon>
-            </wp:wrapTight>
-            <wp:docPr id="9" name="Picture 5"/>
-            <wp:cNvGraphicFramePr>
-              <a:graphicFrameLocks xmlns:a="http://schemas.openxmlformats.org/drawingml/2006/main" noChangeAspect="1"/>
-            </wp:cNvGraphicFramePr>
-            <a:graphic xmlns:a="http://schemas.openxmlformats.org/drawingml/2006/main">
-              <a:graphicData uri="http://schemas.openxmlformats.org/drawingml/2006/picture">
-                <pic:pic xmlns:pic="http://schemas.openxmlformats.org/drawingml/2006/picture">
-                  <pic:nvPicPr>
-                    <pic:cNvPr id="9" name="Picture 5"/>
-                    <pic:cNvPicPr>
-                      <a:picLocks noChangeAspect="1" noChangeArrowheads="1"/>
-                    </pic:cNvPicPr>
-                  </pic:nvPicPr>
-                  <pic:blipFill>
-                    <a:blip r:embed="rId13"/>
-                    <a:stretch>
-                      <a:fillRect/>
-                    </a:stretch>
-                  </pic:blipFill>
-                  <pic:spPr bwMode="auto">
-                    <a:xfrm>
-                      <a:off x="0" y="0"/>
-                      <a:ext cx="807720" cy="800100"/>
-                    </a:xfrm>
-                    <a:prstGeom prst="rect">
-                      <a:avLst/>
-                    </a:prstGeom>
-                    <a:noFill/>
-                  </pic:spPr>
-                </pic:pic>
-              </a:graphicData>
-            </a:graphic>
-          </wp:anchor>
-        </w:drawing>
-      </w:r>
-      <w:r>
-        <w:rPr>
-          <w:noProof/>
-          <w:lang w:val="id-ID"/>
-        </w:rPr>
-        <w:drawing>
-          <wp:anchor distT="0" distB="0" distL="114300" distR="114300" simplePos="0" relativeHeight="10" behindDoc="0" locked="0" layoutInCell="0" allowOverlap="1" wp14:anchorId="3F2C2525" wp14:editId="1B99D935">
-            <wp:simplePos x="0" y="0"/>
-            <wp:positionH relativeFrom="margin">
-              <wp:posOffset>4648200</wp:posOffset>
-            </wp:positionH>
-            <wp:positionV relativeFrom="paragraph">
-              <wp:posOffset>160020</wp:posOffset>
-            </wp:positionV>
-            <wp:extent cx="1135380" cy="416560"/>
-            <wp:effectExtent l="0" t="0" r="0" b="0"/>
-            <wp:wrapSquare wrapText="bothSides"/>
-            <wp:docPr id="10" name="Picture 6"/>
-            <wp:cNvGraphicFramePr>
-              <a:graphicFrameLocks xmlns:a="http://schemas.openxmlformats.org/drawingml/2006/main" noChangeAspect="1"/>
-            </wp:cNvGraphicFramePr>
-            <a:graphic xmlns:a="http://schemas.openxmlformats.org/drawingml/2006/main">
-              <a:graphicData uri="http://schemas.openxmlformats.org/drawingml/2006/picture">
-                <pic:pic xmlns:pic="http://schemas.openxmlformats.org/drawingml/2006/picture">
-                  <pic:nvPicPr>
-                    <pic:cNvPr id="10" name="Picture 6"/>
-                    <pic:cNvPicPr>
-                      <a:picLocks noChangeAspect="1" noChangeArrowheads="1"/>
-                    </pic:cNvPicPr>
-                  </pic:nvPicPr>
-                  <pic:blipFill>
-                    <a:blip r:embed="rId14"/>
-                    <a:stretch>
-                      <a:fillRect/>
-                    </a:stretch>
-                  </pic:blipFill>
-                  <pic:spPr bwMode="auto">
-                    <a:xfrm>
-                      <a:off x="0" y="0"/>
-                      <a:ext cx="1135380" cy="416560"/>
-                    </a:xfrm>
-                    <a:prstGeom prst="rect">
-                      <a:avLst/>
-                    </a:prstGeom>
-                    <a:noFill/>
-                  </pic:spPr>
-                </pic:pic>
-              </a:graphicData>
-            </a:graphic>
-          </wp:anchor>
-        </w:drawing>
-      </w:r>
-      <w:r>
-        <w:rPr>
-          <w:rFonts w:ascii="Times New Roman" w:hAnsi="Times New Roman" w:cs="Times New Roman"/>
-          <w:b/>
-          <w:bCs/>
-          <w:lang w:val="id-ID"/>
-        </w:rPr>
-        <w:t>YAYASAN PELITA HARAPAN CEMERLANG</w:t>
-      </w:r>
-    </w:p>
-    <w:p>
-      <w:pPr>
-        <w:spacing w:after="0" w:line="240" w:lineRule="auto"/>
-        <w:jc w:val="center"/>
-        <w:rPr>
-          <w:rFonts w:ascii="Times New Roman" w:hAnsi="Times New Roman" w:cs="Times New Roman"/>
-          <w:lang w:val="id-ID"/>
-        </w:rPr>
-      </w:pPr>
-      <w:r>
-        <w:rPr>
-          <w:rFonts w:ascii="Times New Roman" w:hAnsi="Times New Roman" w:cs="Times New Roman"/>
-          <w:b/>
-          <w:bCs/>
-          <w:lang w:val="id-ID"/>
-        </w:rPr>
-        <w:t>SMA PELITA CEMERLANG</w:t>
-      </w:r>
-    </w:p>
-    <w:p>
-      <w:pPr>
-        <w:spacing w:after="0" w:line="240" w:lineRule="auto"/>
-        <w:jc w:val="center"/>
-        <w:rPr>
-          <w:rFonts w:ascii="Times New Roman" w:hAnsi="Times New Roman" w:cs="Times New Roman"/>
-          <w:lang w:val="id-ID"/>
-        </w:rPr>
-      </w:pPr>
-      <w:r>
-        <w:rPr>
-          <w:rFonts w:ascii="Times New Roman" w:hAnsi="Times New Roman" w:cs="Times New Roman"/>
-          <w:b/>
-          <w:bCs/>
-          <w:lang w:val="id-ID"/>
-        </w:rPr>
-        <w:t>JALAN PERDANA NO.8 PONTIANAK TENGGARA</w:t>
-      </w:r>
-    </w:p>
-    <w:p>
-      <w:pPr>
-        <w:spacing w:after="0" w:line="240" w:lineRule="auto"/>
-        <w:jc w:val="center"/>
-        <w:rPr>
-          <w:rFonts w:ascii="Times New Roman" w:hAnsi="Times New Roman" w:cs="Times New Roman"/>
-          <w:lang w:val="id-ID"/>
-        </w:rPr>
-      </w:pPr>
-      <w:r>
-        <w:rPr>
-          <w:rFonts w:ascii="Times New Roman" w:hAnsi="Times New Roman" w:cs="Times New Roman"/>
-          <w:b/>
-          <w:bCs/>
-          <w:lang w:val="id-ID"/>
-        </w:rPr>
-        <w:t>DAILY TEST</w:t>
-      </w:r>
-    </w:p>
-    <w:p>
-      <w:pPr>
-        <w:spacing w:after="0" w:line="240" w:lineRule="auto"/>
-        <w:rPr>
-          <w:rFonts w:ascii="Times New Roman" w:hAnsi="Times New Roman" w:cs="Times New Roman"/>
-          <w:lang w:val="id-ID"/>
-        </w:rPr>
-      </w:pPr>
-      <w:r>
-        <w:rPr>
-          <w:rFonts w:ascii="Times New Roman" w:hAnsi="Times New Roman" w:cs="Times New Roman"/>
-          <w:b/>
-          <w:bCs/>
-          <w:lang w:val="id-ID"/>
-        </w:rPr>
-        <w:t xml:space="preserve">                      ACADEMIC YEAR 2024/2025</w:t>
-      </w:r>
-    </w:p>
-    <w:p>
-      <w:pPr>
-        <w:spacing w:after="0" w:line="240" w:lineRule="auto"/>
-        <w:rPr>
-          <w:rFonts w:ascii="Times New Roman" w:hAnsi="Times New Roman" w:cs="Times New Roman"/>
-          <w:lang w:val="id-ID"/>
-        </w:rPr>
-      </w:pPr>
-    </w:p>
-    <w:tbl>
-      <w:tblPr>
-        <w:tblW w:w="13308" w:type="dxa"/>
-        <w:tblLayout w:type="fixed"/>
-        <w:tblLook w:val="04A0" w:firstRow="1" w:lastRow="0" w:firstColumn="1" w:lastColumn="0" w:noHBand="0" w:noVBand="1"/>
-      </w:tblPr>
-      <w:tblGrid>
-        <w:gridCol w:w="845"/>
-        <w:gridCol w:w="286"/>
-        <w:gridCol w:w="2270"/>
-        <w:gridCol w:w="1187"/>
-        <w:gridCol w:w="285"/>
-        <w:gridCol w:w="1368"/>
-        <w:gridCol w:w="1054"/>
-        <w:gridCol w:w="286"/>
-        <w:gridCol w:w="1504"/>
-        <w:gridCol w:w="4223"/>
-      </w:tblGrid>
-      <w:tr>
-        <w:trPr>
-          <w:trHeight w:val="359"/>
-        </w:trPr>
-        <w:tc>
-          <w:tcPr>
-            <w:tcW w:w="845" w:type="dxa"/>
-            <w:shd w:val="clear" w:color="auto" w:fill="FFF2CC"/>
-          </w:tcPr>
-          <w:p>
-            <w:pPr>
-              <w:spacing w:after="0" w:line="240" w:lineRule="auto"/>
-              <w:rPr>
-                <w:rFonts w:ascii="Times New Roman" w:hAnsi="Times New Roman" w:cs="Times New Roman"/>
-                <w:lang w:val="id-ID"/>
-              </w:rPr>
-            </w:pPr>
-            <w:r>
-              <w:rPr>
-                <w:rFonts w:ascii="Times New Roman" w:hAnsi="Times New Roman" w:cs="Times New Roman"/>
-                <w:b/>
-                <w:bCs/>
-                <w:lang w:val="id-ID"/>
-              </w:rPr>
-              <w:t>Name </w:t>
-            </w:r>
-          </w:p>
-        </w:tc>
-        <w:tc>
-          <w:tcPr>
-            <w:tcW w:w="286" w:type="dxa"/>
-            <w:shd w:val="clear" w:color="auto" w:fill="FFF2CC"/>
-          </w:tcPr>
-          <w:p>
-            <w:pPr>
-              <w:spacing w:after="0" w:line="240" w:lineRule="auto"/>
-              <w:rPr>
-                <w:rFonts w:ascii="Times New Roman" w:hAnsi="Times New Roman" w:cs="Times New Roman"/>
-                <w:lang w:val="id-ID"/>
-              </w:rPr>
-            </w:pPr>
-            <w:r>
-              <w:rPr>
-                <w:rFonts w:ascii="Times New Roman" w:hAnsi="Times New Roman" w:cs="Times New Roman"/>
-                <w:b/>
-                <w:bCs/>
-                <w:lang w:val="id-ID"/>
-              </w:rPr>
-              <w:t>:</w:t>
-            </w:r>
-          </w:p>
-        </w:tc>
-        <w:tc>
-          <w:tcPr>
-            <w:tcW w:w="2270" w:type="dxa"/>
-            <w:shd w:val="clear" w:color="auto" w:fill="FFF2CC"/>
-          </w:tcPr>
-          <w:p>
-            <w:pPr>
-              <w:spacing w:after="0" w:line="240" w:lineRule="auto"/>
-              <w:rPr>
-                <w:rFonts w:ascii="Times New Roman" w:hAnsi="Times New Roman" w:cs="Times New Roman"/>
-                <w:lang w:val="id-ID"/>
-              </w:rPr>
-            </w:pPr>
-          </w:p>
-        </w:tc>
-        <w:tc>
-          <w:tcPr>
-            <w:tcW w:w="1187" w:type="dxa"/>
-            <w:shd w:val="clear" w:color="auto" w:fill="FFF2CC"/>
-          </w:tcPr>
-          <w:p>
-            <w:pPr>
-              <w:spacing w:after="0" w:line="240" w:lineRule="auto"/>
-              <w:rPr>
-                <w:rFonts w:ascii="Times New Roman" w:hAnsi="Times New Roman" w:cs="Times New Roman"/>
-                <w:lang w:val="id-ID"/>
-              </w:rPr>
-            </w:pPr>
-            <w:r>
-              <w:rPr>
-                <w:rFonts w:ascii="Times New Roman" w:hAnsi="Times New Roman" w:cs="Times New Roman"/>
-                <w:b/>
-                <w:bCs/>
-                <w:lang w:val="id-ID"/>
-              </w:rPr>
-              <w:t>Subject </w:t>
-            </w:r>
-          </w:p>
-        </w:tc>
-        <w:tc>
-          <w:tcPr>
-            <w:tcW w:w="285" w:type="dxa"/>
-            <w:shd w:val="clear" w:color="auto" w:fill="FFF2CC"/>
-          </w:tcPr>
-          <w:p>
-            <w:pPr>
-              <w:spacing w:after="0" w:line="240" w:lineRule="auto"/>
-              <w:rPr>
-                <w:rFonts w:ascii="Times New Roman" w:hAnsi="Times New Roman" w:cs="Times New Roman"/>
-                <w:lang w:val="id-ID"/>
-              </w:rPr>
-            </w:pPr>
-            <w:r>
-              <w:rPr>
-                <w:rFonts w:ascii="Times New Roman" w:hAnsi="Times New Roman" w:cs="Times New Roman"/>
-                <w:b/>
-                <w:bCs/>
-                <w:lang w:val="id-ID"/>
-              </w:rPr>
-              <w:t>:</w:t>
-            </w:r>
-          </w:p>
-        </w:tc>
-        <w:tc>
-          <w:tcPr>
-            <w:tcW w:w="1368" w:type="dxa"/>
-            <w:shd w:val="clear" w:color="auto" w:fill="FFF2CC"/>
-          </w:tcPr>
-          <w:p>
-            <w:pPr>
-              <w:spacing w:after="0" w:line="240" w:lineRule="auto"/>
-              <w:rPr>
-                <w:rFonts w:ascii="Times New Roman" w:hAnsi="Times New Roman" w:cs="Times New Roman"/>
-                <w:lang w:val="id-ID"/>
-              </w:rPr>
-            </w:pPr>
-          </w:p>
-        </w:tc>
-        <w:tc>
-          <w:tcPr>
-            <w:tcW w:w="1054" w:type="dxa"/>
-            <w:shd w:val="clear" w:color="auto" w:fill="FFF2CC"/>
-          </w:tcPr>
-          <w:p>
-            <w:pPr>
-              <w:spacing w:after="0" w:line="240" w:lineRule="auto"/>
-              <w:rPr>
-                <w:rFonts w:ascii="Times New Roman" w:hAnsi="Times New Roman" w:cs="Times New Roman"/>
-                <w:lang w:val="id-ID"/>
-              </w:rPr>
-            </w:pPr>
-            <w:r>
-              <w:rPr>
-                <w:rFonts w:ascii="Times New Roman" w:hAnsi="Times New Roman" w:cs="Times New Roman"/>
-                <w:b/>
-                <w:bCs/>
-                <w:lang w:val="id-ID"/>
-              </w:rPr>
-              <w:t>Total marks</w:t>
-            </w:r>
-          </w:p>
-        </w:tc>
-        <w:tc>
-          <w:tcPr>
-            <w:tcW w:w="286" w:type="dxa"/>
-            <w:shd w:val="clear" w:color="auto" w:fill="FFF2CC"/>
-          </w:tcPr>
-          <w:p>
-            <w:pPr>
-              <w:spacing w:after="0" w:line="240" w:lineRule="auto"/>
-              <w:rPr>
-                <w:rFonts w:ascii="Times New Roman" w:hAnsi="Times New Roman" w:cs="Times New Roman"/>
-                <w:lang w:val="id-ID"/>
-              </w:rPr>
-            </w:pPr>
-            <w:r>
-              <w:rPr>
-                <w:rFonts w:ascii="Times New Roman" w:hAnsi="Times New Roman" w:cs="Times New Roman"/>
-                <w:b/>
-                <w:bCs/>
-                <w:lang w:val="id-ID"/>
-              </w:rPr>
-              <w:t>:</w:t>
-            </w:r>
-          </w:p>
-        </w:tc>
-        <w:tc>
-          <w:tcPr>
-            <w:tcW w:w="1504" w:type="dxa"/>
-            <w:shd w:val="clear" w:color="auto" w:fill="FFF2CC"/>
-          </w:tcPr>
-          <w:p>
-            <w:pPr>
-              <w:spacing w:after="0" w:line="240" w:lineRule="auto"/>
-              <w:rPr>
-                <w:rFonts w:ascii="Times New Roman" w:hAnsi="Times New Roman" w:cs="Times New Roman"/>
-                <w:lang w:val="id-ID"/>
-              </w:rPr>
-            </w:pPr>
-            <w:r>
-              <w:rPr>
-                <w:rFonts w:ascii="Times New Roman" w:hAnsi="Times New Roman" w:cs="Times New Roman"/>
-                <w:b/>
-                <w:bCs/>
-                <w:lang w:val="id-ID"/>
-              </w:rPr>
-              <w:t xml:space="preserve">   /50=</w:t>
-            </w:r>
-          </w:p>
-        </w:tc>
-        <w:tc>
-          <w:tcPr>
-            <w:tcW w:w="4223" w:type="dxa"/>
-          </w:tcPr>
-          <w:p>
-            <w:pPr>
-              <w:spacing w:after="0" w:line="0" w:lineRule="atLeast"/>
-              <w:rPr>
-                <w:sz w:val="2"/>
-                <w:lang w:val="id-ID"/>
-              </w:rPr>
-            </w:pPr>
-          </w:p>
-        </w:tc>
-      </w:tr>
-      <w:tr>
-        <w:trPr>
-          <w:trHeight w:val="350"/>
-        </w:trPr>
-        <w:tc>
-          <w:tcPr>
-            <w:tcW w:w="845" w:type="dxa"/>
-            <w:shd w:val="clear" w:color="auto" w:fill="FFF2CC"/>
-          </w:tcPr>
-          <w:p>
-            <w:pPr>
-              <w:spacing w:after="0" w:line="240" w:lineRule="auto"/>
-              <w:rPr>
-                <w:rFonts w:ascii="Times New Roman" w:hAnsi="Times New Roman" w:cs="Times New Roman"/>
-                <w:lang w:val="id-ID"/>
-              </w:rPr>
-            </w:pPr>
-            <w:r>
-              <w:rPr>
-                <w:rFonts w:ascii="Times New Roman" w:hAnsi="Times New Roman" w:cs="Times New Roman"/>
-                <w:b/>
-                <w:bCs/>
-                <w:lang w:val="id-ID"/>
-              </w:rPr>
-              <w:t>Class </w:t>
-            </w:r>
-          </w:p>
-        </w:tc>
-        <w:tc>
-          <w:tcPr>
-            <w:tcW w:w="286" w:type="dxa"/>
-            <w:shd w:val="clear" w:color="auto" w:fill="FFF2CC"/>
-          </w:tcPr>
-          <w:p>
-            <w:pPr>
-              <w:spacing w:after="0" w:line="240" w:lineRule="auto"/>
-              <w:rPr>
-                <w:rFonts w:ascii="Times New Roman" w:hAnsi="Times New Roman" w:cs="Times New Roman"/>
-                <w:lang w:val="id-ID"/>
-              </w:rPr>
-            </w:pPr>
-            <w:r>
-              <w:rPr>
-                <w:rFonts w:ascii="Times New Roman" w:hAnsi="Times New Roman" w:cs="Times New Roman"/>
-                <w:b/>
-                <w:bCs/>
-                <w:lang w:val="id-ID"/>
-              </w:rPr>
-              <w:t>:</w:t>
-            </w:r>
-          </w:p>
-        </w:tc>
-        <w:tc>
-          <w:tcPr>
-            <w:tcW w:w="2270" w:type="dxa"/>
-            <w:shd w:val="clear" w:color="auto" w:fill="FFF2CC"/>
-          </w:tcPr>
-          <w:p>
-            <w:pPr>
-              <w:spacing w:after="0" w:line="240" w:lineRule="auto"/>
-              <w:rPr>
-                <w:rFonts w:ascii="Times New Roman" w:hAnsi="Times New Roman" w:cs="Times New Roman"/>
-                <w:b/>
-                <w:bCs/>
-                <w:lang w:val="id-ID"/>
-              </w:rPr>
-            </w:pPr>
-          </w:p>
-        </w:tc>
-        <w:tc>
-          <w:tcPr>
-            <w:tcW w:w="1187" w:type="dxa"/>
-            <w:shd w:val="clear" w:color="auto" w:fill="FFF2CC"/>
-          </w:tcPr>
-          <w:p>
-            <w:pPr>
-              <w:spacing w:after="0" w:line="240" w:lineRule="auto"/>
-              <w:rPr>
-                <w:rFonts w:ascii="Times New Roman" w:hAnsi="Times New Roman" w:cs="Times New Roman"/>
-                <w:lang w:val="id-ID"/>
-              </w:rPr>
-            </w:pPr>
-            <w:r>
-              <w:rPr>
-                <w:rFonts w:ascii="Times New Roman" w:hAnsi="Times New Roman" w:cs="Times New Roman"/>
-                <w:b/>
-                <w:bCs/>
-                <w:lang w:val="id-ID"/>
-              </w:rPr>
-              <w:t>Day/Date</w:t>
-            </w:r>
-          </w:p>
-        </w:tc>
-        <w:tc>
-          <w:tcPr>
-            <w:tcW w:w="285" w:type="dxa"/>
-            <w:shd w:val="clear" w:color="auto" w:fill="FFF2CC"/>
-          </w:tcPr>
-          <w:p>
-            <w:pPr>
-              <w:spacing w:after="0" w:line="240" w:lineRule="auto"/>
-              <w:rPr>
-                <w:rFonts w:ascii="Times New Roman" w:hAnsi="Times New Roman" w:cs="Times New Roman"/>
-                <w:lang w:val="id-ID"/>
-              </w:rPr>
-            </w:pPr>
-            <w:r>
-              <w:rPr>
-                <w:rFonts w:ascii="Times New Roman" w:hAnsi="Times New Roman" w:cs="Times New Roman"/>
-                <w:b/>
-                <w:bCs/>
-                <w:lang w:val="id-ID"/>
-              </w:rPr>
-              <w:t>:</w:t>
-            </w:r>
-          </w:p>
-        </w:tc>
-        <w:tc>
-          <w:tcPr>
-            <w:tcW w:w="1368" w:type="dxa"/>
-            <w:shd w:val="clear" w:color="auto" w:fill="FFF2CC"/>
-          </w:tcPr>
-          <w:p>
-            <w:pPr>
-              <w:spacing w:after="0" w:line="240" w:lineRule="auto"/>
-              <w:rPr>
-                <w:rFonts w:ascii="Times New Roman" w:hAnsi="Times New Roman" w:cs="Times New Roman"/>
-                <w:lang w:val="id-ID"/>
-              </w:rPr>
-            </w:pPr>
-          </w:p>
-        </w:tc>
-        <w:tc>
-          <w:tcPr>
-            <w:tcW w:w="1054" w:type="dxa"/>
-            <w:shd w:val="clear" w:color="auto" w:fill="FFF2CC"/>
-          </w:tcPr>
-          <w:p>
-            <w:pPr>
-              <w:spacing w:after="0" w:line="240" w:lineRule="auto"/>
-              <w:rPr>
-                <w:rFonts w:ascii="Times New Roman" w:hAnsi="Times New Roman" w:cs="Times New Roman"/>
-                <w:lang w:val="id-ID"/>
-              </w:rPr>
-            </w:pPr>
-            <w:r>
-              <w:rPr>
-                <w:rFonts w:ascii="Times New Roman" w:hAnsi="Times New Roman" w:cs="Times New Roman"/>
-                <w:b/>
-                <w:bCs/>
-                <w:lang w:val="id-ID"/>
-              </w:rPr>
-              <w:t>Parent’s sign</w:t>
-            </w:r>
-          </w:p>
-        </w:tc>
-        <w:tc>
-          <w:tcPr>
-            <w:tcW w:w="286" w:type="dxa"/>
-            <w:shd w:val="clear" w:color="auto" w:fill="FFF2CC"/>
-          </w:tcPr>
-          <w:p>
-            <w:pPr>
-              <w:spacing w:after="0" w:line="240" w:lineRule="auto"/>
-              <w:rPr>
-                <w:rFonts w:ascii="Times New Roman" w:hAnsi="Times New Roman" w:cs="Times New Roman"/>
-                <w:lang w:val="id-ID"/>
-              </w:rPr>
-            </w:pPr>
-            <w:r>
-              <w:rPr>
-                <w:rFonts w:ascii="Times New Roman" w:hAnsi="Times New Roman" w:cs="Times New Roman"/>
-                <w:b/>
-                <w:bCs/>
-                <w:lang w:val="id-ID"/>
-              </w:rPr>
-              <w:t>:</w:t>
-            </w:r>
-          </w:p>
-        </w:tc>
-        <w:tc>
-          <w:tcPr>
-            <w:tcW w:w="1504" w:type="dxa"/>
-            <w:shd w:val="clear" w:color="auto" w:fill="FFF2CC"/>
-          </w:tcPr>
-          <w:p>
-            <w:pPr>
-              <w:spacing w:after="0" w:line="240" w:lineRule="auto"/>
-              <w:rPr>
-                <w:rFonts w:ascii="Times New Roman" w:hAnsi="Times New Roman" w:cs="Times New Roman"/>
-                <w:lang w:val="id-ID"/>
-              </w:rPr>
-            </w:pPr>
-          </w:p>
-        </w:tc>
-        <w:tc>
-          <w:tcPr>
-            <w:tcW w:w="4223" w:type="dxa"/>
-          </w:tcPr>
-          <w:p>
-            <w:pPr>
-              <w:spacing w:after="0" w:line="0" w:lineRule="atLeast"/>
-              <w:rPr>
-                <w:sz w:val="2"/>
-                <w:lang w:val="id-ID"/>
-              </w:rPr>
-            </w:pPr>
-          </w:p>
-        </w:tc>
-      </w:tr>
-      <w:tr>
-        <w:tc>
-          <w:tcPr>
-            <w:tcW w:w="13308" w:type="dxa"/>
-            <w:gridSpan w:val="10"/>
-            <w:tcBorders>
-              <w:bottom w:val="single" w:sz="4" w:space="0" w:color="000000"/>
-            </w:tcBorders>
-          </w:tcPr>
-          <w:p>
-            <w:pPr>
-              <w:rPr>
-                <w:rFonts w:ascii="Times New Roman" w:hAnsi="Times New Roman" w:cs="Times New Roman"/>
-                <w:b/>
-                <w:bCs/>
-                <w:sz w:val="24"/>
-                <w:szCs w:val="24"/>
-                <w:lang w:val="id-ID" w:bidi="en-US"/>
-              </w:rPr>
-            </w:pPr>
-            <w:r>
-              <w:rPr>
-                <w:rFonts w:ascii="Times New Roman" w:hAnsi="Times New Roman" w:cs="Times New Roman"/>
-                <w:b/>
-                <w:bCs/>
-                <w:sz w:val="24"/>
-                <w:szCs w:val="24"/>
-                <w:lang w:val="id-ID" w:bidi="en-US"/>
-              </w:rPr>
-              <w:t>Learning Objectives:</w:t>
-            </w:r>
-          </w:p>
-          <w:tbl>
-            <w:tblPr>
-              <w:tblStyle w:val="TableGrid"/>
-              <w:tblW w:w="9101" w:type="dxa"/>
-              <w:tblLayout w:type="fixed"/>
-              <w:tblLook w:val="04A0" w:firstRow="1" w:lastRow="0" w:firstColumn="1" w:lastColumn="0" w:noHBand="0" w:noVBand="1"/>
-            </w:tblPr>
-            <w:tblGrid>
-              <w:gridCol w:w="454"/>
-              <w:gridCol w:w="8647"/>
-            </w:tblGrid>
-            <w:tr>
-              <w:trPr>
-                <w:trHeight w:val="20"/>
-              </w:trPr>
-              <w:tc>
-                <w:tcPr>
-                  <w:tcW w:w="454" w:type="dxa"/>
-                  <w:tcBorders>
-                    <w:top w:val="single" w:sz="4" w:space="0" w:color="FFFFFF"/>
-                    <w:left w:val="single" w:sz="4" w:space="0" w:color="FFFFFF"/>
-                    <w:bottom w:val="single" w:sz="4" w:space="0" w:color="FFFFFF"/>
-                    <w:right w:val="single" w:sz="4" w:space="0" w:color="FFFFFF"/>
-                  </w:tcBorders>
-                </w:tcPr>
-                <w:p>
-                  <w:pPr>
-                    <w:numPr>
-                      <w:ilvl w:val="0"/>
-                      <w:numId w:val="8"/>
-                    </w:numPr>
-                    <w:spacing w:after="0" w:line="240" w:lineRule="auto"/>
-                    <w:rPr>
-                      <w:rFonts w:ascii="Times New Roman" w:hAnsi="Times New Roman" w:cs="Times New Roman"/>
-                      <w:lang w:val="id-ID" w:bidi="en-US"/>
-                    </w:rPr>
-                  </w:pPr>
-                </w:p>
-              </w:tc>
-              <w:tc>
-                <w:tcPr>
-                  <w:tcW w:w="8647" w:type="dxa"/>
-                  <w:tcBorders>
-                    <w:top w:val="single" w:sz="4" w:space="0" w:color="FFFFFF"/>
-                    <w:left w:val="single" w:sz="4" w:space="0" w:color="FFFFFF"/>
-                    <w:bottom w:val="single" w:sz="4" w:space="0" w:color="FFFFFF"/>
-                    <w:right w:val="single" w:sz="4" w:space="0" w:color="FFFFFF"/>
-                  </w:tcBorders>
-                </w:tcPr>
-                <w:p>
-                  <w:pPr>
-                    <w:spacing w:after="0" w:line="240" w:lineRule="auto"/>
-                    <w:rPr>
-                      <w:rFonts w:ascii="Times New Roman" w:hAnsi="Times New Roman" w:cs="Times New Roman"/>
-                      <w:sz w:val="24"/>
-                      <w:szCs w:val="24"/>
-                      <w:lang w:val="id-ID" w:bidi="en-US"/>
-                    </w:rPr>
-                  </w:pPr>
-                  <w:r>
-                    <w:rPr>
-                      <w:rFonts w:ascii="Times New Roman" w:hAnsi="Times New Roman" w:cs="Times New Roman"/>
-                      <w:sz w:val="24"/>
-                      <w:szCs w:val="24"/>
-                      <w:lang w:val="id-ID" w:bidi="en-US"/>
-                    </w:rPr>
-                    <w:t>Use the cosine and sine rule to find a missing side or angle</w:t>
-                  </w:r>
-                </w:p>
-              </w:tc>
-            </w:tr>
-            <w:tr>
-              <w:trPr>
-                <w:trHeight w:val="20"/>
-              </w:trPr>
-              <w:tc>
-                <w:tcPr>
-                  <w:tcW w:w="454" w:type="dxa"/>
-                  <w:tcBorders>
-                    <w:top w:val="single" w:sz="4" w:space="0" w:color="FFFFFF"/>
-                    <w:left w:val="single" w:sz="4" w:space="0" w:color="FFFFFF"/>
-                    <w:bottom w:val="single" w:sz="4" w:space="0" w:color="FFFFFF"/>
-                    <w:right w:val="single" w:sz="4" w:space="0" w:color="FFFFFF"/>
-                  </w:tcBorders>
-                </w:tcPr>
-                <w:p>
-                  <w:pPr>
-                    <w:numPr>
-                      <w:ilvl w:val="0"/>
-                      <w:numId w:val="6"/>
-                    </w:numPr>
-                    <w:spacing w:after="0" w:line="240" w:lineRule="auto"/>
-                    <w:rPr>
-                      <w:rFonts w:ascii="Times New Roman" w:hAnsi="Times New Roman" w:cs="Times New Roman"/>
-                      <w:lang w:val="id-ID" w:bidi="en-US"/>
-                    </w:rPr>
-                  </w:pPr>
-                </w:p>
-              </w:tc>
-              <w:tc>
-                <w:tcPr>
-                  <w:tcW w:w="8647" w:type="dxa"/>
-                  <w:tcBorders>
-                    <w:top w:val="single" w:sz="4" w:space="0" w:color="FFFFFF"/>
-                    <w:left w:val="single" w:sz="4" w:space="0" w:color="FFFFFF"/>
-                    <w:bottom w:val="single" w:sz="4" w:space="0" w:color="FFFFFF"/>
-                    <w:right w:val="single" w:sz="4" w:space="0" w:color="FFFFFF"/>
-                  </w:tcBorders>
-                </w:tcPr>
-                <w:p>
-                  <w:pPr>
-                    <w:spacing w:after="0" w:line="240" w:lineRule="auto"/>
-                    <w:rPr>
-                      <w:rFonts w:ascii="Times New Roman" w:hAnsi="Times New Roman" w:cs="Times New Roman"/>
-                      <w:sz w:val="24"/>
-                      <w:szCs w:val="24"/>
-                      <w:lang w:val="id-ID" w:bidi="en-US"/>
-                    </w:rPr>
-                  </w:pPr>
-                  <w:r>
-                    <w:rPr>
-                      <w:rFonts w:ascii="Times New Roman" w:hAnsi="Times New Roman" w:cs="Times New Roman"/>
-                      <w:sz w:val="24"/>
-                      <w:szCs w:val="24"/>
-                      <w:lang w:val="id-ID" w:bidi="en-US"/>
-                    </w:rPr>
-                    <w:t>Find the area of a triangle and solve problems involving triangles using an appropriate formula</w:t>
-                  </w:r>
-                </w:p>
-              </w:tc>
-            </w:tr>
-            <w:tr>
-              <w:trPr>
-                <w:trHeight w:val="20"/>
-              </w:trPr>
-              <w:tc>
-                <w:tcPr>
-                  <w:tcW w:w="454" w:type="dxa"/>
-                  <w:tcBorders>
-                    <w:top w:val="single" w:sz="4" w:space="0" w:color="FFFFFF"/>
-                    <w:left w:val="single" w:sz="4" w:space="0" w:color="FFFFFF"/>
-                    <w:bottom w:val="single" w:sz="4" w:space="0" w:color="FFFFFF"/>
-                    <w:right w:val="single" w:sz="4" w:space="0" w:color="FFFFFF"/>
-                  </w:tcBorders>
-                </w:tcPr>
-                <w:p>
-                  <w:pPr>
-                    <w:numPr>
-                      <w:ilvl w:val="0"/>
-                      <w:numId w:val="6"/>
-                    </w:numPr>
-                    <w:spacing w:after="0" w:line="240" w:lineRule="auto"/>
-                    <w:rPr>
-                      <w:rFonts w:ascii="Times New Roman" w:hAnsi="Times New Roman" w:cs="Times New Roman"/>
-                      <w:lang w:val="id-ID" w:bidi="en-US"/>
-                    </w:rPr>
-                  </w:pPr>
-                </w:p>
-              </w:tc>
-              <w:tc>
-                <w:tcPr>
-                  <w:tcW w:w="8647" w:type="dxa"/>
-                  <w:tcBorders>
-                    <w:top w:val="single" w:sz="4" w:space="0" w:color="FFFFFF"/>
-                    <w:left w:val="single" w:sz="4" w:space="0" w:color="FFFFFF"/>
-                    <w:bottom w:val="single" w:sz="4" w:space="0" w:color="FFFFFF"/>
-                    <w:right w:val="single" w:sz="4" w:space="0" w:color="FFFFFF"/>
-                  </w:tcBorders>
-                </w:tcPr>
-                <w:p>
-                  <w:pPr>
-                    <w:spacing w:after="0" w:line="240" w:lineRule="auto"/>
-                    <w:rPr>
-                      <w:rFonts w:ascii="Times New Roman" w:hAnsi="Times New Roman" w:cs="Times New Roman"/>
-                      <w:sz w:val="24"/>
-                      <w:szCs w:val="24"/>
-                      <w:lang w:val="id-ID" w:bidi="en-US"/>
-                    </w:rPr>
-                  </w:pPr>
-                  <w:r>
-                    <w:rPr>
-                      <w:rFonts w:ascii="Times New Roman" w:hAnsi="Times New Roman" w:cs="Times New Roman"/>
-                      <w:sz w:val="24"/>
-                      <w:szCs w:val="24"/>
-                      <w:lang w:val="id-ID" w:bidi="en-US"/>
-                    </w:rPr>
-                    <w:t>Sketch the graphs of the sine, cosine and tangent functions and its transformations.</w:t>
-                  </w:r>
-                </w:p>
-              </w:tc>
-            </w:tr>
-          </w:tbl>
-          <w:p>
-            <w:pPr>
-              <w:spacing w:after="0" w:line="240" w:lineRule="auto"/>
-              <w:rPr>
-                <w:rFonts w:ascii="Times New Roman" w:hAnsi="Times New Roman" w:cs="Times New Roman"/>
-                <w:lang w:val="id-ID"/>
-              </w:rPr>
-            </w:pPr>
-          </w:p>
-        </w:tc>
-      </w:tr>
-    </w:tbl>
-    <w:tbl>
-      <w:tblPr>
-        <w:tblStyle w:val="TableGrid"/>
-        <w:tblW w:w="10113" w:type="dxa"/>
-        <w:tblLayout w:type="fixed"/>
-        <w:tblLook w:val="04A0" w:firstRow="1" w:lastRow="0" w:firstColumn="1" w:lastColumn="0" w:noHBand="0" w:noVBand="1"/>
-      </w:tblPr>
-      <w:tblGrid>
-        <w:gridCol w:w="381"/>
-        <w:gridCol w:w="9239"/>
-        <w:gridCol w:w="493"/>
-      </w:tblGrid>
-      <w:tr>
-        <w:tc>
-          <w:tcPr>
-            <w:tcW w:w="381" w:type="dxa"/>
-            <w:tcBorders>
-              <w:top w:val="nil"/>
-              <w:left w:val="nil"/>
-              <w:bottom w:val="nil"/>
-              <w:right w:val="nil"/>
-            </w:tcBorders>
-          </w:tcPr>
-          <w:p>
-            <w:pPr>
-              <w:spacing w:after="0" w:line="240" w:lineRule="auto"/>
-              <w:jc w:val="both"/>
-              <w:rPr>
-                <w:rFonts w:ascii="Times New Roman" w:hAnsi="Times New Roman" w:cs="Times New Roman"/>
-                <w:lang w:val="id-ID"/>
-              </w:rPr>
-            </w:pPr>
-            <w:r>
-              <w:rPr>
-                <w:rFonts w:ascii="Times New Roman" w:hAnsi="Times New Roman" w:cs="Times New Roman"/>
-                <w:lang w:val="id-ID"/>
-              </w:rPr>
-              <w:t>1.</w:t>
-            </w:r>
-          </w:p>
-        </w:tc>
-        <w:tc>
-          <w:tcPr>
-            <w:tcW w:w="9239" w:type="dxa"/>
-            <w:tcBorders>
-              <w:top w:val="nil"/>
-              <w:left w:val="nil"/>
-              <w:bottom w:val="nil"/>
-              <w:right w:val="nil"/>
-            </w:tcBorders>
-          </w:tcPr>
-          <w:p>
-            <w:pPr>
-              <w:spacing w:after="0" w:line="240" w:lineRule="auto"/>
-              <w:jc w:val="both"/>
-              <w:rPr>
-                <w:rFonts w:ascii="Times New Roman" w:hAnsi="Times New Roman" w:cs="Times New Roman"/>
-                <w:lang w:val="id-ID"/>
-              </w:rPr>
-            </w:pPr>
-            <w:r>
-              <w:rPr>
-                <w:rFonts w:ascii="Times New Roman" w:hAnsi="Times New Roman" w:cs="Times New Roman"/>
-                <w:lang w:val="id-ID"/>
-              </w:rPr>
-              <w:t xml:space="preserve">In triangle ABC, calculate the size of the remaining angles, the lengths of the third side and the area of the triangle given that </w:t>
-            </w:r>
-            <w:r>
-              <w:rPr>
-                <w:rFonts w:ascii="Cambria Math" w:hAnsi="Cambria Math" w:cs="Cambria Math"/>
-                <w:lang w:val="id-ID"/>
-              </w:rPr>
-              <w:t>∠</w:t>
-            </w:r>
-            <w:r>
-              <w:rPr>
-                <w:rFonts w:ascii="Times New Roman" w:hAnsi="Times New Roman" w:cs="Times New Roman"/>
-                <w:lang w:val="id-ID"/>
-              </w:rPr>
-              <w:t xml:space="preserve">BAC = </w:t>
-            </w:r>
-            <m:oMath>
-              <m:f>
-                <m:fPr>
-                  <m:ctrlPr>
-                    <w:rPr>
-                      <w:rFonts w:ascii="Cambria Math" w:hAnsi="Cambria Math"/>
-                      <w:lang w:val="id-ID"/>
-                    </w:rPr>
-                  </m:ctrlPr>
-                </m:fPr>
-                <m:num>
-                  <m:r>
-                    <w:rPr>
-                      <w:rFonts w:ascii="Cambria Math" w:hAnsi="Cambria Math"/>
-                      <w:lang w:val="id-ID"/>
-                    </w:rPr>
-                    <m:t>2</m:t>
-                  </m:r>
-                </m:num>
-                <m:den>
-                  <m:r>
-                    <w:rPr>
-                      <w:rFonts w:ascii="Cambria Math" w:hAnsi="Cambria Math"/>
-                      <w:lang w:val="id-ID"/>
-                    </w:rPr>
-                    <m:t>9</m:t>
-                  </m:r>
-                </m:den>
-              </m:f>
-              <m:r>
-                <w:rPr>
-                  <w:rFonts w:ascii="Cambria Math" w:hAnsi="Cambria Math"/>
-                  <w:lang w:val="id-ID"/>
-                </w:rPr>
-                <m:t>π</m:t>
-              </m:r>
-            </m:oMath>
-            <w:r>
-              <w:rPr>
-                <w:rFonts w:ascii="Times New Roman" w:hAnsi="Times New Roman" w:cs="Times New Roman"/>
-                <w:lang w:val="id-ID"/>
-              </w:rPr>
-              <w:t xml:space="preserve"> rad, AB = 8.5 cm and BC = 10.2 cm.</w:t>
-            </w:r>
-          </w:p>
-        </w:tc>
-        <w:tc>
-          <w:tcPr>
-            <w:tcW w:w="493" w:type="dxa"/>
-            <w:tcBorders>
-              <w:top w:val="nil"/>
-              <w:left w:val="nil"/>
-              <w:bottom w:val="nil"/>
-              <w:right w:val="nil"/>
-            </w:tcBorders>
-          </w:tcPr>
-          <w:p>
-            <w:pPr>
-              <w:spacing w:after="0" w:line="240" w:lineRule="auto"/>
-              <w:rPr>
-                <w:rFonts w:ascii="Times New Roman" w:hAnsi="Times New Roman" w:cs="Times New Roman"/>
-                <w:lang w:val="id-ID"/>
-              </w:rPr>
-            </w:pPr>
-            <w:r>
-              <w:rPr>
-                <w:rFonts w:ascii="Times New Roman" w:hAnsi="Times New Roman" w:cs="Times New Roman"/>
-                <w:b/>
-                <w:bCs/>
-                <w:lang w:val="id-ID"/>
-              </w:rPr>
-              <w:t>[6]</w:t>
-            </w:r>
-          </w:p>
-        </w:tc>
-      </w:tr>
-      <w:tr>
-        <w:tc>
-          <w:tcPr>
-            <w:tcW w:w="381" w:type="dxa"/>
-            <w:tcBorders>
-              <w:top w:val="nil"/>
-              <w:left w:val="nil"/>
-              <w:bottom w:val="nil"/>
-              <w:right w:val="nil"/>
-            </w:tcBorders>
-          </w:tcPr>
-          <w:p>
-            <w:pPr>
-              <w:spacing w:after="0" w:line="240" w:lineRule="auto"/>
-              <w:jc w:val="both"/>
-              <w:rPr>
-                <w:rFonts w:ascii="Times New Roman" w:hAnsi="Times New Roman" w:cs="Times New Roman"/>
-                <w:lang w:val="id-ID"/>
-              </w:rPr>
-            </w:pPr>
-          </w:p>
-        </w:tc>
-        <w:tc>
-          <w:tcPr>
-            <w:tcW w:w="9239" w:type="dxa"/>
-            <w:tcBorders>
-              <w:top w:val="nil"/>
-              <w:left w:val="nil"/>
-              <w:bottom w:val="nil"/>
-              <w:right w:val="nil"/>
-            </w:tcBorders>
-          </w:tcPr>
-          <w:p>
-            <w:pPr>
-              <w:spacing w:after="0" w:line="240" w:lineRule="auto"/>
-              <w:jc w:val="both"/>
-              <w:rPr>
-                <w:rFonts w:ascii="Times New Roman" w:hAnsi="Times New Roman" w:cs="Times New Roman"/>
-                <w:lang w:val="id-ID"/>
-              </w:rPr>
-            </w:pPr>
-          </w:p>
-          <w:p>
-            <w:pPr>
-              <w:spacing w:after="0" w:line="240" w:lineRule="auto"/>
-              <w:jc w:val="both"/>
-              <w:rPr>
-                <w:rFonts w:ascii="Times New Roman" w:hAnsi="Times New Roman" w:cs="Times New Roman"/>
-                <w:lang w:val="id-ID"/>
-              </w:rPr>
-            </w:pPr>
-          </w:p>
-          <w:p>
-            <w:pPr>
-              <w:spacing w:after="0" w:line="240" w:lineRule="auto"/>
-              <w:jc w:val="both"/>
-              <w:rPr>
-                <w:rFonts w:ascii="Times New Roman" w:hAnsi="Times New Roman" w:cs="Times New Roman"/>
-                <w:lang w:val="id-ID"/>
-              </w:rPr>
-            </w:pPr>
-          </w:p>
-          <w:p>
-            <w:pPr>
-              <w:spacing w:after="0" w:line="240" w:lineRule="auto"/>
-              <w:jc w:val="both"/>
-              <w:rPr>
-                <w:rFonts w:ascii="Times New Roman" w:hAnsi="Times New Roman" w:cs="Times New Roman"/>
-                <w:lang w:val="id-ID"/>
-              </w:rPr>
-            </w:pPr>
-          </w:p>
-          <w:p>
-            <w:pPr>
-              <w:spacing w:after="0" w:line="240" w:lineRule="auto"/>
-              <w:jc w:val="both"/>
-              <w:rPr>
-                <w:rFonts w:ascii="Times New Roman" w:hAnsi="Times New Roman" w:cs="Times New Roman"/>
-                <w:lang w:val="id-ID"/>
-              </w:rPr>
-            </w:pPr>
-          </w:p>
-          <w:p>
-            <w:pPr>
-              <w:spacing w:after="0" w:line="240" w:lineRule="auto"/>
-              <w:jc w:val="both"/>
-              <w:rPr>
-                <w:rFonts w:ascii="Times New Roman" w:hAnsi="Times New Roman" w:cs="Times New Roman"/>
-                <w:lang w:val="id-ID"/>
-              </w:rPr>
-            </w:pPr>
-          </w:p>
-        </w:tc>
-        <w:tc>
-          <w:tcPr>
-            <w:tcW w:w="493" w:type="dxa"/>
-            <w:tcBorders>
-              <w:top w:val="nil"/>
-              <w:left w:val="nil"/>
-              <w:bottom w:val="nil"/>
-              <w:right w:val="nil"/>
-            </w:tcBorders>
-          </w:tcPr>
-          <w:p>
-            <w:pPr>
-              <w:spacing w:after="0" w:line="240" w:lineRule="auto"/>
-              <w:rPr>
-                <w:rFonts w:ascii="Times New Roman" w:hAnsi="Times New Roman" w:cs="Times New Roman"/>
-                <w:lang w:val="id-ID"/>
-              </w:rPr>
-            </w:pPr>
-          </w:p>
-        </w:tc>
-      </w:tr>
-      <w:tr>
-        <w:tc>
-          <w:tcPr>
-            <w:tcW w:w="381" w:type="dxa"/>
-            <w:tcBorders>
-              <w:top w:val="nil"/>
-              <w:left w:val="nil"/>
-              <w:bottom w:val="nil"/>
-              <w:right w:val="nil"/>
-            </w:tcBorders>
-          </w:tcPr>
-          <w:p>
-            <w:pPr>
-              <w:spacing w:after="0" w:line="240" w:lineRule="auto"/>
-              <w:jc w:val="both"/>
-              <w:rPr>
-                <w:rFonts w:ascii="Times New Roman" w:hAnsi="Times New Roman" w:cs="Times New Roman"/>
-                <w:lang w:val="id-ID"/>
-              </w:rPr>
-            </w:pPr>
-            <w:r>
-              <w:rPr>
-                <w:rFonts w:ascii="Times New Roman" w:hAnsi="Times New Roman" w:cs="Times New Roman"/>
-                <w:lang w:val="id-ID"/>
-              </w:rPr>
-              <w:t xml:space="preserve">2. </w:t>
-            </w:r>
-          </w:p>
-        </w:tc>
-        <w:tc>
-          <w:tcPr>
-            <w:tcW w:w="9239" w:type="dxa"/>
-            <w:tcBorders>
-              <w:top w:val="nil"/>
-              <w:left w:val="nil"/>
-              <w:bottom w:val="nil"/>
-              <w:right w:val="nil"/>
-            </w:tcBorders>
-          </w:tcPr>
-          <w:p>
-            <w:pPr>
-              <w:spacing w:after="0" w:line="240" w:lineRule="auto"/>
-              <w:jc w:val="both"/>
-              <w:rPr>
-                <w:rFonts w:ascii="Times New Roman" w:hAnsi="Times New Roman" w:cs="Times New Roman"/>
-                <w:lang w:val="id-ID"/>
-              </w:rPr>
-            </w:pPr>
-            <w:r>
-              <w:rPr>
-                <w:rFonts w:ascii="Times New Roman" w:hAnsi="Times New Roman" w:cs="Times New Roman"/>
-                <w:lang w:val="id-ID"/>
-              </w:rPr>
-              <w:t xml:space="preserve">Two radar stations A and B are 16 km apart and A is due north of B. A ship is known to be on a bearing of 150° from A and 10 km from B. </w:t>
-            </w:r>
-            <w:r>
-              <w:rPr>
-                <w:rFonts w:ascii="Times New Roman" w:hAnsi="Times New Roman" w:cs="Times New Roman"/>
-                <w:b/>
-                <w:bCs/>
-                <w:lang w:val="id-ID"/>
-              </w:rPr>
-              <w:t>Show</w:t>
-            </w:r>
-            <w:r>
-              <w:rPr>
-                <w:rFonts w:ascii="Times New Roman" w:hAnsi="Times New Roman" w:cs="Times New Roman"/>
-                <w:lang w:val="id-ID"/>
-              </w:rPr>
-              <w:t xml:space="preserve"> that this information gives two positions for the ship, and </w:t>
-            </w:r>
-            <w:r>
-              <w:rPr>
-                <w:rFonts w:ascii="Times New Roman" w:hAnsi="Times New Roman" w:cs="Times New Roman"/>
-                <w:b/>
-                <w:bCs/>
-                <w:lang w:val="id-ID"/>
-              </w:rPr>
-              <w:t>calculate</w:t>
-            </w:r>
-            <w:r>
-              <w:rPr>
-                <w:rFonts w:ascii="Times New Roman" w:hAnsi="Times New Roman" w:cs="Times New Roman"/>
-                <w:lang w:val="id-ID"/>
-              </w:rPr>
-              <w:t xml:space="preserve"> the distance between these two positions.</w:t>
-            </w:r>
-          </w:p>
-        </w:tc>
-        <w:tc>
-          <w:tcPr>
-            <w:tcW w:w="493" w:type="dxa"/>
-            <w:tcBorders>
-              <w:top w:val="nil"/>
-              <w:left w:val="nil"/>
-              <w:bottom w:val="nil"/>
-              <w:right w:val="nil"/>
-            </w:tcBorders>
-          </w:tcPr>
-          <w:p>
-            <w:pPr>
-              <w:spacing w:after="0" w:line="240" w:lineRule="auto"/>
-              <w:rPr>
-                <w:rFonts w:ascii="Times New Roman" w:hAnsi="Times New Roman" w:cs="Times New Roman"/>
-                <w:lang w:val="id-ID"/>
-              </w:rPr>
-            </w:pPr>
-            <w:r>
-              <w:rPr>
-                <w:rFonts w:ascii="Times New Roman" w:hAnsi="Times New Roman" w:cs="Times New Roman"/>
-                <w:b/>
-                <w:bCs/>
-                <w:lang w:val="id-ID"/>
-              </w:rPr>
-              <w:t>[5]</w:t>
-            </w:r>
-          </w:p>
-        </w:tc>
-      </w:tr>
-      <w:tr>
-        <w:tc>
-          <w:tcPr>
-            <w:tcW w:w="381" w:type="dxa"/>
-            <w:tcBorders>
-              <w:top w:val="nil"/>
-              <w:left w:val="nil"/>
-              <w:bottom w:val="nil"/>
-              <w:right w:val="nil"/>
-            </w:tcBorders>
-          </w:tcPr>
-          <w:p>
-            <w:pPr>
-              <w:spacing w:after="0" w:line="240" w:lineRule="auto"/>
-              <w:rPr>
-                <w:rFonts w:ascii="Times New Roman" w:hAnsi="Times New Roman" w:cs="Times New Roman"/>
-                <w:lang w:val="id-ID"/>
-              </w:rPr>
-            </w:pPr>
-          </w:p>
-          <w:p>
-            <w:pPr>
-              <w:spacing w:after="0" w:line="240" w:lineRule="auto"/>
-              <w:rPr>
-                <w:rFonts w:ascii="Times New Roman" w:hAnsi="Times New Roman" w:cs="Times New Roman"/>
-                <w:lang w:val="id-ID"/>
-              </w:rPr>
-            </w:pPr>
-          </w:p>
-        </w:tc>
-        <w:tc>
-          <w:tcPr>
-            <w:tcW w:w="9239" w:type="dxa"/>
-            <w:tcBorders>
-              <w:top w:val="nil"/>
-              <w:left w:val="nil"/>
-              <w:bottom w:val="nil"/>
-              <w:right w:val="nil"/>
-            </w:tcBorders>
-          </w:tcPr>
-          <w:p>
-            <w:pPr>
-              <w:spacing w:after="0" w:line="240" w:lineRule="auto"/>
-              <w:rPr>
-                <w:rFonts w:ascii="Times New Roman" w:hAnsi="Times New Roman" w:cs="Times New Roman"/>
-                <w:lang w:val="id-ID"/>
-              </w:rPr>
-            </w:pPr>
-          </w:p>
-          <w:p>
-            <w:pPr>
-              <w:spacing w:after="0" w:line="240" w:lineRule="auto"/>
-              <w:rPr>
-                <w:rFonts w:ascii="Times New Roman" w:hAnsi="Times New Roman" w:cs="Times New Roman"/>
-                <w:lang w:val="id-ID"/>
-              </w:rPr>
-            </w:pPr>
-          </w:p>
-          <w:p>
-            <w:pPr>
-              <w:spacing w:after="0" w:line="240" w:lineRule="auto"/>
-              <w:rPr>
-                <w:rFonts w:ascii="Times New Roman" w:hAnsi="Times New Roman" w:cs="Times New Roman"/>
-                <w:lang w:val="id-ID"/>
-              </w:rPr>
-            </w:pPr>
-          </w:p>
-        </w:tc>
-        <w:tc>
-          <w:tcPr>
-            <w:tcW w:w="493" w:type="dxa"/>
-            <w:tcBorders>
-              <w:top w:val="nil"/>
-              <w:left w:val="nil"/>
-              <w:bottom w:val="nil"/>
-              <w:right w:val="nil"/>
-            </w:tcBorders>
-          </w:tcPr>
-          <w:p>
-            <w:pPr>
-              <w:spacing w:after="0" w:line="240" w:lineRule="auto"/>
-              <w:rPr>
-                <w:rFonts w:ascii="Times New Roman" w:hAnsi="Times New Roman" w:cs="Times New Roman"/>
-                <w:lang w:val="id-ID"/>
-              </w:rPr>
-            </w:pPr>
-          </w:p>
-        </w:tc>
-      </w:tr>
-      <w:tr>
-        <w:tc>
-          <w:tcPr>
-            <w:tcW w:w="381" w:type="dxa"/>
-            <w:tcBorders>
-              <w:top w:val="nil"/>
-              <w:left w:val="nil"/>
-              <w:bottom w:val="nil"/>
-              <w:right w:val="nil"/>
-            </w:tcBorders>
-          </w:tcPr>
-          <w:p>
-            <w:pPr>
-              <w:spacing w:after="0" w:line="240" w:lineRule="auto"/>
-              <w:rPr>
-                <w:rFonts w:ascii="Times New Roman" w:hAnsi="Times New Roman" w:cs="Times New Roman"/>
-                <w:lang w:val="id-ID"/>
-              </w:rPr>
-            </w:pPr>
-            <w:r>
-              <w:rPr>
-                <w:rFonts w:ascii="Times New Roman" w:hAnsi="Times New Roman" w:cs="Times New Roman"/>
-                <w:lang w:val="id-ID"/>
-              </w:rPr>
-              <w:t>3.</w:t>
-            </w:r>
-          </w:p>
-        </w:tc>
-        <w:tc>
-          <w:tcPr>
-            <w:tcW w:w="9239" w:type="dxa"/>
-            <w:tcBorders>
-              <w:top w:val="nil"/>
-              <w:left w:val="nil"/>
-              <w:bottom w:val="nil"/>
-              <w:right w:val="nil"/>
-            </w:tcBorders>
-          </w:tcPr>
-          <w:p>
-            <w:pPr>
-              <w:spacing w:after="0" w:line="240" w:lineRule="auto"/>
-              <w:jc w:val="both"/>
-              <w:rPr>
-                <w:rFonts w:ascii="Times New Roman" w:hAnsi="Times New Roman" w:cs="Times New Roman"/>
-                <w:lang w:val="id-ID"/>
-              </w:rPr>
-            </w:pPr>
-            <w:r>
-              <w:rPr>
-                <w:rFonts w:ascii="Times New Roman" w:hAnsi="Times New Roman" w:cs="Times New Roman"/>
-                <w:lang w:val="id-ID"/>
-              </w:rPr>
-              <w:t>Sketch, on separate sets of axes, the graphs of the following, in the interval -</w:t>
-            </w:r>
-            <w:r>
-              <w:rPr>
-                <w:rFonts w:ascii="Cambria Math" w:hAnsi="Cambria Math" w:cs="Times New Roman"/>
-                <w:i/>
-                <w:lang w:val="id-ID"/>
-              </w:rPr>
-              <w:t xml:space="preserve"> </w:t>
-            </w:r>
-            <m:oMath>
-              <m:r>
-                <w:rPr>
-                  <w:rFonts w:ascii="Cambria Math" w:hAnsi="Cambria Math"/>
-                  <w:lang w:val="id-ID"/>
-                </w:rPr>
-                <m:t>π≤θ≤π</m:t>
-              </m:r>
-            </m:oMath>
-            <w:r>
-              <w:rPr>
-                <w:rFonts w:ascii="Times New Roman" w:hAnsi="Times New Roman" w:cs="Times New Roman"/>
-                <w:lang w:val="id-ID"/>
-              </w:rPr>
-              <w:t xml:space="preserve">. Give the coordinates of points of the intersection with the axes, and of maximum and minimum points where appropriate. </w:t>
-            </w:r>
-          </w:p>
-        </w:tc>
-        <w:tc>
-          <w:tcPr>
-            <w:tcW w:w="493" w:type="dxa"/>
-            <w:tcBorders>
-              <w:top w:val="nil"/>
-              <w:left w:val="nil"/>
-              <w:bottom w:val="nil"/>
-              <w:right w:val="nil"/>
-            </w:tcBorders>
-          </w:tcPr>
-          <w:p>
-            <w:pPr>
-              <w:spacing w:after="0" w:line="240" w:lineRule="auto"/>
-              <w:rPr>
-                <w:rFonts w:ascii="Times New Roman" w:hAnsi="Times New Roman" w:cs="Times New Roman"/>
-                <w:lang w:val="id-ID"/>
-              </w:rPr>
-            </w:pPr>
-          </w:p>
-        </w:tc>
-      </w:tr>
-      <w:tr>
-        <w:tc>
-          <w:tcPr>
-            <w:tcW w:w="381" w:type="dxa"/>
-            <w:tcBorders>
-              <w:top w:val="nil"/>
-              <w:left w:val="nil"/>
-              <w:bottom w:val="nil"/>
-              <w:right w:val="nil"/>
-            </w:tcBorders>
-          </w:tcPr>
-          <w:p>
-            <w:pPr>
-              <w:spacing w:after="0" w:line="240" w:lineRule="auto"/>
-              <w:rPr>
-                <w:rFonts w:ascii="Times New Roman" w:hAnsi="Times New Roman" w:cs="Times New Roman"/>
-                <w:lang w:val="id-ID"/>
-              </w:rPr>
-            </w:pPr>
-          </w:p>
-        </w:tc>
-        <w:tc>
-          <w:tcPr>
-            <w:tcW w:w="9239" w:type="dxa"/>
-            <w:tcBorders>
-              <w:top w:val="nil"/>
-              <w:left w:val="nil"/>
-              <w:bottom w:val="nil"/>
-              <w:right w:val="nil"/>
-            </w:tcBorders>
-          </w:tcPr>
-          <w:p>
-            <w:pPr>
-              <w:pStyle w:val="ListParagraph"/>
-              <w:numPr>
-                <w:ilvl w:val="0"/>
-                <w:numId w:val="3"/>
-              </w:numPr>
-              <w:spacing w:after="0" w:line="240" w:lineRule="auto"/>
-              <w:rPr>
-                <w:rFonts w:ascii="Times New Roman" w:hAnsi="Times New Roman" w:cs="Times New Roman"/>
-                <w:lang w:val="id-ID"/>
-              </w:rPr>
-            </w:pPr>
-            <m:oMath>
-              <m:r>
-                <w:rPr>
-                  <w:rFonts w:ascii="Cambria Math" w:hAnsi="Cambria Math"/>
-                  <w:lang w:val="id-ID"/>
-                </w:rPr>
-                <m:t>y</m:t>
-              </m:r>
-              <m:r>
-                <m:rPr>
-                  <m:lit/>
-                  <m:nor/>
-                </m:rPr>
-                <w:rPr>
-                  <w:lang w:val="id-ID"/>
-                </w:rPr>
-                <m:t>=-</m:t>
-              </m:r>
-              <m:r>
-                <w:rPr>
-                  <w:rFonts w:ascii="Cambria Math" w:hAnsi="Cambria Math"/>
-                  <w:lang w:val="id-ID"/>
-                </w:rPr>
-                <m:t>2sinθ</m:t>
-              </m:r>
-            </m:oMath>
-          </w:p>
-          <w:p>
-            <w:pPr>
-              <w:spacing w:after="0" w:line="240" w:lineRule="auto"/>
-              <w:rPr>
-                <w:rFonts w:ascii="Times New Roman" w:hAnsi="Times New Roman" w:cs="Times New Roman"/>
-                <w:lang w:val="id-ID"/>
-              </w:rPr>
-            </w:pPr>
-          </w:p>
-        </w:tc>
-        <w:tc>
-          <w:tcPr>
-            <w:tcW w:w="493" w:type="dxa"/>
-            <w:tcBorders>
-              <w:top w:val="nil"/>
-              <w:left w:val="nil"/>
-              <w:bottom w:val="nil"/>
-              <w:right w:val="nil"/>
-            </w:tcBorders>
-          </w:tcPr>
-          <w:p>
-            <w:pPr>
-              <w:spacing w:after="0" w:line="240" w:lineRule="auto"/>
-              <w:rPr>
-                <w:rFonts w:ascii="Times New Roman" w:hAnsi="Times New Roman" w:cs="Times New Roman"/>
-                <w:lang w:val="id-ID"/>
-              </w:rPr>
-            </w:pPr>
-            <w:r>
-              <w:rPr>
-                <w:rFonts w:ascii="Times New Roman" w:hAnsi="Times New Roman" w:cs="Times New Roman"/>
-                <w:b/>
-                <w:bCs/>
-                <w:lang w:val="id-ID"/>
-              </w:rPr>
-              <w:t>[4]</w:t>
-            </w:r>
-          </w:p>
-        </w:tc>
-      </w:tr>
-      <w:tr>
-        <w:tc>
-          <w:tcPr>
-            <w:tcW w:w="381" w:type="dxa"/>
-            <w:tcBorders>
-              <w:top w:val="nil"/>
-              <w:left w:val="nil"/>
-              <w:bottom w:val="nil"/>
-              <w:right w:val="nil"/>
-            </w:tcBorders>
-          </w:tcPr>
-          <w:p>
-            <w:pPr>
-              <w:spacing w:after="0" w:line="240" w:lineRule="auto"/>
-              <w:rPr>
-                <w:rFonts w:ascii="Times New Roman" w:hAnsi="Times New Roman" w:cs="Times New Roman"/>
-                <w:lang w:val="id-ID"/>
-              </w:rPr>
-            </w:pPr>
-          </w:p>
-        </w:tc>
-        <w:tc>
-          <w:tcPr>
-            <w:tcW w:w="9239" w:type="dxa"/>
-            <w:tcBorders>
-              <w:top w:val="nil"/>
-              <w:left w:val="nil"/>
-              <w:bottom w:val="nil"/>
-              <w:right w:val="nil"/>
-            </w:tcBorders>
-          </w:tcPr>
-          <w:p>
-            <w:pPr>
-              <w:spacing w:after="0" w:line="240" w:lineRule="auto"/>
-              <w:rPr>
-                <w:rFonts w:ascii="Times New Roman" w:eastAsia="Calibri" w:hAnsi="Times New Roman" w:cs="Times New Roman"/>
-                <w:lang w:val="id-ID"/>
-              </w:rPr>
-            </w:pPr>
-            <w:r>
-              <w:rPr>
-                <w:noProof/>
-                <w:lang w:val="id-ID"/>
-              </w:rPr>
-              <mc:AlternateContent>
-                <mc:Choice Requires="wps">
-                  <w:drawing>
-                    <wp:inline distT="0" distB="0" distL="0" distR="0" wp14:anchorId="7484D26B" wp14:editId="782E74C8">
-                      <wp:extent cx="5731510" cy="2313940"/>
-                      <wp:effectExtent l="0" t="0" r="2540" b="0"/>
-                      <wp:docPr id="11" name="Picture 1"/>
-                      <wp:cNvGraphicFramePr/>
-                      <a:graphic xmlns:a="http://schemas.openxmlformats.org/drawingml/2006/main">
-                        <a:graphicData uri="http://schemas.openxmlformats.org/drawingml/2006/picture">
-                          <pic:pic xmlns:pic="http://schemas.openxmlformats.org/drawingml/2006/picture">
-                            <pic:nvPicPr>
-                              <pic:cNvPr id="12" name="Picture 1"/>
-                              <pic:cNvPicPr/>
-                            </pic:nvPicPr>
-                            <pic:blipFill>
-                              <a:blip r:embed="rId15">
-                                <a:extLst>
-                                  <a:ext uri="{BEBA8EAE-BF5A-486C-A8C5-ECC9F3942E4B}">
-                                    <a14:imgProps xmlns:a14="http://schemas.microsoft.com/office/drawing/2010/main">
-                                      <a14:imgLayer r:embed="rId16">
-                                        <a14:imgEffect>
-                                          <a14:sharpenSoften amount="80000"/>
-                                        </a14:imgEffect>
-                                      </a14:imgLayer>
-                                    </a14:imgProps>
-                                  </a:ext>
-                                </a:extLst>
-                              </a:blip>
-                              <a:stretch/>
-                            </pic:blipFill>
-                            <pic:spPr>
-                              <a:xfrm>
-                                <a:off x="0" y="0"/>
-                                <a:ext cx="5731560" cy="2314080"/>
-                              </a:xfrm>
-                              <a:prstGeom prst="rect">
-                                <a:avLst/>
-                              </a:prstGeom>
-                              <a:noFill/>
-                              <a:ln w="0">
-                                <a:noFill/>
-                              </a:ln>
-                            </pic:spPr>
-                          </pic:pic>
-                        </a:graphicData>
-                      </a:graphic>
-                    </wp:inline>
-                  </w:drawing>
-                </mc:Choice>
-                <mc:Fallback xmlns:pic="http://schemas.openxmlformats.org/drawingml/2006/picture">
-                  <w:pict>
-                    <v:shapetype id="_x0000_t75" coordsize="21600,21600" o:spt="75" o:preferrelative="t" path="m@4@5l@4@11@9@11@9@5xe" filled="f" stroked="f">
-                      <v:stroke joinstyle="miter"/>
-                      <v:formulas>
-                        <v:f eqn="if lineDrawn pixelLineWidth 0"/>
-                        <v:f eqn="sum @0 1 0"/>
-                        <v:f eqn="sum 0 0 @1"/>
-                        <v:f eqn="prod @2 1 2"/>
-                        <v:f eqn="prod @3 21600 pixelWidth"/>
-                        <v:f eqn="prod @3 21600 pixelHeight"/>
-                        <v:f eqn="sum @0 0 1"/>
-                        <v:f eqn="prod @6 1 2"/>
-                        <v:f eqn="prod @7 21600 pixelWidth"/>
-                        <v:f eqn="sum @8 21600 0"/>
-                        <v:f eqn="prod @7 21600 pixelHeight"/>
-                        <v:f eqn="sum @10 21600 0"/>
-                      </v:formulas>
-                      <v:path o:extrusionok="f" gradientshapeok="t" o:connecttype="rect"/>
-                      <o:lock v:ext="edit" aspectratio="t"/>
-                    </v:shapetype>
-                    <v:shape id="shape_0" stroked="f" o:allowincell="f" style="position:absolute;margin-left:0pt;margin-top:-182.25pt;width:451.25pt;height:182.15pt;mso-wrap-style:none;v-text-anchor:middle;mso-position-vertical:top" wp14:anchorId="7484D26B" type="_x0000_t75">
-                      <v:imagedata r:id="rId17" o:detectmouseclick="t"/>
-                      <v:stroke color="#3465a4" joinstyle="round" endcap="flat"/>
-                      <w10:wrap type="square"/>
-                    </v:shape>
-                  </w:pict>
-                </mc:Fallback>
-              </mc:AlternateContent>
-            </w:r>
-          </w:p>
-        </w:tc>
-        <w:tc>
-          <w:tcPr>
-            <w:tcW w:w="493" w:type="dxa"/>
-            <w:tcBorders>
-              <w:top w:val="nil"/>
-              <w:left w:val="nil"/>
-              <w:bottom w:val="nil"/>
-              <w:right w:val="nil"/>
-            </w:tcBorders>
-          </w:tcPr>
-          <w:p>
-            <w:pPr>
-              <w:spacing w:after="0" w:line="240" w:lineRule="auto"/>
-              <w:rPr>
-                <w:rFonts w:ascii="Times New Roman" w:hAnsi="Times New Roman" w:cs="Times New Roman"/>
-                <w:lang w:val="id-ID"/>
-              </w:rPr>
-            </w:pPr>
-          </w:p>
-        </w:tc>
-      </w:tr>
-      <w:tr>
-        <w:tc>
-          <w:tcPr>
-            <w:tcW w:w="381" w:type="dxa"/>
-            <w:tcBorders>
-              <w:top w:val="nil"/>
-              <w:left w:val="nil"/>
-              <w:bottom w:val="nil"/>
-              <w:right w:val="nil"/>
-            </w:tcBorders>
-          </w:tcPr>
-          <w:p>
-            <w:pPr>
-              <w:spacing w:after="0" w:line="240" w:lineRule="auto"/>
-              <w:rPr>
-                <w:rFonts w:ascii="Times New Roman" w:hAnsi="Times New Roman" w:cs="Times New Roman"/>
-                <w:lang w:val="id-ID"/>
-              </w:rPr>
-            </w:pPr>
-          </w:p>
-        </w:tc>
-        <w:tc>
-          <w:tcPr>
-            <w:tcW w:w="9239" w:type="dxa"/>
-            <w:tcBorders>
-              <w:top w:val="nil"/>
-              <w:left w:val="nil"/>
-              <w:bottom w:val="nil"/>
-              <w:right w:val="nil"/>
-            </w:tcBorders>
-          </w:tcPr>
-          <w:p>
-            <w:pPr>
-              <w:pStyle w:val="ListParagraph"/>
-              <w:numPr>
-                <w:ilvl w:val="0"/>
-                <w:numId w:val="3"/>
-              </w:numPr>
-              <w:spacing w:after="0" w:line="240" w:lineRule="auto"/>
-              <w:rPr>
-                <w:rFonts w:ascii="Times New Roman" w:eastAsia="Calibri" w:hAnsi="Times New Roman" w:cs="Times New Roman"/>
-                <w:lang w:val="id-ID"/>
-              </w:rPr>
-            </w:pPr>
-            <m:oMath>
-              <m:r>
-                <w:rPr>
-                  <w:rFonts w:ascii="Cambria Math" w:hAnsi="Cambria Math"/>
-                  <w:lang w:val="id-ID"/>
-                </w:rPr>
-                <m:t>y</m:t>
-              </m:r>
-              <m:r>
-                <m:rPr>
-                  <m:lit/>
-                  <m:nor/>
-                </m:rPr>
-                <w:rPr>
-                  <w:lang w:val="id-ID"/>
-                </w:rPr>
-                <m:t>=</m:t>
-              </m:r>
-              <m:r>
-                <w:rPr>
-                  <w:rFonts w:ascii="Cambria Math" w:hAnsi="Cambria Math"/>
-                  <w:lang w:val="id-ID"/>
-                </w:rPr>
-                <m:t>tan⁡(θ</m:t>
-              </m:r>
-              <m:r>
-                <m:rPr>
-                  <m:lit/>
-                  <m:nor/>
-                </m:rPr>
-                <w:rPr>
-                  <w:lang w:val="id-ID"/>
-                </w:rPr>
-                <m:t>+</m:t>
-              </m:r>
-              <m:r>
-                <w:rPr>
-                  <w:rFonts w:ascii="Cambria Math" w:hAnsi="Cambria Math"/>
-                  <w:lang w:val="id-ID"/>
-                </w:rPr>
-                <m:t>180)</m:t>
-              </m:r>
-            </m:oMath>
-          </w:p>
-          <w:p>
-            <w:pPr>
-              <w:pStyle w:val="ListParagraph"/>
-              <w:spacing w:after="0" w:line="240" w:lineRule="auto"/>
-              <w:rPr>
-                <w:rFonts w:ascii="Times New Roman" w:eastAsia="Calibri" w:hAnsi="Times New Roman" w:cs="Times New Roman"/>
-                <w:lang w:val="id-ID"/>
-              </w:rPr>
-            </w:pPr>
-          </w:p>
-        </w:tc>
-        <w:tc>
-          <w:tcPr>
-            <w:tcW w:w="493" w:type="dxa"/>
-            <w:tcBorders>
-              <w:top w:val="nil"/>
-              <w:left w:val="nil"/>
-              <w:bottom w:val="nil"/>
-              <w:right w:val="nil"/>
-            </w:tcBorders>
-          </w:tcPr>
-          <w:p>
-            <w:pPr>
-              <w:spacing w:after="0" w:line="240" w:lineRule="auto"/>
-              <w:rPr>
-                <w:rFonts w:ascii="Times New Roman" w:hAnsi="Times New Roman" w:cs="Times New Roman"/>
-                <w:lang w:val="id-ID"/>
-              </w:rPr>
-            </w:pPr>
-            <w:r>
-              <w:rPr>
-                <w:rFonts w:ascii="Times New Roman" w:hAnsi="Times New Roman" w:cs="Times New Roman"/>
-                <w:b/>
-                <w:bCs/>
-                <w:lang w:val="id-ID"/>
-              </w:rPr>
-              <w:t>[4]</w:t>
-            </w:r>
-          </w:p>
-        </w:tc>
-      </w:tr>
-      <w:tr>
-        <w:tc>
-          <w:tcPr>
-            <w:tcW w:w="381" w:type="dxa"/>
-            <w:tcBorders>
-              <w:top w:val="nil"/>
-              <w:left w:val="nil"/>
-              <w:bottom w:val="nil"/>
-              <w:right w:val="nil"/>
-            </w:tcBorders>
-          </w:tcPr>
-          <w:p>
-            <w:pPr>
-              <w:spacing w:after="0" w:line="240" w:lineRule="auto"/>
-              <w:rPr>
-                <w:rFonts w:ascii="Times New Roman" w:hAnsi="Times New Roman" w:cs="Times New Roman"/>
-                <w:lang w:val="id-ID"/>
-              </w:rPr>
-            </w:pPr>
-          </w:p>
-        </w:tc>
-        <w:tc>
-          <w:tcPr>
-            <w:tcW w:w="9239" w:type="dxa"/>
-            <w:tcBorders>
-              <w:top w:val="nil"/>
-              <w:left w:val="nil"/>
-              <w:bottom w:val="nil"/>
-              <w:right w:val="nil"/>
-            </w:tcBorders>
-          </w:tcPr>
-          <w:p>
-            <w:pPr>
-              <w:spacing w:after="0" w:line="240" w:lineRule="auto"/>
-              <w:rPr>
-                <w:rFonts w:ascii="Times New Roman" w:eastAsia="Calibri" w:hAnsi="Times New Roman" w:cs="Times New Roman"/>
-                <w:lang w:val="id-ID"/>
-              </w:rPr>
-            </w:pPr>
-            <w:r>
-              <w:rPr>
-                <w:noProof/>
-                <w:lang w:val="id-ID"/>
-              </w:rPr>
-              <mc:AlternateContent>
-                <mc:Choice Requires="wps">
-                  <w:drawing>
-                    <wp:inline distT="0" distB="0" distL="0" distR="0" wp14:anchorId="7A48340C" wp14:editId="29431525">
-                      <wp:extent cx="5731510" cy="2313940"/>
-                      <wp:effectExtent l="0" t="0" r="2540" b="0"/>
-                      <wp:docPr id="13" name="Picture 1"/>
-                      <wp:cNvGraphicFramePr/>
-                      <a:graphic xmlns:a="http://schemas.openxmlformats.org/drawingml/2006/main">
-                        <a:graphicData uri="http://schemas.openxmlformats.org/drawingml/2006/picture">
-                          <pic:pic xmlns:pic="http://schemas.openxmlformats.org/drawingml/2006/picture">
-                            <pic:nvPicPr>
-                              <pic:cNvPr id="14" name="Picture 1"/>
-                              <pic:cNvPicPr/>
-                            </pic:nvPicPr>
-                            <pic:blipFill>
-                              <a:blip r:embed="rId17">
-                                <a:extLst>
-                                  <a:ext uri="{BEBA8EAE-BF5A-486C-A8C5-ECC9F3942E4B}">
-                                    <a14:imgProps xmlns:a14="http://schemas.microsoft.com/office/drawing/2010/main">
-                                      <a14:imgLayer r:embed="rId16">
-                                        <a14:imgEffect>
-                                          <a14:sharpenSoften amount="80000"/>
-                                        </a14:imgEffect>
-                                      </a14:imgLayer>
-                                    </a14:imgProps>
-                                  </a:ext>
-                                </a:extLst>
-                              </a:blip>
-                              <a:stretch/>
-                            </pic:blipFill>
-                            <pic:spPr>
-                              <a:xfrm>
-                                <a:off x="0" y="0"/>
-                                <a:ext cx="5731560" cy="2314080"/>
-                              </a:xfrm>
-                              <a:prstGeom prst="rect">
-                                <a:avLst/>
-                              </a:prstGeom>
-                              <a:noFill/>
-                              <a:ln w="0">
-                                <a:noFill/>
-                              </a:ln>
-                            </pic:spPr>
-                          </pic:pic>
-                        </a:graphicData>
-                      </a:graphic>
-                    </wp:inline>
-                  </w:drawing>
-                </mc:Choice>
-                <mc:Fallback xmlns:pic="http://schemas.openxmlformats.org/drawingml/2006/picture">
-                  <w:pict>
-                    <v:shape id="shape_0" stroked="f" o:allowincell="f" style="position:absolute;margin-left:0pt;margin-top:-182.25pt;width:451.25pt;height:182.15pt;mso-wrap-style:none;v-text-anchor:middle;mso-position-vertical:top" wp14:anchorId="7A48340C" type="_x0000_t75">
-                      <v:imagedata r:id="rId18" o:detectmouseclick="t"/>
-                      <v:stroke color="#3465a4" joinstyle="round" endcap="flat"/>
-                      <w10:wrap type="square"/>
-                    </v:shape>
-                  </w:pict>
-                </mc:Fallback>
-              </mc:AlternateContent>
-            </w:r>
-          </w:p>
-        </w:tc>
-        <w:tc>
-          <w:tcPr>
-            <w:tcW w:w="493" w:type="dxa"/>
-            <w:tcBorders>
-              <w:top w:val="nil"/>
-              <w:left w:val="nil"/>
-              <w:bottom w:val="nil"/>
-              <w:right w:val="nil"/>
-            </w:tcBorders>
-          </w:tcPr>
-          <w:p>
-            <w:pPr>
-              <w:spacing w:after="0" w:line="240" w:lineRule="auto"/>
-              <w:rPr>
-                <w:rFonts w:ascii="Times New Roman" w:hAnsi="Times New Roman" w:cs="Times New Roman"/>
-                <w:lang w:val="id-ID"/>
-              </w:rPr>
-            </w:pPr>
-          </w:p>
-        </w:tc>
-      </w:tr>
-      <w:tr>
-        <w:tc>
-          <w:tcPr>
-            <w:tcW w:w="381" w:type="dxa"/>
-            <w:tcBorders>
-              <w:top w:val="nil"/>
-              <w:left w:val="nil"/>
-              <w:bottom w:val="nil"/>
-              <w:right w:val="nil"/>
-            </w:tcBorders>
-          </w:tcPr>
-          <w:p>
-            <w:pPr>
-              <w:spacing w:after="0" w:line="240" w:lineRule="auto"/>
-              <w:rPr>
-                <w:rFonts w:ascii="Times New Roman" w:hAnsi="Times New Roman" w:cs="Times New Roman"/>
-                <w:lang w:val="id-ID"/>
-              </w:rPr>
-            </w:pPr>
-          </w:p>
-        </w:tc>
-        <w:tc>
-          <w:tcPr>
-            <w:tcW w:w="9239" w:type="dxa"/>
-            <w:tcBorders>
-              <w:top w:val="nil"/>
-              <w:left w:val="nil"/>
-              <w:bottom w:val="nil"/>
-              <w:right w:val="nil"/>
-            </w:tcBorders>
-          </w:tcPr>
-          <w:p>
-            <w:pPr>
-              <w:pStyle w:val="ListParagraph"/>
-              <w:numPr>
-                <w:ilvl w:val="0"/>
-                <w:numId w:val="3"/>
-              </w:numPr>
-              <w:spacing w:after="0" w:line="240" w:lineRule="auto"/>
-              <w:rPr>
-                <w:rFonts w:ascii="Times New Roman" w:eastAsia="Calibri" w:hAnsi="Times New Roman" w:cs="Times New Roman"/>
-                <w:lang w:val="id-ID"/>
-              </w:rPr>
-            </w:pPr>
-            <m:oMath>
-              <m:r>
-                <w:rPr>
-                  <w:rFonts w:ascii="Cambria Math" w:hAnsi="Cambria Math"/>
-                  <w:lang w:val="id-ID"/>
-                </w:rPr>
-                <m:t>y</m:t>
-              </m:r>
-              <m:r>
-                <m:rPr>
-                  <m:lit/>
-                  <m:nor/>
-                </m:rPr>
-                <w:rPr>
-                  <w:lang w:val="id-ID"/>
-                </w:rPr>
-                <m:t>=</m:t>
-              </m:r>
-              <m:r>
-                <w:rPr>
-                  <w:rFonts w:ascii="Cambria Math" w:hAnsi="Cambria Math"/>
-                  <w:lang w:val="id-ID"/>
-                </w:rPr>
-                <m:t>cos2θ</m:t>
-              </m:r>
-            </m:oMath>
-          </w:p>
-          <w:p>
-            <w:pPr>
-              <w:pStyle w:val="ListParagraph"/>
-              <w:spacing w:after="0" w:line="240" w:lineRule="auto"/>
-              <w:rPr>
-                <w:rFonts w:ascii="Times New Roman" w:eastAsia="Calibri" w:hAnsi="Times New Roman" w:cs="Times New Roman"/>
-                <w:lang w:val="id-ID"/>
-              </w:rPr>
-            </w:pPr>
-          </w:p>
-        </w:tc>
-        <w:tc>
-          <w:tcPr>
-            <w:tcW w:w="493" w:type="dxa"/>
-            <w:tcBorders>
-              <w:top w:val="nil"/>
-              <w:left w:val="nil"/>
-              <w:bottom w:val="nil"/>
-              <w:right w:val="nil"/>
-            </w:tcBorders>
-          </w:tcPr>
-          <w:p>
-            <w:pPr>
-              <w:spacing w:after="0" w:line="240" w:lineRule="auto"/>
-              <w:rPr>
-                <w:rFonts w:ascii="Times New Roman" w:hAnsi="Times New Roman" w:cs="Times New Roman"/>
-                <w:lang w:val="id-ID"/>
-              </w:rPr>
-            </w:pPr>
-            <w:r>
-              <w:rPr>
-                <w:rFonts w:ascii="Times New Roman" w:hAnsi="Times New Roman" w:cs="Times New Roman"/>
-                <w:b/>
-                <w:bCs/>
-                <w:lang w:val="id-ID"/>
-              </w:rPr>
-              <w:t>[4]</w:t>
-            </w:r>
-          </w:p>
-        </w:tc>
-      </w:tr>
-      <w:tr>
-        <w:tc>
-          <w:tcPr>
-            <w:tcW w:w="381" w:type="dxa"/>
-            <w:tcBorders>
-              <w:top w:val="nil"/>
-              <w:left w:val="nil"/>
-              <w:bottom w:val="nil"/>
-              <w:right w:val="nil"/>
-            </w:tcBorders>
-          </w:tcPr>
-          <w:p>
-            <w:pPr>
-              <w:spacing w:after="0" w:line="240" w:lineRule="auto"/>
-              <w:rPr>
-                <w:rFonts w:ascii="Times New Roman" w:hAnsi="Times New Roman" w:cs="Times New Roman"/>
-                <w:lang w:val="id-ID"/>
-              </w:rPr>
-            </w:pPr>
-          </w:p>
-        </w:tc>
-        <w:tc>
-          <w:tcPr>
-            <w:tcW w:w="9239" w:type="dxa"/>
-            <w:tcBorders>
-              <w:top w:val="nil"/>
-              <w:left w:val="nil"/>
-              <w:bottom w:val="nil"/>
-              <w:right w:val="nil"/>
-            </w:tcBorders>
-          </w:tcPr>
-          <w:p>
-            <w:pPr>
-              <w:spacing w:after="0" w:line="240" w:lineRule="auto"/>
-              <w:rPr>
-                <w:rFonts w:ascii="Times New Roman" w:eastAsia="Calibri" w:hAnsi="Times New Roman" w:cs="Times New Roman"/>
-                <w:lang w:val="id-ID"/>
-              </w:rPr>
-            </w:pPr>
-            <w:r>
-              <w:rPr>
-                <w:noProof/>
-                <w:lang w:val="id-ID"/>
-              </w:rPr>
-              <mc:AlternateContent>
-                <mc:Choice Requires="wps">
-                  <w:drawing>
-                    <wp:inline distT="0" distB="0" distL="0" distR="0" wp14:anchorId="3D66C6ED" wp14:editId="0D8EE2EB">
-                      <wp:extent cx="5731510" cy="2313940"/>
-                      <wp:effectExtent l="0" t="0" r="2540" b="0"/>
-                      <wp:docPr id="15" name="Picture 1"/>
-                      <wp:cNvGraphicFramePr/>
-                      <a:graphic xmlns:a="http://schemas.openxmlformats.org/drawingml/2006/main">
-                        <a:graphicData uri="http://schemas.openxmlformats.org/drawingml/2006/picture">
-                          <pic:pic xmlns:pic="http://schemas.openxmlformats.org/drawingml/2006/picture">
-                            <pic:nvPicPr>
-                              <pic:cNvPr id="16" name="Picture 1"/>
-                              <pic:cNvPicPr/>
-                            </pic:nvPicPr>
-                            <pic:blipFill>
-                              <a:blip r:embed="rId15">
-                                <a:extLst>
-                                  <a:ext uri="{BEBA8EAE-BF5A-486C-A8C5-ECC9F3942E4B}">
-                                    <a14:imgProps xmlns:a14="http://schemas.microsoft.com/office/drawing/2010/main">
-                                      <a14:imgLayer r:embed="rId16">
-                                        <a14:imgEffect>
-                                          <a14:sharpenSoften amount="80000"/>
-                                        </a14:imgEffect>
-                                      </a14:imgLayer>
-                                    </a14:imgProps>
-                                  </a:ext>
-                                </a:extLst>
-                              </a:blip>
-                              <a:stretch/>
-                            </pic:blipFill>
-                            <pic:spPr>
-                              <a:xfrm>
-                                <a:off x="0" y="0"/>
-                                <a:ext cx="5731560" cy="2314080"/>
-                              </a:xfrm>
-                              <a:prstGeom prst="rect">
-                                <a:avLst/>
-                              </a:prstGeom>
-                              <a:noFill/>
-                              <a:ln w="0">
-                                <a:noFill/>
-                              </a:ln>
-                            </pic:spPr>
-                          </pic:pic>
-                        </a:graphicData>
-                      </a:graphic>
-                    </wp:inline>
-                  </w:drawing>
-                </mc:Choice>
-                <mc:Fallback xmlns:pic="http://schemas.openxmlformats.org/drawingml/2006/picture">
-                  <w:pict>
-                    <v:shape id="shape_0" stroked="f" o:allowincell="f" style="position:absolute;margin-left:0pt;margin-top:-182.25pt;width:451.25pt;height:182.15pt;mso-wrap-style:none;v-text-anchor:middle;mso-position-vertical:top" wp14:anchorId="3D66C6ED" type="_x0000_t75">
-                      <v:imagedata r:id="rId19" o:detectmouseclick="t"/>
-                      <v:stroke color="#3465a4" joinstyle="round" endcap="flat"/>
-                      <w10:wrap type="square"/>
-                    </v:shape>
-                  </w:pict>
-                </mc:Fallback>
-              </mc:AlternateContent>
-            </w:r>
-          </w:p>
-        </w:tc>
-        <w:tc>
-          <w:tcPr>
-            <w:tcW w:w="493" w:type="dxa"/>
-            <w:tcBorders>
-              <w:top w:val="nil"/>
-              <w:left w:val="nil"/>
-              <w:bottom w:val="nil"/>
-              <w:right w:val="nil"/>
-            </w:tcBorders>
-          </w:tcPr>
-          <w:p>
-            <w:pPr>
-              <w:spacing w:after="0" w:line="240" w:lineRule="auto"/>
-              <w:rPr>
-                <w:rFonts w:ascii="Times New Roman" w:hAnsi="Times New Roman" w:cs="Times New Roman"/>
-                <w:lang w:val="id-ID"/>
-              </w:rPr>
-            </w:pPr>
-          </w:p>
-          <w:p>
-            <w:pPr>
-              <w:spacing w:after="0" w:line="240" w:lineRule="auto"/>
-              <w:rPr>
-                <w:rFonts w:ascii="Times New Roman" w:hAnsi="Times New Roman" w:cs="Times New Roman"/>
-                <w:lang w:val="id-ID"/>
-              </w:rPr>
-            </w:pPr>
-          </w:p>
-        </w:tc>
-      </w:tr>
-      <w:tr>
-        <w:tc>
-          <w:tcPr>
-            <w:tcW w:w="381" w:type="dxa"/>
-            <w:tcBorders>
-              <w:top w:val="nil"/>
-              <w:left w:val="nil"/>
-              <w:bottom w:val="nil"/>
-              <w:right w:val="nil"/>
-            </w:tcBorders>
-          </w:tcPr>
-          <w:p>
-            <w:pPr>
-              <w:spacing w:after="0" w:line="240" w:lineRule="auto"/>
-              <w:rPr>
-                <w:rFonts w:ascii="Times New Roman" w:hAnsi="Times New Roman" w:cs="Times New Roman"/>
-                <w:lang w:val="id-ID"/>
-              </w:rPr>
-            </w:pPr>
-          </w:p>
-          <w:p>
-            <w:pPr>
-              <w:spacing w:after="0" w:line="240" w:lineRule="auto"/>
-              <w:rPr>
-                <w:rFonts w:ascii="Times New Roman" w:hAnsi="Times New Roman" w:cs="Times New Roman"/>
-                <w:lang w:val="id-ID"/>
-              </w:rPr>
-            </w:pPr>
-          </w:p>
-          <w:p>
-            <w:pPr>
-              <w:spacing w:after="0" w:line="240" w:lineRule="auto"/>
-              <w:rPr>
-                <w:rFonts w:ascii="Times New Roman" w:hAnsi="Times New Roman" w:cs="Times New Roman"/>
-                <w:lang w:val="id-ID"/>
-              </w:rPr>
-            </w:pPr>
-            <w:r>
-              <w:rPr>
-                <w:rFonts w:ascii="Times New Roman" w:hAnsi="Times New Roman" w:cs="Times New Roman"/>
-                <w:lang w:val="id-ID"/>
-              </w:rPr>
-              <w:t xml:space="preserve">4. </w:t>
-            </w:r>
-          </w:p>
-        </w:tc>
-        <w:tc>
-          <w:tcPr>
-            <w:tcW w:w="9239" w:type="dxa"/>
-            <w:tcBorders>
-              <w:top w:val="nil"/>
-              <w:left w:val="nil"/>
-              <w:bottom w:val="nil"/>
-              <w:right w:val="nil"/>
-            </w:tcBorders>
-          </w:tcPr>
-          <w:p>
-            <w:pPr>
-              <w:spacing w:after="0" w:line="240" w:lineRule="auto"/>
-              <w:rPr>
-                <w:rFonts w:ascii="Times New Roman" w:eastAsia="Calibri" w:hAnsi="Times New Roman" w:cs="Times New Roman"/>
-                <w:lang w:val="id-ID"/>
-              </w:rPr>
-            </w:pPr>
-          </w:p>
-          <w:p>
-            <w:pPr>
-              <w:spacing w:after="0" w:line="240" w:lineRule="auto"/>
-              <w:rPr>
-                <w:rFonts w:ascii="Times New Roman" w:eastAsia="Calibri" w:hAnsi="Times New Roman" w:cs="Times New Roman"/>
-                <w:lang w:val="id-ID"/>
-              </w:rPr>
-            </w:pPr>
-          </w:p>
-          <w:p>
-            <w:pPr>
-              <w:spacing w:after="0" w:line="240" w:lineRule="auto"/>
-              <w:rPr>
-                <w:rFonts w:ascii="Times New Roman" w:eastAsia="Calibri" w:hAnsi="Times New Roman" w:cs="Times New Roman"/>
-                <w:lang w:val="id-ID"/>
-              </w:rPr>
-            </w:pPr>
-            <w:r>
-              <w:rPr>
-                <w:rFonts w:ascii="Times New Roman" w:eastAsia="Calibri" w:hAnsi="Times New Roman" w:cs="Times New Roman"/>
-                <w:lang w:val="id-ID"/>
-              </w:rPr>
-              <w:t>Express the following as trigonometric ratios and hence find their exact values</w:t>
-            </w:r>
-          </w:p>
-        </w:tc>
-        <w:tc>
-          <w:tcPr>
-            <w:tcW w:w="493" w:type="dxa"/>
-            <w:tcBorders>
-              <w:top w:val="nil"/>
-              <w:left w:val="nil"/>
-              <w:bottom w:val="nil"/>
-              <w:right w:val="nil"/>
-            </w:tcBorders>
-          </w:tcPr>
-          <w:p>
-            <w:pPr>
-              <w:spacing w:after="0" w:line="240" w:lineRule="auto"/>
-              <w:rPr>
-                <w:rFonts w:ascii="Times New Roman" w:hAnsi="Times New Roman" w:cs="Times New Roman"/>
-                <w:lang w:val="id-ID"/>
-              </w:rPr>
-            </w:pPr>
-          </w:p>
-        </w:tc>
-      </w:tr>
-      <w:tr>
-        <w:tc>
-          <w:tcPr>
-            <w:tcW w:w="381" w:type="dxa"/>
-            <w:tcBorders>
-              <w:top w:val="nil"/>
-              <w:left w:val="nil"/>
-              <w:bottom w:val="nil"/>
-              <w:right w:val="nil"/>
-            </w:tcBorders>
-          </w:tcPr>
-          <w:p>
-            <w:pPr>
-              <w:spacing w:after="0" w:line="240" w:lineRule="auto"/>
-              <w:rPr>
-                <w:rFonts w:ascii="Times New Roman" w:hAnsi="Times New Roman" w:cs="Times New Roman"/>
-                <w:lang w:val="id-ID"/>
-              </w:rPr>
-            </w:pPr>
-          </w:p>
-        </w:tc>
-        <w:tc>
-          <w:tcPr>
-            <w:tcW w:w="9239" w:type="dxa"/>
-            <w:tcBorders>
-              <w:top w:val="nil"/>
-              <w:left w:val="nil"/>
-              <w:bottom w:val="nil"/>
-              <w:right w:val="nil"/>
-            </w:tcBorders>
-          </w:tcPr>
-          <w:p>
-            <w:pPr>
-              <w:pStyle w:val="ListParagraph"/>
-              <w:numPr>
-                <w:ilvl w:val="0"/>
-                <w:numId w:val="4"/>
-              </w:numPr>
-              <w:spacing w:after="0" w:line="240" w:lineRule="auto"/>
-              <w:rPr>
-                <w:rFonts w:ascii="Times New Roman" w:eastAsia="Calibri" w:hAnsi="Times New Roman" w:cs="Times New Roman"/>
-                <w:lang w:val="id-ID"/>
-              </w:rPr>
-            </w:pPr>
-            <m:oMath>
-              <m:r>
-                <w:rPr>
-                  <w:rFonts w:ascii="Cambria Math" w:hAnsi="Cambria Math"/>
-                  <w:lang w:val="id-ID"/>
-                </w:rPr>
-                <m:t>cos</m:t>
-              </m:r>
-              <m:d>
-                <m:dPr>
-                  <m:ctrlPr>
-                    <w:rPr>
-                      <w:rFonts w:ascii="Cambria Math" w:hAnsi="Cambria Math"/>
-                      <w:lang w:val="id-ID"/>
-                    </w:rPr>
-                  </m:ctrlPr>
-                </m:dPr>
-                <m:e>
-                  <m:f>
-                    <m:fPr>
-                      <m:ctrlPr>
-                        <w:rPr>
-                          <w:rFonts w:ascii="Cambria Math" w:hAnsi="Cambria Math"/>
-                          <w:lang w:val="id-ID"/>
-                        </w:rPr>
-                      </m:ctrlPr>
-                    </m:fPr>
-                    <m:num>
-                      <m:r>
-                        <w:rPr>
-                          <w:rFonts w:ascii="Cambria Math" w:hAnsi="Cambria Math"/>
-                          <w:lang w:val="id-ID"/>
-                        </w:rPr>
-                        <m:t>5π</m:t>
-                      </m:r>
-                    </m:num>
-                    <m:den>
-                      <m:r>
-                        <w:rPr>
-                          <w:rFonts w:ascii="Cambria Math" w:hAnsi="Cambria Math"/>
-                          <w:lang w:val="id-ID"/>
-                        </w:rPr>
-                        <m:t>3</m:t>
-                      </m:r>
-                    </m:den>
-                  </m:f>
-                </m:e>
-              </m:d>
-            </m:oMath>
-            <w:r>
-              <w:rPr>
-                <w:rFonts w:ascii="Times New Roman" w:eastAsia="Calibri" w:hAnsi="Times New Roman" w:cs="Times New Roman"/>
-                <w:lang w:val="id-ID"/>
-              </w:rPr>
-              <w:t xml:space="preserve"> </w:t>
-            </w:r>
-          </w:p>
-        </w:tc>
-        <w:tc>
-          <w:tcPr>
-            <w:tcW w:w="493" w:type="dxa"/>
-            <w:tcBorders>
-              <w:top w:val="nil"/>
-              <w:left w:val="nil"/>
-              <w:bottom w:val="nil"/>
-              <w:right w:val="nil"/>
-            </w:tcBorders>
-          </w:tcPr>
-          <w:p>
-            <w:pPr>
-              <w:spacing w:after="0" w:line="240" w:lineRule="auto"/>
-              <w:rPr>
-                <w:rFonts w:ascii="Times New Roman" w:hAnsi="Times New Roman" w:cs="Times New Roman"/>
-                <w:lang w:val="id-ID"/>
-              </w:rPr>
-            </w:pPr>
-            <w:r>
-              <w:rPr>
-                <w:rFonts w:ascii="Times New Roman" w:hAnsi="Times New Roman" w:cs="Times New Roman"/>
-                <w:b/>
-                <w:bCs/>
-                <w:lang w:val="id-ID"/>
-              </w:rPr>
-              <w:t>[2]</w:t>
-            </w:r>
-          </w:p>
-        </w:tc>
-      </w:tr>
-      <w:tr>
-        <w:tc>
-          <w:tcPr>
-            <w:tcW w:w="381" w:type="dxa"/>
-            <w:tcBorders>
-              <w:top w:val="nil"/>
-              <w:left w:val="nil"/>
-              <w:bottom w:val="nil"/>
-              <w:right w:val="nil"/>
-            </w:tcBorders>
-          </w:tcPr>
-          <w:p>
-            <w:pPr>
-              <w:spacing w:after="0" w:line="240" w:lineRule="auto"/>
-              <w:rPr>
-                <w:rFonts w:ascii="Times New Roman" w:hAnsi="Times New Roman" w:cs="Times New Roman"/>
-                <w:lang w:val="id-ID"/>
-              </w:rPr>
-            </w:pPr>
-          </w:p>
-        </w:tc>
-        <w:tc>
-          <w:tcPr>
-            <w:tcW w:w="9239" w:type="dxa"/>
-            <w:tcBorders>
-              <w:top w:val="nil"/>
-              <w:left w:val="nil"/>
-              <w:bottom w:val="nil"/>
-              <w:right w:val="nil"/>
-            </w:tcBorders>
-          </w:tcPr>
-          <w:p>
-            <w:pPr>
-              <w:spacing w:after="0" w:line="240" w:lineRule="auto"/>
-              <w:rPr>
-                <w:rFonts w:ascii="Times New Roman" w:eastAsia="Calibri" w:hAnsi="Times New Roman" w:cs="Times New Roman"/>
-                <w:lang w:val="id-ID"/>
-              </w:rPr>
-            </w:pPr>
-          </w:p>
-          <w:p>
-            <w:pPr>
-              <w:spacing w:after="0" w:line="240" w:lineRule="auto"/>
-              <w:rPr>
-                <w:rFonts w:ascii="Times New Roman" w:eastAsia="Calibri" w:hAnsi="Times New Roman" w:cs="Times New Roman"/>
-                <w:lang w:val="id-ID"/>
-              </w:rPr>
-            </w:pPr>
-          </w:p>
-        </w:tc>
-        <w:tc>
-          <w:tcPr>
-            <w:tcW w:w="493" w:type="dxa"/>
-            <w:tcBorders>
-              <w:top w:val="nil"/>
-              <w:left w:val="nil"/>
-              <w:bottom w:val="nil"/>
-              <w:right w:val="nil"/>
-            </w:tcBorders>
-          </w:tcPr>
-          <w:p>
-            <w:pPr>
-              <w:spacing w:after="0" w:line="240" w:lineRule="auto"/>
-              <w:rPr>
-                <w:rFonts w:ascii="Times New Roman" w:hAnsi="Times New Roman" w:cs="Times New Roman"/>
-                <w:lang w:val="id-ID"/>
-              </w:rPr>
-            </w:pPr>
-          </w:p>
-        </w:tc>
-      </w:tr>
-      <w:tr>
-        <w:tc>
-          <w:tcPr>
-            <w:tcW w:w="381" w:type="dxa"/>
-            <w:tcBorders>
-              <w:top w:val="nil"/>
-              <w:left w:val="nil"/>
-              <w:bottom w:val="nil"/>
-              <w:right w:val="nil"/>
-            </w:tcBorders>
-          </w:tcPr>
-          <w:p>
-            <w:pPr>
-              <w:spacing w:after="0" w:line="240" w:lineRule="auto"/>
-              <w:rPr>
-                <w:rFonts w:ascii="Times New Roman" w:hAnsi="Times New Roman" w:cs="Times New Roman"/>
-                <w:lang w:val="id-ID"/>
-              </w:rPr>
-            </w:pPr>
-          </w:p>
-        </w:tc>
-        <w:tc>
-          <w:tcPr>
-            <w:tcW w:w="9239" w:type="dxa"/>
-            <w:tcBorders>
-              <w:top w:val="nil"/>
-              <w:left w:val="nil"/>
-              <w:bottom w:val="nil"/>
-              <w:right w:val="nil"/>
-            </w:tcBorders>
-          </w:tcPr>
-          <w:p>
-            <w:pPr>
-              <w:pStyle w:val="ListParagraph"/>
-              <w:numPr>
-                <w:ilvl w:val="0"/>
-                <w:numId w:val="4"/>
-              </w:numPr>
-              <w:spacing w:after="0" w:line="240" w:lineRule="auto"/>
-              <w:rPr>
-                <w:rFonts w:ascii="Times New Roman" w:eastAsia="Calibri" w:hAnsi="Times New Roman" w:cs="Times New Roman"/>
-                <w:lang w:val="id-ID"/>
-              </w:rPr>
-            </w:pPr>
-            <m:oMath>
-              <m:r>
-                <w:rPr>
-                  <w:rFonts w:ascii="Cambria Math" w:hAnsi="Cambria Math"/>
-                  <w:lang w:val="id-ID"/>
-                </w:rPr>
-                <m:t>sin</m:t>
-              </m:r>
-              <m:d>
-                <m:dPr>
-                  <m:ctrlPr>
-                    <w:rPr>
-                      <w:rFonts w:ascii="Cambria Math" w:hAnsi="Cambria Math"/>
-                      <w:lang w:val="id-ID"/>
-                    </w:rPr>
-                  </m:ctrlPr>
-                </m:dPr>
-                <m:e>
-                  <m:r>
-                    <m:rPr>
-                      <m:lit/>
-                      <m:nor/>
-                    </m:rPr>
-                    <w:rPr>
-                      <w:lang w:val="id-ID"/>
-                    </w:rPr>
-                    <m:t>-</m:t>
-                  </m:r>
-                  <m:r>
-                    <w:rPr>
-                      <w:rFonts w:ascii="Cambria Math" w:hAnsi="Cambria Math"/>
-                      <w:lang w:val="id-ID"/>
-                    </w:rPr>
-                    <m:t>300</m:t>
-                  </m:r>
-                </m:e>
-              </m:d>
-            </m:oMath>
-          </w:p>
-        </w:tc>
-        <w:tc>
-          <w:tcPr>
-            <w:tcW w:w="493" w:type="dxa"/>
-            <w:tcBorders>
-              <w:top w:val="nil"/>
-              <w:left w:val="nil"/>
-              <w:bottom w:val="nil"/>
-              <w:right w:val="nil"/>
-            </w:tcBorders>
-          </w:tcPr>
-          <w:p>
-            <w:pPr>
-              <w:spacing w:after="0" w:line="240" w:lineRule="auto"/>
-              <w:rPr>
-                <w:rFonts w:ascii="Times New Roman" w:hAnsi="Times New Roman" w:cs="Times New Roman"/>
-                <w:lang w:val="id-ID"/>
-              </w:rPr>
-            </w:pPr>
-            <w:r>
-              <w:rPr>
-                <w:rFonts w:ascii="Times New Roman" w:hAnsi="Times New Roman" w:cs="Times New Roman"/>
-                <w:b/>
-                <w:bCs/>
-                <w:lang w:val="id-ID"/>
-              </w:rPr>
-              <w:t>[2]</w:t>
-            </w:r>
-          </w:p>
-        </w:tc>
-      </w:tr>
-      <w:tr>
-        <w:tc>
-          <w:tcPr>
-            <w:tcW w:w="381" w:type="dxa"/>
-            <w:tcBorders>
-              <w:top w:val="nil"/>
-              <w:left w:val="nil"/>
-              <w:bottom w:val="nil"/>
-              <w:right w:val="nil"/>
-            </w:tcBorders>
-          </w:tcPr>
-          <w:p>
-            <w:pPr>
-              <w:spacing w:after="0" w:line="240" w:lineRule="auto"/>
-              <w:rPr>
-                <w:rFonts w:ascii="Times New Roman" w:hAnsi="Times New Roman" w:cs="Times New Roman"/>
-                <w:lang w:val="id-ID"/>
-              </w:rPr>
-            </w:pPr>
-          </w:p>
-        </w:tc>
-        <w:tc>
-          <w:tcPr>
-            <w:tcW w:w="9239" w:type="dxa"/>
-            <w:tcBorders>
-              <w:top w:val="nil"/>
-              <w:left w:val="nil"/>
-              <w:bottom w:val="nil"/>
-              <w:right w:val="nil"/>
-            </w:tcBorders>
-          </w:tcPr>
-          <w:p>
-            <w:pPr>
-              <w:spacing w:after="0" w:line="240" w:lineRule="auto"/>
-              <w:rPr>
-                <w:rFonts w:ascii="Times New Roman" w:eastAsia="Calibri" w:hAnsi="Times New Roman" w:cs="Times New Roman"/>
-                <w:lang w:val="id-ID"/>
-              </w:rPr>
-            </w:pPr>
-          </w:p>
-          <w:p>
-            <w:pPr>
-              <w:spacing w:after="0" w:line="240" w:lineRule="auto"/>
-              <w:rPr>
-                <w:rFonts w:ascii="Times New Roman" w:eastAsia="Calibri" w:hAnsi="Times New Roman" w:cs="Times New Roman"/>
-                <w:lang w:val="id-ID"/>
-              </w:rPr>
-            </w:pPr>
-          </w:p>
-        </w:tc>
-        <w:tc>
-          <w:tcPr>
-            <w:tcW w:w="493" w:type="dxa"/>
-            <w:tcBorders>
-              <w:top w:val="nil"/>
-              <w:left w:val="nil"/>
-              <w:bottom w:val="nil"/>
-              <w:right w:val="nil"/>
-            </w:tcBorders>
-          </w:tcPr>
-          <w:p>
-            <w:pPr>
-              <w:spacing w:after="0" w:line="240" w:lineRule="auto"/>
-              <w:rPr>
-                <w:rFonts w:ascii="Times New Roman" w:hAnsi="Times New Roman" w:cs="Times New Roman"/>
-                <w:lang w:val="id-ID"/>
-              </w:rPr>
-            </w:pPr>
-          </w:p>
-        </w:tc>
-      </w:tr>
-      <w:tr>
-        <w:tc>
-          <w:tcPr>
-            <w:tcW w:w="381" w:type="dxa"/>
-            <w:tcBorders>
-              <w:top w:val="nil"/>
-              <w:left w:val="nil"/>
-              <w:bottom w:val="nil"/>
-              <w:right w:val="nil"/>
-            </w:tcBorders>
-          </w:tcPr>
-          <w:p>
-            <w:pPr>
-              <w:spacing w:after="0" w:line="240" w:lineRule="auto"/>
-              <w:rPr>
-                <w:rFonts w:ascii="Times New Roman" w:hAnsi="Times New Roman" w:cs="Times New Roman"/>
-                <w:lang w:val="id-ID"/>
-              </w:rPr>
-            </w:pPr>
-          </w:p>
-        </w:tc>
-        <w:tc>
-          <w:tcPr>
-            <w:tcW w:w="9239" w:type="dxa"/>
-            <w:tcBorders>
-              <w:top w:val="nil"/>
-              <w:left w:val="nil"/>
-              <w:bottom w:val="nil"/>
-              <w:right w:val="nil"/>
-            </w:tcBorders>
-          </w:tcPr>
-          <w:p>
-            <w:pPr>
-              <w:pStyle w:val="ListParagraph"/>
-              <w:numPr>
-                <w:ilvl w:val="0"/>
-                <w:numId w:val="4"/>
-              </w:numPr>
-              <w:spacing w:after="0" w:line="240" w:lineRule="auto"/>
-              <w:rPr>
-                <w:rFonts w:ascii="Times New Roman" w:eastAsia="Calibri" w:hAnsi="Times New Roman" w:cs="Times New Roman"/>
-                <w:lang w:val="id-ID"/>
-              </w:rPr>
-            </w:pPr>
-            <m:oMath>
-              <m:r>
-                <w:rPr>
-                  <w:rFonts w:ascii="Cambria Math" w:hAnsi="Cambria Math"/>
-                  <w:lang w:val="id-ID"/>
-                </w:rPr>
-                <m:t>tan</m:t>
-              </m:r>
-              <m:d>
-                <m:dPr>
-                  <m:ctrlPr>
-                    <w:rPr>
-                      <w:rFonts w:ascii="Cambria Math" w:hAnsi="Cambria Math"/>
-                      <w:lang w:val="id-ID"/>
-                    </w:rPr>
-                  </m:ctrlPr>
-                </m:dPr>
-                <m:e>
-                  <m:r>
-                    <m:rPr>
-                      <m:lit/>
-                      <m:nor/>
-                    </m:rPr>
-                    <w:rPr>
-                      <w:lang w:val="id-ID"/>
-                    </w:rPr>
-                    <m:t>-</m:t>
-                  </m:r>
-                  <m:f>
-                    <m:fPr>
-                      <m:ctrlPr>
-                        <w:rPr>
-                          <w:rFonts w:ascii="Cambria Math" w:hAnsi="Cambria Math"/>
-                          <w:lang w:val="id-ID"/>
-                        </w:rPr>
-                      </m:ctrlPr>
-                    </m:fPr>
-                    <m:num>
-                      <m:r>
-                        <w:rPr>
-                          <w:rFonts w:ascii="Cambria Math" w:hAnsi="Cambria Math"/>
-                          <w:lang w:val="id-ID"/>
-                        </w:rPr>
-                        <m:t>2π</m:t>
-                      </m:r>
-                    </m:num>
-                    <m:den>
-                      <m:r>
-                        <w:rPr>
-                          <w:rFonts w:ascii="Cambria Math" w:hAnsi="Cambria Math"/>
-                          <w:lang w:val="id-ID"/>
-                        </w:rPr>
-                        <m:t>3</m:t>
-                      </m:r>
-                    </m:den>
-                  </m:f>
-                </m:e>
-              </m:d>
-            </m:oMath>
-          </w:p>
-        </w:tc>
-        <w:tc>
-          <w:tcPr>
-            <w:tcW w:w="493" w:type="dxa"/>
-            <w:tcBorders>
-              <w:top w:val="nil"/>
-              <w:left w:val="nil"/>
-              <w:bottom w:val="nil"/>
-              <w:right w:val="nil"/>
-            </w:tcBorders>
-          </w:tcPr>
-          <w:p>
-            <w:pPr>
-              <w:spacing w:after="0" w:line="240" w:lineRule="auto"/>
-              <w:rPr>
-                <w:rFonts w:ascii="Times New Roman" w:hAnsi="Times New Roman" w:cs="Times New Roman"/>
-                <w:lang w:val="id-ID"/>
-              </w:rPr>
-            </w:pPr>
-            <w:r>
-              <w:rPr>
-                <w:rFonts w:ascii="Times New Roman" w:hAnsi="Times New Roman" w:cs="Times New Roman"/>
-                <w:b/>
-                <w:bCs/>
-                <w:lang w:val="id-ID"/>
-              </w:rPr>
-              <w:t>[2]</w:t>
-            </w:r>
-          </w:p>
-        </w:tc>
-      </w:tr>
-      <w:tr>
-        <w:tc>
-          <w:tcPr>
-            <w:tcW w:w="381" w:type="dxa"/>
-            <w:tcBorders>
-              <w:top w:val="nil"/>
-              <w:left w:val="nil"/>
-              <w:bottom w:val="nil"/>
-              <w:right w:val="nil"/>
-            </w:tcBorders>
-          </w:tcPr>
-          <w:p>
-            <w:pPr>
-              <w:spacing w:after="0" w:line="240" w:lineRule="auto"/>
-              <w:rPr>
-                <w:rFonts w:ascii="Times New Roman" w:hAnsi="Times New Roman" w:cs="Times New Roman"/>
-                <w:lang w:val="id-ID"/>
-              </w:rPr>
-            </w:pPr>
-          </w:p>
-        </w:tc>
-        <w:tc>
-          <w:tcPr>
-            <w:tcW w:w="9239" w:type="dxa"/>
-            <w:tcBorders>
-              <w:top w:val="nil"/>
-              <w:left w:val="nil"/>
-              <w:bottom w:val="nil"/>
-              <w:right w:val="nil"/>
-            </w:tcBorders>
-          </w:tcPr>
-          <w:p>
-            <w:pPr>
-              <w:spacing w:after="0" w:line="240" w:lineRule="auto"/>
-              <w:rPr>
-                <w:rFonts w:ascii="Times New Roman" w:eastAsia="Calibri" w:hAnsi="Times New Roman" w:cs="Times New Roman"/>
-                <w:lang w:val="id-ID"/>
-              </w:rPr>
-            </w:pPr>
-          </w:p>
-          <w:p>
-            <w:pPr>
-              <w:spacing w:after="0" w:line="240" w:lineRule="auto"/>
-              <w:rPr>
-                <w:rFonts w:ascii="Times New Roman" w:eastAsia="Calibri" w:hAnsi="Times New Roman" w:cs="Times New Roman"/>
-                <w:lang w:val="id-ID"/>
-              </w:rPr>
-            </w:pPr>
-          </w:p>
-        </w:tc>
-        <w:tc>
-          <w:tcPr>
-            <w:tcW w:w="493" w:type="dxa"/>
-            <w:tcBorders>
-              <w:top w:val="nil"/>
-              <w:left w:val="nil"/>
-              <w:bottom w:val="nil"/>
-              <w:right w:val="nil"/>
-            </w:tcBorders>
-          </w:tcPr>
-          <w:p>
-            <w:pPr>
-              <w:spacing w:after="0" w:line="240" w:lineRule="auto"/>
-              <w:rPr>
-                <w:rFonts w:ascii="Times New Roman" w:hAnsi="Times New Roman" w:cs="Times New Roman"/>
-                <w:lang w:val="id-ID"/>
-              </w:rPr>
-            </w:pPr>
-          </w:p>
-        </w:tc>
-      </w:tr>
-      <w:tr>
-        <w:tc>
-          <w:tcPr>
-            <w:tcW w:w="381" w:type="dxa"/>
-            <w:tcBorders>
-              <w:top w:val="nil"/>
-              <w:left w:val="nil"/>
-              <w:bottom w:val="nil"/>
-              <w:right w:val="nil"/>
-            </w:tcBorders>
-          </w:tcPr>
-          <w:p>
-            <w:pPr>
-              <w:spacing w:after="0" w:line="240" w:lineRule="auto"/>
-              <w:rPr>
-                <w:rFonts w:ascii="Times New Roman" w:hAnsi="Times New Roman" w:cs="Times New Roman"/>
-                <w:lang w:val="id-ID"/>
-              </w:rPr>
-            </w:pPr>
-            <w:r>
-              <w:rPr>
-                <w:rFonts w:ascii="Times New Roman" w:hAnsi="Times New Roman" w:cs="Times New Roman"/>
-                <w:lang w:val="id-ID"/>
-              </w:rPr>
-              <w:t>5.</w:t>
-            </w:r>
-          </w:p>
-        </w:tc>
-        <w:tc>
-          <w:tcPr>
-            <w:tcW w:w="9239" w:type="dxa"/>
-            <w:tcBorders>
-              <w:top w:val="nil"/>
-              <w:left w:val="nil"/>
-              <w:bottom w:val="nil"/>
-              <w:right w:val="nil"/>
-            </w:tcBorders>
-          </w:tcPr>
-          <w:p>
-            <w:pPr>
-              <w:spacing w:after="0" w:line="240" w:lineRule="auto"/>
-              <w:rPr>
-                <w:rFonts w:ascii="Times New Roman" w:eastAsia="Calibri" w:hAnsi="Times New Roman" w:cs="Times New Roman"/>
-                <w:lang w:val="id-ID"/>
-              </w:rPr>
-            </w:pPr>
-            <w:r>
-              <w:rPr>
-                <w:rFonts w:ascii="Times New Roman" w:eastAsia="Calibri" w:hAnsi="Times New Roman" w:cs="Times New Roman"/>
-                <w:lang w:val="id-ID"/>
-              </w:rPr>
-              <w:t xml:space="preserve">Using the identities </w:t>
-            </w:r>
-            <m:oMath>
-              <m:sSup>
-                <m:sSupPr>
-                  <m:ctrlPr>
-                    <w:rPr>
-                      <w:rFonts w:ascii="Cambria Math" w:hAnsi="Cambria Math"/>
-                      <w:lang w:val="id-ID"/>
-                    </w:rPr>
-                  </m:ctrlPr>
-                </m:sSupPr>
-                <m:e>
-                  <m:r>
-                    <w:rPr>
-                      <w:rFonts w:ascii="Cambria Math" w:hAnsi="Cambria Math"/>
-                      <w:lang w:val="id-ID"/>
-                    </w:rPr>
-                    <m:t>sin</m:t>
-                  </m:r>
-                </m:e>
-                <m:sup>
-                  <m:r>
-                    <w:rPr>
-                      <w:rFonts w:ascii="Cambria Math" w:hAnsi="Cambria Math"/>
-                      <w:lang w:val="id-ID"/>
-                    </w:rPr>
-                    <m:t>2</m:t>
-                  </m:r>
-                </m:sup>
-              </m:sSup>
-              <m:r>
-                <w:rPr>
-                  <w:rFonts w:ascii="Cambria Math" w:hAnsi="Cambria Math"/>
-                  <w:lang w:val="id-ID"/>
-                </w:rPr>
-                <m:t>θ</m:t>
-              </m:r>
-              <m:r>
-                <m:rPr>
-                  <m:lit/>
-                  <m:nor/>
-                </m:rPr>
-                <w:rPr>
-                  <w:lang w:val="id-ID"/>
-                </w:rPr>
-                <m:t>+</m:t>
-              </m:r>
-              <m:sSup>
-                <m:sSupPr>
-                  <m:ctrlPr>
-                    <w:rPr>
-                      <w:rFonts w:ascii="Cambria Math" w:hAnsi="Cambria Math"/>
-                      <w:lang w:val="id-ID"/>
-                    </w:rPr>
-                  </m:ctrlPr>
-                </m:sSupPr>
-                <m:e>
-                  <m:r>
-                    <w:rPr>
-                      <w:rFonts w:ascii="Cambria Math" w:hAnsi="Cambria Math"/>
-                      <w:lang w:val="id-ID"/>
-                    </w:rPr>
-                    <m:t>cos</m:t>
-                  </m:r>
-                </m:e>
-                <m:sup>
-                  <m:r>
-                    <w:rPr>
-                      <w:rFonts w:ascii="Cambria Math" w:hAnsi="Cambria Math"/>
-                      <w:lang w:val="id-ID"/>
-                    </w:rPr>
-                    <m:t>2</m:t>
-                  </m:r>
-                </m:sup>
-              </m:sSup>
-              <m:r>
-                <w:rPr>
-                  <w:rFonts w:ascii="Cambria Math" w:hAnsi="Cambria Math"/>
-                  <w:lang w:val="id-ID"/>
-                </w:rPr>
-                <m:t>θ</m:t>
-              </m:r>
-              <m:r>
-                <m:rPr>
-                  <m:lit/>
-                  <m:nor/>
-                </m:rPr>
-                <w:rPr>
-                  <w:lang w:val="id-ID"/>
-                </w:rPr>
-                <m:t>=</m:t>
-              </m:r>
-              <m:r>
-                <w:rPr>
-                  <w:rFonts w:ascii="Cambria Math" w:hAnsi="Cambria Math"/>
-                  <w:lang w:val="id-ID"/>
-                </w:rPr>
-                <m:t>1</m:t>
-              </m:r>
-            </m:oMath>
-            <w:r>
-              <w:rPr>
-                <w:rFonts w:ascii="Times New Roman" w:eastAsia="Calibri" w:hAnsi="Times New Roman" w:cs="Times New Roman"/>
-                <w:lang w:val="id-ID"/>
-              </w:rPr>
-              <w:t xml:space="preserve"> and/or </w:t>
-            </w:r>
-            <m:oMath>
-              <m:r>
-                <w:rPr>
-                  <w:rFonts w:ascii="Cambria Math" w:hAnsi="Cambria Math"/>
-                  <w:lang w:val="id-ID"/>
-                </w:rPr>
-                <m:t>tanθ</m:t>
-              </m:r>
-              <m:r>
-                <m:rPr>
-                  <m:lit/>
-                  <m:nor/>
-                </m:rPr>
-                <w:rPr>
-                  <w:lang w:val="id-ID"/>
-                </w:rPr>
-                <m:t>=</m:t>
-              </m:r>
-              <m:f>
-                <m:fPr>
-                  <m:ctrlPr>
-                    <w:rPr>
-                      <w:rFonts w:ascii="Cambria Math" w:hAnsi="Cambria Math"/>
-                      <w:lang w:val="id-ID"/>
-                    </w:rPr>
-                  </m:ctrlPr>
-                </m:fPr>
-                <m:num>
-                  <m:r>
-                    <w:rPr>
-                      <w:rFonts w:ascii="Cambria Math" w:hAnsi="Cambria Math"/>
-                      <w:lang w:val="id-ID"/>
-                    </w:rPr>
-                    <m:t>sinθ</m:t>
-                  </m:r>
-                </m:num>
-                <m:den>
-                  <m:r>
-                    <w:rPr>
-                      <w:rFonts w:ascii="Cambria Math" w:hAnsi="Cambria Math"/>
-                      <w:lang w:val="id-ID"/>
-                    </w:rPr>
-                    <m:t>cosθ</m:t>
-                  </m:r>
-                </m:den>
-              </m:f>
-            </m:oMath>
-            <w:r>
-              <w:rPr>
-                <w:rFonts w:ascii="Times New Roman" w:eastAsia="Calibri" w:hAnsi="Times New Roman" w:cs="Times New Roman"/>
-                <w:lang w:val="id-ID"/>
-              </w:rPr>
-              <w:t xml:space="preserve">, prove that </w:t>
-            </w:r>
-            <m:oMath>
-              <m:sSup>
-                <m:sSupPr>
-                  <m:ctrlPr>
-                    <w:rPr>
-                      <w:rFonts w:ascii="Cambria Math" w:hAnsi="Cambria Math"/>
-                      <w:lang w:val="id-ID"/>
-                    </w:rPr>
-                  </m:ctrlPr>
-                </m:sSupPr>
-                <m:e>
-                  <m:d>
-                    <m:dPr>
-                      <m:ctrlPr>
-                        <w:rPr>
-                          <w:rFonts w:ascii="Cambria Math" w:hAnsi="Cambria Math"/>
-                          <w:lang w:val="id-ID"/>
-                        </w:rPr>
-                      </m:ctrlPr>
-                    </m:dPr>
-                    <m:e>
-                      <m:r>
-                        <w:rPr>
-                          <w:rFonts w:ascii="Cambria Math" w:hAnsi="Cambria Math"/>
-                          <w:lang w:val="id-ID"/>
-                        </w:rPr>
-                        <m:t>2</m:t>
-                      </m:r>
-                      <m:r>
-                        <m:rPr>
-                          <m:lit/>
-                          <m:nor/>
-                        </m:rPr>
-                        <w:rPr>
-                          <w:lang w:val="id-ID"/>
-                        </w:rPr>
-                        <m:t xml:space="preserve"> </m:t>
-                      </m:r>
-                      <m:r>
-                        <w:rPr>
-                          <w:rFonts w:ascii="Cambria Math" w:hAnsi="Cambria Math"/>
-                          <w:lang w:val="id-ID"/>
-                        </w:rPr>
-                        <m:t>sinθ</m:t>
-                      </m:r>
-                      <m:r>
-                        <m:rPr>
-                          <m:lit/>
-                          <m:nor/>
-                        </m:rPr>
-                        <w:rPr>
-                          <w:lang w:val="id-ID"/>
-                        </w:rPr>
-                        <m:t>-</m:t>
-                      </m:r>
-                      <m:r>
-                        <w:rPr>
-                          <w:rFonts w:ascii="Cambria Math" w:hAnsi="Cambria Math"/>
-                          <w:lang w:val="id-ID"/>
-                        </w:rPr>
-                        <m:t>cosθ</m:t>
-                      </m:r>
-                    </m:e>
-                  </m:d>
-                </m:e>
-                <m:sup>
-                  <m:r>
-                    <w:rPr>
-                      <w:rFonts w:ascii="Cambria Math" w:hAnsi="Cambria Math"/>
-                      <w:lang w:val="id-ID"/>
-                    </w:rPr>
-                    <m:t>2</m:t>
-                  </m:r>
-                </m:sup>
-              </m:sSup>
-              <m:r>
-                <m:rPr>
-                  <m:lit/>
-                  <m:nor/>
-                </m:rPr>
-                <w:rPr>
-                  <w:lang w:val="id-ID"/>
-                </w:rPr>
-                <m:t>+</m:t>
-              </m:r>
-              <m:sSup>
-                <m:sSupPr>
-                  <m:ctrlPr>
-                    <w:rPr>
-                      <w:rFonts w:ascii="Cambria Math" w:hAnsi="Cambria Math"/>
-                      <w:lang w:val="id-ID"/>
-                    </w:rPr>
-                  </m:ctrlPr>
-                </m:sSupPr>
-                <m:e>
-                  <m:d>
-                    <m:dPr>
-                      <m:ctrlPr>
-                        <w:rPr>
-                          <w:rFonts w:ascii="Cambria Math" w:hAnsi="Cambria Math"/>
-                          <w:lang w:val="id-ID"/>
-                        </w:rPr>
-                      </m:ctrlPr>
-                    </m:dPr>
-                    <m:e>
-                      <m:r>
-                        <w:rPr>
-                          <w:rFonts w:ascii="Cambria Math" w:hAnsi="Cambria Math"/>
-                          <w:lang w:val="id-ID"/>
-                        </w:rPr>
-                        <m:t>sinθ</m:t>
-                      </m:r>
-                      <m:r>
-                        <m:rPr>
-                          <m:lit/>
-                          <m:nor/>
-                        </m:rPr>
-                        <w:rPr>
-                          <w:lang w:val="id-ID"/>
-                        </w:rPr>
-                        <m:t>+</m:t>
-                      </m:r>
-                      <m:r>
-                        <w:rPr>
-                          <w:rFonts w:ascii="Cambria Math" w:hAnsi="Cambria Math"/>
-                          <w:lang w:val="id-ID"/>
-                        </w:rPr>
-                        <m:t>2cosθ</m:t>
-                      </m:r>
-                      <m:r>
-                        <m:rPr>
-                          <m:lit/>
-                          <m:nor/>
-                        </m:rPr>
-                        <w:rPr>
-                          <w:lang w:val="id-ID"/>
-                        </w:rPr>
-                        <m:t xml:space="preserve"> </m:t>
-                      </m:r>
-                    </m:e>
-                  </m:d>
-                </m:e>
-                <m:sup>
-                  <m:r>
-                    <w:rPr>
-                      <w:rFonts w:ascii="Cambria Math" w:hAnsi="Cambria Math"/>
-                      <w:lang w:val="id-ID"/>
-                    </w:rPr>
-                    <m:t>2</m:t>
-                  </m:r>
-                </m:sup>
-              </m:sSup>
-              <m:r>
-                <m:rPr>
-                  <m:lit/>
-                  <m:nor/>
-                </m:rPr>
-                <w:rPr>
-                  <w:lang w:val="id-ID"/>
-                </w:rPr>
-                <m:t>=</m:t>
-              </m:r>
-              <m:r>
-                <w:rPr>
-                  <w:rFonts w:ascii="Cambria Math" w:hAnsi="Cambria Math"/>
-                  <w:lang w:val="id-ID"/>
-                </w:rPr>
-                <m:t>5</m:t>
-              </m:r>
-              <m:r>
-                <m:rPr>
-                  <m:lit/>
-                  <m:nor/>
-                </m:rPr>
-                <w:rPr>
-                  <w:lang w:val="id-ID"/>
-                </w:rPr>
-                <m:t xml:space="preserve"> </m:t>
-              </m:r>
-            </m:oMath>
-            <w:r>
-              <w:rPr>
-                <w:rFonts w:ascii="Times New Roman" w:eastAsia="Calibri" w:hAnsi="Times New Roman" w:cs="Times New Roman"/>
-                <w:lang w:val="id-ID"/>
-              </w:rPr>
-              <w:t xml:space="preserve"> </w:t>
-            </w:r>
-          </w:p>
-        </w:tc>
-        <w:tc>
-          <w:tcPr>
-            <w:tcW w:w="493" w:type="dxa"/>
-            <w:tcBorders>
-              <w:top w:val="nil"/>
-              <w:left w:val="nil"/>
-              <w:bottom w:val="nil"/>
-              <w:right w:val="nil"/>
-            </w:tcBorders>
-          </w:tcPr>
-          <w:p>
-            <w:pPr>
-              <w:spacing w:after="0" w:line="240" w:lineRule="auto"/>
-              <w:rPr>
-                <w:rFonts w:ascii="Times New Roman" w:hAnsi="Times New Roman" w:cs="Times New Roman"/>
-                <w:b/>
-                <w:bCs/>
-                <w:lang w:val="id-ID"/>
-              </w:rPr>
-            </w:pPr>
-            <w:r>
-              <w:rPr>
-                <w:rFonts w:ascii="Times New Roman" w:hAnsi="Times New Roman" w:cs="Times New Roman"/>
-                <w:b/>
-                <w:bCs/>
-                <w:lang w:val="id-ID"/>
-              </w:rPr>
-              <w:t>[4]</w:t>
-            </w:r>
-          </w:p>
-        </w:tc>
-      </w:tr>
-      <w:tr>
-        <w:tc>
-          <w:tcPr>
-            <w:tcW w:w="381" w:type="dxa"/>
-            <w:tcBorders>
-              <w:top w:val="nil"/>
-              <w:left w:val="nil"/>
-              <w:bottom w:val="nil"/>
-              <w:right w:val="nil"/>
-            </w:tcBorders>
-          </w:tcPr>
-          <w:p>
-            <w:pPr>
-              <w:spacing w:after="0" w:line="240" w:lineRule="auto"/>
-              <w:rPr>
-                <w:rFonts w:ascii="Times New Roman" w:hAnsi="Times New Roman" w:cs="Times New Roman"/>
-                <w:lang w:val="id-ID"/>
-              </w:rPr>
-            </w:pPr>
-          </w:p>
-        </w:tc>
-        <w:tc>
-          <w:tcPr>
-            <w:tcW w:w="9239" w:type="dxa"/>
-            <w:tcBorders>
-              <w:top w:val="nil"/>
-              <w:left w:val="nil"/>
-              <w:bottom w:val="nil"/>
-              <w:right w:val="nil"/>
-            </w:tcBorders>
-          </w:tcPr>
-          <w:p>
-            <w:pPr>
-              <w:spacing w:after="0" w:line="240" w:lineRule="auto"/>
-              <w:rPr>
-                <w:rFonts w:ascii="Times New Roman" w:eastAsia="Calibri" w:hAnsi="Times New Roman" w:cs="Times New Roman"/>
-                <w:lang w:val="id-ID"/>
-              </w:rPr>
-            </w:pPr>
-          </w:p>
-          <w:p>
-            <w:pPr>
-              <w:spacing w:after="0" w:line="240" w:lineRule="auto"/>
-              <w:rPr>
-                <w:rFonts w:ascii="Times New Roman" w:eastAsia="Calibri" w:hAnsi="Times New Roman" w:cs="Times New Roman"/>
-                <w:lang w:val="id-ID"/>
-              </w:rPr>
-            </w:pPr>
-          </w:p>
-          <w:p>
-            <w:pPr>
-              <w:spacing w:after="0" w:line="240" w:lineRule="auto"/>
-              <w:rPr>
-                <w:rFonts w:ascii="Times New Roman" w:eastAsia="Calibri" w:hAnsi="Times New Roman" w:cs="Times New Roman"/>
-                <w:lang w:val="id-ID"/>
-              </w:rPr>
-            </w:pPr>
-          </w:p>
-          <w:p>
-            <w:pPr>
-              <w:spacing w:after="0" w:line="240" w:lineRule="auto"/>
-              <w:rPr>
-                <w:rFonts w:ascii="Times New Roman" w:eastAsia="Calibri" w:hAnsi="Times New Roman" w:cs="Times New Roman"/>
-                <w:lang w:val="id-ID"/>
-              </w:rPr>
-            </w:pPr>
-          </w:p>
-          <w:p>
-            <w:pPr>
-              <w:spacing w:after="0" w:line="240" w:lineRule="auto"/>
-              <w:rPr>
-                <w:rFonts w:ascii="Times New Roman" w:eastAsia="Calibri" w:hAnsi="Times New Roman" w:cs="Times New Roman"/>
-                <w:lang w:val="id-ID"/>
-              </w:rPr>
-            </w:pPr>
-          </w:p>
-          <w:p>
-            <w:pPr>
-              <w:spacing w:after="0" w:line="240" w:lineRule="auto"/>
-              <w:rPr>
-                <w:rFonts w:ascii="Times New Roman" w:eastAsia="Calibri" w:hAnsi="Times New Roman" w:cs="Times New Roman"/>
-                <w:lang w:val="id-ID"/>
-              </w:rPr>
-            </w:pPr>
-          </w:p>
-          <w:p>
-            <w:pPr>
-              <w:spacing w:after="0" w:line="240" w:lineRule="auto"/>
-              <w:rPr>
-                <w:rFonts w:ascii="Times New Roman" w:eastAsia="Calibri" w:hAnsi="Times New Roman" w:cs="Times New Roman"/>
-                <w:lang w:val="id-ID"/>
-              </w:rPr>
-            </w:pPr>
-          </w:p>
-          <w:p>
-            <w:pPr>
-              <w:spacing w:after="0" w:line="240" w:lineRule="auto"/>
-              <w:rPr>
-                <w:rFonts w:ascii="Times New Roman" w:eastAsia="Calibri" w:hAnsi="Times New Roman" w:cs="Times New Roman"/>
-                <w:lang w:val="id-ID"/>
-              </w:rPr>
-            </w:pPr>
-          </w:p>
-          <w:p>
-            <w:pPr>
-              <w:spacing w:after="0" w:line="240" w:lineRule="auto"/>
-              <w:rPr>
-                <w:rFonts w:ascii="Times New Roman" w:eastAsia="Calibri" w:hAnsi="Times New Roman" w:cs="Times New Roman"/>
-                <w:lang w:val="id-ID"/>
-              </w:rPr>
-            </w:pPr>
-          </w:p>
-          <w:p>
-            <w:pPr>
-              <w:spacing w:after="0" w:line="240" w:lineRule="auto"/>
-              <w:rPr>
-                <w:rFonts w:ascii="Times New Roman" w:eastAsia="Calibri" w:hAnsi="Times New Roman" w:cs="Times New Roman"/>
-                <w:lang w:val="id-ID"/>
-              </w:rPr>
-            </w:pPr>
-          </w:p>
-        </w:tc>
-        <w:tc>
-          <w:tcPr>
-            <w:tcW w:w="493" w:type="dxa"/>
-            <w:tcBorders>
-              <w:top w:val="nil"/>
-              <w:left w:val="nil"/>
-              <w:bottom w:val="nil"/>
-              <w:right w:val="nil"/>
-            </w:tcBorders>
-          </w:tcPr>
-          <w:p>
-            <w:pPr>
-              <w:spacing w:after="0" w:line="240" w:lineRule="auto"/>
-              <w:rPr>
-                <w:rFonts w:ascii="Times New Roman" w:hAnsi="Times New Roman" w:cs="Times New Roman"/>
-                <w:lang w:val="id-ID"/>
-              </w:rPr>
-            </w:pPr>
-          </w:p>
-        </w:tc>
-      </w:tr>
-      <w:tr>
-        <w:tc>
-          <w:tcPr>
-            <w:tcW w:w="381" w:type="dxa"/>
-            <w:tcBorders>
-              <w:top w:val="nil"/>
-              <w:left w:val="nil"/>
-              <w:bottom w:val="nil"/>
-              <w:right w:val="nil"/>
-            </w:tcBorders>
-          </w:tcPr>
-          <w:p>
-            <w:pPr>
-              <w:spacing w:after="0" w:line="240" w:lineRule="auto"/>
-              <w:rPr>
-                <w:rFonts w:ascii="Times New Roman" w:hAnsi="Times New Roman" w:cs="Times New Roman"/>
-                <w:lang w:val="id-ID"/>
-              </w:rPr>
-            </w:pPr>
-            <w:r>
-              <w:rPr>
-                <w:rFonts w:ascii="Times New Roman" w:hAnsi="Times New Roman" w:cs="Times New Roman"/>
-                <w:lang w:val="id-ID"/>
-              </w:rPr>
-              <w:t>6.</w:t>
-            </w:r>
-          </w:p>
-        </w:tc>
-        <w:tc>
-          <w:tcPr>
-            <w:tcW w:w="9239" w:type="dxa"/>
-            <w:tcBorders>
-              <w:top w:val="nil"/>
-              <w:left w:val="nil"/>
-              <w:bottom w:val="nil"/>
-              <w:right w:val="nil"/>
-            </w:tcBorders>
-          </w:tcPr>
-          <w:p>
-            <w:pPr>
-              <w:spacing w:after="0" w:line="240" w:lineRule="auto"/>
-              <w:rPr>
-                <w:rFonts w:ascii="Times New Roman" w:eastAsia="Calibri" w:hAnsi="Times New Roman" w:cs="Times New Roman"/>
-                <w:lang w:val="id-ID"/>
-              </w:rPr>
-            </w:pPr>
-            <w:r>
-              <w:rPr>
-                <w:rFonts w:ascii="Times New Roman" w:eastAsia="Calibri" w:hAnsi="Times New Roman" w:cs="Times New Roman"/>
-                <w:lang w:val="id-ID"/>
-              </w:rPr>
-              <w:t xml:space="preserve">Solve the equation </w:t>
-            </w:r>
-            <m:oMath>
-              <m:r>
-                <w:rPr>
-                  <w:rFonts w:ascii="Cambria Math" w:hAnsi="Cambria Math"/>
-                  <w:lang w:val="id-ID"/>
-                </w:rPr>
-                <m:t>cos3θ</m:t>
-              </m:r>
-            </m:oMath>
-            <w:r>
-              <w:rPr>
-                <w:rFonts w:ascii="Cambria Math" w:hAnsi="Cambria Math" w:cs="Times New Roman"/>
-                <w:i/>
-                <w:lang w:val="id-ID"/>
-              </w:rPr>
-              <w:t xml:space="preserve"> </w:t>
-            </w:r>
-            <w:r>
-              <w:rPr>
-                <w:rFonts w:ascii="Times New Roman" w:eastAsia="Calibri" w:hAnsi="Times New Roman" w:cs="Times New Roman"/>
-                <w:lang w:val="id-ID"/>
-              </w:rPr>
-              <w:t xml:space="preserve">= 0.766, in the interval 0 </w:t>
-            </w:r>
-            <m:oMath>
-              <m:r>
-                <w:rPr>
-                  <w:rFonts w:ascii="Cambria Math" w:hAnsi="Cambria Math"/>
-                  <w:lang w:val="id-ID"/>
-                </w:rPr>
-                <m:t>≤θ≤2π</m:t>
-              </m:r>
-            </m:oMath>
-          </w:p>
-        </w:tc>
-        <w:tc>
-          <w:tcPr>
-            <w:tcW w:w="493" w:type="dxa"/>
-            <w:tcBorders>
-              <w:top w:val="nil"/>
-              <w:left w:val="nil"/>
-              <w:bottom w:val="nil"/>
-              <w:right w:val="nil"/>
-            </w:tcBorders>
-          </w:tcPr>
-          <w:p>
-            <w:pPr>
-              <w:spacing w:after="0" w:line="240" w:lineRule="auto"/>
-              <w:rPr>
-                <w:rFonts w:ascii="Times New Roman" w:hAnsi="Times New Roman" w:cs="Times New Roman"/>
-                <w:lang w:val="id-ID"/>
-              </w:rPr>
-            </w:pPr>
-            <w:r>
-              <w:rPr>
-                <w:rFonts w:ascii="Times New Roman" w:hAnsi="Times New Roman" w:cs="Times New Roman"/>
-                <w:b/>
-                <w:bCs/>
-                <w:lang w:val="id-ID"/>
-              </w:rPr>
-              <w:t>[5]</w:t>
-            </w:r>
-          </w:p>
-        </w:tc>
-      </w:tr>
-      <w:tr>
-        <w:tc>
-          <w:tcPr>
-            <w:tcW w:w="381" w:type="dxa"/>
-            <w:tcBorders>
-              <w:top w:val="nil"/>
-              <w:left w:val="nil"/>
-              <w:bottom w:val="nil"/>
-              <w:right w:val="nil"/>
-            </w:tcBorders>
-          </w:tcPr>
-          <w:p>
-            <w:pPr>
-              <w:spacing w:after="0" w:line="240" w:lineRule="auto"/>
-              <w:rPr>
-                <w:rFonts w:ascii="Times New Roman" w:hAnsi="Times New Roman" w:cs="Times New Roman"/>
-                <w:lang w:val="id-ID"/>
-              </w:rPr>
-            </w:pPr>
-          </w:p>
-        </w:tc>
-        <w:tc>
-          <w:tcPr>
-            <w:tcW w:w="9239" w:type="dxa"/>
-            <w:tcBorders>
-              <w:top w:val="nil"/>
-              <w:left w:val="nil"/>
-              <w:bottom w:val="nil"/>
-              <w:right w:val="nil"/>
-            </w:tcBorders>
-          </w:tcPr>
-          <w:p>
-            <w:pPr>
-              <w:spacing w:after="0" w:line="240" w:lineRule="auto"/>
-              <w:rPr>
-                <w:rFonts w:ascii="Times New Roman" w:eastAsia="Calibri" w:hAnsi="Times New Roman" w:cs="Times New Roman"/>
-                <w:lang w:val="id-ID"/>
-              </w:rPr>
-            </w:pPr>
-          </w:p>
-          <w:p>
-            <w:pPr>
-              <w:spacing w:after="0" w:line="240" w:lineRule="auto"/>
-              <w:rPr>
-                <w:rFonts w:ascii="Times New Roman" w:eastAsia="Calibri" w:hAnsi="Times New Roman" w:cs="Times New Roman"/>
-                <w:lang w:val="id-ID"/>
-              </w:rPr>
-            </w:pPr>
-          </w:p>
-          <w:p>
-            <w:pPr>
-              <w:spacing w:after="0" w:line="240" w:lineRule="auto"/>
-              <w:rPr>
-                <w:rFonts w:ascii="Times New Roman" w:eastAsia="Calibri" w:hAnsi="Times New Roman" w:cs="Times New Roman"/>
-                <w:lang w:val="id-ID"/>
-              </w:rPr>
-            </w:pPr>
-          </w:p>
-          <w:p>
-            <w:pPr>
-              <w:spacing w:after="0" w:line="240" w:lineRule="auto"/>
-              <w:rPr>
-                <w:rFonts w:ascii="Times New Roman" w:eastAsia="Calibri" w:hAnsi="Times New Roman" w:cs="Times New Roman"/>
-                <w:lang w:val="id-ID"/>
-              </w:rPr>
-            </w:pPr>
-          </w:p>
-          <w:p>
-            <w:pPr>
-              <w:spacing w:after="0" w:line="240" w:lineRule="auto"/>
-              <w:rPr>
-                <w:rFonts w:ascii="Times New Roman" w:eastAsia="Calibri" w:hAnsi="Times New Roman" w:cs="Times New Roman"/>
-                <w:lang w:val="id-ID"/>
-              </w:rPr>
-            </w:pPr>
-          </w:p>
-          <w:p>
-            <w:pPr>
-              <w:spacing w:after="0" w:line="240" w:lineRule="auto"/>
-              <w:rPr>
-                <w:rFonts w:ascii="Times New Roman" w:eastAsia="Calibri" w:hAnsi="Times New Roman" w:cs="Times New Roman"/>
-                <w:lang w:val="id-ID"/>
-              </w:rPr>
-            </w:pPr>
-          </w:p>
-          <w:p>
-            <w:pPr>
-              <w:spacing w:after="0" w:line="240" w:lineRule="auto"/>
-              <w:rPr>
-                <w:rFonts w:ascii="Times New Roman" w:eastAsia="Calibri" w:hAnsi="Times New Roman" w:cs="Times New Roman"/>
-                <w:lang w:val="id-ID"/>
-              </w:rPr>
-            </w:pPr>
-          </w:p>
-          <w:p>
-            <w:pPr>
-              <w:spacing w:after="0" w:line="240" w:lineRule="auto"/>
-              <w:rPr>
-                <w:rFonts w:ascii="Times New Roman" w:eastAsia="Calibri" w:hAnsi="Times New Roman" w:cs="Times New Roman"/>
-                <w:lang w:val="id-ID"/>
-              </w:rPr>
-            </w:pPr>
-          </w:p>
-          <w:p>
-            <w:pPr>
-              <w:spacing w:after="0" w:line="240" w:lineRule="auto"/>
-              <w:rPr>
-                <w:rFonts w:ascii="Times New Roman" w:eastAsia="Calibri" w:hAnsi="Times New Roman" w:cs="Times New Roman"/>
-                <w:lang w:val="id-ID"/>
-              </w:rPr>
-            </w:pPr>
-          </w:p>
-        </w:tc>
-        <w:tc>
-          <w:tcPr>
-            <w:tcW w:w="493" w:type="dxa"/>
-            <w:tcBorders>
-              <w:top w:val="nil"/>
-              <w:left w:val="nil"/>
-              <w:bottom w:val="nil"/>
-              <w:right w:val="nil"/>
-            </w:tcBorders>
-          </w:tcPr>
-          <w:p>
-            <w:pPr>
-              <w:spacing w:after="0" w:line="240" w:lineRule="auto"/>
-              <w:rPr>
-                <w:rFonts w:ascii="Times New Roman" w:hAnsi="Times New Roman" w:cs="Times New Roman"/>
-                <w:lang w:val="id-ID"/>
-              </w:rPr>
-            </w:pPr>
-          </w:p>
-        </w:tc>
-      </w:tr>
-      <w:tr>
-        <w:tc>
-          <w:tcPr>
-            <w:tcW w:w="381" w:type="dxa"/>
-            <w:tcBorders>
-              <w:top w:val="nil"/>
-              <w:left w:val="nil"/>
-              <w:bottom w:val="nil"/>
-              <w:right w:val="nil"/>
-            </w:tcBorders>
-          </w:tcPr>
-          <w:p>
-            <w:pPr>
-              <w:spacing w:after="0" w:line="240" w:lineRule="auto"/>
-              <w:rPr>
-                <w:rFonts w:ascii="Times New Roman" w:hAnsi="Times New Roman" w:cs="Times New Roman"/>
-                <w:lang w:val="id-ID"/>
-              </w:rPr>
-            </w:pPr>
-            <w:r>
-              <w:rPr>
-                <w:rFonts w:ascii="Times New Roman" w:hAnsi="Times New Roman" w:cs="Times New Roman"/>
-                <w:lang w:val="id-ID"/>
-              </w:rPr>
-              <w:t>7.</w:t>
-            </w:r>
-          </w:p>
-        </w:tc>
-        <w:tc>
-          <w:tcPr>
-            <w:tcW w:w="9239" w:type="dxa"/>
-            <w:tcBorders>
-              <w:top w:val="nil"/>
-              <w:left w:val="nil"/>
-              <w:bottom w:val="nil"/>
-              <w:right w:val="nil"/>
-            </w:tcBorders>
-          </w:tcPr>
-          <w:p>
-            <w:pPr>
-              <w:spacing w:after="0" w:line="240" w:lineRule="auto"/>
-              <w:rPr>
-                <w:rFonts w:ascii="Times New Roman" w:eastAsia="Calibri" w:hAnsi="Times New Roman" w:cs="Times New Roman"/>
-                <w:lang w:val="id-ID"/>
-              </w:rPr>
-            </w:pPr>
-            <w:r>
-              <w:rPr>
-                <w:rFonts w:ascii="Times New Roman" w:eastAsia="Calibri" w:hAnsi="Times New Roman" w:cs="Times New Roman"/>
-                <w:lang w:val="id-ID"/>
-              </w:rPr>
-              <w:t xml:space="preserve">Solve for </w:t>
-            </w:r>
-            <m:oMath>
-              <m:r>
-                <w:rPr>
-                  <w:rFonts w:ascii="Cambria Math" w:hAnsi="Cambria Math"/>
-                  <w:lang w:val="id-ID"/>
-                </w:rPr>
-                <m:t>θ</m:t>
-              </m:r>
-            </m:oMath>
-            <w:r>
-              <w:rPr>
-                <w:rFonts w:ascii="Times New Roman" w:eastAsia="Calibri" w:hAnsi="Times New Roman" w:cs="Times New Roman"/>
-                <w:lang w:val="id-ID"/>
-              </w:rPr>
-              <w:t xml:space="preserve">, in the interval, the equation </w:t>
-            </w:r>
-            <m:oMath>
-              <m:r>
-                <w:rPr>
-                  <w:rFonts w:ascii="Cambria Math" w:hAnsi="Cambria Math"/>
-                  <w:lang w:val="id-ID"/>
-                </w:rPr>
-                <m:t>2</m:t>
-              </m:r>
-              <m:sSup>
-                <m:sSupPr>
-                  <m:ctrlPr>
-                    <w:rPr>
-                      <w:rFonts w:ascii="Cambria Math" w:hAnsi="Cambria Math"/>
-                      <w:lang w:val="id-ID"/>
-                    </w:rPr>
-                  </m:ctrlPr>
-                </m:sSupPr>
-                <m:e>
-                  <m:r>
-                    <w:rPr>
-                      <w:rFonts w:ascii="Cambria Math" w:hAnsi="Cambria Math"/>
-                      <w:lang w:val="id-ID"/>
-                    </w:rPr>
-                    <m:t>cos</m:t>
-                  </m:r>
-                </m:e>
-                <m:sup>
-                  <m:r>
-                    <w:rPr>
-                      <w:rFonts w:ascii="Cambria Math" w:hAnsi="Cambria Math"/>
-                      <w:lang w:val="id-ID"/>
-                    </w:rPr>
-                    <m:t>2</m:t>
-                  </m:r>
-                </m:sup>
-              </m:sSup>
-              <m:r>
-                <w:rPr>
-                  <w:rFonts w:ascii="Cambria Math" w:hAnsi="Cambria Math"/>
-                  <w:lang w:val="id-ID"/>
-                </w:rPr>
-                <m:t>θ</m:t>
-              </m:r>
-              <m:r>
-                <m:rPr>
-                  <m:lit/>
-                  <m:nor/>
-                </m:rPr>
-                <w:rPr>
-                  <w:lang w:val="id-ID"/>
-                </w:rPr>
-                <m:t>-</m:t>
-              </m:r>
-              <m:r>
-                <w:rPr>
-                  <w:rFonts w:ascii="Cambria Math" w:hAnsi="Cambria Math"/>
-                  <w:lang w:val="id-ID"/>
-                </w:rPr>
-                <m:t>cosθ</m:t>
-              </m:r>
-              <m:r>
-                <m:rPr>
-                  <m:lit/>
-                  <m:nor/>
-                </m:rPr>
-                <w:rPr>
-                  <w:lang w:val="id-ID"/>
-                </w:rPr>
-                <m:t>-</m:t>
-              </m:r>
-              <m:r>
-                <w:rPr>
-                  <w:rFonts w:ascii="Cambria Math" w:hAnsi="Cambria Math"/>
-                  <w:lang w:val="id-ID"/>
-                </w:rPr>
-                <m:t>1</m:t>
-              </m:r>
-            </m:oMath>
-            <w:r>
-              <w:rPr>
-                <w:rFonts w:ascii="Cambria Math" w:hAnsi="Cambria Math" w:cs="Times New Roman"/>
-                <w:i/>
-                <w:lang w:val="id-ID"/>
-              </w:rPr>
-              <w:t>= 0</w:t>
-            </w:r>
-          </w:p>
-        </w:tc>
-        <w:tc>
-          <w:tcPr>
-            <w:tcW w:w="493" w:type="dxa"/>
-            <w:tcBorders>
-              <w:top w:val="nil"/>
-              <w:left w:val="nil"/>
-              <w:bottom w:val="nil"/>
-              <w:right w:val="nil"/>
-            </w:tcBorders>
-          </w:tcPr>
-          <w:p>
-            <w:pPr>
-              <w:spacing w:after="0" w:line="240" w:lineRule="auto"/>
-              <w:rPr>
-                <w:rFonts w:ascii="Times New Roman" w:hAnsi="Times New Roman" w:cs="Times New Roman"/>
-                <w:lang w:val="id-ID"/>
-              </w:rPr>
-            </w:pPr>
-            <w:r>
-              <w:rPr>
-                <w:rFonts w:ascii="Times New Roman" w:hAnsi="Times New Roman" w:cs="Times New Roman"/>
-                <w:b/>
-                <w:bCs/>
-                <w:lang w:val="id-ID"/>
-              </w:rPr>
-              <w:t>[5]</w:t>
-            </w:r>
-          </w:p>
-        </w:tc>
-      </w:tr>
-    </w:tbl>
-    <w:p>
-      <w:pPr>
-        <w:rPr>
-          <w:rFonts w:ascii="Times New Roman" w:hAnsi="Times New Roman" w:cs="Times New Roman"/>
-          <w:lang w:val="id-ID"/>
-        </w:rPr>
-      </w:pPr>
-    </w:p>
-    <w:p>
-      <w:pPr>
-        <w:rPr>
-          <w:rFonts w:ascii="Arial Nova" w:hAnsi="Arial Nova"/>
-          <w:b/>
-          <w:bCs/>
-          <w:sz w:val="24"/>
-          <w:szCs w:val="24"/>
-          <w:lang w:val="id-ID"/>
-        </w:rPr>
-      </w:pPr>
-    </w:p>
-    <w:sectPr>
-      <w:pgSz w:w="11906" w:h="16838"/>
-      <w:pgMar w:top="709" w:right="849" w:bottom="1276" w:left="1080" w:header="0" w:footer="0" w:gutter="0"/>
-      <w:cols w:space="720"/>
-      <w:formProt w:val="0"/>
-      <w:docGrid w:linePitch="360"/>
-    </w:sectPr>
   </w:body>
 </w:document>
 </file>

</xml_diff>

<commit_message>
chore: update template.docx content and formatting
</commit_message>
<xml_diff>
--- a/template.docx
+++ b/template.docx
@@ -881,6 +881,7 @@
           <w:szCs w:val="40"/>
           <w:lang w:val="id-ID"/>
         </w:rPr>
+        <w:lastRenderedPageBreak/>
         <w:t>Tahun Akademik 2025-2026</w:t>
       </w:r>
     </w:p>
@@ -963,7 +964,6 @@
           <w:p>
             <w:pPr>
               <w:spacing w:beforeAutospacing="1" w:after="0" w:line="240" w:lineRule="auto"/>
-              <w:jc w:val="right"/>
               <w:outlineLvl w:val="1"/>
               <w:rPr>
                 <w:rFonts w:ascii="Arial Nova" w:eastAsia="Times New Roman" w:hAnsi="Arial Nova" w:cs="Times New Roman"/>
@@ -1038,7 +1038,6 @@
           <w:p>
             <w:pPr>
               <w:spacing w:beforeAutospacing="1" w:after="0" w:line="240" w:lineRule="auto"/>
-              <w:jc w:val="right"/>
               <w:outlineLvl w:val="1"/>
               <w:rPr>
                 <w:rFonts w:ascii="Arial Nova" w:eastAsia="Times New Roman" w:hAnsi="Arial Nova" w:cs="Times New Roman"/>
@@ -1101,7 +1100,6 @@
           <w:p>
             <w:pPr>
               <w:spacing w:beforeAutospacing="1" w:after="0" w:line="240" w:lineRule="auto"/>
-              <w:jc w:val="right"/>
               <w:outlineLvl w:val="1"/>
               <w:rPr>
                 <w:rFonts w:ascii="Arial Nova" w:eastAsia="Times New Roman" w:hAnsi="Arial Nova" w:cs="Times New Roman"/>
@@ -1167,7 +1165,6 @@
           <w:p>
             <w:pPr>
               <w:spacing w:beforeAutospacing="1" w:after="0" w:line="240" w:lineRule="auto"/>
-              <w:jc w:val="right"/>
               <w:outlineLvl w:val="1"/>
               <w:rPr>
                 <w:rFonts w:ascii="Arial Nova" w:eastAsia="Times New Roman" w:hAnsi="Arial Nova" w:cs="Times New Roman"/>
@@ -1234,7 +1231,6 @@
           <w:p>
             <w:pPr>
               <w:spacing w:beforeAutospacing="1" w:after="0" w:line="240" w:lineRule="auto"/>
-              <w:jc w:val="right"/>
               <w:outlineLvl w:val="1"/>
               <w:rPr>
                 <w:rFonts w:ascii="Arial Nova" w:eastAsia="Times New Roman" w:hAnsi="Arial Nova" w:cs="Times New Roman"/>
@@ -1260,7 +1256,23 @@
             <w:tcW w:w="7236" w:type="dxa"/>
           </w:tcPr>
           <w:p>
-            <w:r>
+            <w:pPr>
+              <w:cnfStyle w:val="000000000000" w:firstRow="0" w:lastRow="0" w:firstColumn="0" w:lastColumn="0" w:oddVBand="0" w:evenVBand="0" w:oddHBand="0" w:evenHBand="0" w:firstRowFirstColumn="0" w:firstRowLastColumn="0" w:lastRowFirstColumn="0" w:lastRowLastColumn="0"/>
+              <w:rPr>
+                <w:rFonts w:ascii="Open Sans" w:hAnsi="Open Sans" w:cs="Open Sans"/>
+                <w:b/>
+                <w:bCs/>
+              </w:rPr>
+            </w:pPr>
+            <w:r>
+              <w:rPr>
+                <w:rFonts w:ascii="Open Sans" w:hAnsi="Open Sans" w:cs="Open Sans"/>
+                <w:b/>
+                <w:bCs/>
+                <w:color w:val="EE0000"/>
+                <w:sz w:val="22"/>
+                <w:szCs w:val="22"/>
+              </w:rPr>
               <w:t>{judul_tema_subtopik}</w:t>
             </w:r>
           </w:p>
@@ -1281,7 +1293,6 @@
           <w:p>
             <w:pPr>
               <w:spacing w:beforeAutospacing="1" w:after="0" w:line="240" w:lineRule="auto"/>
-              <w:jc w:val="right"/>
               <w:outlineLvl w:val="1"/>
               <w:rPr>
                 <w:rFonts w:ascii="Arial Nova" w:eastAsia="Times New Roman" w:hAnsi="Arial Nova" w:cs="Times New Roman"/>
@@ -1344,7 +1355,6 @@
           <w:p>
             <w:pPr>
               <w:spacing w:beforeAutospacing="1" w:after="0" w:line="240" w:lineRule="auto"/>
-              <w:jc w:val="right"/>
               <w:outlineLvl w:val="1"/>
               <w:rPr>
                 <w:rFonts w:ascii="Arial Nova" w:eastAsia="Times New Roman" w:hAnsi="Arial Nova" w:cs="Times New Roman"/>
@@ -1410,7 +1420,6 @@
           <w:p>
             <w:pPr>
               <w:spacing w:beforeAutospacing="1" w:after="0" w:line="240" w:lineRule="auto"/>
-              <w:jc w:val="right"/>
               <w:outlineLvl w:val="1"/>
               <w:rPr>
                 <w:rFonts w:ascii="Arial Nova" w:eastAsia="Times New Roman" w:hAnsi="Arial Nova" w:cs="Times New Roman"/>
@@ -1473,7 +1482,6 @@
           <w:p>
             <w:pPr>
               <w:spacing w:beforeAutospacing="1" w:after="0" w:line="240" w:lineRule="auto"/>
-              <w:jc w:val="right"/>
               <w:outlineLvl w:val="1"/>
               <w:rPr>
                 <w:rFonts w:ascii="Arial Nova" w:eastAsia="Times New Roman" w:hAnsi="Arial Nova" w:cs="Times New Roman"/>
@@ -1899,8 +1907,26 @@
           <w:p>
             <w:r>
               <w:t>Latar belakang pembelajaran:</w:t>
+            </w:r>
+            <w:r>
               <w:br/>
+            </w:r>
+            <w:r>
+              <w:rPr>
+                <w:rFonts w:ascii="Arial Nova" w:hAnsi="Arial Nova" w:cs="Arial"/>
+                <w:color w:val="EE0000"/>
+                <w:sz w:val="20"/>
+                <w:szCs w:val="20"/>
+              </w:rPr>
               <w:t>{FOR lb IN latar_belakang_pembelajaran}• {$lb}</w:t>
+            </w:r>
+            <w:r>
+              <w:rPr>
+                <w:rFonts w:ascii="Arial Nova" w:hAnsi="Arial Nova" w:cs="Arial"/>
+                <w:color w:val="EE0000"/>
+                <w:sz w:val="20"/>
+                <w:szCs w:val="20"/>
+              </w:rPr>
               <w:br/>
               <w:t>{END-FOR lb}</w:t>
             </w:r>
@@ -1929,6 +1955,7 @@
                 <w:lang w:val="id-ID" w:eastAsia="en-ID"/>
               </w:rPr>
             </w:pPr>
+            <w:proofErr w:type="spellStart"/>
             <w:r>
               <w:rPr>
                 <w:rFonts w:ascii="Arial Nova" w:eastAsia="Times New Roman" w:hAnsi="Arial Nova" w:cs="Times New Roman"/>
@@ -1936,10 +1963,59 @@
                 <w:bCs/>
                 <w:sz w:val="20"/>
                 <w:szCs w:val="20"/>
-                <w:lang w:val="id-ID" w:eastAsia="en-ID"/>
-              </w:rPr>
-              <w:t>Dimensi Profil Lulusan</w:t>
-            </w:r>
+                <w:lang w:eastAsia="en-ID"/>
+              </w:rPr>
+              <w:t>Dimensi</w:t>
+            </w:r>
+            <w:proofErr w:type="spellEnd"/>
+            <w:r>
+              <w:rPr>
+                <w:rFonts w:ascii="Arial Nova" w:eastAsia="Times New Roman" w:hAnsi="Arial Nova" w:cs="Times New Roman"/>
+                <w:b/>
+                <w:bCs/>
+                <w:sz w:val="20"/>
+                <w:szCs w:val="20"/>
+                <w:lang w:eastAsia="en-ID"/>
+              </w:rPr>
+              <w:t xml:space="preserve"> </w:t>
+            </w:r>
+            <w:proofErr w:type="spellStart"/>
+            <w:r>
+              <w:rPr>
+                <w:rFonts w:ascii="Arial Nova" w:eastAsia="Times New Roman" w:hAnsi="Arial Nova" w:cs="Times New Roman"/>
+                <w:b/>
+                <w:bCs/>
+                <w:sz w:val="20"/>
+                <w:szCs w:val="20"/>
+                <w:lang w:eastAsia="en-ID"/>
+              </w:rPr>
+              <w:t>Profil</w:t>
+            </w:r>
+            <w:proofErr w:type="spellEnd"/>
+            <w:r>
+              <w:rPr>
+                <w:rFonts w:ascii="Arial Nova" w:eastAsia="Times New Roman" w:hAnsi="Arial Nova" w:cs="Times New Roman"/>
+                <w:b/>
+                <w:bCs/>
+                <w:sz w:val="20"/>
+                <w:szCs w:val="20"/>
+                <w:lang w:eastAsia="en-ID"/>
+              </w:rPr>
+              <w:t xml:space="preserve"> </w:t>
+            </w:r>
+            <w:proofErr w:type="spellStart"/>
+            <w:r>
+              <w:rPr>
+                <w:rFonts w:ascii="Arial Nova" w:eastAsia="Times New Roman" w:hAnsi="Arial Nova" w:cs="Times New Roman"/>
+                <w:b/>
+                <w:bCs/>
+                <w:sz w:val="20"/>
+                <w:szCs w:val="20"/>
+                <w:lang w:eastAsia="en-ID"/>
+              </w:rPr>
+              <w:t>Lulusan</w:t>
+            </w:r>
+            <w:proofErr w:type="spellEnd"/>
           </w:p>
         </w:tc>
         <w:tc>
@@ -1966,7 +2042,7 @@
                 <w:bCs/>
                 <w:sz w:val="20"/>
                 <w:szCs w:val="20"/>
-                <w:lang w:val="id-ID" w:eastAsia="en-ID"/>
+                <w:lang w:eastAsia="en-ID"/>
               </w:rPr>
               <w:t xml:space="preserve">☐   DPL 1          </w:t>
             </w:r>
@@ -1996,7 +2072,7 @@
                 <w:bCs/>
                 <w:sz w:val="20"/>
                 <w:szCs w:val="20"/>
-                <w:lang w:val="id-ID" w:eastAsia="en-ID"/>
+                <w:lang w:eastAsia="en-ID"/>
               </w:rPr>
               <w:t>☐   DPL 2</w:t>
             </w:r>
@@ -2027,7 +2103,7 @@
                 <w:bCs/>
                 <w:sz w:val="20"/>
                 <w:szCs w:val="20"/>
-                <w:lang w:val="id-ID" w:eastAsia="en-ID"/>
+                <w:lang w:eastAsia="en-ID"/>
               </w:rPr>
               <w:t>☐   DPL 3</w:t>
             </w:r>
@@ -2057,7 +2133,7 @@
                 <w:bCs/>
                 <w:sz w:val="20"/>
                 <w:szCs w:val="20"/>
-                <w:lang w:val="id-ID" w:eastAsia="en-ID"/>
+                <w:lang w:eastAsia="en-ID"/>
               </w:rPr>
               <w:t>☐   DPL 4</w:t>
             </w:r>
@@ -2104,14 +2180,85 @@
                 <w:lang w:val="id-ID" w:eastAsia="en-ID"/>
               </w:rPr>
             </w:pPr>
+            <w:proofErr w:type="spellStart"/>
             <w:r>
               <w:rPr>
                 <w:rFonts w:ascii="Segoe UI Symbol" w:eastAsia="Times New Roman" w:hAnsi="Segoe UI Symbol" w:cs="Segoe UI Symbol"/>
                 <w:sz w:val="16"/>
                 <w:szCs w:val="16"/>
-                <w:lang w:val="id-ID" w:eastAsia="en-ID"/>
-              </w:rPr>
-              <w:t>Keimanan dan Ketakwaan terhadap Tuhan YME</w:t>
+                <w:lang w:eastAsia="en-ID"/>
+              </w:rPr>
+              <w:t>Keimanan</w:t>
+            </w:r>
+            <w:proofErr w:type="spellEnd"/>
+            <w:r>
+              <w:rPr>
+                <w:rFonts w:ascii="Segoe UI Symbol" w:eastAsia="Times New Roman" w:hAnsi="Segoe UI Symbol" w:cs="Segoe UI Symbol"/>
+                <w:sz w:val="16"/>
+                <w:szCs w:val="16"/>
+                <w:lang w:eastAsia="en-ID"/>
+              </w:rPr>
+              <w:t xml:space="preserve"> dan </w:t>
+            </w:r>
+            <w:proofErr w:type="spellStart"/>
+            <w:r>
+              <w:rPr>
+                <w:rFonts w:ascii="Segoe UI Symbol" w:eastAsia="Times New Roman" w:hAnsi="Segoe UI Symbol" w:cs="Segoe UI Symbol"/>
+                <w:sz w:val="16"/>
+                <w:szCs w:val="16"/>
+                <w:lang w:eastAsia="en-ID"/>
+              </w:rPr>
+              <w:t>Ketakwaan</w:t>
+            </w:r>
+            <w:proofErr w:type="spellEnd"/>
+            <w:r>
+              <w:rPr>
+                <w:rFonts w:ascii="Segoe UI Symbol" w:eastAsia="Times New Roman" w:hAnsi="Segoe UI Symbol" w:cs="Segoe UI Symbol"/>
+                <w:sz w:val="16"/>
+                <w:szCs w:val="16"/>
+                <w:lang w:eastAsia="en-ID"/>
+              </w:rPr>
+              <w:t xml:space="preserve"> </w:t>
+            </w:r>
+            <w:proofErr w:type="spellStart"/>
+            <w:r>
+              <w:rPr>
+                <w:rFonts w:ascii="Segoe UI Symbol" w:eastAsia="Times New Roman" w:hAnsi="Segoe UI Symbol" w:cs="Segoe UI Symbol"/>
+                <w:sz w:val="16"/>
+                <w:szCs w:val="16"/>
+                <w:lang w:eastAsia="en-ID"/>
+              </w:rPr>
+              <w:t>terhadap</w:t>
+            </w:r>
+            <w:proofErr w:type="spellEnd"/>
+            <w:r>
+              <w:rPr>
+                <w:rFonts w:ascii="Segoe UI Symbol" w:eastAsia="Times New Roman" w:hAnsi="Segoe UI Symbol" w:cs="Segoe UI Symbol"/>
+                <w:sz w:val="16"/>
+                <w:szCs w:val="16"/>
+                <w:lang w:eastAsia="en-ID"/>
+              </w:rPr>
+              <w:t xml:space="preserve"> </w:t>
+            </w:r>
+            <w:proofErr w:type="spellStart"/>
+            <w:r>
+              <w:rPr>
+                <w:rFonts w:ascii="Segoe UI Symbol" w:eastAsia="Times New Roman" w:hAnsi="Segoe UI Symbol" w:cs="Segoe UI Symbol"/>
+                <w:sz w:val="16"/>
+                <w:szCs w:val="16"/>
+                <w:lang w:eastAsia="en-ID"/>
+              </w:rPr>
+              <w:t>Tuhan</w:t>
+            </w:r>
+            <w:proofErr w:type="spellEnd"/>
+            <w:r>
+              <w:rPr>
+                <w:rFonts w:ascii="Segoe UI Symbol" w:eastAsia="Times New Roman" w:hAnsi="Segoe UI Symbol" w:cs="Segoe UI Symbol"/>
+                <w:sz w:val="16"/>
+                <w:szCs w:val="16"/>
+                <w:lang w:eastAsia="en-ID"/>
+              </w:rPr>
+              <w:t xml:space="preserve"> YME</w:t>
             </w:r>
           </w:p>
         </w:tc>
@@ -2131,15 +2278,17 @@
                 <w:lang w:val="id-ID" w:eastAsia="en-ID"/>
               </w:rPr>
             </w:pPr>
+            <w:proofErr w:type="spellStart"/>
             <w:r>
               <w:rPr>
                 <w:rFonts w:ascii="Segoe UI Symbol" w:eastAsia="Times New Roman" w:hAnsi="Segoe UI Symbol" w:cs="Segoe UI Symbol"/>
                 <w:sz w:val="16"/>
                 <w:szCs w:val="16"/>
-                <w:lang w:val="id-ID" w:eastAsia="en-ID"/>
+                <w:lang w:eastAsia="en-ID"/>
               </w:rPr>
               <w:t>Kewargaan</w:t>
             </w:r>
+            <w:proofErr w:type="spellEnd"/>
           </w:p>
         </w:tc>
         <w:tc>
@@ -2159,15 +2308,37 @@
                 <w:lang w:val="id-ID" w:eastAsia="en-ID"/>
               </w:rPr>
             </w:pPr>
+            <w:proofErr w:type="spellStart"/>
             <w:r>
               <w:rPr>
                 <w:rFonts w:ascii="Arial Nova" w:eastAsia="Times New Roman" w:hAnsi="Arial Nova" w:cs="Times New Roman"/>
                 <w:sz w:val="16"/>
                 <w:szCs w:val="16"/>
-                <w:lang w:val="id-ID" w:eastAsia="en-ID"/>
-              </w:rPr>
-              <w:t>Penalaran Kritis</w:t>
-            </w:r>
+                <w:lang w:eastAsia="en-ID"/>
+              </w:rPr>
+              <w:t>Penalaran</w:t>
+            </w:r>
+            <w:proofErr w:type="spellEnd"/>
+            <w:r>
+              <w:rPr>
+                <w:rFonts w:ascii="Arial Nova" w:eastAsia="Times New Roman" w:hAnsi="Arial Nova" w:cs="Times New Roman"/>
+                <w:sz w:val="16"/>
+                <w:szCs w:val="16"/>
+                <w:lang w:eastAsia="en-ID"/>
+              </w:rPr>
+              <w:t xml:space="preserve"> </w:t>
+            </w:r>
+            <w:proofErr w:type="spellStart"/>
+            <w:r>
+              <w:rPr>
+                <w:rFonts w:ascii="Arial Nova" w:eastAsia="Times New Roman" w:hAnsi="Arial Nova" w:cs="Times New Roman"/>
+                <w:sz w:val="16"/>
+                <w:szCs w:val="16"/>
+                <w:lang w:eastAsia="en-ID"/>
+              </w:rPr>
+              <w:t>Kritis</w:t>
+            </w:r>
+            <w:proofErr w:type="spellEnd"/>
           </w:p>
         </w:tc>
         <w:tc>
@@ -2186,15 +2357,17 @@
                 <w:lang w:val="id-ID" w:eastAsia="en-ID"/>
               </w:rPr>
             </w:pPr>
+            <w:proofErr w:type="spellStart"/>
             <w:r>
               <w:rPr>
                 <w:rFonts w:ascii="Arial Nova" w:eastAsia="Times New Roman" w:hAnsi="Arial Nova" w:cs="Times New Roman"/>
                 <w:sz w:val="16"/>
                 <w:szCs w:val="16"/>
-                <w:lang w:val="id-ID" w:eastAsia="en-ID"/>
+                <w:lang w:eastAsia="en-ID"/>
               </w:rPr>
               <w:t>Kreativitas</w:t>
             </w:r>
+            <w:proofErr w:type="spellEnd"/>
           </w:p>
         </w:tc>
       </w:tr>
@@ -2206,7 +2379,6 @@
           <w:tcPr>
             <w:tcW w:w="1667" w:type="dxa"/>
             <w:vMerge/>
-            <w:vAlign w:val="center"/>
           </w:tcPr>
           <w:p>
             <w:pPr>
@@ -2225,27 +2397,44 @@
         <w:tc>
           <w:tcPr>
             <w:tcW w:w="2080" w:type="dxa"/>
-          </w:tcPr>
-          <w:p>
-            <w:r>
-              <w:t>{capaian_pembelajaran}</w:t>
-            </w:r>
-          </w:p>
-        </w:tc>
-        <w:tc>
-          <w:tcPr>
-            <w:tcW w:w="2086" w:type="dxa"/>
+            <w:shd w:val="clear" w:color="auto" w:fill="FFF2CC" w:themeFill="accent4" w:themeFillTint="33"/>
           </w:tcPr>
           <w:p>
             <w:pPr>
               <w:spacing w:after="0" w:line="240" w:lineRule="auto"/>
+              <w:rPr>
+                <w:rFonts w:ascii="Segoe UI Symbol" w:eastAsia="Times New Roman" w:hAnsi="Segoe UI Symbol" w:cs="Segoe UI Symbol"/>
+                <w:sz w:val="16"/>
+                <w:szCs w:val="16"/>
+                <w:lang w:eastAsia="en-ID"/>
+              </w:rPr>
+            </w:pPr>
+            <w:r>
               <w:rPr>
                 <w:rFonts w:ascii="Segoe UI Symbol" w:eastAsia="Times New Roman" w:hAnsi="Segoe UI Symbol" w:cs="Segoe UI Symbol"/>
                 <w:b/>
                 <w:bCs/>
                 <w:sz w:val="20"/>
                 <w:szCs w:val="20"/>
-                <w:lang w:val="id-ID" w:eastAsia="en-ID"/>
+                <w:lang w:eastAsia="en-ID"/>
+              </w:rPr>
+              <w:t>☐   DPL 6</w:t>
+            </w:r>
+          </w:p>
+        </w:tc>
+        <w:tc>
+          <w:tcPr>
+            <w:tcW w:w="2086" w:type="dxa"/>
+            <w:shd w:val="clear" w:color="auto" w:fill="FFF2CC" w:themeFill="accent4" w:themeFillTint="33"/>
+          </w:tcPr>
+          <w:p>
+            <w:pPr>
+              <w:spacing w:after="0" w:line="240" w:lineRule="auto"/>
+              <w:rPr>
+                <w:rFonts w:ascii="Segoe UI Symbol" w:eastAsia="Times New Roman" w:hAnsi="Segoe UI Symbol" w:cs="Segoe UI Symbol"/>
+                <w:sz w:val="16"/>
+                <w:szCs w:val="16"/>
+                <w:lang w:eastAsia="en-ID"/>
               </w:rPr>
             </w:pPr>
             <w:r>
@@ -2255,9 +2444,9 @@
                 <w:bCs/>
                 <w:sz w:val="20"/>
                 <w:szCs w:val="20"/>
-                <w:lang w:val="id-ID" w:eastAsia="en-ID"/>
-              </w:rPr>
-              <w:t>☐   DPL 6</w:t>
+                <w:lang w:eastAsia="en-ID"/>
+              </w:rPr>
+              <w:t>☐   DPL 7</w:t>
             </w:r>
           </w:p>
         </w:tc>
@@ -2265,17 +2454,16 @@
           <w:tcPr>
             <w:tcW w:w="2072" w:type="dxa"/>
             <w:gridSpan w:val="2"/>
+            <w:shd w:val="clear" w:color="auto" w:fill="FFF2CC" w:themeFill="accent4" w:themeFillTint="33"/>
           </w:tcPr>
           <w:p>
             <w:pPr>
               <w:spacing w:after="0" w:line="240" w:lineRule="auto"/>
               <w:rPr>
                 <w:rFonts w:ascii="Arial Nova" w:eastAsia="Times New Roman" w:hAnsi="Arial Nova" w:cs="Times New Roman"/>
-                <w:b/>
-                <w:bCs/>
-                <w:sz w:val="20"/>
-                <w:szCs w:val="20"/>
-                <w:lang w:val="id-ID" w:eastAsia="en-ID"/>
+                <w:sz w:val="16"/>
+                <w:szCs w:val="16"/>
+                <w:lang w:eastAsia="en-ID"/>
               </w:rPr>
             </w:pPr>
             <w:r>
@@ -2285,26 +2473,25 @@
                 <w:bCs/>
                 <w:sz w:val="20"/>
                 <w:szCs w:val="20"/>
-                <w:lang w:val="id-ID" w:eastAsia="en-ID"/>
-              </w:rPr>
-              <w:t>☐   DPL 7</w:t>
+                <w:lang w:eastAsia="en-ID"/>
+              </w:rPr>
+              <w:t>☐   DPL 8</w:t>
             </w:r>
           </w:p>
         </w:tc>
         <w:tc>
           <w:tcPr>
             <w:tcW w:w="2087" w:type="dxa"/>
+            <w:shd w:val="clear" w:color="auto" w:fill="FFF2CC" w:themeFill="accent4" w:themeFillTint="33"/>
           </w:tcPr>
           <w:p>
             <w:pPr>
               <w:spacing w:after="0" w:line="240" w:lineRule="auto"/>
               <w:rPr>
                 <w:rFonts w:ascii="Arial Nova" w:eastAsia="Times New Roman" w:hAnsi="Arial Nova" w:cs="Times New Roman"/>
-                <w:b/>
-                <w:bCs/>
-                <w:sz w:val="20"/>
-                <w:szCs w:val="20"/>
-                <w:lang w:val="id-ID" w:eastAsia="en-ID"/>
+                <w:sz w:val="16"/>
+                <w:szCs w:val="16"/>
+                <w:lang w:eastAsia="en-ID"/>
               </w:rPr>
             </w:pPr>
             <w:r>
@@ -2314,16 +2501,16 @@
                 <w:bCs/>
                 <w:sz w:val="20"/>
                 <w:szCs w:val="20"/>
-                <w:lang w:val="id-ID" w:eastAsia="en-ID"/>
-              </w:rPr>
-              <w:t>☐   DPL 8</w:t>
+                <w:lang w:eastAsia="en-ID"/>
+              </w:rPr>
+              <w:t>☐   DPL 5</w:t>
             </w:r>
           </w:p>
         </w:tc>
       </w:tr>
       <w:tr>
         <w:trPr>
-          <w:trHeight w:val="79"/>
+          <w:trHeight w:val="70"/>
         </w:trPr>
         <w:tc>
           <w:tcPr>
@@ -2352,11 +2539,17 @@
             <w:vAlign w:val="center"/>
           </w:tcPr>
           <w:p>
-            <w:r>
-              <w:t>{FOR tpu IN tujuan_pembelajaran_umum}{$tpu}</w:t>
-              <w:br/>
-              <w:t>{END-FOR tpu}</w:t>
-            </w:r>
+            <w:proofErr w:type="spellStart"/>
+            <w:r>
+              <w:rPr>
+                <w:rFonts w:ascii="Arial Nova" w:eastAsia="Times New Roman" w:hAnsi="Arial Nova" w:cs="Times New Roman"/>
+                <w:sz w:val="16"/>
+                <w:szCs w:val="16"/>
+                <w:lang w:eastAsia="en-ID"/>
+              </w:rPr>
+              <w:t>Kolaborasi</w:t>
+            </w:r>
+            <w:proofErr w:type="spellEnd"/>
           </w:p>
         </w:tc>
         <w:tc>
@@ -2375,15 +2568,17 @@
                 <w:lang w:val="id-ID" w:eastAsia="en-ID"/>
               </w:rPr>
             </w:pPr>
+            <w:proofErr w:type="spellStart"/>
             <w:r>
               <w:rPr>
                 <w:rFonts w:ascii="Arial Nova" w:eastAsia="Times New Roman" w:hAnsi="Arial Nova" w:cs="Times New Roman"/>
                 <w:sz w:val="16"/>
                 <w:szCs w:val="16"/>
-                <w:lang w:val="id-ID" w:eastAsia="en-ID"/>
+                <w:lang w:eastAsia="en-ID"/>
               </w:rPr>
               <w:t>Kemandirian</w:t>
             </w:r>
+            <w:proofErr w:type="spellEnd"/>
           </w:p>
         </w:tc>
         <w:tc>
@@ -2408,7 +2603,7 @@
                 <w:rFonts w:ascii="Arial Nova" w:eastAsia="Times New Roman" w:hAnsi="Arial Nova" w:cs="Times New Roman"/>
                 <w:sz w:val="16"/>
                 <w:szCs w:val="16"/>
-                <w:lang w:val="id-ID" w:eastAsia="en-ID"/>
+                <w:lang w:eastAsia="en-ID"/>
               </w:rPr>
               <w:t>Kesehatan</w:t>
             </w:r>
@@ -2430,15 +2625,17 @@
                 <w:lang w:val="id-ID" w:eastAsia="en-ID"/>
               </w:rPr>
             </w:pPr>
+            <w:proofErr w:type="spellStart"/>
             <w:r>
               <w:rPr>
                 <w:rFonts w:ascii="Arial Nova" w:eastAsia="Times New Roman" w:hAnsi="Arial Nova" w:cs="Times New Roman"/>
                 <w:sz w:val="16"/>
                 <w:szCs w:val="16"/>
-                <w:lang w:val="id-ID" w:eastAsia="en-ID"/>
+                <w:lang w:eastAsia="en-ID"/>
               </w:rPr>
               <w:t>Komunikasi</w:t>
             </w:r>
+            <w:proofErr w:type="spellEnd"/>
           </w:p>
         </w:tc>
       </w:tr>
@@ -2497,7 +2694,15 @@
           </w:tcPr>
           <w:p>
             <w:r>
-              <w:t>{enduring_understanding}</w:t>
+              <w:t>{</w:t>
+            </w:r>
+            <w:proofErr w:type="spellStart"/>
+            <w:r>
+              <w:t>capaian_pembelajaran</w:t>
+            </w:r>
+            <w:proofErr w:type="spellEnd"/>
+            <w:r>
+              <w:t>}</w:t>
             </w:r>
           </w:p>
         </w:tc>
@@ -2557,7 +2762,51 @@
           </w:tcPr>
           <w:p>
             <w:r>
-              <w:t>{lintas_disiplin_ilmu}</w:t>
+              <w:t xml:space="preserve">{FOR </w:t>
+            </w:r>
+            <w:proofErr w:type="spellStart"/>
+            <w:r>
+              <w:t>tpu</w:t>
+            </w:r>
+            <w:proofErr w:type="spellEnd"/>
+            <w:r>
+              <w:t xml:space="preserve"> IN </w:t>
+            </w:r>
+            <w:proofErr w:type="spellStart"/>
+            <w:r>
+              <w:t>tujuan_pembelajaran_</w:t>
+            </w:r>
+            <w:proofErr w:type="gramStart"/>
+            <w:r>
+              <w:t>umum</w:t>
+            </w:r>
+            <w:proofErr w:type="spellEnd"/>
+            <w:r>
+              <w:t>}{</w:t>
+            </w:r>
+            <w:proofErr w:type="gramEnd"/>
+            <w:r>
+              <w:t>$</w:t>
+            </w:r>
+            <w:proofErr w:type="spellStart"/>
+            <w:r>
+              <w:t>tpu</w:t>
+            </w:r>
+            <w:proofErr w:type="spellEnd"/>
+            <w:r>
+              <w:t>}</w:t>
+            </w:r>
+            <w:r>
+              <w:br/>
+              <w:t xml:space="preserve">{END-FOR </w:t>
+            </w:r>
+            <w:proofErr w:type="spellStart"/>
+            <w:r>
+              <w:t>tpu</w:t>
+            </w:r>
+            <w:proofErr w:type="spellEnd"/>
+            <w:r>
+              <w:t>}</w:t>
             </w:r>
           </w:p>
         </w:tc>
@@ -2592,6 +2841,7 @@
                 <w:szCs w:val="20"/>
                 <w:lang w:val="id-ID" w:eastAsia="en-ID"/>
               </w:rPr>
+              <w:lastRenderedPageBreak/>
               <w:t>Enduring Understanding/ Pemahaman Bermakna</w:t>
             </w:r>
           </w:p>
@@ -2613,14 +2863,15 @@
               </w:rPr>
             </w:pPr>
             <w:r>
-              <w:rPr>
-                <w:rFonts w:ascii="Arial" w:hAnsi="Arial" w:cs="Arial"/>
-                <w:color w:val="000000"/>
-                <w:sz w:val="20"/>
-                <w:szCs w:val="20"/>
-                <w:lang w:val="id-ID"/>
-              </w:rPr>
-              <w:t>Persamaan dan fungsi kuadrat bukan sekadar grafik melengkung atau hitungan hafalan akar, melainkan alat matematika esensial untuk memodelkan lintasan simetris, mengoptimalkan nilai maksimum/minimum, serta fondasi transisi menuju aljabar tingkat tinggi melalui manipulasi variabel tersembunyi.</w:t>
+              <w:t>{</w:t>
+            </w:r>
+            <w:proofErr w:type="spellStart"/>
+            <w:r>
+              <w:t>enduring_understanding</w:t>
+            </w:r>
+            <w:proofErr w:type="spellEnd"/>
+            <w:r>
+              <w:t>}</w:t>
             </w:r>
           </w:p>
         </w:tc>
@@ -2676,88 +2927,15 @@
               </w:rPr>
             </w:pPr>
             <w:r>
-              <w:rPr>
-                <w:rFonts w:ascii="Arial Nova" w:hAnsi="Arial Nova" w:cs="Segoe UI Symbol"/>
-                <w:color w:val="000000"/>
-                <w:sz w:val="20"/>
-                <w:szCs w:val="20"/>
-                <w:lang w:val="id-ID"/>
-              </w:rPr>
-              <w:t xml:space="preserve">Analisis kuadratik memiliki keterkaitan erat dengan tiga disiplin ilmu utama. Pertama, dalam </w:t>
-            </w:r>
-            <w:r>
-              <w:rPr>
-                <w:rFonts w:ascii="Arial Nova" w:hAnsi="Arial Nova" w:cs="Segoe UI Symbol"/>
-                <w:b/>
-                <w:color w:val="000000"/>
-                <w:sz w:val="20"/>
-                <w:szCs w:val="20"/>
-                <w:lang w:val="id-ID"/>
-              </w:rPr>
-              <w:t>Sains (Fisika)</w:t>
-            </w:r>
-            <w:r>
-              <w:rPr>
-                <w:rFonts w:ascii="Arial Nova" w:hAnsi="Arial Nova" w:cs="Segoe UI Symbol"/>
-                <w:color w:val="000000"/>
-                <w:sz w:val="20"/>
-                <w:szCs w:val="20"/>
-                <w:lang w:val="id-ID"/>
-              </w:rPr>
-              <w:t xml:space="preserve">, ia sangat fundamental untuk memodelkan gerak parabola (kinematika), </w:t>
-            </w:r>
-            <w:r>
-              <w:rPr>
-                <w:rFonts w:ascii="Arial Nova" w:hAnsi="Arial Nova" w:cs="Segoe UI Symbol"/>
-                <w:color w:val="000000"/>
-                <w:sz w:val="20"/>
-                <w:szCs w:val="20"/>
-                <w:lang w:val="id-ID"/>
-              </w:rPr>
-              <w:lastRenderedPageBreak/>
-              <w:t xml:space="preserve">menghitung waktu puncak, maupun jangkauan maksimum objek. Kedua, dalam </w:t>
-            </w:r>
-            <w:r>
-              <w:rPr>
-                <w:rFonts w:ascii="Arial Nova" w:hAnsi="Arial Nova" w:cs="Segoe UI Symbol"/>
-                <w:b/>
-                <w:color w:val="000000"/>
-                <w:sz w:val="20"/>
-                <w:szCs w:val="20"/>
-                <w:lang w:val="id-ID"/>
-              </w:rPr>
-              <w:t>Teknologi Informasi dan Rekayasa</w:t>
-            </w:r>
-            <w:r>
-              <w:rPr>
-                <w:rFonts w:ascii="Arial Nova" w:hAnsi="Arial Nova" w:cs="Segoe UI Symbol"/>
-                <w:color w:val="000000"/>
-                <w:sz w:val="20"/>
-                <w:szCs w:val="20"/>
-                <w:lang w:val="id-ID"/>
-              </w:rPr>
-              <w:t xml:space="preserve">, struktur kuadrat digunakan sebagai dasar algoritma optimasi, pengolahan citra digital grafik 3D, dan pemodelan kurva lengkung desain objek. Ketiga, ia berhubungan langsung dengan </w:t>
-            </w:r>
-            <w:r>
-              <w:rPr>
-                <w:rFonts w:ascii="Arial Nova" w:hAnsi="Arial Nova" w:cs="Segoe UI Symbol"/>
-                <w:b/>
-                <w:color w:val="000000"/>
-                <w:sz w:val="20"/>
-                <w:szCs w:val="20"/>
-                <w:lang w:val="id-ID"/>
-              </w:rPr>
-              <w:t>Ekonomi</w:t>
-            </w:r>
-            <w:r>
-              <w:rPr>
-                <w:rFonts w:ascii="Arial Nova" w:hAnsi="Arial Nova" w:cs="Segoe UI Symbol"/>
-                <w:color w:val="000000"/>
-                <w:sz w:val="20"/>
-                <w:szCs w:val="20"/>
-                <w:lang w:val="id-ID"/>
-              </w:rPr>
-              <w:t>, terutama dalam kalkulasi maksimalisasi keuntungan perusahaan atau minimalisasi biaya produksi berdasarkan fungsi biaya kuadratik.</w:t>
+              <w:t>{</w:t>
+            </w:r>
+            <w:proofErr w:type="spellStart"/>
+            <w:r>
+              <w:t>lintas_disiplin_ilmu</w:t>
+            </w:r>
+            <w:proofErr w:type="spellEnd"/>
+            <w:r>
+              <w:t>}</w:t>
             </w:r>
           </w:p>
         </w:tc>
@@ -2792,7 +2970,6 @@
                 <w:szCs w:val="20"/>
                 <w:lang w:val="id-ID" w:eastAsia="en-ID"/>
               </w:rPr>
-              <w:lastRenderedPageBreak/>
               <w:t>Moda Pembelajaran:</w:t>
             </w:r>
           </w:p>
@@ -3750,20 +3927,36 @@
           <w:p>
             <w:r>
               <w:t>{integrity_checked ? '☑' : '☐'} Integrity</w:t>
+            </w:r>
+            <w:r>
               <w:br/>
               <w:t>{mindful_checked ? '☑' : '☐'} Mindful</w:t>
+            </w:r>
+            <w:r>
               <w:br/>
               <w:t>{progressive_checked ? '☑' : '☐'} Progressive</w:t>
+            </w:r>
+            <w:r>
               <w:br/>
               <w:t>☐ Agility</w:t>
+            </w:r>
+            <w:r>
               <w:br/>
               <w:t>☐ Compassion</w:t>
+            </w:r>
+            <w:r>
               <w:br/>
               <w:t>☐ Tenacity</w:t>
+            </w:r>
+            <w:r>
               <w:br/>
               <w:t>☐ Fidelity</w:t>
+            </w:r>
+            <w:r>
               <w:br/>
               <w:t>☐ Uplifting</w:t>
+            </w:r>
+            <w:r>
               <w:br/>
               <w:t>☐ Lifelong Learner.</w:t>
             </w:r>
@@ -3777,12 +3970,20 @@
           <w:p>
             <w:r>
               <w:t>{FOR val IN sasaran_profil_sekolah}</w:t>
+            </w:r>
+            <w:r>
               <w:br/>
               <w:t>{$val.nilai}:</w:t>
+            </w:r>
+            <w:r>
               <w:br/>
               <w:t>{FOR ind IN $val.indikator}• {$ind}</w:t>
+            </w:r>
+            <w:r>
               <w:br/>
               <w:t>{END-FOR ind}</w:t>
+            </w:r>
+            <w:r>
               <w:br/>
               <w:t>{END-FOR val}</w:t>
             </w:r>
@@ -3897,6 +4098,7 @@
                 <w:szCs w:val="20"/>
                 <w:lang w:val="id-ID" w:eastAsia="en-ID"/>
               </w:rPr>
+              <w:lastRenderedPageBreak/>
               <w:t>TP:</w:t>
             </w:r>
           </w:p>
@@ -4186,6 +4388,9 @@
             <w:tcW w:w="1307" w:type="dxa"/>
           </w:tcPr>
           <w:p>
+            <w:pPr>
+              <w:cnfStyle w:val="000000000000" w:firstRow="0" w:lastRow="0" w:firstColumn="0" w:lastColumn="0" w:oddVBand="0" w:evenVBand="0" w:oddHBand="0" w:evenHBand="0" w:firstRowFirstColumn="0" w:firstRowLastColumn="0" w:lastRowFirstColumn="0" w:lastRowLastColumn="0"/>
+            </w:pPr>
             <w:r>
               <w:t>{$p.aktivitas_pembelajaran[0].tahapan_sintaks}</w:t>
             </w:r>
@@ -4197,6 +4402,9 @@
             <w:gridSpan w:val="2"/>
           </w:tcPr>
           <w:p>
+            <w:pPr>
+              <w:cnfStyle w:val="000000000000" w:firstRow="0" w:lastRow="0" w:firstColumn="0" w:lastColumn="0" w:oddVBand="0" w:evenVBand="0" w:oddHBand="0" w:evenHBand="0" w:firstRowFirstColumn="0" w:firstRowLastColumn="0" w:lastRowFirstColumn="0" w:lastRowLastColumn="0"/>
+            </w:pPr>
             <w:r>
               <w:t>{$p.aktivitas_pembelajaran[0].prosedur_guru}</w:t>
             </w:r>
@@ -4207,6 +4415,9 @@
             <w:tcW w:w="1969" w:type="dxa"/>
           </w:tcPr>
           <w:p>
+            <w:pPr>
+              <w:cnfStyle w:val="000000000000" w:firstRow="0" w:lastRow="0" w:firstColumn="0" w:lastColumn="0" w:oddVBand="0" w:evenVBand="0" w:oddHBand="0" w:evenHBand="0" w:firstRowFirstColumn="0" w:firstRowLastColumn="0" w:lastRowFirstColumn="0" w:lastRowLastColumn="0"/>
+            </w:pPr>
             <w:r>
               <w:t>{$p.aktivitas_pembelajaran[0].prosedur_siswa}</w:t>
             </w:r>
@@ -4217,8 +4428,13 @@
             <w:tcW w:w="1294" w:type="dxa"/>
           </w:tcPr>
           <w:p>
+            <w:pPr>
+              <w:cnfStyle w:val="000000000000" w:firstRow="0" w:lastRow="0" w:firstColumn="0" w:lastColumn="0" w:oddVBand="0" w:evenVBand="0" w:oddHBand="0" w:evenHBand="0" w:firstRowFirstColumn="0" w:firstRowLastColumn="0" w:lastRowFirstColumn="0" w:lastRowLastColumn="0"/>
+            </w:pPr>
             <w:r>
               <w:t>{FOR pk IN $p.aktivitas_pembelajaran[0].pertanyaan_kunci}{$pk}</w:t>
+            </w:r>
+            <w:r>
               <w:br/>
               <w:t>{END-FOR pk}</w:t>
             </w:r>
@@ -4229,7 +4445,9 @@
             <w:tcW w:w="2418" w:type="dxa"/>
           </w:tcPr>
           <w:p>
-            <w:r/>
+            <w:pPr>
+              <w:cnfStyle w:val="000000000000" w:firstRow="0" w:lastRow="0" w:firstColumn="0" w:lastColumn="0" w:oddVBand="0" w:evenVBand="0" w:oddHBand="0" w:evenHBand="0" w:firstRowFirstColumn="0" w:firstRowLastColumn="0" w:lastRowFirstColumn="0" w:lastRowLastColumn="0"/>
+            </w:pPr>
             <w:r>
               <w:rPr>
                 <w:b/>
@@ -4287,7 +4505,6 @@
                 <w:szCs w:val="20"/>
                 <w:lang w:val="id-ID" w:eastAsia="en-ID"/>
               </w:rPr>
-              <w:lastRenderedPageBreak/>
               <w:t>INTI (Berkesadaran, Bermakna, Menggembirakan)</w:t>
             </w:r>
           </w:p>
@@ -4310,6 +4527,9 @@
             <w:tcW w:w="1307" w:type="dxa"/>
           </w:tcPr>
           <w:p>
+            <w:pPr>
+              <w:cnfStyle w:val="000000000000" w:firstRow="0" w:lastRow="0" w:firstColumn="0" w:lastColumn="0" w:oddVBand="0" w:evenVBand="0" w:oddHBand="0" w:evenHBand="0" w:firstRowFirstColumn="0" w:firstRowLastColumn="0" w:lastRowFirstColumn="0" w:lastRowLastColumn="0"/>
+            </w:pPr>
             <w:r>
               <w:t>{$p.aktivitas_pembelajaran[1].tahapan_sintaks}</w:t>
             </w:r>
@@ -4321,6 +4541,9 @@
             <w:gridSpan w:val="2"/>
           </w:tcPr>
           <w:p>
+            <w:pPr>
+              <w:cnfStyle w:val="000000000000" w:firstRow="0" w:lastRow="0" w:firstColumn="0" w:lastColumn="0" w:oddVBand="0" w:evenVBand="0" w:oddHBand="0" w:evenHBand="0" w:firstRowFirstColumn="0" w:firstRowLastColumn="0" w:lastRowFirstColumn="0" w:lastRowLastColumn="0"/>
+            </w:pPr>
             <w:r>
               <w:t>{$p.aktivitas_pembelajaran[1].prosedur_guru}</w:t>
             </w:r>
@@ -4331,6 +4554,9 @@
             <w:tcW w:w="1969" w:type="dxa"/>
           </w:tcPr>
           <w:p>
+            <w:pPr>
+              <w:cnfStyle w:val="000000000000" w:firstRow="0" w:lastRow="0" w:firstColumn="0" w:lastColumn="0" w:oddVBand="0" w:evenVBand="0" w:oddHBand="0" w:evenHBand="0" w:firstRowFirstColumn="0" w:firstRowLastColumn="0" w:lastRowFirstColumn="0" w:lastRowLastColumn="0"/>
+            </w:pPr>
             <w:r>
               <w:t>{$p.aktivitas_pembelajaran[1].prosedur_siswa}</w:t>
             </w:r>
@@ -4341,8 +4567,13 @@
             <w:tcW w:w="1294" w:type="dxa"/>
           </w:tcPr>
           <w:p>
+            <w:pPr>
+              <w:cnfStyle w:val="000000000000" w:firstRow="0" w:lastRow="0" w:firstColumn="0" w:lastColumn="0" w:oddVBand="0" w:evenVBand="0" w:oddHBand="0" w:evenHBand="0" w:firstRowFirstColumn="0" w:firstRowLastColumn="0" w:lastRowFirstColumn="0" w:lastRowLastColumn="0"/>
+            </w:pPr>
             <w:r>
               <w:t>{FOR pk IN $p.aktivitas_pembelajaran[1].pertanyaan_kunci}{$pk}</w:t>
+            </w:r>
+            <w:r>
               <w:br/>
               <w:t>{END-FOR pk}</w:t>
             </w:r>
@@ -4353,7 +4584,9 @@
             <w:tcW w:w="2418" w:type="dxa"/>
           </w:tcPr>
           <w:p>
-            <w:r/>
+            <w:pPr>
+              <w:cnfStyle w:val="000000000000" w:firstRow="0" w:lastRow="0" w:firstColumn="0" w:lastColumn="0" w:oddVBand="0" w:evenVBand="0" w:oddHBand="0" w:evenHBand="0" w:firstRowFirstColumn="0" w:firstRowLastColumn="0" w:lastRowFirstColumn="0" w:lastRowLastColumn="0"/>
+            </w:pPr>
             <w:r>
               <w:rPr>
                 <w:b/>
@@ -4367,7 +4600,14 @@
               <w:rPr>
                 <w:b/>
               </w:rPr>
-              <w:t>{$p.aktivitas_pembelajaran[1].muatan_inovatif.differentiation ? 'Differentiation (' + $p.aktivitas_pembelajaran[1].muatan_inovatif.differentiation.type + '): ' : ''}</w:t>
+              <w:t xml:space="preserve">{$p.aktivitas_pembelajaran[1].muatan_inovatif.differentiation ? 'Differentiation (' + </w:t>
+            </w:r>
+            <w:r>
+              <w:rPr>
+                <w:b/>
+              </w:rPr>
+              <w:lastRenderedPageBreak/>
+              <w:t>$p.aktivitas_pembelajaran[1].muatan_inovatif.differentiation.type + '): ' : ''}</w:t>
             </w:r>
             <w:r>
               <w:t>{$p.aktivitas_pembelajaran[1].muatan_inovatif.differentiation ? $p.aktivitas_pembelajaran[1].muatan_inovatif.differentiation.deskripsi : ''}</w:t>
@@ -4392,6 +4632,7 @@
           </w:tcPr>
           <w:p>
             <w:r>
+              <w:lastRenderedPageBreak/>
               <w:t>{$p.aktivitas_pembelajaran[2].waktu_menit}'</w:t>
             </w:r>
           </w:p>
@@ -4401,6 +4642,9 @@
             <w:tcW w:w="1307" w:type="dxa"/>
           </w:tcPr>
           <w:p>
+            <w:pPr>
+              <w:cnfStyle w:val="000000000000" w:firstRow="0" w:lastRow="0" w:firstColumn="0" w:lastColumn="0" w:oddVBand="0" w:evenVBand="0" w:oddHBand="0" w:evenHBand="0" w:firstRowFirstColumn="0" w:firstRowLastColumn="0" w:lastRowFirstColumn="0" w:lastRowLastColumn="0"/>
+            </w:pPr>
             <w:r>
               <w:t>{$p.aktivitas_pembelajaran[2].tahapan_sintaks}</w:t>
             </w:r>
@@ -4412,6 +4656,9 @@
             <w:gridSpan w:val="2"/>
           </w:tcPr>
           <w:p>
+            <w:pPr>
+              <w:cnfStyle w:val="000000000000" w:firstRow="0" w:lastRow="0" w:firstColumn="0" w:lastColumn="0" w:oddVBand="0" w:evenVBand="0" w:oddHBand="0" w:evenHBand="0" w:firstRowFirstColumn="0" w:firstRowLastColumn="0" w:lastRowFirstColumn="0" w:lastRowLastColumn="0"/>
+            </w:pPr>
             <w:r>
               <w:t>{$p.aktivitas_pembelajaran[2].prosedur_guru}</w:t>
             </w:r>
@@ -4422,6 +4669,9 @@
             <w:tcW w:w="1969" w:type="dxa"/>
           </w:tcPr>
           <w:p>
+            <w:pPr>
+              <w:cnfStyle w:val="000000000000" w:firstRow="0" w:lastRow="0" w:firstColumn="0" w:lastColumn="0" w:oddVBand="0" w:evenVBand="0" w:oddHBand="0" w:evenHBand="0" w:firstRowFirstColumn="0" w:firstRowLastColumn="0" w:lastRowFirstColumn="0" w:lastRowLastColumn="0"/>
+            </w:pPr>
             <w:r>
               <w:t>{$p.aktivitas_pembelajaran[2].prosedur_siswa}</w:t>
             </w:r>
@@ -4432,8 +4682,13 @@
             <w:tcW w:w="1294" w:type="dxa"/>
           </w:tcPr>
           <w:p>
+            <w:pPr>
+              <w:cnfStyle w:val="000000000000" w:firstRow="0" w:lastRow="0" w:firstColumn="0" w:lastColumn="0" w:oddVBand="0" w:evenVBand="0" w:oddHBand="0" w:evenHBand="0" w:firstRowFirstColumn="0" w:firstRowLastColumn="0" w:lastRowFirstColumn="0" w:lastRowLastColumn="0"/>
+            </w:pPr>
             <w:r>
               <w:t>{FOR pk IN $p.aktivitas_pembelajaran[2].pertanyaan_kunci}{$pk}</w:t>
+            </w:r>
+            <w:r>
               <w:br/>
               <w:t>{END-FOR pk}</w:t>
             </w:r>
@@ -4444,7 +4699,9 @@
             <w:tcW w:w="2418" w:type="dxa"/>
           </w:tcPr>
           <w:p>
-            <w:r/>
+            <w:pPr>
+              <w:cnfStyle w:val="000000000000" w:firstRow="0" w:lastRow="0" w:firstColumn="0" w:lastColumn="0" w:oddVBand="0" w:evenVBand="0" w:oddHBand="0" w:evenHBand="0" w:firstRowFirstColumn="0" w:firstRowLastColumn="0" w:lastRowFirstColumn="0" w:lastRowLastColumn="0"/>
+            </w:pPr>
             <w:r>
               <w:rPr>
                 <w:b/>
@@ -4483,6 +4740,7 @@
           </w:tcPr>
           <w:p>
             <w:r>
+              <w:lastRenderedPageBreak/>
               <w:t>{$p.aktivitas_pembelajaran[3].waktu_menit}'</w:t>
             </w:r>
           </w:p>
@@ -4492,6 +4750,9 @@
             <w:tcW w:w="1307" w:type="dxa"/>
           </w:tcPr>
           <w:p>
+            <w:pPr>
+              <w:cnfStyle w:val="000000000000" w:firstRow="0" w:lastRow="0" w:firstColumn="0" w:lastColumn="0" w:oddVBand="0" w:evenVBand="0" w:oddHBand="0" w:evenHBand="0" w:firstRowFirstColumn="0" w:firstRowLastColumn="0" w:lastRowFirstColumn="0" w:lastRowLastColumn="0"/>
+            </w:pPr>
             <w:r>
               <w:t>{$p.aktivitas_pembelajaran[3].tahapan_sintaks}</w:t>
             </w:r>
@@ -4503,6 +4764,9 @@
             <w:gridSpan w:val="2"/>
           </w:tcPr>
           <w:p>
+            <w:pPr>
+              <w:cnfStyle w:val="000000000000" w:firstRow="0" w:lastRow="0" w:firstColumn="0" w:lastColumn="0" w:oddVBand="0" w:evenVBand="0" w:oddHBand="0" w:evenHBand="0" w:firstRowFirstColumn="0" w:firstRowLastColumn="0" w:lastRowFirstColumn="0" w:lastRowLastColumn="0"/>
+            </w:pPr>
             <w:r>
               <w:t>{$p.aktivitas_pembelajaran[3].prosedur_guru}</w:t>
             </w:r>
@@ -4513,6 +4777,9 @@
             <w:tcW w:w="1969" w:type="dxa"/>
           </w:tcPr>
           <w:p>
+            <w:pPr>
+              <w:cnfStyle w:val="000000000000" w:firstRow="0" w:lastRow="0" w:firstColumn="0" w:lastColumn="0" w:oddVBand="0" w:evenVBand="0" w:oddHBand="0" w:evenHBand="0" w:firstRowFirstColumn="0" w:firstRowLastColumn="0" w:lastRowFirstColumn="0" w:lastRowLastColumn="0"/>
+            </w:pPr>
             <w:r>
               <w:t>{$p.aktivitas_pembelajaran[3].prosedur_siswa}</w:t>
             </w:r>
@@ -4523,8 +4790,13 @@
             <w:tcW w:w="1294" w:type="dxa"/>
           </w:tcPr>
           <w:p>
+            <w:pPr>
+              <w:cnfStyle w:val="000000000000" w:firstRow="0" w:lastRow="0" w:firstColumn="0" w:lastColumn="0" w:oddVBand="0" w:evenVBand="0" w:oddHBand="0" w:evenHBand="0" w:firstRowFirstColumn="0" w:firstRowLastColumn="0" w:lastRowFirstColumn="0" w:lastRowLastColumn="0"/>
+            </w:pPr>
             <w:r>
               <w:t>{FOR pk IN $p.aktivitas_pembelajaran[3].pertanyaan_kunci}{$pk}</w:t>
+            </w:r>
+            <w:r>
               <w:br/>
               <w:t>{END-FOR pk}</w:t>
             </w:r>
@@ -4535,7 +4807,9 @@
             <w:tcW w:w="2418" w:type="dxa"/>
           </w:tcPr>
           <w:p>
-            <w:r/>
+            <w:pPr>
+              <w:cnfStyle w:val="000000000000" w:firstRow="0" w:lastRow="0" w:firstColumn="0" w:lastColumn="0" w:oddVBand="0" w:evenVBand="0" w:oddHBand="0" w:evenHBand="0" w:firstRowFirstColumn="0" w:firstRowLastColumn="0" w:lastRowFirstColumn="0" w:lastRowLastColumn="0"/>
+            </w:pPr>
             <w:r>
               <w:rPr>
                 <w:b/>
@@ -4613,6 +4887,9 @@
             <w:tcW w:w="1307" w:type="dxa"/>
           </w:tcPr>
           <w:p>
+            <w:pPr>
+              <w:cnfStyle w:val="000000000000" w:firstRow="0" w:lastRow="0" w:firstColumn="0" w:lastColumn="0" w:oddVBand="0" w:evenVBand="0" w:oddHBand="0" w:evenHBand="0" w:firstRowFirstColumn="0" w:firstRowLastColumn="0" w:lastRowFirstColumn="0" w:lastRowLastColumn="0"/>
+            </w:pPr>
             <w:r>
               <w:t>{$p.aktivitas_pembelajaran[4].tahapan_sintaks}</w:t>
             </w:r>
@@ -4624,6 +4901,9 @@
             <w:gridSpan w:val="2"/>
           </w:tcPr>
           <w:p>
+            <w:pPr>
+              <w:cnfStyle w:val="000000000000" w:firstRow="0" w:lastRow="0" w:firstColumn="0" w:lastColumn="0" w:oddVBand="0" w:evenVBand="0" w:oddHBand="0" w:evenHBand="0" w:firstRowFirstColumn="0" w:firstRowLastColumn="0" w:lastRowFirstColumn="0" w:lastRowLastColumn="0"/>
+            </w:pPr>
             <w:r>
               <w:t>{$p.aktivitas_pembelajaran[4].prosedur_guru}</w:t>
             </w:r>
@@ -4634,6 +4914,9 @@
             <w:tcW w:w="1969" w:type="dxa"/>
           </w:tcPr>
           <w:p>
+            <w:pPr>
+              <w:cnfStyle w:val="000000000000" w:firstRow="0" w:lastRow="0" w:firstColumn="0" w:lastColumn="0" w:oddVBand="0" w:evenVBand="0" w:oddHBand="0" w:evenHBand="0" w:firstRowFirstColumn="0" w:firstRowLastColumn="0" w:lastRowFirstColumn="0" w:lastRowLastColumn="0"/>
+            </w:pPr>
             <w:r>
               <w:t>{$p.aktivitas_pembelajaran[4].prosedur_siswa}</w:t>
             </w:r>
@@ -4644,8 +4927,13 @@
             <w:tcW w:w="1294" w:type="dxa"/>
           </w:tcPr>
           <w:p>
+            <w:pPr>
+              <w:cnfStyle w:val="000000000000" w:firstRow="0" w:lastRow="0" w:firstColumn="0" w:lastColumn="0" w:oddVBand="0" w:evenVBand="0" w:oddHBand="0" w:evenHBand="0" w:firstRowFirstColumn="0" w:firstRowLastColumn="0" w:lastRowFirstColumn="0" w:lastRowLastColumn="0"/>
+            </w:pPr>
             <w:r>
               <w:t>{FOR pk IN $p.aktivitas_pembelajaran[4].pertanyaan_kunci}{$pk}</w:t>
+            </w:r>
+            <w:r>
               <w:br/>
               <w:t>{END-FOR pk}</w:t>
             </w:r>
@@ -4656,7 +4944,9 @@
             <w:tcW w:w="2418" w:type="dxa"/>
           </w:tcPr>
           <w:p>
-            <w:r/>
+            <w:pPr>
+              <w:cnfStyle w:val="000000000000" w:firstRow="0" w:lastRow="0" w:firstColumn="0" w:lastColumn="0" w:oddVBand="0" w:evenVBand="0" w:oddHBand="0" w:evenHBand="0" w:firstRowFirstColumn="0" w:firstRowLastColumn="0" w:lastRowFirstColumn="0" w:lastRowLastColumn="0"/>
+            </w:pPr>
             <w:r>
               <w:rPr>
                 <w:b/>
@@ -4673,7 +4963,11 @@
               <w:t>{$p.aktivitas_pembelajaran[4].muatan_inovatif.differentiation ? 'Differentiation (' + $p.aktivitas_pembelajaran[4].muatan_inovatif.differentiation.type + '): ' : ''}</w:t>
             </w:r>
             <w:r>
-              <w:t>{$p.aktivitas_pembelajaran[4].muatan_inovatif.differentiation ? $p.aktivitas_pembelajaran[4].muatan_inovatif.differentiation.deskripsi : ''}</w:t>
+              <w:t>{$p.aktivitas_pembelajaran[4].muatan_inovatif.</w:t>
+            </w:r>
+            <w:r>
+              <w:lastRenderedPageBreak/>
+              <w:t>differentiation ? $p.aktivitas_pembelajaran[4].muatan_inovatif.differentiation.deskripsi : ''}</w:t>
             </w:r>
             <w:r>
               <w:rPr>
@@ -4698,6 +4992,7 @@
           </w:tcPr>
           <w:p>
             <w:r>
+              <w:lastRenderedPageBreak/>
               <w:t>{$p.aktivitas_pembelajaran[5].waktu_menit}'</w:t>
             </w:r>
           </w:p>
@@ -4710,6 +5005,9 @@
             </w:tcBorders>
           </w:tcPr>
           <w:p>
+            <w:pPr>
+              <w:cnfStyle w:val="000000000000" w:firstRow="0" w:lastRow="0" w:firstColumn="0" w:lastColumn="0" w:oddVBand="0" w:evenVBand="0" w:oddHBand="0" w:evenHBand="0" w:firstRowFirstColumn="0" w:firstRowLastColumn="0" w:lastRowFirstColumn="0" w:lastRowLastColumn="0"/>
+            </w:pPr>
             <w:r>
               <w:t>{$p.aktivitas_pembelajaran[5].tahapan_sintaks}</w:t>
             </w:r>
@@ -4724,6 +5022,9 @@
             </w:tcBorders>
           </w:tcPr>
           <w:p>
+            <w:pPr>
+              <w:cnfStyle w:val="000000000000" w:firstRow="0" w:lastRow="0" w:firstColumn="0" w:lastColumn="0" w:oddVBand="0" w:evenVBand="0" w:oddHBand="0" w:evenHBand="0" w:firstRowFirstColumn="0" w:firstRowLastColumn="0" w:lastRowFirstColumn="0" w:lastRowLastColumn="0"/>
+            </w:pPr>
             <w:r>
               <w:t>{$p.aktivitas_pembelajaran[5].prosedur_guru}</w:t>
             </w:r>
@@ -4737,6 +5038,9 @@
             </w:tcBorders>
           </w:tcPr>
           <w:p>
+            <w:pPr>
+              <w:cnfStyle w:val="000000000000" w:firstRow="0" w:lastRow="0" w:firstColumn="0" w:lastColumn="0" w:oddVBand="0" w:evenVBand="0" w:oddHBand="0" w:evenHBand="0" w:firstRowFirstColumn="0" w:firstRowLastColumn="0" w:lastRowFirstColumn="0" w:lastRowLastColumn="0"/>
+            </w:pPr>
             <w:r>
               <w:t>{$p.aktivitas_pembelajaran[5].prosedur_siswa}</w:t>
             </w:r>
@@ -4750,8 +5054,13 @@
             </w:tcBorders>
           </w:tcPr>
           <w:p>
+            <w:pPr>
+              <w:cnfStyle w:val="000000000000" w:firstRow="0" w:lastRow="0" w:firstColumn="0" w:lastColumn="0" w:oddVBand="0" w:evenVBand="0" w:oddHBand="0" w:evenHBand="0" w:firstRowFirstColumn="0" w:firstRowLastColumn="0" w:lastRowFirstColumn="0" w:lastRowLastColumn="0"/>
+            </w:pPr>
             <w:r>
               <w:t>{FOR pk IN $p.aktivitas_pembelajaran[5].pertanyaan_kunci}{$pk}</w:t>
+            </w:r>
+            <w:r>
               <w:br/>
               <w:t>{END-FOR pk}</w:t>
             </w:r>
@@ -4765,7 +5074,9 @@
             </w:tcBorders>
           </w:tcPr>
           <w:p>
-            <w:r/>
+            <w:pPr>
+              <w:cnfStyle w:val="000000000000" w:firstRow="0" w:lastRow="0" w:firstColumn="0" w:lastColumn="0" w:oddVBand="0" w:evenVBand="0" w:oddHBand="0" w:evenHBand="0" w:firstRowFirstColumn="0" w:firstRowLastColumn="0" w:lastRowFirstColumn="0" w:lastRowLastColumn="0"/>
+            </w:pPr>
             <w:r>
               <w:rPr>
                 <w:b/>
@@ -4934,7 +5245,6 @@
                 <w:rFonts w:ascii="Arial Nova" w:eastAsia="Times New Roman" w:hAnsi="Arial Nova" w:cs="Times New Roman"/>
                 <w:b w:val="0"/>
                 <w:bCs w:val="0"/>
-                <w:color w:val="FFFFFF" w:themeColor="background1"/>
                 <w:sz w:val="20"/>
                 <w:szCs w:val="20"/>
                 <w:lang w:val="id-ID" w:eastAsia="en-ID"/>
@@ -4971,7 +5281,6 @@
                 <w:rFonts w:ascii="Arial Nova" w:eastAsia="Times New Roman" w:hAnsi="Arial Nova" w:cs="Times New Roman"/>
                 <w:b w:val="0"/>
                 <w:bCs w:val="0"/>
-                <w:color w:val="FFFFFF" w:themeColor="background1"/>
                 <w:sz w:val="20"/>
                 <w:szCs w:val="20"/>
                 <w:lang w:val="id-ID" w:eastAsia="en-ID"/>
@@ -5008,7 +5317,6 @@
                 <w:rFonts w:ascii="Arial Nova" w:eastAsia="Times New Roman" w:hAnsi="Arial Nova" w:cs="Times New Roman"/>
                 <w:b w:val="0"/>
                 <w:bCs w:val="0"/>
-                <w:color w:val="FFFFFF" w:themeColor="background1"/>
                 <w:sz w:val="20"/>
                 <w:szCs w:val="20"/>
                 <w:lang w:val="id-ID" w:eastAsia="en-ID"/>
@@ -5028,39 +5336,44 @@
             <w:tcW w:w="1279" w:type="dxa"/>
           </w:tcPr>
           <w:p>
-            <w:r/>
+            <w:r>
+              <w:t>{$p.asesmen[0].jenis}</w:t>
+            </w:r>
+          </w:p>
+        </w:tc>
+        <w:tc>
+          <w:tcPr>
+            <w:tcW w:w="3029" w:type="dxa"/>
+          </w:tcPr>
+          <w:p>
+            <w:pPr>
+              <w:cnfStyle w:val="000000100000" w:firstRow="0" w:lastRow="0" w:firstColumn="0" w:lastColumn="0" w:oddVBand="0" w:evenVBand="0" w:oddHBand="1" w:evenHBand="0" w:firstRowFirstColumn="0" w:firstRowLastColumn="0" w:lastRowFirstColumn="0" w:lastRowLastColumn="0"/>
+            </w:pPr>
+            <w:r>
+              <w:t>{$p.asesmen[0].bentuk}</w:t>
+            </w:r>
+          </w:p>
+        </w:tc>
+        <w:tc>
+          <w:tcPr>
+            <w:tcW w:w="5659" w:type="dxa"/>
+          </w:tcPr>
+          <w:p>
+            <w:pPr>
+              <w:cnfStyle w:val="000000100000" w:firstRow="0" w:lastRow="0" w:firstColumn="0" w:lastColumn="0" w:oddVBand="0" w:evenVBand="0" w:oddHBand="1" w:evenHBand="0" w:firstRowFirstColumn="0" w:firstRowLastColumn="0" w:lastRowFirstColumn="0" w:lastRowLastColumn="0"/>
+            </w:pPr>
             <w:r>
               <w:rPr>
                 <w:b/>
               </w:rPr>
-              <w:t>{$p.asesmen[0].jenis}</w:t>
-            </w:r>
-          </w:p>
-        </w:tc>
-        <w:tc>
-          <w:tcPr>
-            <w:tcW w:w="3029" w:type="dxa"/>
-          </w:tcPr>
-          <w:p>
-            <w:r>
-              <w:t>{$p.asesmen[0].bentuk}</w:t>
-            </w:r>
-          </w:p>
-        </w:tc>
-        <w:tc>
-          <w:tcPr>
-            <w:tcW w:w="5659" w:type="dxa"/>
-          </w:tcPr>
-          <w:p>
-            <w:r/>
-            <w:r>
-              <w:rPr>
-                <w:b/>
-              </w:rPr>
               <w:t>{$p.asesmen[0].lampiran.includes(':') ? $p.asesmen[0].lampiran.split(':')[0] + ':' : ''}</w:t>
             </w:r>
             <w:r>
-              <w:t>{$p.asesmen[0].lampiran.includes(':') ? $p.asesmen[0].lampiran.substring($p.asesmen[0].lampiran.indexOf(':') + 1) : $p.asesmen[0].lampiran}</w:t>
+              <w:t xml:space="preserve">{$p.asesmen[0].lampiran.includes(':') ? </w:t>
+            </w:r>
+            <w:r>
+              <w:lastRenderedPageBreak/>
+              <w:t>$p.asesmen[0].lampiran.substring($p.asesmen[0].lampiran.indexOf(':') + 1) : $p.asesmen[0].lampiran}</w:t>
             </w:r>
           </w:p>
         </w:tc>
@@ -5072,11 +5385,8 @@
             <w:tcW w:w="1279" w:type="dxa"/>
           </w:tcPr>
           <w:p>
-            <w:r/>
-            <w:r>
-              <w:rPr>
-                <w:b/>
-              </w:rPr>
+            <w:r>
+              <w:lastRenderedPageBreak/>
               <w:t>{$p.asesmen[1].jenis}</w:t>
             </w:r>
           </w:p>
@@ -5086,6 +5396,9 @@
             <w:tcW w:w="3029" w:type="dxa"/>
           </w:tcPr>
           <w:p>
+            <w:pPr>
+              <w:cnfStyle w:val="000000000000" w:firstRow="0" w:lastRow="0" w:firstColumn="0" w:lastColumn="0" w:oddVBand="0" w:evenVBand="0" w:oddHBand="0" w:evenHBand="0" w:firstRowFirstColumn="0" w:firstRowLastColumn="0" w:lastRowFirstColumn="0" w:lastRowLastColumn="0"/>
+            </w:pPr>
             <w:r>
               <w:t>{$p.asesmen[1].bentuk}</w:t>
             </w:r>
@@ -5096,7 +5409,9 @@
             <w:tcW w:w="5659" w:type="dxa"/>
           </w:tcPr>
           <w:p>
-            <w:r/>
+            <w:pPr>
+              <w:cnfStyle w:val="000000000000" w:firstRow="0" w:lastRow="0" w:firstColumn="0" w:lastColumn="0" w:oddVBand="0" w:evenVBand="0" w:oddHBand="0" w:evenHBand="0" w:firstRowFirstColumn="0" w:firstRowLastColumn="0" w:lastRowFirstColumn="0" w:lastRowLastColumn="0"/>
+            </w:pPr>
             <w:r>
               <w:rPr>
                 <w:b/>
@@ -5119,11 +5434,7 @@
             <w:tcW w:w="1279" w:type="dxa"/>
           </w:tcPr>
           <w:p>
-            <w:r/>
-            <w:r>
-              <w:rPr>
-                <w:b/>
-              </w:rPr>
+            <w:r>
               <w:t>{$p.asesmen[2].jenis}</w:t>
             </w:r>
           </w:p>
@@ -5133,6 +5444,9 @@
             <w:tcW w:w="3029" w:type="dxa"/>
           </w:tcPr>
           <w:p>
+            <w:pPr>
+              <w:cnfStyle w:val="000000100000" w:firstRow="0" w:lastRow="0" w:firstColumn="0" w:lastColumn="0" w:oddVBand="0" w:evenVBand="0" w:oddHBand="1" w:evenHBand="0" w:firstRowFirstColumn="0" w:firstRowLastColumn="0" w:lastRowFirstColumn="0" w:lastRowLastColumn="0"/>
+            </w:pPr>
             <w:r>
               <w:t>{$p.asesmen[2].bentuk}</w:t>
             </w:r>
@@ -5143,7 +5457,9 @@
             <w:tcW w:w="5659" w:type="dxa"/>
           </w:tcPr>
           <w:p>
-            <w:r/>
+            <w:pPr>
+              <w:cnfStyle w:val="000000100000" w:firstRow="0" w:lastRow="0" w:firstColumn="0" w:lastColumn="0" w:oddVBand="0" w:evenVBand="0" w:oddHBand="1" w:evenHBand="0" w:firstRowFirstColumn="0" w:firstRowLastColumn="0" w:lastRowFirstColumn="0" w:lastRowLastColumn="0"/>
+            </w:pPr>
             <w:r>
               <w:rPr>
                 <w:b/>
@@ -5163,11 +5479,7 @@
             <w:tcW w:w="1279" w:type="dxa"/>
           </w:tcPr>
           <w:p>
-            <w:r/>
-            <w:r>
-              <w:rPr>
-                <w:b/>
-              </w:rPr>
+            <w:r>
               <w:t>{$p.asesmen[3].jenis}</w:t>
             </w:r>
           </w:p>
@@ -5177,6 +5489,9 @@
             <w:tcW w:w="3029" w:type="dxa"/>
           </w:tcPr>
           <w:p>
+            <w:pPr>
+              <w:cnfStyle w:val="000000000000" w:firstRow="0" w:lastRow="0" w:firstColumn="0" w:lastColumn="0" w:oddVBand="0" w:evenVBand="0" w:oddHBand="0" w:evenHBand="0" w:firstRowFirstColumn="0" w:firstRowLastColumn="0" w:lastRowFirstColumn="0" w:lastRowLastColumn="0"/>
+            </w:pPr>
             <w:r>
               <w:t>{$p.asesmen[3].bentuk}</w:t>
             </w:r>
@@ -5187,7 +5502,9 @@
             <w:tcW w:w="5659" w:type="dxa"/>
           </w:tcPr>
           <w:p>
-            <w:r/>
+            <w:pPr>
+              <w:cnfStyle w:val="000000000000" w:firstRow="0" w:lastRow="0" w:firstColumn="0" w:lastColumn="0" w:oddVBand="0" w:evenVBand="0" w:oddHBand="0" w:evenHBand="0" w:firstRowFirstColumn="0" w:firstRowLastColumn="0" w:lastRowFirstColumn="0" w:lastRowLastColumn="0"/>
+            </w:pPr>
             <w:r>
               <w:rPr>
                 <w:b/>
@@ -5551,6 +5868,12 @@
         <w:br w:type="page"/>
       </w:r>
     </w:p>
+    <w:sectPr>
+      <w:pgSz w:w="11906" w:h="16838"/>
+      <w:pgMar w:top="1440" w:right="1440" w:bottom="1440" w:left="1440" w:header="708" w:footer="708" w:gutter="0"/>
+      <w:cols w:space="708"/>
+      <w:docGrid w:linePitch="360"/>
+    </w:sectPr>
   </w:body>
 </w:document>
 </file>

</xml_diff>

<commit_message>
feat: make all 9 school profile checkboxes dynamic and format the indicators list with bold sequential numbers and bullet points
</commit_message>
<xml_diff>
--- a/template.docx
+++ b/template.docx
@@ -881,7 +881,6 @@
           <w:szCs w:val="40"/>
           <w:lang w:val="id-ID"/>
         </w:rPr>
-        <w:lastRenderedPageBreak/>
         <w:t>Tahun Akademik 2025-2026</w:t>
       </w:r>
     </w:p>
@@ -964,6 +963,7 @@
           <w:p>
             <w:pPr>
               <w:spacing w:beforeAutospacing="1" w:after="0" w:line="240" w:lineRule="auto"/>
+              <w:jc w:val="right"/>
               <w:outlineLvl w:val="1"/>
               <w:rPr>
                 <w:rFonts w:ascii="Arial Nova" w:eastAsia="Times New Roman" w:hAnsi="Arial Nova" w:cs="Times New Roman"/>
@@ -1038,6 +1038,7 @@
           <w:p>
             <w:pPr>
               <w:spacing w:beforeAutospacing="1" w:after="0" w:line="240" w:lineRule="auto"/>
+              <w:jc w:val="right"/>
               <w:outlineLvl w:val="1"/>
               <w:rPr>
                 <w:rFonts w:ascii="Arial Nova" w:eastAsia="Times New Roman" w:hAnsi="Arial Nova" w:cs="Times New Roman"/>
@@ -1100,6 +1101,7 @@
           <w:p>
             <w:pPr>
               <w:spacing w:beforeAutospacing="1" w:after="0" w:line="240" w:lineRule="auto"/>
+              <w:jc w:val="right"/>
               <w:outlineLvl w:val="1"/>
               <w:rPr>
                 <w:rFonts w:ascii="Arial Nova" w:eastAsia="Times New Roman" w:hAnsi="Arial Nova" w:cs="Times New Roman"/>
@@ -1165,6 +1167,7 @@
           <w:p>
             <w:pPr>
               <w:spacing w:beforeAutospacing="1" w:after="0" w:line="240" w:lineRule="auto"/>
+              <w:jc w:val="right"/>
               <w:outlineLvl w:val="1"/>
               <w:rPr>
                 <w:rFonts w:ascii="Arial Nova" w:eastAsia="Times New Roman" w:hAnsi="Arial Nova" w:cs="Times New Roman"/>
@@ -1231,6 +1234,7 @@
           <w:p>
             <w:pPr>
               <w:spacing w:beforeAutospacing="1" w:after="0" w:line="240" w:lineRule="auto"/>
+              <w:jc w:val="right"/>
               <w:outlineLvl w:val="1"/>
               <w:rPr>
                 <w:rFonts w:ascii="Arial Nova" w:eastAsia="Times New Roman" w:hAnsi="Arial Nova" w:cs="Times New Roman"/>
@@ -1256,23 +1260,7 @@
             <w:tcW w:w="7236" w:type="dxa"/>
           </w:tcPr>
           <w:p>
-            <w:pPr>
-              <w:cnfStyle w:val="000000000000" w:firstRow="0" w:lastRow="0" w:firstColumn="0" w:lastColumn="0" w:oddVBand="0" w:evenVBand="0" w:oddHBand="0" w:evenHBand="0" w:firstRowFirstColumn="0" w:firstRowLastColumn="0" w:lastRowFirstColumn="0" w:lastRowLastColumn="0"/>
-              <w:rPr>
-                <w:rFonts w:ascii="Open Sans" w:hAnsi="Open Sans" w:cs="Open Sans"/>
-                <w:b/>
-                <w:bCs/>
-              </w:rPr>
-            </w:pPr>
-            <w:r>
-              <w:rPr>
-                <w:rFonts w:ascii="Open Sans" w:hAnsi="Open Sans" w:cs="Open Sans"/>
-                <w:b/>
-                <w:bCs/>
-                <w:color w:val="EE0000"/>
-                <w:sz w:val="22"/>
-                <w:szCs w:val="22"/>
-              </w:rPr>
+            <w:r>
               <w:t>{judul_tema_subtopik}</w:t>
             </w:r>
           </w:p>
@@ -1293,6 +1281,7 @@
           <w:p>
             <w:pPr>
               <w:spacing w:beforeAutospacing="1" w:after="0" w:line="240" w:lineRule="auto"/>
+              <w:jc w:val="right"/>
               <w:outlineLvl w:val="1"/>
               <w:rPr>
                 <w:rFonts w:ascii="Arial Nova" w:eastAsia="Times New Roman" w:hAnsi="Arial Nova" w:cs="Times New Roman"/>
@@ -1355,6 +1344,7 @@
           <w:p>
             <w:pPr>
               <w:spacing w:beforeAutospacing="1" w:after="0" w:line="240" w:lineRule="auto"/>
+              <w:jc w:val="right"/>
               <w:outlineLvl w:val="1"/>
               <w:rPr>
                 <w:rFonts w:ascii="Arial Nova" w:eastAsia="Times New Roman" w:hAnsi="Arial Nova" w:cs="Times New Roman"/>
@@ -1420,6 +1410,7 @@
           <w:p>
             <w:pPr>
               <w:spacing w:beforeAutospacing="1" w:after="0" w:line="240" w:lineRule="auto"/>
+              <w:jc w:val="right"/>
               <w:outlineLvl w:val="1"/>
               <w:rPr>
                 <w:rFonts w:ascii="Arial Nova" w:eastAsia="Times New Roman" w:hAnsi="Arial Nova" w:cs="Times New Roman"/>
@@ -1482,6 +1473,7 @@
           <w:p>
             <w:pPr>
               <w:spacing w:beforeAutospacing="1" w:after="0" w:line="240" w:lineRule="auto"/>
+              <w:jc w:val="right"/>
               <w:outlineLvl w:val="1"/>
               <w:rPr>
                 <w:rFonts w:ascii="Arial Nova" w:eastAsia="Times New Roman" w:hAnsi="Arial Nova" w:cs="Times New Roman"/>
@@ -1907,26 +1899,8 @@
           <w:p>
             <w:r>
               <w:t>Latar belakang pembelajaran:</w:t>
-            </w:r>
-            <w:r>
               <w:br/>
-            </w:r>
-            <w:r>
-              <w:rPr>
-                <w:rFonts w:ascii="Arial Nova" w:hAnsi="Arial Nova" w:cs="Arial"/>
-                <w:color w:val="EE0000"/>
-                <w:sz w:val="20"/>
-                <w:szCs w:val="20"/>
-              </w:rPr>
               <w:t>{FOR lb IN latar_belakang_pembelajaran}• {$lb}</w:t>
-            </w:r>
-            <w:r>
-              <w:rPr>
-                <w:rFonts w:ascii="Arial Nova" w:hAnsi="Arial Nova" w:cs="Arial"/>
-                <w:color w:val="EE0000"/>
-                <w:sz w:val="20"/>
-                <w:szCs w:val="20"/>
-              </w:rPr>
               <w:br/>
               <w:t>{END-FOR lb}</w:t>
             </w:r>
@@ -1955,7 +1929,6 @@
                 <w:lang w:val="id-ID" w:eastAsia="en-ID"/>
               </w:rPr>
             </w:pPr>
-            <w:proofErr w:type="spellStart"/>
             <w:r>
               <w:rPr>
                 <w:rFonts w:ascii="Arial Nova" w:eastAsia="Times New Roman" w:hAnsi="Arial Nova" w:cs="Times New Roman"/>
@@ -1963,59 +1936,10 @@
                 <w:bCs/>
                 <w:sz w:val="20"/>
                 <w:szCs w:val="20"/>
-                <w:lang w:eastAsia="en-ID"/>
-              </w:rPr>
-              <w:t>Dimensi</w:t>
-            </w:r>
-            <w:proofErr w:type="spellEnd"/>
-            <w:r>
-              <w:rPr>
-                <w:rFonts w:ascii="Arial Nova" w:eastAsia="Times New Roman" w:hAnsi="Arial Nova" w:cs="Times New Roman"/>
-                <w:b/>
-                <w:bCs/>
-                <w:sz w:val="20"/>
-                <w:szCs w:val="20"/>
-                <w:lang w:eastAsia="en-ID"/>
-              </w:rPr>
-              <w:t xml:space="preserve"> </w:t>
-            </w:r>
-            <w:proofErr w:type="spellStart"/>
-            <w:r>
-              <w:rPr>
-                <w:rFonts w:ascii="Arial Nova" w:eastAsia="Times New Roman" w:hAnsi="Arial Nova" w:cs="Times New Roman"/>
-                <w:b/>
-                <w:bCs/>
-                <w:sz w:val="20"/>
-                <w:szCs w:val="20"/>
-                <w:lang w:eastAsia="en-ID"/>
-              </w:rPr>
-              <w:t>Profil</w:t>
-            </w:r>
-            <w:proofErr w:type="spellEnd"/>
-            <w:r>
-              <w:rPr>
-                <w:rFonts w:ascii="Arial Nova" w:eastAsia="Times New Roman" w:hAnsi="Arial Nova" w:cs="Times New Roman"/>
-                <w:b/>
-                <w:bCs/>
-                <w:sz w:val="20"/>
-                <w:szCs w:val="20"/>
-                <w:lang w:eastAsia="en-ID"/>
-              </w:rPr>
-              <w:t xml:space="preserve"> </w:t>
-            </w:r>
-            <w:proofErr w:type="spellStart"/>
-            <w:r>
-              <w:rPr>
-                <w:rFonts w:ascii="Arial Nova" w:eastAsia="Times New Roman" w:hAnsi="Arial Nova" w:cs="Times New Roman"/>
-                <w:b/>
-                <w:bCs/>
-                <w:sz w:val="20"/>
-                <w:szCs w:val="20"/>
-                <w:lang w:eastAsia="en-ID"/>
-              </w:rPr>
-              <w:t>Lulusan</w:t>
-            </w:r>
-            <w:proofErr w:type="spellEnd"/>
+                <w:lang w:val="id-ID" w:eastAsia="en-ID"/>
+              </w:rPr>
+              <w:t>Dimensi Profil Lulusan</w:t>
+            </w:r>
           </w:p>
         </w:tc>
         <w:tc>
@@ -2042,7 +1966,7 @@
                 <w:bCs/>
                 <w:sz w:val="20"/>
                 <w:szCs w:val="20"/>
-                <w:lang w:eastAsia="en-ID"/>
+                <w:lang w:val="id-ID" w:eastAsia="en-ID"/>
               </w:rPr>
               <w:t xml:space="preserve">☐   DPL 1          </w:t>
             </w:r>
@@ -2072,7 +1996,7 @@
                 <w:bCs/>
                 <w:sz w:val="20"/>
                 <w:szCs w:val="20"/>
-                <w:lang w:eastAsia="en-ID"/>
+                <w:lang w:val="id-ID" w:eastAsia="en-ID"/>
               </w:rPr>
               <w:t>☐   DPL 2</w:t>
             </w:r>
@@ -2103,7 +2027,7 @@
                 <w:bCs/>
                 <w:sz w:val="20"/>
                 <w:szCs w:val="20"/>
-                <w:lang w:eastAsia="en-ID"/>
+                <w:lang w:val="id-ID" w:eastAsia="en-ID"/>
               </w:rPr>
               <w:t>☐   DPL 3</w:t>
             </w:r>
@@ -2133,7 +2057,7 @@
                 <w:bCs/>
                 <w:sz w:val="20"/>
                 <w:szCs w:val="20"/>
-                <w:lang w:eastAsia="en-ID"/>
+                <w:lang w:val="id-ID" w:eastAsia="en-ID"/>
               </w:rPr>
               <w:t>☐   DPL 4</w:t>
             </w:r>
@@ -2180,115 +2104,42 @@
                 <w:lang w:val="id-ID" w:eastAsia="en-ID"/>
               </w:rPr>
             </w:pPr>
-            <w:proofErr w:type="spellStart"/>
             <w:r>
               <w:rPr>
                 <w:rFonts w:ascii="Segoe UI Symbol" w:eastAsia="Times New Roman" w:hAnsi="Segoe UI Symbol" w:cs="Segoe UI Symbol"/>
                 <w:sz w:val="16"/>
                 <w:szCs w:val="16"/>
-                <w:lang w:eastAsia="en-ID"/>
-              </w:rPr>
-              <w:t>Keimanan</w:t>
-            </w:r>
-            <w:proofErr w:type="spellEnd"/>
-            <w:r>
+                <w:lang w:val="id-ID" w:eastAsia="en-ID"/>
+              </w:rPr>
+              <w:t>Keimanan dan Ketakwaan terhadap Tuhan YME</w:t>
+            </w:r>
+          </w:p>
+        </w:tc>
+        <w:tc>
+          <w:tcPr>
+            <w:tcW w:w="2086" w:type="dxa"/>
+            <w:shd w:val="clear" w:color="auto" w:fill="FFF2CC" w:themeFill="accent4" w:themeFillTint="33"/>
+            <w:vAlign w:val="center"/>
+          </w:tcPr>
+          <w:p>
+            <w:pPr>
+              <w:spacing w:after="0" w:line="240" w:lineRule="auto"/>
               <w:rPr>
                 <w:rFonts w:ascii="Segoe UI Symbol" w:eastAsia="Times New Roman" w:hAnsi="Segoe UI Symbol" w:cs="Segoe UI Symbol"/>
                 <w:sz w:val="16"/>
                 <w:szCs w:val="16"/>
-                <w:lang w:eastAsia="en-ID"/>
-              </w:rPr>
-              <w:t xml:space="preserve"> dan </w:t>
-            </w:r>
-            <w:proofErr w:type="spellStart"/>
+                <w:lang w:val="id-ID" w:eastAsia="en-ID"/>
+              </w:rPr>
+            </w:pPr>
             <w:r>
               <w:rPr>
                 <w:rFonts w:ascii="Segoe UI Symbol" w:eastAsia="Times New Roman" w:hAnsi="Segoe UI Symbol" w:cs="Segoe UI Symbol"/>
                 <w:sz w:val="16"/>
                 <w:szCs w:val="16"/>
-                <w:lang w:eastAsia="en-ID"/>
-              </w:rPr>
-              <w:t>Ketakwaan</w:t>
-            </w:r>
-            <w:proofErr w:type="spellEnd"/>
-            <w:r>
-              <w:rPr>
-                <w:rFonts w:ascii="Segoe UI Symbol" w:eastAsia="Times New Roman" w:hAnsi="Segoe UI Symbol" w:cs="Segoe UI Symbol"/>
-                <w:sz w:val="16"/>
-                <w:szCs w:val="16"/>
-                <w:lang w:eastAsia="en-ID"/>
-              </w:rPr>
-              <w:t xml:space="preserve"> </w:t>
-            </w:r>
-            <w:proofErr w:type="spellStart"/>
-            <w:r>
-              <w:rPr>
-                <w:rFonts w:ascii="Segoe UI Symbol" w:eastAsia="Times New Roman" w:hAnsi="Segoe UI Symbol" w:cs="Segoe UI Symbol"/>
-                <w:sz w:val="16"/>
-                <w:szCs w:val="16"/>
-                <w:lang w:eastAsia="en-ID"/>
-              </w:rPr>
-              <w:t>terhadap</w:t>
-            </w:r>
-            <w:proofErr w:type="spellEnd"/>
-            <w:r>
-              <w:rPr>
-                <w:rFonts w:ascii="Segoe UI Symbol" w:eastAsia="Times New Roman" w:hAnsi="Segoe UI Symbol" w:cs="Segoe UI Symbol"/>
-                <w:sz w:val="16"/>
-                <w:szCs w:val="16"/>
-                <w:lang w:eastAsia="en-ID"/>
-              </w:rPr>
-              <w:t xml:space="preserve"> </w:t>
-            </w:r>
-            <w:proofErr w:type="spellStart"/>
-            <w:r>
-              <w:rPr>
-                <w:rFonts w:ascii="Segoe UI Symbol" w:eastAsia="Times New Roman" w:hAnsi="Segoe UI Symbol" w:cs="Segoe UI Symbol"/>
-                <w:sz w:val="16"/>
-                <w:szCs w:val="16"/>
-                <w:lang w:eastAsia="en-ID"/>
-              </w:rPr>
-              <w:t>Tuhan</w:t>
-            </w:r>
-            <w:proofErr w:type="spellEnd"/>
-            <w:r>
-              <w:rPr>
-                <w:rFonts w:ascii="Segoe UI Symbol" w:eastAsia="Times New Roman" w:hAnsi="Segoe UI Symbol" w:cs="Segoe UI Symbol"/>
-                <w:sz w:val="16"/>
-                <w:szCs w:val="16"/>
-                <w:lang w:eastAsia="en-ID"/>
-              </w:rPr>
-              <w:t xml:space="preserve"> YME</w:t>
-            </w:r>
-          </w:p>
-        </w:tc>
-        <w:tc>
-          <w:tcPr>
-            <w:tcW w:w="2086" w:type="dxa"/>
-            <w:shd w:val="clear" w:color="auto" w:fill="FFF2CC" w:themeFill="accent4" w:themeFillTint="33"/>
-            <w:vAlign w:val="center"/>
-          </w:tcPr>
-          <w:p>
-            <w:pPr>
-              <w:spacing w:after="0" w:line="240" w:lineRule="auto"/>
-              <w:rPr>
-                <w:rFonts w:ascii="Segoe UI Symbol" w:eastAsia="Times New Roman" w:hAnsi="Segoe UI Symbol" w:cs="Segoe UI Symbol"/>
-                <w:sz w:val="16"/>
-                <w:szCs w:val="16"/>
-                <w:lang w:val="id-ID" w:eastAsia="en-ID"/>
-              </w:rPr>
-            </w:pPr>
-            <w:proofErr w:type="spellStart"/>
-            <w:r>
-              <w:rPr>
-                <w:rFonts w:ascii="Segoe UI Symbol" w:eastAsia="Times New Roman" w:hAnsi="Segoe UI Symbol" w:cs="Segoe UI Symbol"/>
-                <w:sz w:val="16"/>
-                <w:szCs w:val="16"/>
-                <w:lang w:eastAsia="en-ID"/>
+                <w:lang w:val="id-ID" w:eastAsia="en-ID"/>
               </w:rPr>
               <w:t>Kewargaan</w:t>
             </w:r>
-            <w:proofErr w:type="spellEnd"/>
           </w:p>
         </w:tc>
         <w:tc>
@@ -2308,37 +2159,15 @@
                 <w:lang w:val="id-ID" w:eastAsia="en-ID"/>
               </w:rPr>
             </w:pPr>
-            <w:proofErr w:type="spellStart"/>
             <w:r>
               <w:rPr>
                 <w:rFonts w:ascii="Arial Nova" w:eastAsia="Times New Roman" w:hAnsi="Arial Nova" w:cs="Times New Roman"/>
                 <w:sz w:val="16"/>
                 <w:szCs w:val="16"/>
-                <w:lang w:eastAsia="en-ID"/>
-              </w:rPr>
-              <w:t>Penalaran</w:t>
-            </w:r>
-            <w:proofErr w:type="spellEnd"/>
-            <w:r>
-              <w:rPr>
-                <w:rFonts w:ascii="Arial Nova" w:eastAsia="Times New Roman" w:hAnsi="Arial Nova" w:cs="Times New Roman"/>
-                <w:sz w:val="16"/>
-                <w:szCs w:val="16"/>
-                <w:lang w:eastAsia="en-ID"/>
-              </w:rPr>
-              <w:t xml:space="preserve"> </w:t>
-            </w:r>
-            <w:proofErr w:type="spellStart"/>
-            <w:r>
-              <w:rPr>
-                <w:rFonts w:ascii="Arial Nova" w:eastAsia="Times New Roman" w:hAnsi="Arial Nova" w:cs="Times New Roman"/>
-                <w:sz w:val="16"/>
-                <w:szCs w:val="16"/>
-                <w:lang w:eastAsia="en-ID"/>
-              </w:rPr>
-              <w:t>Kritis</w:t>
-            </w:r>
-            <w:proofErr w:type="spellEnd"/>
+                <w:lang w:val="id-ID" w:eastAsia="en-ID"/>
+              </w:rPr>
+              <w:t>Penalaran Kritis</w:t>
+            </w:r>
           </w:p>
         </w:tc>
         <w:tc>
@@ -2357,17 +2186,15 @@
                 <w:lang w:val="id-ID" w:eastAsia="en-ID"/>
               </w:rPr>
             </w:pPr>
-            <w:proofErr w:type="spellStart"/>
             <w:r>
               <w:rPr>
                 <w:rFonts w:ascii="Arial Nova" w:eastAsia="Times New Roman" w:hAnsi="Arial Nova" w:cs="Times New Roman"/>
                 <w:sz w:val="16"/>
                 <w:szCs w:val="16"/>
-                <w:lang w:eastAsia="en-ID"/>
+                <w:lang w:val="id-ID" w:eastAsia="en-ID"/>
               </w:rPr>
               <w:t>Kreativitas</w:t>
             </w:r>
-            <w:proofErr w:type="spellEnd"/>
           </w:p>
         </w:tc>
       </w:tr>
@@ -2379,6 +2206,7 @@
           <w:tcPr>
             <w:tcW w:w="1667" w:type="dxa"/>
             <w:vMerge/>
+            <w:vAlign w:val="center"/>
           </w:tcPr>
           <w:p>
             <w:pPr>
@@ -2397,44 +2225,27 @@
         <w:tc>
           <w:tcPr>
             <w:tcW w:w="2080" w:type="dxa"/>
-            <w:shd w:val="clear" w:color="auto" w:fill="FFF2CC" w:themeFill="accent4" w:themeFillTint="33"/>
+          </w:tcPr>
+          <w:p>
+            <w:r>
+              <w:t>{capaian_pembelajaran}</w:t>
+            </w:r>
+          </w:p>
+        </w:tc>
+        <w:tc>
+          <w:tcPr>
+            <w:tcW w:w="2086" w:type="dxa"/>
           </w:tcPr>
           <w:p>
             <w:pPr>
               <w:spacing w:after="0" w:line="240" w:lineRule="auto"/>
-              <w:rPr>
-                <w:rFonts w:ascii="Segoe UI Symbol" w:eastAsia="Times New Roman" w:hAnsi="Segoe UI Symbol" w:cs="Segoe UI Symbol"/>
-                <w:sz w:val="16"/>
-                <w:szCs w:val="16"/>
-                <w:lang w:eastAsia="en-ID"/>
-              </w:rPr>
-            </w:pPr>
-            <w:r>
               <w:rPr>
                 <w:rFonts w:ascii="Segoe UI Symbol" w:eastAsia="Times New Roman" w:hAnsi="Segoe UI Symbol" w:cs="Segoe UI Symbol"/>
                 <w:b/>
                 <w:bCs/>
                 <w:sz w:val="20"/>
                 <w:szCs w:val="20"/>
-                <w:lang w:eastAsia="en-ID"/>
-              </w:rPr>
-              <w:t>☐   DPL 6</w:t>
-            </w:r>
-          </w:p>
-        </w:tc>
-        <w:tc>
-          <w:tcPr>
-            <w:tcW w:w="2086" w:type="dxa"/>
-            <w:shd w:val="clear" w:color="auto" w:fill="FFF2CC" w:themeFill="accent4" w:themeFillTint="33"/>
-          </w:tcPr>
-          <w:p>
-            <w:pPr>
-              <w:spacing w:after="0" w:line="240" w:lineRule="auto"/>
-              <w:rPr>
-                <w:rFonts w:ascii="Segoe UI Symbol" w:eastAsia="Times New Roman" w:hAnsi="Segoe UI Symbol" w:cs="Segoe UI Symbol"/>
-                <w:sz w:val="16"/>
-                <w:szCs w:val="16"/>
-                <w:lang w:eastAsia="en-ID"/>
+                <w:lang w:val="id-ID" w:eastAsia="en-ID"/>
               </w:rPr>
             </w:pPr>
             <w:r>
@@ -2444,9 +2255,9 @@
                 <w:bCs/>
                 <w:sz w:val="20"/>
                 <w:szCs w:val="20"/>
-                <w:lang w:eastAsia="en-ID"/>
-              </w:rPr>
-              <w:t>☐   DPL 7</w:t>
+                <w:lang w:val="id-ID" w:eastAsia="en-ID"/>
+              </w:rPr>
+              <w:t>☐   DPL 6</w:t>
             </w:r>
           </w:p>
         </w:tc>
@@ -2454,16 +2265,17 @@
           <w:tcPr>
             <w:tcW w:w="2072" w:type="dxa"/>
             <w:gridSpan w:val="2"/>
-            <w:shd w:val="clear" w:color="auto" w:fill="FFF2CC" w:themeFill="accent4" w:themeFillTint="33"/>
           </w:tcPr>
           <w:p>
             <w:pPr>
               <w:spacing w:after="0" w:line="240" w:lineRule="auto"/>
               <w:rPr>
                 <w:rFonts w:ascii="Arial Nova" w:eastAsia="Times New Roman" w:hAnsi="Arial Nova" w:cs="Times New Roman"/>
-                <w:sz w:val="16"/>
-                <w:szCs w:val="16"/>
-                <w:lang w:eastAsia="en-ID"/>
+                <w:b/>
+                <w:bCs/>
+                <w:sz w:val="20"/>
+                <w:szCs w:val="20"/>
+                <w:lang w:val="id-ID" w:eastAsia="en-ID"/>
               </w:rPr>
             </w:pPr>
             <w:r>
@@ -2473,25 +2285,26 @@
                 <w:bCs/>
                 <w:sz w:val="20"/>
                 <w:szCs w:val="20"/>
-                <w:lang w:eastAsia="en-ID"/>
-              </w:rPr>
-              <w:t>☐   DPL 8</w:t>
+                <w:lang w:val="id-ID" w:eastAsia="en-ID"/>
+              </w:rPr>
+              <w:t>☐   DPL 7</w:t>
             </w:r>
           </w:p>
         </w:tc>
         <w:tc>
           <w:tcPr>
             <w:tcW w:w="2087" w:type="dxa"/>
-            <w:shd w:val="clear" w:color="auto" w:fill="FFF2CC" w:themeFill="accent4" w:themeFillTint="33"/>
           </w:tcPr>
           <w:p>
             <w:pPr>
               <w:spacing w:after="0" w:line="240" w:lineRule="auto"/>
               <w:rPr>
                 <w:rFonts w:ascii="Arial Nova" w:eastAsia="Times New Roman" w:hAnsi="Arial Nova" w:cs="Times New Roman"/>
-                <w:sz w:val="16"/>
-                <w:szCs w:val="16"/>
-                <w:lang w:eastAsia="en-ID"/>
+                <w:b/>
+                <w:bCs/>
+                <w:sz w:val="20"/>
+                <w:szCs w:val="20"/>
+                <w:lang w:val="id-ID" w:eastAsia="en-ID"/>
               </w:rPr>
             </w:pPr>
             <w:r>
@@ -2501,16 +2314,16 @@
                 <w:bCs/>
                 <w:sz w:val="20"/>
                 <w:szCs w:val="20"/>
-                <w:lang w:eastAsia="en-ID"/>
-              </w:rPr>
-              <w:t>☐   DPL 5</w:t>
+                <w:lang w:val="id-ID" w:eastAsia="en-ID"/>
+              </w:rPr>
+              <w:t>☐   DPL 8</w:t>
             </w:r>
           </w:p>
         </w:tc>
       </w:tr>
       <w:tr>
         <w:trPr>
-          <w:trHeight w:val="70"/>
+          <w:trHeight w:val="79"/>
         </w:trPr>
         <w:tc>
           <w:tcPr>
@@ -2539,17 +2352,11 @@
             <w:vAlign w:val="center"/>
           </w:tcPr>
           <w:p>
-            <w:proofErr w:type="spellStart"/>
-            <w:r>
-              <w:rPr>
-                <w:rFonts w:ascii="Arial Nova" w:eastAsia="Times New Roman" w:hAnsi="Arial Nova" w:cs="Times New Roman"/>
-                <w:sz w:val="16"/>
-                <w:szCs w:val="16"/>
-                <w:lang w:eastAsia="en-ID"/>
-              </w:rPr>
-              <w:t>Kolaborasi</w:t>
-            </w:r>
-            <w:proofErr w:type="spellEnd"/>
+            <w:r>
+              <w:t>{FOR tpu IN tujuan_pembelajaran_umum}{$tpu}</w:t>
+              <w:br/>
+              <w:t>{END-FOR tpu}</w:t>
+            </w:r>
           </w:p>
         </w:tc>
         <w:tc>
@@ -2568,17 +2375,15 @@
                 <w:lang w:val="id-ID" w:eastAsia="en-ID"/>
               </w:rPr>
             </w:pPr>
-            <w:proofErr w:type="spellStart"/>
             <w:r>
               <w:rPr>
                 <w:rFonts w:ascii="Arial Nova" w:eastAsia="Times New Roman" w:hAnsi="Arial Nova" w:cs="Times New Roman"/>
                 <w:sz w:val="16"/>
                 <w:szCs w:val="16"/>
-                <w:lang w:eastAsia="en-ID"/>
+                <w:lang w:val="id-ID" w:eastAsia="en-ID"/>
               </w:rPr>
               <w:t>Kemandirian</w:t>
             </w:r>
-            <w:proofErr w:type="spellEnd"/>
           </w:p>
         </w:tc>
         <w:tc>
@@ -2603,7 +2408,7 @@
                 <w:rFonts w:ascii="Arial Nova" w:eastAsia="Times New Roman" w:hAnsi="Arial Nova" w:cs="Times New Roman"/>
                 <w:sz w:val="16"/>
                 <w:szCs w:val="16"/>
-                <w:lang w:eastAsia="en-ID"/>
+                <w:lang w:val="id-ID" w:eastAsia="en-ID"/>
               </w:rPr>
               <w:t>Kesehatan</w:t>
             </w:r>
@@ -2625,17 +2430,15 @@
                 <w:lang w:val="id-ID" w:eastAsia="en-ID"/>
               </w:rPr>
             </w:pPr>
-            <w:proofErr w:type="spellStart"/>
             <w:r>
               <w:rPr>
                 <w:rFonts w:ascii="Arial Nova" w:eastAsia="Times New Roman" w:hAnsi="Arial Nova" w:cs="Times New Roman"/>
                 <w:sz w:val="16"/>
                 <w:szCs w:val="16"/>
-                <w:lang w:eastAsia="en-ID"/>
+                <w:lang w:val="id-ID" w:eastAsia="en-ID"/>
               </w:rPr>
               <w:t>Komunikasi</w:t>
             </w:r>
-            <w:proofErr w:type="spellEnd"/>
           </w:p>
         </w:tc>
       </w:tr>
@@ -2694,15 +2497,7 @@
           </w:tcPr>
           <w:p>
             <w:r>
-              <w:t>{</w:t>
-            </w:r>
-            <w:proofErr w:type="spellStart"/>
-            <w:r>
-              <w:t>capaian_pembelajaran</w:t>
-            </w:r>
-            <w:proofErr w:type="spellEnd"/>
-            <w:r>
-              <w:t>}</w:t>
+              <w:t>{enduring_understanding}</w:t>
             </w:r>
           </w:p>
         </w:tc>
@@ -2762,51 +2557,7 @@
           </w:tcPr>
           <w:p>
             <w:r>
-              <w:t xml:space="preserve">{FOR </w:t>
-            </w:r>
-            <w:proofErr w:type="spellStart"/>
-            <w:r>
-              <w:t>tpu</w:t>
-            </w:r>
-            <w:proofErr w:type="spellEnd"/>
-            <w:r>
-              <w:t xml:space="preserve"> IN </w:t>
-            </w:r>
-            <w:proofErr w:type="spellStart"/>
-            <w:r>
-              <w:t>tujuan_pembelajaran_</w:t>
-            </w:r>
-            <w:proofErr w:type="gramStart"/>
-            <w:r>
-              <w:t>umum</w:t>
-            </w:r>
-            <w:proofErr w:type="spellEnd"/>
-            <w:r>
-              <w:t>}{</w:t>
-            </w:r>
-            <w:proofErr w:type="gramEnd"/>
-            <w:r>
-              <w:t>$</w:t>
-            </w:r>
-            <w:proofErr w:type="spellStart"/>
-            <w:r>
-              <w:t>tpu</w:t>
-            </w:r>
-            <w:proofErr w:type="spellEnd"/>
-            <w:r>
-              <w:t>}</w:t>
-            </w:r>
-            <w:r>
-              <w:br/>
-              <w:t xml:space="preserve">{END-FOR </w:t>
-            </w:r>
-            <w:proofErr w:type="spellStart"/>
-            <w:r>
-              <w:t>tpu</w:t>
-            </w:r>
-            <w:proofErr w:type="spellEnd"/>
-            <w:r>
-              <w:t>}</w:t>
+              <w:t>{lintas_disiplin_ilmu}</w:t>
             </w:r>
           </w:p>
         </w:tc>
@@ -2841,7 +2592,6 @@
                 <w:szCs w:val="20"/>
                 <w:lang w:val="id-ID" w:eastAsia="en-ID"/>
               </w:rPr>
-              <w:lastRenderedPageBreak/>
               <w:t>Enduring Understanding/ Pemahaman Bermakna</w:t>
             </w:r>
           </w:p>
@@ -2863,15 +2613,14 @@
               </w:rPr>
             </w:pPr>
             <w:r>
-              <w:t>{</w:t>
-            </w:r>
-            <w:proofErr w:type="spellStart"/>
-            <w:r>
-              <w:t>enduring_understanding</w:t>
-            </w:r>
-            <w:proofErr w:type="spellEnd"/>
-            <w:r>
-              <w:t>}</w:t>
+              <w:rPr>
+                <w:rFonts w:ascii="Arial" w:hAnsi="Arial" w:cs="Arial"/>
+                <w:color w:val="000000"/>
+                <w:sz w:val="20"/>
+                <w:szCs w:val="20"/>
+                <w:lang w:val="id-ID"/>
+              </w:rPr>
+              <w:t>Persamaan dan fungsi kuadrat bukan sekadar grafik melengkung atau hitungan hafalan akar, melainkan alat matematika esensial untuk memodelkan lintasan simetris, mengoptimalkan nilai maksimum/minimum, serta fondasi transisi menuju aljabar tingkat tinggi melalui manipulasi variabel tersembunyi.</w:t>
             </w:r>
           </w:p>
         </w:tc>
@@ -2927,15 +2676,88 @@
               </w:rPr>
             </w:pPr>
             <w:r>
-              <w:t>{</w:t>
-            </w:r>
-            <w:proofErr w:type="spellStart"/>
-            <w:r>
-              <w:t>lintas_disiplin_ilmu</w:t>
-            </w:r>
-            <w:proofErr w:type="spellEnd"/>
-            <w:r>
-              <w:t>}</w:t>
+              <w:rPr>
+                <w:rFonts w:ascii="Arial Nova" w:hAnsi="Arial Nova" w:cs="Segoe UI Symbol"/>
+                <w:color w:val="000000"/>
+                <w:sz w:val="20"/>
+                <w:szCs w:val="20"/>
+                <w:lang w:val="id-ID"/>
+              </w:rPr>
+              <w:t xml:space="preserve">Analisis kuadratik memiliki keterkaitan erat dengan tiga disiplin ilmu utama. Pertama, dalam </w:t>
+            </w:r>
+            <w:r>
+              <w:rPr>
+                <w:rFonts w:ascii="Arial Nova" w:hAnsi="Arial Nova" w:cs="Segoe UI Symbol"/>
+                <w:b/>
+                <w:color w:val="000000"/>
+                <w:sz w:val="20"/>
+                <w:szCs w:val="20"/>
+                <w:lang w:val="id-ID"/>
+              </w:rPr>
+              <w:t>Sains (Fisika)</w:t>
+            </w:r>
+            <w:r>
+              <w:rPr>
+                <w:rFonts w:ascii="Arial Nova" w:hAnsi="Arial Nova" w:cs="Segoe UI Symbol"/>
+                <w:color w:val="000000"/>
+                <w:sz w:val="20"/>
+                <w:szCs w:val="20"/>
+                <w:lang w:val="id-ID"/>
+              </w:rPr>
+              <w:t xml:space="preserve">, ia sangat fundamental untuk memodelkan gerak parabola (kinematika), </w:t>
+            </w:r>
+            <w:r>
+              <w:rPr>
+                <w:rFonts w:ascii="Arial Nova" w:hAnsi="Arial Nova" w:cs="Segoe UI Symbol"/>
+                <w:color w:val="000000"/>
+                <w:sz w:val="20"/>
+                <w:szCs w:val="20"/>
+                <w:lang w:val="id-ID"/>
+              </w:rPr>
+              <w:lastRenderedPageBreak/>
+              <w:t xml:space="preserve">menghitung waktu puncak, maupun jangkauan maksimum objek. Kedua, dalam </w:t>
+            </w:r>
+            <w:r>
+              <w:rPr>
+                <w:rFonts w:ascii="Arial Nova" w:hAnsi="Arial Nova" w:cs="Segoe UI Symbol"/>
+                <w:b/>
+                <w:color w:val="000000"/>
+                <w:sz w:val="20"/>
+                <w:szCs w:val="20"/>
+                <w:lang w:val="id-ID"/>
+              </w:rPr>
+              <w:t>Teknologi Informasi dan Rekayasa</w:t>
+            </w:r>
+            <w:r>
+              <w:rPr>
+                <w:rFonts w:ascii="Arial Nova" w:hAnsi="Arial Nova" w:cs="Segoe UI Symbol"/>
+                <w:color w:val="000000"/>
+                <w:sz w:val="20"/>
+                <w:szCs w:val="20"/>
+                <w:lang w:val="id-ID"/>
+              </w:rPr>
+              <w:t xml:space="preserve">, struktur kuadrat digunakan sebagai dasar algoritma optimasi, pengolahan citra digital grafik 3D, dan pemodelan kurva lengkung desain objek. Ketiga, ia berhubungan langsung dengan </w:t>
+            </w:r>
+            <w:r>
+              <w:rPr>
+                <w:rFonts w:ascii="Arial Nova" w:hAnsi="Arial Nova" w:cs="Segoe UI Symbol"/>
+                <w:b/>
+                <w:color w:val="000000"/>
+                <w:sz w:val="20"/>
+                <w:szCs w:val="20"/>
+                <w:lang w:val="id-ID"/>
+              </w:rPr>
+              <w:t>Ekonomi</w:t>
+            </w:r>
+            <w:r>
+              <w:rPr>
+                <w:rFonts w:ascii="Arial Nova" w:hAnsi="Arial Nova" w:cs="Segoe UI Symbol"/>
+                <w:color w:val="000000"/>
+                <w:sz w:val="20"/>
+                <w:szCs w:val="20"/>
+                <w:lang w:val="id-ID"/>
+              </w:rPr>
+              <w:t>, terutama dalam kalkulasi maksimalisasi keuntungan perusahaan atau minimalisasi biaya produksi berdasarkan fungsi biaya kuadratik.</w:t>
             </w:r>
           </w:p>
         </w:tc>
@@ -2970,6 +2792,7 @@
                 <w:szCs w:val="20"/>
                 <w:lang w:val="id-ID" w:eastAsia="en-ID"/>
               </w:rPr>
+              <w:lastRenderedPageBreak/>
               <w:t>Moda Pembelajaran:</w:t>
             </w:r>
           </w:p>
@@ -3928,37 +3751,45 @@
             <w:r>
               <w:t>{integrity_checked ? '☑' : '☐'} Integrity</w:t>
             </w:r>
-            <w:r>
-              <w:br/>
+          </w:p>
+          <w:p>
+            <w:r>
               <w:t>{mindful_checked ? '☑' : '☐'} Mindful</w:t>
             </w:r>
-            <w:r>
-              <w:br/>
+          </w:p>
+          <w:p>
+            <w:r>
               <w:t>{progressive_checked ? '☑' : '☐'} Progressive</w:t>
             </w:r>
-            <w:r>
-              <w:br/>
-              <w:t>☐ Agility</w:t>
-            </w:r>
-            <w:r>
-              <w:br/>
-              <w:t>☐ Compassion</w:t>
-            </w:r>
-            <w:r>
-              <w:br/>
-              <w:t>☐ Tenacity</w:t>
-            </w:r>
-            <w:r>
-              <w:br/>
-              <w:t>☐ Fidelity</w:t>
-            </w:r>
-            <w:r>
-              <w:br/>
-              <w:t>☐ Uplifting</w:t>
-            </w:r>
-            <w:r>
-              <w:br/>
-              <w:t>☐ Lifelong Learner.</w:t>
+          </w:p>
+          <w:p>
+            <w:r>
+              <w:t>{agility_checked ? '☑' : '☐'} Agility</w:t>
+            </w:r>
+          </w:p>
+          <w:p>
+            <w:r>
+              <w:t>{compassion_checked ? '☑' : '☐'} Compassion</w:t>
+            </w:r>
+          </w:p>
+          <w:p>
+            <w:r>
+              <w:t>{tenacity_checked ? '☑' : '☐'} Tenacity</w:t>
+            </w:r>
+          </w:p>
+          <w:p>
+            <w:r>
+              <w:t>{fidelity_checked ? '☑' : '☐'} Fidelity</w:t>
+            </w:r>
+          </w:p>
+          <w:p>
+            <w:r>
+              <w:t>{uplifting_checked ? '☑' : '☐'} Uplifting</w:t>
+            </w:r>
+          </w:p>
+          <w:p>
+            <w:r>
+              <w:t>{lifelong_learner_checked ? '☑' : '☐'} Lifelong Learner.</w:t>
             </w:r>
           </w:p>
         </w:tc>
@@ -3971,20 +3802,32 @@
             <w:r>
               <w:t>{FOR val IN sasaran_profil_sekolah}</w:t>
             </w:r>
-            <w:r>
-              <w:br/>
-              <w:t>{$val.nilai}:</w:t>
-            </w:r>
-            <w:r>
-              <w:br/>
-              <w:t>{FOR ind IN $val.indikator}• {$ind}</w:t>
-            </w:r>
-            <w:r>
-              <w:br/>
+          </w:p>
+          <w:p>
+            <w:r>
+              <w:rPr>
+                <w:b/>
+              </w:rPr>
+              <w:t>{$val.index}. {$val.nilai}:</w:t>
+            </w:r>
+          </w:p>
+          <w:p>
+            <w:r>
+              <w:t>{FOR ind IN $val.indikator}</w:t>
+            </w:r>
+          </w:p>
+          <w:p>
+            <w:r>
+              <w:t>• {$ind}</w:t>
+            </w:r>
+          </w:p>
+          <w:p>
+            <w:r>
               <w:t>{END-FOR ind}</w:t>
             </w:r>
-            <w:r>
-              <w:br/>
+          </w:p>
+          <w:p>
+            <w:r>
               <w:t>{END-FOR val}</w:t>
             </w:r>
           </w:p>
@@ -4098,7 +3941,6 @@
                 <w:szCs w:val="20"/>
                 <w:lang w:val="id-ID" w:eastAsia="en-ID"/>
               </w:rPr>
-              <w:lastRenderedPageBreak/>
               <w:t>TP:</w:t>
             </w:r>
           </w:p>
@@ -4388,9 +4230,6 @@
             <w:tcW w:w="1307" w:type="dxa"/>
           </w:tcPr>
           <w:p>
-            <w:pPr>
-              <w:cnfStyle w:val="000000000000" w:firstRow="0" w:lastRow="0" w:firstColumn="0" w:lastColumn="0" w:oddVBand="0" w:evenVBand="0" w:oddHBand="0" w:evenHBand="0" w:firstRowFirstColumn="0" w:firstRowLastColumn="0" w:lastRowFirstColumn="0" w:lastRowLastColumn="0"/>
-            </w:pPr>
             <w:r>
               <w:t>{$p.aktivitas_pembelajaran[0].tahapan_sintaks}</w:t>
             </w:r>
@@ -4402,9 +4241,6 @@
             <w:gridSpan w:val="2"/>
           </w:tcPr>
           <w:p>
-            <w:pPr>
-              <w:cnfStyle w:val="000000000000" w:firstRow="0" w:lastRow="0" w:firstColumn="0" w:lastColumn="0" w:oddVBand="0" w:evenVBand="0" w:oddHBand="0" w:evenHBand="0" w:firstRowFirstColumn="0" w:firstRowLastColumn="0" w:lastRowFirstColumn="0" w:lastRowLastColumn="0"/>
-            </w:pPr>
             <w:r>
               <w:t>{$p.aktivitas_pembelajaran[0].prosedur_guru}</w:t>
             </w:r>
@@ -4415,9 +4251,6 @@
             <w:tcW w:w="1969" w:type="dxa"/>
           </w:tcPr>
           <w:p>
-            <w:pPr>
-              <w:cnfStyle w:val="000000000000" w:firstRow="0" w:lastRow="0" w:firstColumn="0" w:lastColumn="0" w:oddVBand="0" w:evenVBand="0" w:oddHBand="0" w:evenHBand="0" w:firstRowFirstColumn="0" w:firstRowLastColumn="0" w:lastRowFirstColumn="0" w:lastRowLastColumn="0"/>
-            </w:pPr>
             <w:r>
               <w:t>{$p.aktivitas_pembelajaran[0].prosedur_siswa}</w:t>
             </w:r>
@@ -4428,13 +4261,8 @@
             <w:tcW w:w="1294" w:type="dxa"/>
           </w:tcPr>
           <w:p>
-            <w:pPr>
-              <w:cnfStyle w:val="000000000000" w:firstRow="0" w:lastRow="0" w:firstColumn="0" w:lastColumn="0" w:oddVBand="0" w:evenVBand="0" w:oddHBand="0" w:evenHBand="0" w:firstRowFirstColumn="0" w:firstRowLastColumn="0" w:lastRowFirstColumn="0" w:lastRowLastColumn="0"/>
-            </w:pPr>
             <w:r>
               <w:t>{FOR pk IN $p.aktivitas_pembelajaran[0].pertanyaan_kunci}{$pk}</w:t>
-            </w:r>
-            <w:r>
               <w:br/>
               <w:t>{END-FOR pk}</w:t>
             </w:r>
@@ -4445,9 +4273,7 @@
             <w:tcW w:w="2418" w:type="dxa"/>
           </w:tcPr>
           <w:p>
-            <w:pPr>
-              <w:cnfStyle w:val="000000000000" w:firstRow="0" w:lastRow="0" w:firstColumn="0" w:lastColumn="0" w:oddVBand="0" w:evenVBand="0" w:oddHBand="0" w:evenHBand="0" w:firstRowFirstColumn="0" w:firstRowLastColumn="0" w:lastRowFirstColumn="0" w:lastRowLastColumn="0"/>
-            </w:pPr>
+            <w:r/>
             <w:r>
               <w:rPr>
                 <w:b/>
@@ -4505,6 +4331,7 @@
                 <w:szCs w:val="20"/>
                 <w:lang w:val="id-ID" w:eastAsia="en-ID"/>
               </w:rPr>
+              <w:lastRenderedPageBreak/>
               <w:t>INTI (Berkesadaran, Bermakna, Menggembirakan)</w:t>
             </w:r>
           </w:p>
@@ -4527,9 +4354,6 @@
             <w:tcW w:w="1307" w:type="dxa"/>
           </w:tcPr>
           <w:p>
-            <w:pPr>
-              <w:cnfStyle w:val="000000000000" w:firstRow="0" w:lastRow="0" w:firstColumn="0" w:lastColumn="0" w:oddVBand="0" w:evenVBand="0" w:oddHBand="0" w:evenHBand="0" w:firstRowFirstColumn="0" w:firstRowLastColumn="0" w:lastRowFirstColumn="0" w:lastRowLastColumn="0"/>
-            </w:pPr>
             <w:r>
               <w:t>{$p.aktivitas_pembelajaran[1].tahapan_sintaks}</w:t>
             </w:r>
@@ -4541,9 +4365,6 @@
             <w:gridSpan w:val="2"/>
           </w:tcPr>
           <w:p>
-            <w:pPr>
-              <w:cnfStyle w:val="000000000000" w:firstRow="0" w:lastRow="0" w:firstColumn="0" w:lastColumn="0" w:oddVBand="0" w:evenVBand="0" w:oddHBand="0" w:evenHBand="0" w:firstRowFirstColumn="0" w:firstRowLastColumn="0" w:lastRowFirstColumn="0" w:lastRowLastColumn="0"/>
-            </w:pPr>
             <w:r>
               <w:t>{$p.aktivitas_pembelajaran[1].prosedur_guru}</w:t>
             </w:r>
@@ -4554,9 +4375,6 @@
             <w:tcW w:w="1969" w:type="dxa"/>
           </w:tcPr>
           <w:p>
-            <w:pPr>
-              <w:cnfStyle w:val="000000000000" w:firstRow="0" w:lastRow="0" w:firstColumn="0" w:lastColumn="0" w:oddVBand="0" w:evenVBand="0" w:oddHBand="0" w:evenHBand="0" w:firstRowFirstColumn="0" w:firstRowLastColumn="0" w:lastRowFirstColumn="0" w:lastRowLastColumn="0"/>
-            </w:pPr>
             <w:r>
               <w:t>{$p.aktivitas_pembelajaran[1].prosedur_siswa}</w:t>
             </w:r>
@@ -4567,13 +4385,8 @@
             <w:tcW w:w="1294" w:type="dxa"/>
           </w:tcPr>
           <w:p>
-            <w:pPr>
-              <w:cnfStyle w:val="000000000000" w:firstRow="0" w:lastRow="0" w:firstColumn="0" w:lastColumn="0" w:oddVBand="0" w:evenVBand="0" w:oddHBand="0" w:evenHBand="0" w:firstRowFirstColumn="0" w:firstRowLastColumn="0" w:lastRowFirstColumn="0" w:lastRowLastColumn="0"/>
-            </w:pPr>
             <w:r>
               <w:t>{FOR pk IN $p.aktivitas_pembelajaran[1].pertanyaan_kunci}{$pk}</w:t>
-            </w:r>
-            <w:r>
               <w:br/>
               <w:t>{END-FOR pk}</w:t>
             </w:r>
@@ -4584,9 +4397,7 @@
             <w:tcW w:w="2418" w:type="dxa"/>
           </w:tcPr>
           <w:p>
-            <w:pPr>
-              <w:cnfStyle w:val="000000000000" w:firstRow="0" w:lastRow="0" w:firstColumn="0" w:lastColumn="0" w:oddVBand="0" w:evenVBand="0" w:oddHBand="0" w:evenHBand="0" w:firstRowFirstColumn="0" w:firstRowLastColumn="0" w:lastRowFirstColumn="0" w:lastRowLastColumn="0"/>
-            </w:pPr>
+            <w:r/>
             <w:r>
               <w:rPr>
                 <w:b/>
@@ -4600,14 +4411,7 @@
               <w:rPr>
                 <w:b/>
               </w:rPr>
-              <w:t xml:space="preserve">{$p.aktivitas_pembelajaran[1].muatan_inovatif.differentiation ? 'Differentiation (' + </w:t>
-            </w:r>
-            <w:r>
-              <w:rPr>
-                <w:b/>
-              </w:rPr>
-              <w:lastRenderedPageBreak/>
-              <w:t>$p.aktivitas_pembelajaran[1].muatan_inovatif.differentiation.type + '): ' : ''}</w:t>
+              <w:t>{$p.aktivitas_pembelajaran[1].muatan_inovatif.differentiation ? 'Differentiation (' + $p.aktivitas_pembelajaran[1].muatan_inovatif.differentiation.type + '): ' : ''}</w:t>
             </w:r>
             <w:r>
               <w:t>{$p.aktivitas_pembelajaran[1].muatan_inovatif.differentiation ? $p.aktivitas_pembelajaran[1].muatan_inovatif.differentiation.deskripsi : ''}</w:t>
@@ -4632,7 +4436,6 @@
           </w:tcPr>
           <w:p>
             <w:r>
-              <w:lastRenderedPageBreak/>
               <w:t>{$p.aktivitas_pembelajaran[2].waktu_menit}'</w:t>
             </w:r>
           </w:p>
@@ -4642,9 +4445,6 @@
             <w:tcW w:w="1307" w:type="dxa"/>
           </w:tcPr>
           <w:p>
-            <w:pPr>
-              <w:cnfStyle w:val="000000000000" w:firstRow="0" w:lastRow="0" w:firstColumn="0" w:lastColumn="0" w:oddVBand="0" w:evenVBand="0" w:oddHBand="0" w:evenHBand="0" w:firstRowFirstColumn="0" w:firstRowLastColumn="0" w:lastRowFirstColumn="0" w:lastRowLastColumn="0"/>
-            </w:pPr>
             <w:r>
               <w:t>{$p.aktivitas_pembelajaran[2].tahapan_sintaks}</w:t>
             </w:r>
@@ -4656,9 +4456,6 @@
             <w:gridSpan w:val="2"/>
           </w:tcPr>
           <w:p>
-            <w:pPr>
-              <w:cnfStyle w:val="000000000000" w:firstRow="0" w:lastRow="0" w:firstColumn="0" w:lastColumn="0" w:oddVBand="0" w:evenVBand="0" w:oddHBand="0" w:evenHBand="0" w:firstRowFirstColumn="0" w:firstRowLastColumn="0" w:lastRowFirstColumn="0" w:lastRowLastColumn="0"/>
-            </w:pPr>
             <w:r>
               <w:t>{$p.aktivitas_pembelajaran[2].prosedur_guru}</w:t>
             </w:r>
@@ -4669,9 +4466,6 @@
             <w:tcW w:w="1969" w:type="dxa"/>
           </w:tcPr>
           <w:p>
-            <w:pPr>
-              <w:cnfStyle w:val="000000000000" w:firstRow="0" w:lastRow="0" w:firstColumn="0" w:lastColumn="0" w:oddVBand="0" w:evenVBand="0" w:oddHBand="0" w:evenHBand="0" w:firstRowFirstColumn="0" w:firstRowLastColumn="0" w:lastRowFirstColumn="0" w:lastRowLastColumn="0"/>
-            </w:pPr>
             <w:r>
               <w:t>{$p.aktivitas_pembelajaran[2].prosedur_siswa}</w:t>
             </w:r>
@@ -4682,13 +4476,8 @@
             <w:tcW w:w="1294" w:type="dxa"/>
           </w:tcPr>
           <w:p>
-            <w:pPr>
-              <w:cnfStyle w:val="000000000000" w:firstRow="0" w:lastRow="0" w:firstColumn="0" w:lastColumn="0" w:oddVBand="0" w:evenVBand="0" w:oddHBand="0" w:evenHBand="0" w:firstRowFirstColumn="0" w:firstRowLastColumn="0" w:lastRowFirstColumn="0" w:lastRowLastColumn="0"/>
-            </w:pPr>
             <w:r>
               <w:t>{FOR pk IN $p.aktivitas_pembelajaran[2].pertanyaan_kunci}{$pk}</w:t>
-            </w:r>
-            <w:r>
               <w:br/>
               <w:t>{END-FOR pk}</w:t>
             </w:r>
@@ -4699,9 +4488,7 @@
             <w:tcW w:w="2418" w:type="dxa"/>
           </w:tcPr>
           <w:p>
-            <w:pPr>
-              <w:cnfStyle w:val="000000000000" w:firstRow="0" w:lastRow="0" w:firstColumn="0" w:lastColumn="0" w:oddVBand="0" w:evenVBand="0" w:oddHBand="0" w:evenHBand="0" w:firstRowFirstColumn="0" w:firstRowLastColumn="0" w:lastRowFirstColumn="0" w:lastRowLastColumn="0"/>
-            </w:pPr>
+            <w:r/>
             <w:r>
               <w:rPr>
                 <w:b/>
@@ -4740,7 +4527,6 @@
           </w:tcPr>
           <w:p>
             <w:r>
-              <w:lastRenderedPageBreak/>
               <w:t>{$p.aktivitas_pembelajaran[3].waktu_menit}'</w:t>
             </w:r>
           </w:p>
@@ -4750,9 +4536,6 @@
             <w:tcW w:w="1307" w:type="dxa"/>
           </w:tcPr>
           <w:p>
-            <w:pPr>
-              <w:cnfStyle w:val="000000000000" w:firstRow="0" w:lastRow="0" w:firstColumn="0" w:lastColumn="0" w:oddVBand="0" w:evenVBand="0" w:oddHBand="0" w:evenHBand="0" w:firstRowFirstColumn="0" w:firstRowLastColumn="0" w:lastRowFirstColumn="0" w:lastRowLastColumn="0"/>
-            </w:pPr>
             <w:r>
               <w:t>{$p.aktivitas_pembelajaran[3].tahapan_sintaks}</w:t>
             </w:r>
@@ -4764,9 +4547,6 @@
             <w:gridSpan w:val="2"/>
           </w:tcPr>
           <w:p>
-            <w:pPr>
-              <w:cnfStyle w:val="000000000000" w:firstRow="0" w:lastRow="0" w:firstColumn="0" w:lastColumn="0" w:oddVBand="0" w:evenVBand="0" w:oddHBand="0" w:evenHBand="0" w:firstRowFirstColumn="0" w:firstRowLastColumn="0" w:lastRowFirstColumn="0" w:lastRowLastColumn="0"/>
-            </w:pPr>
             <w:r>
               <w:t>{$p.aktivitas_pembelajaran[3].prosedur_guru}</w:t>
             </w:r>
@@ -4777,9 +4557,6 @@
             <w:tcW w:w="1969" w:type="dxa"/>
           </w:tcPr>
           <w:p>
-            <w:pPr>
-              <w:cnfStyle w:val="000000000000" w:firstRow="0" w:lastRow="0" w:firstColumn="0" w:lastColumn="0" w:oddVBand="0" w:evenVBand="0" w:oddHBand="0" w:evenHBand="0" w:firstRowFirstColumn="0" w:firstRowLastColumn="0" w:lastRowFirstColumn="0" w:lastRowLastColumn="0"/>
-            </w:pPr>
             <w:r>
               <w:t>{$p.aktivitas_pembelajaran[3].prosedur_siswa}</w:t>
             </w:r>
@@ -4790,13 +4567,8 @@
             <w:tcW w:w="1294" w:type="dxa"/>
           </w:tcPr>
           <w:p>
-            <w:pPr>
-              <w:cnfStyle w:val="000000000000" w:firstRow="0" w:lastRow="0" w:firstColumn="0" w:lastColumn="0" w:oddVBand="0" w:evenVBand="0" w:oddHBand="0" w:evenHBand="0" w:firstRowFirstColumn="0" w:firstRowLastColumn="0" w:lastRowFirstColumn="0" w:lastRowLastColumn="0"/>
-            </w:pPr>
             <w:r>
               <w:t>{FOR pk IN $p.aktivitas_pembelajaran[3].pertanyaan_kunci}{$pk}</w:t>
-            </w:r>
-            <w:r>
               <w:br/>
               <w:t>{END-FOR pk}</w:t>
             </w:r>
@@ -4807,9 +4579,7 @@
             <w:tcW w:w="2418" w:type="dxa"/>
           </w:tcPr>
           <w:p>
-            <w:pPr>
-              <w:cnfStyle w:val="000000000000" w:firstRow="0" w:lastRow="0" w:firstColumn="0" w:lastColumn="0" w:oddVBand="0" w:evenVBand="0" w:oddHBand="0" w:evenHBand="0" w:firstRowFirstColumn="0" w:firstRowLastColumn="0" w:lastRowFirstColumn="0" w:lastRowLastColumn="0"/>
-            </w:pPr>
+            <w:r/>
             <w:r>
               <w:rPr>
                 <w:b/>
@@ -4887,9 +4657,6 @@
             <w:tcW w:w="1307" w:type="dxa"/>
           </w:tcPr>
           <w:p>
-            <w:pPr>
-              <w:cnfStyle w:val="000000000000" w:firstRow="0" w:lastRow="0" w:firstColumn="0" w:lastColumn="0" w:oddVBand="0" w:evenVBand="0" w:oddHBand="0" w:evenHBand="0" w:firstRowFirstColumn="0" w:firstRowLastColumn="0" w:lastRowFirstColumn="0" w:lastRowLastColumn="0"/>
-            </w:pPr>
             <w:r>
               <w:t>{$p.aktivitas_pembelajaran[4].tahapan_sintaks}</w:t>
             </w:r>
@@ -4901,9 +4668,6 @@
             <w:gridSpan w:val="2"/>
           </w:tcPr>
           <w:p>
-            <w:pPr>
-              <w:cnfStyle w:val="000000000000" w:firstRow="0" w:lastRow="0" w:firstColumn="0" w:lastColumn="0" w:oddVBand="0" w:evenVBand="0" w:oddHBand="0" w:evenHBand="0" w:firstRowFirstColumn="0" w:firstRowLastColumn="0" w:lastRowFirstColumn="0" w:lastRowLastColumn="0"/>
-            </w:pPr>
             <w:r>
               <w:t>{$p.aktivitas_pembelajaran[4].prosedur_guru}</w:t>
             </w:r>
@@ -4914,9 +4678,6 @@
             <w:tcW w:w="1969" w:type="dxa"/>
           </w:tcPr>
           <w:p>
-            <w:pPr>
-              <w:cnfStyle w:val="000000000000" w:firstRow="0" w:lastRow="0" w:firstColumn="0" w:lastColumn="0" w:oddVBand="0" w:evenVBand="0" w:oddHBand="0" w:evenHBand="0" w:firstRowFirstColumn="0" w:firstRowLastColumn="0" w:lastRowFirstColumn="0" w:lastRowLastColumn="0"/>
-            </w:pPr>
             <w:r>
               <w:t>{$p.aktivitas_pembelajaran[4].prosedur_siswa}</w:t>
             </w:r>
@@ -4927,13 +4688,8 @@
             <w:tcW w:w="1294" w:type="dxa"/>
           </w:tcPr>
           <w:p>
-            <w:pPr>
-              <w:cnfStyle w:val="000000000000" w:firstRow="0" w:lastRow="0" w:firstColumn="0" w:lastColumn="0" w:oddVBand="0" w:evenVBand="0" w:oddHBand="0" w:evenHBand="0" w:firstRowFirstColumn="0" w:firstRowLastColumn="0" w:lastRowFirstColumn="0" w:lastRowLastColumn="0"/>
-            </w:pPr>
             <w:r>
               <w:t>{FOR pk IN $p.aktivitas_pembelajaran[4].pertanyaan_kunci}{$pk}</w:t>
-            </w:r>
-            <w:r>
               <w:br/>
               <w:t>{END-FOR pk}</w:t>
             </w:r>
@@ -4944,9 +4700,7 @@
             <w:tcW w:w="2418" w:type="dxa"/>
           </w:tcPr>
           <w:p>
-            <w:pPr>
-              <w:cnfStyle w:val="000000000000" w:firstRow="0" w:lastRow="0" w:firstColumn="0" w:lastColumn="0" w:oddVBand="0" w:evenVBand="0" w:oddHBand="0" w:evenHBand="0" w:firstRowFirstColumn="0" w:firstRowLastColumn="0" w:lastRowFirstColumn="0" w:lastRowLastColumn="0"/>
-            </w:pPr>
+            <w:r/>
             <w:r>
               <w:rPr>
                 <w:b/>
@@ -4963,11 +4717,7 @@
               <w:t>{$p.aktivitas_pembelajaran[4].muatan_inovatif.differentiation ? 'Differentiation (' + $p.aktivitas_pembelajaran[4].muatan_inovatif.differentiation.type + '): ' : ''}</w:t>
             </w:r>
             <w:r>
-              <w:t>{$p.aktivitas_pembelajaran[4].muatan_inovatif.</w:t>
-            </w:r>
-            <w:r>
-              <w:lastRenderedPageBreak/>
-              <w:t>differentiation ? $p.aktivitas_pembelajaran[4].muatan_inovatif.differentiation.deskripsi : ''}</w:t>
+              <w:t>{$p.aktivitas_pembelajaran[4].muatan_inovatif.differentiation ? $p.aktivitas_pembelajaran[4].muatan_inovatif.differentiation.deskripsi : ''}</w:t>
             </w:r>
             <w:r>
               <w:rPr>
@@ -4992,7 +4742,6 @@
           </w:tcPr>
           <w:p>
             <w:r>
-              <w:lastRenderedPageBreak/>
               <w:t>{$p.aktivitas_pembelajaran[5].waktu_menit}'</w:t>
             </w:r>
           </w:p>
@@ -5005,9 +4754,6 @@
             </w:tcBorders>
           </w:tcPr>
           <w:p>
-            <w:pPr>
-              <w:cnfStyle w:val="000000000000" w:firstRow="0" w:lastRow="0" w:firstColumn="0" w:lastColumn="0" w:oddVBand="0" w:evenVBand="0" w:oddHBand="0" w:evenHBand="0" w:firstRowFirstColumn="0" w:firstRowLastColumn="0" w:lastRowFirstColumn="0" w:lastRowLastColumn="0"/>
-            </w:pPr>
             <w:r>
               <w:t>{$p.aktivitas_pembelajaran[5].tahapan_sintaks}</w:t>
             </w:r>
@@ -5022,9 +4768,6 @@
             </w:tcBorders>
           </w:tcPr>
           <w:p>
-            <w:pPr>
-              <w:cnfStyle w:val="000000000000" w:firstRow="0" w:lastRow="0" w:firstColumn="0" w:lastColumn="0" w:oddVBand="0" w:evenVBand="0" w:oddHBand="0" w:evenHBand="0" w:firstRowFirstColumn="0" w:firstRowLastColumn="0" w:lastRowFirstColumn="0" w:lastRowLastColumn="0"/>
-            </w:pPr>
             <w:r>
               <w:t>{$p.aktivitas_pembelajaran[5].prosedur_guru}</w:t>
             </w:r>
@@ -5038,9 +4781,6 @@
             </w:tcBorders>
           </w:tcPr>
           <w:p>
-            <w:pPr>
-              <w:cnfStyle w:val="000000000000" w:firstRow="0" w:lastRow="0" w:firstColumn="0" w:lastColumn="0" w:oddVBand="0" w:evenVBand="0" w:oddHBand="0" w:evenHBand="0" w:firstRowFirstColumn="0" w:firstRowLastColumn="0" w:lastRowFirstColumn="0" w:lastRowLastColumn="0"/>
-            </w:pPr>
             <w:r>
               <w:t>{$p.aktivitas_pembelajaran[5].prosedur_siswa}</w:t>
             </w:r>
@@ -5054,13 +4794,8 @@
             </w:tcBorders>
           </w:tcPr>
           <w:p>
-            <w:pPr>
-              <w:cnfStyle w:val="000000000000" w:firstRow="0" w:lastRow="0" w:firstColumn="0" w:lastColumn="0" w:oddVBand="0" w:evenVBand="0" w:oddHBand="0" w:evenHBand="0" w:firstRowFirstColumn="0" w:firstRowLastColumn="0" w:lastRowFirstColumn="0" w:lastRowLastColumn="0"/>
-            </w:pPr>
             <w:r>
               <w:t>{FOR pk IN $p.aktivitas_pembelajaran[5].pertanyaan_kunci}{$pk}</w:t>
-            </w:r>
-            <w:r>
               <w:br/>
               <w:t>{END-FOR pk}</w:t>
             </w:r>
@@ -5074,9 +4809,7 @@
             </w:tcBorders>
           </w:tcPr>
           <w:p>
-            <w:pPr>
-              <w:cnfStyle w:val="000000000000" w:firstRow="0" w:lastRow="0" w:firstColumn="0" w:lastColumn="0" w:oddVBand="0" w:evenVBand="0" w:oddHBand="0" w:evenHBand="0" w:firstRowFirstColumn="0" w:firstRowLastColumn="0" w:lastRowFirstColumn="0" w:lastRowLastColumn="0"/>
-            </w:pPr>
+            <w:r/>
             <w:r>
               <w:rPr>
                 <w:b/>
@@ -5245,6 +4978,7 @@
                 <w:rFonts w:ascii="Arial Nova" w:eastAsia="Times New Roman" w:hAnsi="Arial Nova" w:cs="Times New Roman"/>
                 <w:b w:val="0"/>
                 <w:bCs w:val="0"/>
+                <w:color w:val="FFFFFF" w:themeColor="background1"/>
                 <w:sz w:val="20"/>
                 <w:szCs w:val="20"/>
                 <w:lang w:val="id-ID" w:eastAsia="en-ID"/>
@@ -5281,6 +5015,7 @@
                 <w:rFonts w:ascii="Arial Nova" w:eastAsia="Times New Roman" w:hAnsi="Arial Nova" w:cs="Times New Roman"/>
                 <w:b w:val="0"/>
                 <w:bCs w:val="0"/>
+                <w:color w:val="FFFFFF" w:themeColor="background1"/>
                 <w:sz w:val="20"/>
                 <w:szCs w:val="20"/>
                 <w:lang w:val="id-ID" w:eastAsia="en-ID"/>
@@ -5317,6 +5052,7 @@
                 <w:rFonts w:ascii="Arial Nova" w:eastAsia="Times New Roman" w:hAnsi="Arial Nova" w:cs="Times New Roman"/>
                 <w:b w:val="0"/>
                 <w:bCs w:val="0"/>
+                <w:color w:val="FFFFFF" w:themeColor="background1"/>
                 <w:sz w:val="20"/>
                 <w:szCs w:val="20"/>
                 <w:lang w:val="id-ID" w:eastAsia="en-ID"/>
@@ -5336,7 +5072,11 @@
             <w:tcW w:w="1279" w:type="dxa"/>
           </w:tcPr>
           <w:p>
-            <w:r>
+            <w:r/>
+            <w:r>
+              <w:rPr>
+                <w:b/>
+              </w:rPr>
               <w:t>{$p.asesmen[0].jenis}</w:t>
             </w:r>
           </w:p>
@@ -5346,9 +5086,6 @@
             <w:tcW w:w="3029" w:type="dxa"/>
           </w:tcPr>
           <w:p>
-            <w:pPr>
-              <w:cnfStyle w:val="000000100000" w:firstRow="0" w:lastRow="0" w:firstColumn="0" w:lastColumn="0" w:oddVBand="0" w:evenVBand="0" w:oddHBand="1" w:evenHBand="0" w:firstRowFirstColumn="0" w:firstRowLastColumn="0" w:lastRowFirstColumn="0" w:lastRowLastColumn="0"/>
-            </w:pPr>
             <w:r>
               <w:t>{$p.asesmen[0].bentuk}</w:t>
             </w:r>
@@ -5359,9 +5096,7 @@
             <w:tcW w:w="5659" w:type="dxa"/>
           </w:tcPr>
           <w:p>
-            <w:pPr>
-              <w:cnfStyle w:val="000000100000" w:firstRow="0" w:lastRow="0" w:firstColumn="0" w:lastColumn="0" w:oddVBand="0" w:evenVBand="0" w:oddHBand="1" w:evenHBand="0" w:firstRowFirstColumn="0" w:firstRowLastColumn="0" w:lastRowFirstColumn="0" w:lastRowLastColumn="0"/>
-            </w:pPr>
+            <w:r/>
             <w:r>
               <w:rPr>
                 <w:b/>
@@ -5369,11 +5104,7 @@
               <w:t>{$p.asesmen[0].lampiran.includes(':') ? $p.asesmen[0].lampiran.split(':')[0] + ':' : ''}</w:t>
             </w:r>
             <w:r>
-              <w:t xml:space="preserve">{$p.asesmen[0].lampiran.includes(':') ? </w:t>
-            </w:r>
-            <w:r>
-              <w:lastRenderedPageBreak/>
-              <w:t>$p.asesmen[0].lampiran.substring($p.asesmen[0].lampiran.indexOf(':') + 1) : $p.asesmen[0].lampiran}</w:t>
+              <w:t>{$p.asesmen[0].lampiran.includes(':') ? $p.asesmen[0].lampiran.substring($p.asesmen[0].lampiran.indexOf(':') + 1) : $p.asesmen[0].lampiran}</w:t>
             </w:r>
           </w:p>
         </w:tc>
@@ -5385,8 +5116,11 @@
             <w:tcW w:w="1279" w:type="dxa"/>
           </w:tcPr>
           <w:p>
-            <w:r>
-              <w:lastRenderedPageBreak/>
+            <w:r/>
+            <w:r>
+              <w:rPr>
+                <w:b/>
+              </w:rPr>
               <w:t>{$p.asesmen[1].jenis}</w:t>
             </w:r>
           </w:p>
@@ -5396,9 +5130,6 @@
             <w:tcW w:w="3029" w:type="dxa"/>
           </w:tcPr>
           <w:p>
-            <w:pPr>
-              <w:cnfStyle w:val="000000000000" w:firstRow="0" w:lastRow="0" w:firstColumn="0" w:lastColumn="0" w:oddVBand="0" w:evenVBand="0" w:oddHBand="0" w:evenHBand="0" w:firstRowFirstColumn="0" w:firstRowLastColumn="0" w:lastRowFirstColumn="0" w:lastRowLastColumn="0"/>
-            </w:pPr>
             <w:r>
               <w:t>{$p.asesmen[1].bentuk}</w:t>
             </w:r>
@@ -5409,9 +5140,7 @@
             <w:tcW w:w="5659" w:type="dxa"/>
           </w:tcPr>
           <w:p>
-            <w:pPr>
-              <w:cnfStyle w:val="000000000000" w:firstRow="0" w:lastRow="0" w:firstColumn="0" w:lastColumn="0" w:oddVBand="0" w:evenVBand="0" w:oddHBand="0" w:evenHBand="0" w:firstRowFirstColumn="0" w:firstRowLastColumn="0" w:lastRowFirstColumn="0" w:lastRowLastColumn="0"/>
-            </w:pPr>
+            <w:r/>
             <w:r>
               <w:rPr>
                 <w:b/>
@@ -5434,7 +5163,11 @@
             <w:tcW w:w="1279" w:type="dxa"/>
           </w:tcPr>
           <w:p>
-            <w:r>
+            <w:r/>
+            <w:r>
+              <w:rPr>
+                <w:b/>
+              </w:rPr>
               <w:t>{$p.asesmen[2].jenis}</w:t>
             </w:r>
           </w:p>
@@ -5444,9 +5177,6 @@
             <w:tcW w:w="3029" w:type="dxa"/>
           </w:tcPr>
           <w:p>
-            <w:pPr>
-              <w:cnfStyle w:val="000000100000" w:firstRow="0" w:lastRow="0" w:firstColumn="0" w:lastColumn="0" w:oddVBand="0" w:evenVBand="0" w:oddHBand="1" w:evenHBand="0" w:firstRowFirstColumn="0" w:firstRowLastColumn="0" w:lastRowFirstColumn="0" w:lastRowLastColumn="0"/>
-            </w:pPr>
             <w:r>
               <w:t>{$p.asesmen[2].bentuk}</w:t>
             </w:r>
@@ -5457,9 +5187,7 @@
             <w:tcW w:w="5659" w:type="dxa"/>
           </w:tcPr>
           <w:p>
-            <w:pPr>
-              <w:cnfStyle w:val="000000100000" w:firstRow="0" w:lastRow="0" w:firstColumn="0" w:lastColumn="0" w:oddVBand="0" w:evenVBand="0" w:oddHBand="1" w:evenHBand="0" w:firstRowFirstColumn="0" w:firstRowLastColumn="0" w:lastRowFirstColumn="0" w:lastRowLastColumn="0"/>
-            </w:pPr>
+            <w:r/>
             <w:r>
               <w:rPr>
                 <w:b/>
@@ -5479,7 +5207,11 @@
             <w:tcW w:w="1279" w:type="dxa"/>
           </w:tcPr>
           <w:p>
-            <w:r>
+            <w:r/>
+            <w:r>
+              <w:rPr>
+                <w:b/>
+              </w:rPr>
               <w:t>{$p.asesmen[3].jenis}</w:t>
             </w:r>
           </w:p>
@@ -5489,9 +5221,6 @@
             <w:tcW w:w="3029" w:type="dxa"/>
           </w:tcPr>
           <w:p>
-            <w:pPr>
-              <w:cnfStyle w:val="000000000000" w:firstRow="0" w:lastRow="0" w:firstColumn="0" w:lastColumn="0" w:oddVBand="0" w:evenVBand="0" w:oddHBand="0" w:evenHBand="0" w:firstRowFirstColumn="0" w:firstRowLastColumn="0" w:lastRowFirstColumn="0" w:lastRowLastColumn="0"/>
-            </w:pPr>
             <w:r>
               <w:t>{$p.asesmen[3].bentuk}</w:t>
             </w:r>
@@ -5502,9 +5231,7 @@
             <w:tcW w:w="5659" w:type="dxa"/>
           </w:tcPr>
           <w:p>
-            <w:pPr>
-              <w:cnfStyle w:val="000000000000" w:firstRow="0" w:lastRow="0" w:firstColumn="0" w:lastColumn="0" w:oddVBand="0" w:evenVBand="0" w:oddHBand="0" w:evenHBand="0" w:firstRowFirstColumn="0" w:firstRowLastColumn="0" w:lastRowFirstColumn="0" w:lastRowLastColumn="0"/>
-            </w:pPr>
+            <w:r/>
             <w:r>
               <w:rPr>
                 <w:b/>
@@ -5868,12 +5595,6 @@
         <w:br w:type="page"/>
       </w:r>
     </w:p>
-    <w:sectPr>
-      <w:pgSz w:w="11906" w:h="16838"/>
-      <w:pgMar w:top="1440" w:right="1440" w:bottom="1440" w:left="1440" w:header="708" w:footer="708" w:gutter="0"/>
-      <w:cols w:space="708"/>
-      <w:docGrid w:linePitch="360"/>
-    </w:sectPr>
   </w:body>
 </w:document>
 </file>

</xml_diff>

<commit_message>
feat: adopt user's updated template.docx and rebuild compiler page
</commit_message>
<xml_diff>
--- a/template.docx
+++ b/template.docx
@@ -881,6 +881,7 @@
           <w:szCs w:val="40"/>
           <w:lang w:val="id-ID"/>
         </w:rPr>
+        <w:lastRenderedPageBreak/>
         <w:t>Tahun Akademik 2025-2026</w:t>
       </w:r>
     </w:p>
@@ -963,7 +964,6 @@
           <w:p>
             <w:pPr>
               <w:spacing w:beforeAutospacing="1" w:after="0" w:line="240" w:lineRule="auto"/>
-              <w:jc w:val="right"/>
               <w:outlineLvl w:val="1"/>
               <w:rPr>
                 <w:rFonts w:ascii="Arial Nova" w:eastAsia="Times New Roman" w:hAnsi="Arial Nova" w:cs="Times New Roman"/>
@@ -1038,7 +1038,6 @@
           <w:p>
             <w:pPr>
               <w:spacing w:beforeAutospacing="1" w:after="0" w:line="240" w:lineRule="auto"/>
-              <w:jc w:val="right"/>
               <w:outlineLvl w:val="1"/>
               <w:rPr>
                 <w:rFonts w:ascii="Arial Nova" w:eastAsia="Times New Roman" w:hAnsi="Arial Nova" w:cs="Times New Roman"/>
@@ -1101,7 +1100,6 @@
           <w:p>
             <w:pPr>
               <w:spacing w:beforeAutospacing="1" w:after="0" w:line="240" w:lineRule="auto"/>
-              <w:jc w:val="right"/>
               <w:outlineLvl w:val="1"/>
               <w:rPr>
                 <w:rFonts w:ascii="Arial Nova" w:eastAsia="Times New Roman" w:hAnsi="Arial Nova" w:cs="Times New Roman"/>
@@ -1167,7 +1165,6 @@
           <w:p>
             <w:pPr>
               <w:spacing w:beforeAutospacing="1" w:after="0" w:line="240" w:lineRule="auto"/>
-              <w:jc w:val="right"/>
               <w:outlineLvl w:val="1"/>
               <w:rPr>
                 <w:rFonts w:ascii="Arial Nova" w:eastAsia="Times New Roman" w:hAnsi="Arial Nova" w:cs="Times New Roman"/>
@@ -1234,7 +1231,6 @@
           <w:p>
             <w:pPr>
               <w:spacing w:beforeAutospacing="1" w:after="0" w:line="240" w:lineRule="auto"/>
-              <w:jc w:val="right"/>
               <w:outlineLvl w:val="1"/>
               <w:rPr>
                 <w:rFonts w:ascii="Arial Nova" w:eastAsia="Times New Roman" w:hAnsi="Arial Nova" w:cs="Times New Roman"/>
@@ -1260,7 +1256,23 @@
             <w:tcW w:w="7236" w:type="dxa"/>
           </w:tcPr>
           <w:p>
-            <w:r>
+            <w:pPr>
+              <w:cnfStyle w:val="000000000000" w:firstRow="0" w:lastRow="0" w:firstColumn="0" w:lastColumn="0" w:oddVBand="0" w:evenVBand="0" w:oddHBand="0" w:evenHBand="0" w:firstRowFirstColumn="0" w:firstRowLastColumn="0" w:lastRowFirstColumn="0" w:lastRowLastColumn="0"/>
+              <w:rPr>
+                <w:rFonts w:ascii="Open Sans" w:hAnsi="Open Sans" w:cs="Open Sans"/>
+                <w:b/>
+                <w:bCs/>
+              </w:rPr>
+            </w:pPr>
+            <w:r>
+              <w:rPr>
+                <w:rFonts w:ascii="Open Sans" w:hAnsi="Open Sans" w:cs="Open Sans"/>
+                <w:b/>
+                <w:bCs/>
+                <w:color w:val="EE0000"/>
+                <w:sz w:val="22"/>
+                <w:szCs w:val="22"/>
+              </w:rPr>
               <w:t>{judul_tema_subtopik}</w:t>
             </w:r>
           </w:p>
@@ -1281,7 +1293,6 @@
           <w:p>
             <w:pPr>
               <w:spacing w:beforeAutospacing="1" w:after="0" w:line="240" w:lineRule="auto"/>
-              <w:jc w:val="right"/>
               <w:outlineLvl w:val="1"/>
               <w:rPr>
                 <w:rFonts w:ascii="Arial Nova" w:eastAsia="Times New Roman" w:hAnsi="Arial Nova" w:cs="Times New Roman"/>
@@ -1344,7 +1355,6 @@
           <w:p>
             <w:pPr>
               <w:spacing w:beforeAutospacing="1" w:after="0" w:line="240" w:lineRule="auto"/>
-              <w:jc w:val="right"/>
               <w:outlineLvl w:val="1"/>
               <w:rPr>
                 <w:rFonts w:ascii="Arial Nova" w:eastAsia="Times New Roman" w:hAnsi="Arial Nova" w:cs="Times New Roman"/>
@@ -1410,7 +1420,6 @@
           <w:p>
             <w:pPr>
               <w:spacing w:beforeAutospacing="1" w:after="0" w:line="240" w:lineRule="auto"/>
-              <w:jc w:val="right"/>
               <w:outlineLvl w:val="1"/>
               <w:rPr>
                 <w:rFonts w:ascii="Arial Nova" w:eastAsia="Times New Roman" w:hAnsi="Arial Nova" w:cs="Times New Roman"/>
@@ -1473,7 +1482,6 @@
           <w:p>
             <w:pPr>
               <w:spacing w:beforeAutospacing="1" w:after="0" w:line="240" w:lineRule="auto"/>
-              <w:jc w:val="right"/>
               <w:outlineLvl w:val="1"/>
               <w:rPr>
                 <w:rFonts w:ascii="Arial Nova" w:eastAsia="Times New Roman" w:hAnsi="Arial Nova" w:cs="Times New Roman"/>
@@ -1899,8 +1907,26 @@
           <w:p>
             <w:r>
               <w:t>Latar belakang pembelajaran:</w:t>
+            </w:r>
+            <w:r>
               <w:br/>
+            </w:r>
+            <w:r>
+              <w:rPr>
+                <w:rFonts w:ascii="Arial Nova" w:hAnsi="Arial Nova"/>
+                <w:color w:val="EE0000"/>
+                <w:sz w:val="20"/>
+                <w:szCs w:val="20"/>
+              </w:rPr>
               <w:t>{FOR lb IN latar_belakang_pembelajaran}• {$lb}</w:t>
+            </w:r>
+            <w:r>
+              <w:rPr>
+                <w:rFonts w:ascii="Arial Nova" w:hAnsi="Arial Nova"/>
+                <w:color w:val="EE0000"/>
+                <w:sz w:val="20"/>
+                <w:szCs w:val="20"/>
+              </w:rPr>
               <w:br/>
               <w:t>{END-FOR lb}</w:t>
             </w:r>
@@ -2206,7 +2232,6 @@
           <w:tcPr>
             <w:tcW w:w="1667" w:type="dxa"/>
             <w:vMerge/>
-            <w:vAlign w:val="center"/>
           </w:tcPr>
           <w:p>
             <w:pPr>
@@ -2225,26 +2250,43 @@
         <w:tc>
           <w:tcPr>
             <w:tcW w:w="2080" w:type="dxa"/>
-          </w:tcPr>
-          <w:p>
-            <w:r>
-              <w:t>{capaian_pembelajaran}</w:t>
-            </w:r>
-          </w:p>
-        </w:tc>
-        <w:tc>
-          <w:tcPr>
-            <w:tcW w:w="2086" w:type="dxa"/>
+            <w:shd w:val="clear" w:color="auto" w:fill="FFF2CC" w:themeFill="accent4" w:themeFillTint="33"/>
           </w:tcPr>
           <w:p>
             <w:pPr>
               <w:spacing w:after="0" w:line="240" w:lineRule="auto"/>
+              <w:rPr>
+                <w:rFonts w:ascii="Segoe UI Symbol" w:eastAsia="Times New Roman" w:hAnsi="Segoe UI Symbol" w:cs="Segoe UI Symbol"/>
+                <w:sz w:val="16"/>
+                <w:szCs w:val="16"/>
+                <w:lang w:val="id-ID" w:eastAsia="en-ID"/>
+              </w:rPr>
+            </w:pPr>
+            <w:r>
               <w:rPr>
                 <w:rFonts w:ascii="Segoe UI Symbol" w:eastAsia="Times New Roman" w:hAnsi="Segoe UI Symbol" w:cs="Segoe UI Symbol"/>
                 <w:b/>
                 <w:bCs/>
                 <w:sz w:val="20"/>
                 <w:szCs w:val="20"/>
+                <w:lang w:eastAsia="en-ID"/>
+              </w:rPr>
+              <w:t>☐   DPL 6</w:t>
+            </w:r>
+          </w:p>
+        </w:tc>
+        <w:tc>
+          <w:tcPr>
+            <w:tcW w:w="2086" w:type="dxa"/>
+            <w:shd w:val="clear" w:color="auto" w:fill="FFF2CC" w:themeFill="accent4" w:themeFillTint="33"/>
+          </w:tcPr>
+          <w:p>
+            <w:pPr>
+              <w:spacing w:after="0" w:line="240" w:lineRule="auto"/>
+              <w:rPr>
+                <w:rFonts w:ascii="Segoe UI Symbol" w:eastAsia="Times New Roman" w:hAnsi="Segoe UI Symbol" w:cs="Segoe UI Symbol"/>
+                <w:sz w:val="16"/>
+                <w:szCs w:val="16"/>
                 <w:lang w:val="id-ID" w:eastAsia="en-ID"/>
               </w:rPr>
             </w:pPr>
@@ -2255,9 +2297,9 @@
                 <w:bCs/>
                 <w:sz w:val="20"/>
                 <w:szCs w:val="20"/>
-                <w:lang w:val="id-ID" w:eastAsia="en-ID"/>
-              </w:rPr>
-              <w:t>☐   DPL 6</w:t>
+                <w:lang w:eastAsia="en-ID"/>
+              </w:rPr>
+              <w:t>☐   DPL 7</w:t>
             </w:r>
           </w:p>
         </w:tc>
@@ -2265,16 +2307,15 @@
           <w:tcPr>
             <w:tcW w:w="2072" w:type="dxa"/>
             <w:gridSpan w:val="2"/>
+            <w:shd w:val="clear" w:color="auto" w:fill="FFF2CC" w:themeFill="accent4" w:themeFillTint="33"/>
           </w:tcPr>
           <w:p>
             <w:pPr>
               <w:spacing w:after="0" w:line="240" w:lineRule="auto"/>
               <w:rPr>
                 <w:rFonts w:ascii="Arial Nova" w:eastAsia="Times New Roman" w:hAnsi="Arial Nova" w:cs="Times New Roman"/>
-                <w:b/>
-                <w:bCs/>
-                <w:sz w:val="20"/>
-                <w:szCs w:val="20"/>
+                <w:sz w:val="16"/>
+                <w:szCs w:val="16"/>
                 <w:lang w:val="id-ID" w:eastAsia="en-ID"/>
               </w:rPr>
             </w:pPr>
@@ -2285,25 +2326,24 @@
                 <w:bCs/>
                 <w:sz w:val="20"/>
                 <w:szCs w:val="20"/>
-                <w:lang w:val="id-ID" w:eastAsia="en-ID"/>
-              </w:rPr>
-              <w:t>☐   DPL 7</w:t>
+                <w:lang w:eastAsia="en-ID"/>
+              </w:rPr>
+              <w:t>☐   DPL 8</w:t>
             </w:r>
           </w:p>
         </w:tc>
         <w:tc>
           <w:tcPr>
             <w:tcW w:w="2087" w:type="dxa"/>
+            <w:shd w:val="clear" w:color="auto" w:fill="FFF2CC" w:themeFill="accent4" w:themeFillTint="33"/>
           </w:tcPr>
           <w:p>
             <w:pPr>
               <w:spacing w:after="0" w:line="240" w:lineRule="auto"/>
               <w:rPr>
                 <w:rFonts w:ascii="Arial Nova" w:eastAsia="Times New Roman" w:hAnsi="Arial Nova" w:cs="Times New Roman"/>
-                <w:b/>
-                <w:bCs/>
-                <w:sz w:val="20"/>
-                <w:szCs w:val="20"/>
+                <w:sz w:val="16"/>
+                <w:szCs w:val="16"/>
                 <w:lang w:val="id-ID" w:eastAsia="en-ID"/>
               </w:rPr>
             </w:pPr>
@@ -2314,22 +2354,21 @@
                 <w:bCs/>
                 <w:sz w:val="20"/>
                 <w:szCs w:val="20"/>
-                <w:lang w:val="id-ID" w:eastAsia="en-ID"/>
-              </w:rPr>
-              <w:t>☐   DPL 8</w:t>
+                <w:lang w:eastAsia="en-ID"/>
+              </w:rPr>
+              <w:t>☐   DPL 5</w:t>
             </w:r>
           </w:p>
         </w:tc>
       </w:tr>
       <w:tr>
         <w:trPr>
-          <w:trHeight w:val="79"/>
+          <w:trHeight w:val="54"/>
         </w:trPr>
         <w:tc>
           <w:tcPr>
             <w:tcW w:w="1667" w:type="dxa"/>
             <w:vMerge/>
-            <w:vAlign w:val="center"/>
           </w:tcPr>
           <w:p>
             <w:pPr>
@@ -2352,11 +2391,28 @@
             <w:vAlign w:val="center"/>
           </w:tcPr>
           <w:p>
-            <w:r>
-              <w:t>{FOR tpu IN tujuan_pembelajaran_umum}{$tpu}</w:t>
-              <w:br/>
-              <w:t>{END-FOR tpu}</w:t>
-            </w:r>
+            <w:pPr>
+              <w:spacing w:after="0" w:line="240" w:lineRule="auto"/>
+              <w:rPr>
+                <w:rFonts w:ascii="Segoe UI Symbol" w:eastAsia="Times New Roman" w:hAnsi="Segoe UI Symbol" w:cs="Segoe UI Symbol"/>
+                <w:b/>
+                <w:bCs/>
+                <w:sz w:val="20"/>
+                <w:szCs w:val="20"/>
+                <w:lang w:eastAsia="en-ID"/>
+              </w:rPr>
+            </w:pPr>
+            <w:proofErr w:type="spellStart"/>
+            <w:r>
+              <w:rPr>
+                <w:rFonts w:ascii="Arial Nova" w:eastAsia="Times New Roman" w:hAnsi="Arial Nova" w:cs="Times New Roman"/>
+                <w:sz w:val="16"/>
+                <w:szCs w:val="16"/>
+                <w:lang w:eastAsia="en-ID"/>
+              </w:rPr>
+              <w:t>Kolaborasi</w:t>
+            </w:r>
+            <w:proofErr w:type="spellEnd"/>
           </w:p>
         </w:tc>
         <w:tc>
@@ -2369,21 +2425,25 @@
             <w:pPr>
               <w:spacing w:after="0" w:line="240" w:lineRule="auto"/>
               <w:rPr>
+                <w:rFonts w:ascii="Segoe UI Symbol" w:eastAsia="Times New Roman" w:hAnsi="Segoe UI Symbol" w:cs="Segoe UI Symbol"/>
+                <w:b/>
+                <w:bCs/>
+                <w:sz w:val="20"/>
+                <w:szCs w:val="20"/>
+                <w:lang w:eastAsia="en-ID"/>
+              </w:rPr>
+            </w:pPr>
+            <w:proofErr w:type="spellStart"/>
+            <w:r>
+              <w:rPr>
                 <w:rFonts w:ascii="Arial Nova" w:eastAsia="Times New Roman" w:hAnsi="Arial Nova" w:cs="Times New Roman"/>
                 <w:sz w:val="16"/>
                 <w:szCs w:val="16"/>
-                <w:lang w:val="id-ID" w:eastAsia="en-ID"/>
-              </w:rPr>
-            </w:pPr>
-            <w:r>
-              <w:rPr>
-                <w:rFonts w:ascii="Arial Nova" w:eastAsia="Times New Roman" w:hAnsi="Arial Nova" w:cs="Times New Roman"/>
-                <w:sz w:val="16"/>
-                <w:szCs w:val="16"/>
-                <w:lang w:val="id-ID" w:eastAsia="en-ID"/>
+                <w:lang w:eastAsia="en-ID"/>
               </w:rPr>
               <w:t>Kemandirian</w:t>
             </w:r>
+            <w:proofErr w:type="spellEnd"/>
           </w:p>
         </w:tc>
         <w:tc>
@@ -2397,18 +2457,20 @@
             <w:pPr>
               <w:spacing w:after="0" w:line="240" w:lineRule="auto"/>
               <w:rPr>
+                <w:rFonts w:ascii="Segoe UI Symbol" w:eastAsia="Times New Roman" w:hAnsi="Segoe UI Symbol" w:cs="Segoe UI Symbol"/>
+                <w:b/>
+                <w:bCs/>
+                <w:sz w:val="20"/>
+                <w:szCs w:val="20"/>
+                <w:lang w:eastAsia="en-ID"/>
+              </w:rPr>
+            </w:pPr>
+            <w:r>
+              <w:rPr>
                 <w:rFonts w:ascii="Arial Nova" w:eastAsia="Times New Roman" w:hAnsi="Arial Nova" w:cs="Times New Roman"/>
                 <w:sz w:val="16"/>
                 <w:szCs w:val="16"/>
-                <w:lang w:val="id-ID" w:eastAsia="en-ID"/>
-              </w:rPr>
-            </w:pPr>
-            <w:r>
-              <w:rPr>
-                <w:rFonts w:ascii="Arial Nova" w:eastAsia="Times New Roman" w:hAnsi="Arial Nova" w:cs="Times New Roman"/>
-                <w:sz w:val="16"/>
-                <w:szCs w:val="16"/>
-                <w:lang w:val="id-ID" w:eastAsia="en-ID"/>
+                <w:lang w:eastAsia="en-ID"/>
               </w:rPr>
               <w:t>Kesehatan</w:t>
             </w:r>
@@ -2424,21 +2486,25 @@
             <w:pPr>
               <w:spacing w:after="0" w:line="240" w:lineRule="auto"/>
               <w:rPr>
+                <w:rFonts w:ascii="Segoe UI Symbol" w:eastAsia="Times New Roman" w:hAnsi="Segoe UI Symbol" w:cs="Segoe UI Symbol"/>
+                <w:b/>
+                <w:bCs/>
+                <w:sz w:val="20"/>
+                <w:szCs w:val="20"/>
+                <w:lang w:eastAsia="en-ID"/>
+              </w:rPr>
+            </w:pPr>
+            <w:proofErr w:type="spellStart"/>
+            <w:r>
+              <w:rPr>
                 <w:rFonts w:ascii="Arial Nova" w:eastAsia="Times New Roman" w:hAnsi="Arial Nova" w:cs="Times New Roman"/>
                 <w:sz w:val="16"/>
                 <w:szCs w:val="16"/>
-                <w:lang w:val="id-ID" w:eastAsia="en-ID"/>
-              </w:rPr>
-            </w:pPr>
-            <w:r>
-              <w:rPr>
-                <w:rFonts w:ascii="Arial Nova" w:eastAsia="Times New Roman" w:hAnsi="Arial Nova" w:cs="Times New Roman"/>
-                <w:sz w:val="16"/>
-                <w:szCs w:val="16"/>
-                <w:lang w:val="id-ID" w:eastAsia="en-ID"/>
+                <w:lang w:eastAsia="en-ID"/>
               </w:rPr>
               <w:t>Komunikasi</w:t>
             </w:r>
+            <w:proofErr w:type="spellEnd"/>
           </w:p>
         </w:tc>
       </w:tr>
@@ -2496,8 +2562,34 @@
             <w:vAlign w:val="center"/>
           </w:tcPr>
           <w:p>
-            <w:r>
-              <w:t>{enduring_understanding}</w:t>
+            <w:pPr>
+              <w:rPr>
+                <w:i/>
+                <w:iCs/>
+              </w:rPr>
+            </w:pPr>
+            <w:r>
+              <w:rPr>
+                <w:i/>
+                <w:iCs/>
+              </w:rPr>
+              <w:t>{</w:t>
+            </w:r>
+            <w:proofErr w:type="spellStart"/>
+            <w:r>
+              <w:rPr>
+                <w:i/>
+                <w:iCs/>
+              </w:rPr>
+              <w:t>capaian_pembelajaran</w:t>
+            </w:r>
+            <w:proofErr w:type="spellEnd"/>
+            <w:r>
+              <w:rPr>
+                <w:i/>
+                <w:iCs/>
+              </w:rPr>
+              <w:t>}</w:t>
             </w:r>
           </w:p>
         </w:tc>
@@ -2557,7 +2649,51 @@
           </w:tcPr>
           <w:p>
             <w:r>
-              <w:t>{lintas_disiplin_ilmu}</w:t>
+              <w:t xml:space="preserve">{FOR </w:t>
+            </w:r>
+            <w:proofErr w:type="spellStart"/>
+            <w:r>
+              <w:t>tpu</w:t>
+            </w:r>
+            <w:proofErr w:type="spellEnd"/>
+            <w:r>
+              <w:t xml:space="preserve"> IN </w:t>
+            </w:r>
+            <w:proofErr w:type="spellStart"/>
+            <w:r>
+              <w:t>tujuan_pembelajaran_</w:t>
+            </w:r>
+            <w:proofErr w:type="gramStart"/>
+            <w:r>
+              <w:t>umum</w:t>
+            </w:r>
+            <w:proofErr w:type="spellEnd"/>
+            <w:r>
+              <w:t>}{</w:t>
+            </w:r>
+            <w:proofErr w:type="gramEnd"/>
+            <w:r>
+              <w:t>$</w:t>
+            </w:r>
+            <w:proofErr w:type="spellStart"/>
+            <w:r>
+              <w:t>tpu</w:t>
+            </w:r>
+            <w:proofErr w:type="spellEnd"/>
+            <w:r>
+              <w:t>}</w:t>
+            </w:r>
+            <w:r>
+              <w:br/>
+              <w:t xml:space="preserve">{END-FOR </w:t>
+            </w:r>
+            <w:proofErr w:type="spellStart"/>
+            <w:r>
+              <w:t>tpu</w:t>
+            </w:r>
+            <w:proofErr w:type="spellEnd"/>
+            <w:r>
+              <w:t>}</w:t>
             </w:r>
           </w:p>
         </w:tc>
@@ -2592,6 +2728,7 @@
                 <w:szCs w:val="20"/>
                 <w:lang w:val="id-ID" w:eastAsia="en-ID"/>
               </w:rPr>
+              <w:lastRenderedPageBreak/>
               <w:t>Enduring Understanding/ Pemahaman Bermakna</w:t>
             </w:r>
           </w:p>
@@ -2613,14 +2750,15 @@
               </w:rPr>
             </w:pPr>
             <w:r>
-              <w:rPr>
-                <w:rFonts w:ascii="Arial" w:hAnsi="Arial" w:cs="Arial"/>
-                <w:color w:val="000000"/>
-                <w:sz w:val="20"/>
-                <w:szCs w:val="20"/>
-                <w:lang w:val="id-ID"/>
-              </w:rPr>
-              <w:t>Persamaan dan fungsi kuadrat bukan sekadar grafik melengkung atau hitungan hafalan akar, melainkan alat matematika esensial untuk memodelkan lintasan simetris, mengoptimalkan nilai maksimum/minimum, serta fondasi transisi menuju aljabar tingkat tinggi melalui manipulasi variabel tersembunyi.</w:t>
+              <w:t>{</w:t>
+            </w:r>
+            <w:proofErr w:type="spellStart"/>
+            <w:r>
+              <w:t>enduring_understanding</w:t>
+            </w:r>
+            <w:proofErr w:type="spellEnd"/>
+            <w:r>
+              <w:t>}</w:t>
             </w:r>
           </w:p>
         </w:tc>
@@ -2676,88 +2814,15 @@
               </w:rPr>
             </w:pPr>
             <w:r>
-              <w:rPr>
-                <w:rFonts w:ascii="Arial Nova" w:hAnsi="Arial Nova" w:cs="Segoe UI Symbol"/>
-                <w:color w:val="000000"/>
-                <w:sz w:val="20"/>
-                <w:szCs w:val="20"/>
-                <w:lang w:val="id-ID"/>
-              </w:rPr>
-              <w:t xml:space="preserve">Analisis kuadratik memiliki keterkaitan erat dengan tiga disiplin ilmu utama. Pertama, dalam </w:t>
-            </w:r>
-            <w:r>
-              <w:rPr>
-                <w:rFonts w:ascii="Arial Nova" w:hAnsi="Arial Nova" w:cs="Segoe UI Symbol"/>
-                <w:b/>
-                <w:color w:val="000000"/>
-                <w:sz w:val="20"/>
-                <w:szCs w:val="20"/>
-                <w:lang w:val="id-ID"/>
-              </w:rPr>
-              <w:t>Sains (Fisika)</w:t>
-            </w:r>
-            <w:r>
-              <w:rPr>
-                <w:rFonts w:ascii="Arial Nova" w:hAnsi="Arial Nova" w:cs="Segoe UI Symbol"/>
-                <w:color w:val="000000"/>
-                <w:sz w:val="20"/>
-                <w:szCs w:val="20"/>
-                <w:lang w:val="id-ID"/>
-              </w:rPr>
-              <w:t xml:space="preserve">, ia sangat fundamental untuk memodelkan gerak parabola (kinematika), </w:t>
-            </w:r>
-            <w:r>
-              <w:rPr>
-                <w:rFonts w:ascii="Arial Nova" w:hAnsi="Arial Nova" w:cs="Segoe UI Symbol"/>
-                <w:color w:val="000000"/>
-                <w:sz w:val="20"/>
-                <w:szCs w:val="20"/>
-                <w:lang w:val="id-ID"/>
-              </w:rPr>
-              <w:lastRenderedPageBreak/>
-              <w:t xml:space="preserve">menghitung waktu puncak, maupun jangkauan maksimum objek. Kedua, dalam </w:t>
-            </w:r>
-            <w:r>
-              <w:rPr>
-                <w:rFonts w:ascii="Arial Nova" w:hAnsi="Arial Nova" w:cs="Segoe UI Symbol"/>
-                <w:b/>
-                <w:color w:val="000000"/>
-                <w:sz w:val="20"/>
-                <w:szCs w:val="20"/>
-                <w:lang w:val="id-ID"/>
-              </w:rPr>
-              <w:t>Teknologi Informasi dan Rekayasa</w:t>
-            </w:r>
-            <w:r>
-              <w:rPr>
-                <w:rFonts w:ascii="Arial Nova" w:hAnsi="Arial Nova" w:cs="Segoe UI Symbol"/>
-                <w:color w:val="000000"/>
-                <w:sz w:val="20"/>
-                <w:szCs w:val="20"/>
-                <w:lang w:val="id-ID"/>
-              </w:rPr>
-              <w:t xml:space="preserve">, struktur kuadrat digunakan sebagai dasar algoritma optimasi, pengolahan citra digital grafik 3D, dan pemodelan kurva lengkung desain objek. Ketiga, ia berhubungan langsung dengan </w:t>
-            </w:r>
-            <w:r>
-              <w:rPr>
-                <w:rFonts w:ascii="Arial Nova" w:hAnsi="Arial Nova" w:cs="Segoe UI Symbol"/>
-                <w:b/>
-                <w:color w:val="000000"/>
-                <w:sz w:val="20"/>
-                <w:szCs w:val="20"/>
-                <w:lang w:val="id-ID"/>
-              </w:rPr>
-              <w:t>Ekonomi</w:t>
-            </w:r>
-            <w:r>
-              <w:rPr>
-                <w:rFonts w:ascii="Arial Nova" w:hAnsi="Arial Nova" w:cs="Segoe UI Symbol"/>
-                <w:color w:val="000000"/>
-                <w:sz w:val="20"/>
-                <w:szCs w:val="20"/>
-                <w:lang w:val="id-ID"/>
-              </w:rPr>
-              <w:t>, terutama dalam kalkulasi maksimalisasi keuntungan perusahaan atau minimalisasi biaya produksi berdasarkan fungsi biaya kuadratik.</w:t>
+              <w:t>{</w:t>
+            </w:r>
+            <w:proofErr w:type="spellStart"/>
+            <w:r>
+              <w:t>lintas_disiplin_ilmu</w:t>
+            </w:r>
+            <w:proofErr w:type="spellEnd"/>
+            <w:r>
+              <w:t>}</w:t>
             </w:r>
           </w:p>
         </w:tc>
@@ -2792,7 +2857,6 @@
                 <w:szCs w:val="20"/>
                 <w:lang w:val="id-ID" w:eastAsia="en-ID"/>
               </w:rPr>
-              <w:lastRenderedPageBreak/>
               <w:t>Moda Pembelajaran:</w:t>
             </w:r>
           </w:p>
@@ -3779,6 +3843,7 @@
           </w:p>
           <w:p>
             <w:r>
+              <w:lastRenderedPageBreak/>
               <w:t>{fidelity_checked ? '☑' : '☐'} Fidelity</w:t>
             </w:r>
           </w:p>
@@ -3800,6 +3865,7 @@
           </w:tcPr>
           <w:p>
             <w:r>
+              <w:lastRenderedPageBreak/>
               <w:t>{FOR val IN sasaran_profil_sekolah}</w:t>
             </w:r>
           </w:p>
@@ -3902,7 +3968,43 @@
         </w:rPr>
       </w:pPr>
       <w:r>
-        <w:t>Pertemuan {$p.pertemuan_number} – {$p.model_pembelajaran}</w:t>
+        <w:rPr>
+          <w:b/>
+          <w:bCs/>
+        </w:rPr>
+        <w:t>Pertemuan {$</w:t>
+      </w:r>
+      <w:proofErr w:type="gramStart"/>
+      <w:r>
+        <w:rPr>
+          <w:b/>
+          <w:bCs/>
+        </w:rPr>
+        <w:t>p.pertemuan</w:t>
+      </w:r>
+      <w:proofErr w:type="gramEnd"/>
+      <w:r>
+        <w:rPr>
+          <w:b/>
+          <w:bCs/>
+        </w:rPr>
+        <w:t>_number} – {$</w:t>
+      </w:r>
+      <w:proofErr w:type="gramStart"/>
+      <w:r>
+        <w:rPr>
+          <w:b/>
+          <w:bCs/>
+        </w:rPr>
+        <w:t>p.model</w:t>
+      </w:r>
+      <w:proofErr w:type="gramEnd"/>
+      <w:r>
+        <w:rPr>
+          <w:b/>
+          <w:bCs/>
+        </w:rPr>
+        <w:t>_pembelajaran}</w:t>
       </w:r>
     </w:p>
     <w:tbl>
@@ -4230,6 +4332,9 @@
             <w:tcW w:w="1307" w:type="dxa"/>
           </w:tcPr>
           <w:p>
+            <w:pPr>
+              <w:cnfStyle w:val="000000000000" w:firstRow="0" w:lastRow="0" w:firstColumn="0" w:lastColumn="0" w:oddVBand="0" w:evenVBand="0" w:oddHBand="0" w:evenHBand="0" w:firstRowFirstColumn="0" w:firstRowLastColumn="0" w:lastRowFirstColumn="0" w:lastRowLastColumn="0"/>
+            </w:pPr>
             <w:r>
               <w:t>{$p.aktivitas_pembelajaran[0].tahapan_sintaks}</w:t>
             </w:r>
@@ -4241,6 +4346,9 @@
             <w:gridSpan w:val="2"/>
           </w:tcPr>
           <w:p>
+            <w:pPr>
+              <w:cnfStyle w:val="000000000000" w:firstRow="0" w:lastRow="0" w:firstColumn="0" w:lastColumn="0" w:oddVBand="0" w:evenVBand="0" w:oddHBand="0" w:evenHBand="0" w:firstRowFirstColumn="0" w:firstRowLastColumn="0" w:lastRowFirstColumn="0" w:lastRowLastColumn="0"/>
+            </w:pPr>
             <w:r>
               <w:t>{$p.aktivitas_pembelajaran[0].prosedur_guru}</w:t>
             </w:r>
@@ -4251,6 +4359,9 @@
             <w:tcW w:w="1969" w:type="dxa"/>
           </w:tcPr>
           <w:p>
+            <w:pPr>
+              <w:cnfStyle w:val="000000000000" w:firstRow="0" w:lastRow="0" w:firstColumn="0" w:lastColumn="0" w:oddVBand="0" w:evenVBand="0" w:oddHBand="0" w:evenHBand="0" w:firstRowFirstColumn="0" w:firstRowLastColumn="0" w:lastRowFirstColumn="0" w:lastRowLastColumn="0"/>
+            </w:pPr>
             <w:r>
               <w:t>{$p.aktivitas_pembelajaran[0].prosedur_siswa}</w:t>
             </w:r>
@@ -4261,8 +4372,13 @@
             <w:tcW w:w="1294" w:type="dxa"/>
           </w:tcPr>
           <w:p>
+            <w:pPr>
+              <w:cnfStyle w:val="000000000000" w:firstRow="0" w:lastRow="0" w:firstColumn="0" w:lastColumn="0" w:oddVBand="0" w:evenVBand="0" w:oddHBand="0" w:evenHBand="0" w:firstRowFirstColumn="0" w:firstRowLastColumn="0" w:lastRowFirstColumn="0" w:lastRowLastColumn="0"/>
+            </w:pPr>
             <w:r>
               <w:t>{FOR pk IN $p.aktivitas_pembelajaran[0].pertanyaan_kunci}{$pk}</w:t>
+            </w:r>
+            <w:r>
               <w:br/>
               <w:t>{END-FOR pk}</w:t>
             </w:r>
@@ -4273,7 +4389,9 @@
             <w:tcW w:w="2418" w:type="dxa"/>
           </w:tcPr>
           <w:p>
-            <w:r/>
+            <w:pPr>
+              <w:cnfStyle w:val="000000000000" w:firstRow="0" w:lastRow="0" w:firstColumn="0" w:lastColumn="0" w:oddVBand="0" w:evenVBand="0" w:oddHBand="0" w:evenHBand="0" w:firstRowFirstColumn="0" w:firstRowLastColumn="0" w:lastRowFirstColumn="0" w:lastRowLastColumn="0"/>
+            </w:pPr>
             <w:r>
               <w:rPr>
                 <w:b/>
@@ -4299,7 +4417,11 @@
               <w:t>{$p.aktivitas_pembelajaran[0].muatan_inovatif.impactful ? 'Impactful: ' : ''}</w:t>
             </w:r>
             <w:r>
-              <w:t>{$p.aktivitas_pembelajaran[0].muatan_inovatif.impactful || ''}</w:t>
+              <w:t>{$p.aktivitas_pembelaj</w:t>
+            </w:r>
+            <w:r>
+              <w:lastRenderedPageBreak/>
+              <w:t>aran[0].muatan_inovatif.impactful || ''}</w:t>
             </w:r>
           </w:p>
         </w:tc>
@@ -4354,6 +4476,9 @@
             <w:tcW w:w="1307" w:type="dxa"/>
           </w:tcPr>
           <w:p>
+            <w:pPr>
+              <w:cnfStyle w:val="000000000000" w:firstRow="0" w:lastRow="0" w:firstColumn="0" w:lastColumn="0" w:oddVBand="0" w:evenVBand="0" w:oddHBand="0" w:evenHBand="0" w:firstRowFirstColumn="0" w:firstRowLastColumn="0" w:lastRowFirstColumn="0" w:lastRowLastColumn="0"/>
+            </w:pPr>
             <w:r>
               <w:t>{$p.aktivitas_pembelajaran[1].tahapan_sintaks}</w:t>
             </w:r>
@@ -4365,6 +4490,9 @@
             <w:gridSpan w:val="2"/>
           </w:tcPr>
           <w:p>
+            <w:pPr>
+              <w:cnfStyle w:val="000000000000" w:firstRow="0" w:lastRow="0" w:firstColumn="0" w:lastColumn="0" w:oddVBand="0" w:evenVBand="0" w:oddHBand="0" w:evenHBand="0" w:firstRowFirstColumn="0" w:firstRowLastColumn="0" w:lastRowFirstColumn="0" w:lastRowLastColumn="0"/>
+            </w:pPr>
             <w:r>
               <w:t>{$p.aktivitas_pembelajaran[1].prosedur_guru}</w:t>
             </w:r>
@@ -4375,6 +4503,9 @@
             <w:tcW w:w="1969" w:type="dxa"/>
           </w:tcPr>
           <w:p>
+            <w:pPr>
+              <w:cnfStyle w:val="000000000000" w:firstRow="0" w:lastRow="0" w:firstColumn="0" w:lastColumn="0" w:oddVBand="0" w:evenVBand="0" w:oddHBand="0" w:evenHBand="0" w:firstRowFirstColumn="0" w:firstRowLastColumn="0" w:lastRowFirstColumn="0" w:lastRowLastColumn="0"/>
+            </w:pPr>
             <w:r>
               <w:t>{$p.aktivitas_pembelajaran[1].prosedur_siswa}</w:t>
             </w:r>
@@ -4385,8 +4516,13 @@
             <w:tcW w:w="1294" w:type="dxa"/>
           </w:tcPr>
           <w:p>
+            <w:pPr>
+              <w:cnfStyle w:val="000000000000" w:firstRow="0" w:lastRow="0" w:firstColumn="0" w:lastColumn="0" w:oddVBand="0" w:evenVBand="0" w:oddHBand="0" w:evenHBand="0" w:firstRowFirstColumn="0" w:firstRowLastColumn="0" w:lastRowFirstColumn="0" w:lastRowLastColumn="0"/>
+            </w:pPr>
             <w:r>
               <w:t>{FOR pk IN $p.aktivitas_pembelajaran[1].pertanyaan_kunci}{$pk}</w:t>
+            </w:r>
+            <w:r>
               <w:br/>
               <w:t>{END-FOR pk}</w:t>
             </w:r>
@@ -4397,7 +4533,9 @@
             <w:tcW w:w="2418" w:type="dxa"/>
           </w:tcPr>
           <w:p>
-            <w:r/>
+            <w:pPr>
+              <w:cnfStyle w:val="000000000000" w:firstRow="0" w:lastRow="0" w:firstColumn="0" w:lastColumn="0" w:oddVBand="0" w:evenVBand="0" w:oddHBand="0" w:evenHBand="0" w:firstRowFirstColumn="0" w:firstRowLastColumn="0" w:lastRowFirstColumn="0" w:lastRowLastColumn="0"/>
+            </w:pPr>
             <w:r>
               <w:rPr>
                 <w:b/>
@@ -4445,6 +4583,9 @@
             <w:tcW w:w="1307" w:type="dxa"/>
           </w:tcPr>
           <w:p>
+            <w:pPr>
+              <w:cnfStyle w:val="000000000000" w:firstRow="0" w:lastRow="0" w:firstColumn="0" w:lastColumn="0" w:oddVBand="0" w:evenVBand="0" w:oddHBand="0" w:evenHBand="0" w:firstRowFirstColumn="0" w:firstRowLastColumn="0" w:lastRowFirstColumn="0" w:lastRowLastColumn="0"/>
+            </w:pPr>
             <w:r>
               <w:t>{$p.aktivitas_pembelajaran[2].tahapan_sintaks}</w:t>
             </w:r>
@@ -4456,6 +4597,9 @@
             <w:gridSpan w:val="2"/>
           </w:tcPr>
           <w:p>
+            <w:pPr>
+              <w:cnfStyle w:val="000000000000" w:firstRow="0" w:lastRow="0" w:firstColumn="0" w:lastColumn="0" w:oddVBand="0" w:evenVBand="0" w:oddHBand="0" w:evenHBand="0" w:firstRowFirstColumn="0" w:firstRowLastColumn="0" w:lastRowFirstColumn="0" w:lastRowLastColumn="0"/>
+            </w:pPr>
             <w:r>
               <w:t>{$p.aktivitas_pembelajaran[2].prosedur_guru}</w:t>
             </w:r>
@@ -4466,6 +4610,9 @@
             <w:tcW w:w="1969" w:type="dxa"/>
           </w:tcPr>
           <w:p>
+            <w:pPr>
+              <w:cnfStyle w:val="000000000000" w:firstRow="0" w:lastRow="0" w:firstColumn="0" w:lastColumn="0" w:oddVBand="0" w:evenVBand="0" w:oddHBand="0" w:evenHBand="0" w:firstRowFirstColumn="0" w:firstRowLastColumn="0" w:lastRowFirstColumn="0" w:lastRowLastColumn="0"/>
+            </w:pPr>
             <w:r>
               <w:t>{$p.aktivitas_pembelajaran[2].prosedur_siswa}</w:t>
             </w:r>
@@ -4476,8 +4623,13 @@
             <w:tcW w:w="1294" w:type="dxa"/>
           </w:tcPr>
           <w:p>
+            <w:pPr>
+              <w:cnfStyle w:val="000000000000" w:firstRow="0" w:lastRow="0" w:firstColumn="0" w:lastColumn="0" w:oddVBand="0" w:evenVBand="0" w:oddHBand="0" w:evenHBand="0" w:firstRowFirstColumn="0" w:firstRowLastColumn="0" w:lastRowFirstColumn="0" w:lastRowLastColumn="0"/>
+            </w:pPr>
             <w:r>
               <w:t>{FOR pk IN $p.aktivitas_pembelajaran[2].pertanyaan_kunci}{$pk}</w:t>
+            </w:r>
+            <w:r>
               <w:br/>
               <w:t>{END-FOR pk}</w:t>
             </w:r>
@@ -4488,7 +4640,9 @@
             <w:tcW w:w="2418" w:type="dxa"/>
           </w:tcPr>
           <w:p>
-            <w:r/>
+            <w:pPr>
+              <w:cnfStyle w:val="000000000000" w:firstRow="0" w:lastRow="0" w:firstColumn="0" w:lastColumn="0" w:oddVBand="0" w:evenVBand="0" w:oddHBand="0" w:evenHBand="0" w:firstRowFirstColumn="0" w:firstRowLastColumn="0" w:lastRowFirstColumn="0" w:lastRowLastColumn="0"/>
+            </w:pPr>
             <w:r>
               <w:rPr>
                 <w:b/>
@@ -4502,7 +4656,14 @@
               <w:rPr>
                 <w:b/>
               </w:rPr>
-              <w:t>{$p.aktivitas_pembelajaran[2].muatan_inovatif.differentiation ? 'Differentiation (' + $p.aktivitas_pembelajaran[2].muatan_inovatif.differentiation.type + '): ' : ''}</w:t>
+              <w:t>{$p.aktivitas_pembelajaran[2].muatan_inovatif.differentiation ? 'Differentiation (' + $p.aktivitas_pembelajaran[2].muatan_inovatif.di</w:t>
+            </w:r>
+            <w:r>
+              <w:rPr>
+                <w:b/>
+              </w:rPr>
+              <w:lastRenderedPageBreak/>
+              <w:t>fferentiation.type + '): ' : ''}</w:t>
             </w:r>
             <w:r>
               <w:t>{$p.aktivitas_pembelajaran[2].muatan_inovatif.differentiation ? $p.aktivitas_pembelajaran[2].muatan_inovatif.differentiation.deskripsi : ''}</w:t>
@@ -4527,6 +4688,7 @@
           </w:tcPr>
           <w:p>
             <w:r>
+              <w:lastRenderedPageBreak/>
               <w:t>{$p.aktivitas_pembelajaran[3].waktu_menit}'</w:t>
             </w:r>
           </w:p>
@@ -4536,6 +4698,9 @@
             <w:tcW w:w="1307" w:type="dxa"/>
           </w:tcPr>
           <w:p>
+            <w:pPr>
+              <w:cnfStyle w:val="000000000000" w:firstRow="0" w:lastRow="0" w:firstColumn="0" w:lastColumn="0" w:oddVBand="0" w:evenVBand="0" w:oddHBand="0" w:evenHBand="0" w:firstRowFirstColumn="0" w:firstRowLastColumn="0" w:lastRowFirstColumn="0" w:lastRowLastColumn="0"/>
+            </w:pPr>
             <w:r>
               <w:t>{$p.aktivitas_pembelajaran[3].tahapan_sintaks}</w:t>
             </w:r>
@@ -4547,6 +4712,9 @@
             <w:gridSpan w:val="2"/>
           </w:tcPr>
           <w:p>
+            <w:pPr>
+              <w:cnfStyle w:val="000000000000" w:firstRow="0" w:lastRow="0" w:firstColumn="0" w:lastColumn="0" w:oddVBand="0" w:evenVBand="0" w:oddHBand="0" w:evenHBand="0" w:firstRowFirstColumn="0" w:firstRowLastColumn="0" w:lastRowFirstColumn="0" w:lastRowLastColumn="0"/>
+            </w:pPr>
             <w:r>
               <w:t>{$p.aktivitas_pembelajaran[3].prosedur_guru}</w:t>
             </w:r>
@@ -4557,6 +4725,9 @@
             <w:tcW w:w="1969" w:type="dxa"/>
           </w:tcPr>
           <w:p>
+            <w:pPr>
+              <w:cnfStyle w:val="000000000000" w:firstRow="0" w:lastRow="0" w:firstColumn="0" w:lastColumn="0" w:oddVBand="0" w:evenVBand="0" w:oddHBand="0" w:evenHBand="0" w:firstRowFirstColumn="0" w:firstRowLastColumn="0" w:lastRowFirstColumn="0" w:lastRowLastColumn="0"/>
+            </w:pPr>
             <w:r>
               <w:t>{$p.aktivitas_pembelajaran[3].prosedur_siswa}</w:t>
             </w:r>
@@ -4567,8 +4738,13 @@
             <w:tcW w:w="1294" w:type="dxa"/>
           </w:tcPr>
           <w:p>
+            <w:pPr>
+              <w:cnfStyle w:val="000000000000" w:firstRow="0" w:lastRow="0" w:firstColumn="0" w:lastColumn="0" w:oddVBand="0" w:evenVBand="0" w:oddHBand="0" w:evenHBand="0" w:firstRowFirstColumn="0" w:firstRowLastColumn="0" w:lastRowFirstColumn="0" w:lastRowLastColumn="0"/>
+            </w:pPr>
             <w:r>
               <w:t>{FOR pk IN $p.aktivitas_pembelajaran[3].pertanyaan_kunci}{$pk}</w:t>
+            </w:r>
+            <w:r>
               <w:br/>
               <w:t>{END-FOR pk}</w:t>
             </w:r>
@@ -4579,7 +4755,9 @@
             <w:tcW w:w="2418" w:type="dxa"/>
           </w:tcPr>
           <w:p>
-            <w:r/>
+            <w:pPr>
+              <w:cnfStyle w:val="000000000000" w:firstRow="0" w:lastRow="0" w:firstColumn="0" w:lastColumn="0" w:oddVBand="0" w:evenVBand="0" w:oddHBand="0" w:evenHBand="0" w:firstRowFirstColumn="0" w:firstRowLastColumn="0" w:lastRowFirstColumn="0" w:lastRowLastColumn="0"/>
+            </w:pPr>
             <w:r>
               <w:rPr>
                 <w:b/>
@@ -4648,6 +4826,7 @@
           </w:tcPr>
           <w:p>
             <w:r>
+              <w:lastRenderedPageBreak/>
               <w:t>{$p.aktivitas_pembelajaran[4].waktu_menit}'</w:t>
             </w:r>
           </w:p>
@@ -4657,6 +4836,9 @@
             <w:tcW w:w="1307" w:type="dxa"/>
           </w:tcPr>
           <w:p>
+            <w:pPr>
+              <w:cnfStyle w:val="000000000000" w:firstRow="0" w:lastRow="0" w:firstColumn="0" w:lastColumn="0" w:oddVBand="0" w:evenVBand="0" w:oddHBand="0" w:evenHBand="0" w:firstRowFirstColumn="0" w:firstRowLastColumn="0" w:lastRowFirstColumn="0" w:lastRowLastColumn="0"/>
+            </w:pPr>
             <w:r>
               <w:t>{$p.aktivitas_pembelajaran[4].tahapan_sintaks}</w:t>
             </w:r>
@@ -4668,6 +4850,9 @@
             <w:gridSpan w:val="2"/>
           </w:tcPr>
           <w:p>
+            <w:pPr>
+              <w:cnfStyle w:val="000000000000" w:firstRow="0" w:lastRow="0" w:firstColumn="0" w:lastColumn="0" w:oddVBand="0" w:evenVBand="0" w:oddHBand="0" w:evenHBand="0" w:firstRowFirstColumn="0" w:firstRowLastColumn="0" w:lastRowFirstColumn="0" w:lastRowLastColumn="0"/>
+            </w:pPr>
             <w:r>
               <w:t>{$p.aktivitas_pembelajaran[4].prosedur_guru}</w:t>
             </w:r>
@@ -4678,6 +4863,9 @@
             <w:tcW w:w="1969" w:type="dxa"/>
           </w:tcPr>
           <w:p>
+            <w:pPr>
+              <w:cnfStyle w:val="000000000000" w:firstRow="0" w:lastRow="0" w:firstColumn="0" w:lastColumn="0" w:oddVBand="0" w:evenVBand="0" w:oddHBand="0" w:evenHBand="0" w:firstRowFirstColumn="0" w:firstRowLastColumn="0" w:lastRowFirstColumn="0" w:lastRowLastColumn="0"/>
+            </w:pPr>
             <w:r>
               <w:t>{$p.aktivitas_pembelajaran[4].prosedur_siswa}</w:t>
             </w:r>
@@ -4688,8 +4876,13 @@
             <w:tcW w:w="1294" w:type="dxa"/>
           </w:tcPr>
           <w:p>
+            <w:pPr>
+              <w:cnfStyle w:val="000000000000" w:firstRow="0" w:lastRow="0" w:firstColumn="0" w:lastColumn="0" w:oddVBand="0" w:evenVBand="0" w:oddHBand="0" w:evenHBand="0" w:firstRowFirstColumn="0" w:firstRowLastColumn="0" w:lastRowFirstColumn="0" w:lastRowLastColumn="0"/>
+            </w:pPr>
             <w:r>
               <w:t>{FOR pk IN $p.aktivitas_pembelajaran[4].pertanyaan_kunci}{$pk}</w:t>
+            </w:r>
+            <w:r>
               <w:br/>
               <w:t>{END-FOR pk}</w:t>
             </w:r>
@@ -4700,7 +4893,9 @@
             <w:tcW w:w="2418" w:type="dxa"/>
           </w:tcPr>
           <w:p>
-            <w:r/>
+            <w:pPr>
+              <w:cnfStyle w:val="000000000000" w:firstRow="0" w:lastRow="0" w:firstColumn="0" w:lastColumn="0" w:oddVBand="0" w:evenVBand="0" w:oddHBand="0" w:evenHBand="0" w:firstRowFirstColumn="0" w:firstRowLastColumn="0" w:lastRowFirstColumn="0" w:lastRowLastColumn="0"/>
+            </w:pPr>
             <w:r>
               <w:rPr>
                 <w:b/>
@@ -4754,6 +4949,9 @@
             </w:tcBorders>
           </w:tcPr>
           <w:p>
+            <w:pPr>
+              <w:cnfStyle w:val="000000000000" w:firstRow="0" w:lastRow="0" w:firstColumn="0" w:lastColumn="0" w:oddVBand="0" w:evenVBand="0" w:oddHBand="0" w:evenHBand="0" w:firstRowFirstColumn="0" w:firstRowLastColumn="0" w:lastRowFirstColumn="0" w:lastRowLastColumn="0"/>
+            </w:pPr>
             <w:r>
               <w:t>{$p.aktivitas_pembelajaran[5].tahapan_sintaks}</w:t>
             </w:r>
@@ -4768,6 +4966,9 @@
             </w:tcBorders>
           </w:tcPr>
           <w:p>
+            <w:pPr>
+              <w:cnfStyle w:val="000000000000" w:firstRow="0" w:lastRow="0" w:firstColumn="0" w:lastColumn="0" w:oddVBand="0" w:evenVBand="0" w:oddHBand="0" w:evenHBand="0" w:firstRowFirstColumn="0" w:firstRowLastColumn="0" w:lastRowFirstColumn="0" w:lastRowLastColumn="0"/>
+            </w:pPr>
             <w:r>
               <w:t>{$p.aktivitas_pembelajaran[5].prosedur_guru}</w:t>
             </w:r>
@@ -4781,6 +4982,9 @@
             </w:tcBorders>
           </w:tcPr>
           <w:p>
+            <w:pPr>
+              <w:cnfStyle w:val="000000000000" w:firstRow="0" w:lastRow="0" w:firstColumn="0" w:lastColumn="0" w:oddVBand="0" w:evenVBand="0" w:oddHBand="0" w:evenHBand="0" w:firstRowFirstColumn="0" w:firstRowLastColumn="0" w:lastRowFirstColumn="0" w:lastRowLastColumn="0"/>
+            </w:pPr>
             <w:r>
               <w:t>{$p.aktivitas_pembelajaran[5].prosedur_siswa}</w:t>
             </w:r>
@@ -4794,8 +4998,13 @@
             </w:tcBorders>
           </w:tcPr>
           <w:p>
+            <w:pPr>
+              <w:cnfStyle w:val="000000000000" w:firstRow="0" w:lastRow="0" w:firstColumn="0" w:lastColumn="0" w:oddVBand="0" w:evenVBand="0" w:oddHBand="0" w:evenHBand="0" w:firstRowFirstColumn="0" w:firstRowLastColumn="0" w:lastRowFirstColumn="0" w:lastRowLastColumn="0"/>
+            </w:pPr>
             <w:r>
               <w:t>{FOR pk IN $p.aktivitas_pembelajaran[5].pertanyaan_kunci}{$pk}</w:t>
+            </w:r>
+            <w:r>
               <w:br/>
               <w:t>{END-FOR pk}</w:t>
             </w:r>
@@ -4809,7 +5018,9 @@
             </w:tcBorders>
           </w:tcPr>
           <w:p>
-            <w:r/>
+            <w:pPr>
+              <w:cnfStyle w:val="000000000000" w:firstRow="0" w:lastRow="0" w:firstColumn="0" w:lastColumn="0" w:oddVBand="0" w:evenVBand="0" w:oddHBand="0" w:evenHBand="0" w:firstRowFirstColumn="0" w:firstRowLastColumn="0" w:lastRowFirstColumn="0" w:lastRowLastColumn="0"/>
+            </w:pPr>
             <w:r>
               <w:rPr>
                 <w:b/>
@@ -4826,7 +5037,11 @@
               <w:t>{$p.aktivitas_pembelajaran[5].muatan_inovatif.differentiation ? 'Differentiation (' + $p.aktivitas_pembelajaran[5].muatan_inovatif.differentiation.type + '): ' : ''}</w:t>
             </w:r>
             <w:r>
-              <w:t>{$p.aktivitas_pembelajaran[5].muatan_inovatif.differentiation ? $p.aktivitas_pembelajaran[5].muatan_inovatif.differentiation.deskripsi : ''}</w:t>
+              <w:t>{$p.aktivitas_pembelajaran[5].muatan_inovatif.</w:t>
+            </w:r>
+            <w:r>
+              <w:lastRenderedPageBreak/>
+              <w:t>differentiation ? $p.aktivitas_pembelajaran[5].muatan_inovatif.differentiation.deskripsi : ''}</w:t>
             </w:r>
             <w:r>
               <w:rPr>
@@ -4856,6 +5071,7 @@
           <w:noProof/>
           <w:lang w:val="id-ID"/>
         </w:rPr>
+        <w:lastRenderedPageBreak/>
         <mc:AlternateContent>
           <mc:Choice Requires="wps">
             <w:drawing>
@@ -4978,7 +5194,6 @@
                 <w:rFonts w:ascii="Arial Nova" w:eastAsia="Times New Roman" w:hAnsi="Arial Nova" w:cs="Times New Roman"/>
                 <w:b w:val="0"/>
                 <w:bCs w:val="0"/>
-                <w:color w:val="FFFFFF" w:themeColor="background1"/>
                 <w:sz w:val="20"/>
                 <w:szCs w:val="20"/>
                 <w:lang w:val="id-ID" w:eastAsia="en-ID"/>
@@ -5015,7 +5230,6 @@
                 <w:rFonts w:ascii="Arial Nova" w:eastAsia="Times New Roman" w:hAnsi="Arial Nova" w:cs="Times New Roman"/>
                 <w:b w:val="0"/>
                 <w:bCs w:val="0"/>
-                <w:color w:val="FFFFFF" w:themeColor="background1"/>
                 <w:sz w:val="20"/>
                 <w:szCs w:val="20"/>
                 <w:lang w:val="id-ID" w:eastAsia="en-ID"/>
@@ -5052,7 +5266,6 @@
                 <w:rFonts w:ascii="Arial Nova" w:eastAsia="Times New Roman" w:hAnsi="Arial Nova" w:cs="Times New Roman"/>
                 <w:b w:val="0"/>
                 <w:bCs w:val="0"/>
-                <w:color w:val="FFFFFF" w:themeColor="background1"/>
                 <w:sz w:val="20"/>
                 <w:szCs w:val="20"/>
                 <w:lang w:val="id-ID" w:eastAsia="en-ID"/>
@@ -5072,11 +5285,7 @@
             <w:tcW w:w="1279" w:type="dxa"/>
           </w:tcPr>
           <w:p>
-            <w:r/>
-            <w:r>
-              <w:rPr>
-                <w:b/>
-              </w:rPr>
+            <w:r>
               <w:t>{$p.asesmen[0].jenis}</w:t>
             </w:r>
           </w:p>
@@ -5086,6 +5295,9 @@
             <w:tcW w:w="3029" w:type="dxa"/>
           </w:tcPr>
           <w:p>
+            <w:pPr>
+              <w:cnfStyle w:val="000000100000" w:firstRow="0" w:lastRow="0" w:firstColumn="0" w:lastColumn="0" w:oddVBand="0" w:evenVBand="0" w:oddHBand="1" w:evenHBand="0" w:firstRowFirstColumn="0" w:firstRowLastColumn="0" w:lastRowFirstColumn="0" w:lastRowLastColumn="0"/>
+            </w:pPr>
             <w:r>
               <w:t>{$p.asesmen[0].bentuk}</w:t>
             </w:r>
@@ -5096,7 +5308,9 @@
             <w:tcW w:w="5659" w:type="dxa"/>
           </w:tcPr>
           <w:p>
-            <w:r/>
+            <w:pPr>
+              <w:cnfStyle w:val="000000100000" w:firstRow="0" w:lastRow="0" w:firstColumn="0" w:lastColumn="0" w:oddVBand="0" w:evenVBand="0" w:oddHBand="1" w:evenHBand="0" w:firstRowFirstColumn="0" w:firstRowLastColumn="0" w:lastRowFirstColumn="0" w:lastRowLastColumn="0"/>
+            </w:pPr>
             <w:r>
               <w:rPr>
                 <w:b/>
@@ -5116,11 +5330,7 @@
             <w:tcW w:w="1279" w:type="dxa"/>
           </w:tcPr>
           <w:p>
-            <w:r/>
-            <w:r>
-              <w:rPr>
-                <w:b/>
-              </w:rPr>
+            <w:r>
               <w:t>{$p.asesmen[1].jenis}</w:t>
             </w:r>
           </w:p>
@@ -5130,6 +5340,9 @@
             <w:tcW w:w="3029" w:type="dxa"/>
           </w:tcPr>
           <w:p>
+            <w:pPr>
+              <w:cnfStyle w:val="000000000000" w:firstRow="0" w:lastRow="0" w:firstColumn="0" w:lastColumn="0" w:oddVBand="0" w:evenVBand="0" w:oddHBand="0" w:evenHBand="0" w:firstRowFirstColumn="0" w:firstRowLastColumn="0" w:lastRowFirstColumn="0" w:lastRowLastColumn="0"/>
+            </w:pPr>
             <w:r>
               <w:t>{$p.asesmen[1].bentuk}</w:t>
             </w:r>
@@ -5140,7 +5353,9 @@
             <w:tcW w:w="5659" w:type="dxa"/>
           </w:tcPr>
           <w:p>
-            <w:r/>
+            <w:pPr>
+              <w:cnfStyle w:val="000000000000" w:firstRow="0" w:lastRow="0" w:firstColumn="0" w:lastColumn="0" w:oddVBand="0" w:evenVBand="0" w:oddHBand="0" w:evenHBand="0" w:firstRowFirstColumn="0" w:firstRowLastColumn="0" w:lastRowFirstColumn="0" w:lastRowLastColumn="0"/>
+            </w:pPr>
             <w:r>
               <w:rPr>
                 <w:b/>
@@ -5163,11 +5378,7 @@
             <w:tcW w:w="1279" w:type="dxa"/>
           </w:tcPr>
           <w:p>
-            <w:r/>
-            <w:r>
-              <w:rPr>
-                <w:b/>
-              </w:rPr>
+            <w:r>
               <w:t>{$p.asesmen[2].jenis}</w:t>
             </w:r>
           </w:p>
@@ -5177,6 +5388,9 @@
             <w:tcW w:w="3029" w:type="dxa"/>
           </w:tcPr>
           <w:p>
+            <w:pPr>
+              <w:cnfStyle w:val="000000100000" w:firstRow="0" w:lastRow="0" w:firstColumn="0" w:lastColumn="0" w:oddVBand="0" w:evenVBand="0" w:oddHBand="1" w:evenHBand="0" w:firstRowFirstColumn="0" w:firstRowLastColumn="0" w:lastRowFirstColumn="0" w:lastRowLastColumn="0"/>
+            </w:pPr>
             <w:r>
               <w:t>{$p.asesmen[2].bentuk}</w:t>
             </w:r>
@@ -5187,7 +5401,9 @@
             <w:tcW w:w="5659" w:type="dxa"/>
           </w:tcPr>
           <w:p>
-            <w:r/>
+            <w:pPr>
+              <w:cnfStyle w:val="000000100000" w:firstRow="0" w:lastRow="0" w:firstColumn="0" w:lastColumn="0" w:oddVBand="0" w:evenVBand="0" w:oddHBand="1" w:evenHBand="0" w:firstRowFirstColumn="0" w:firstRowLastColumn="0" w:lastRowFirstColumn="0" w:lastRowLastColumn="0"/>
+            </w:pPr>
             <w:r>
               <w:rPr>
                 <w:b/>
@@ -5207,11 +5423,7 @@
             <w:tcW w:w="1279" w:type="dxa"/>
           </w:tcPr>
           <w:p>
-            <w:r/>
-            <w:r>
-              <w:rPr>
-                <w:b/>
-              </w:rPr>
+            <w:r>
               <w:t>{$p.asesmen[3].jenis}</w:t>
             </w:r>
           </w:p>
@@ -5221,6 +5433,9 @@
             <w:tcW w:w="3029" w:type="dxa"/>
           </w:tcPr>
           <w:p>
+            <w:pPr>
+              <w:cnfStyle w:val="000000000000" w:firstRow="0" w:lastRow="0" w:firstColumn="0" w:lastColumn="0" w:oddVBand="0" w:evenVBand="0" w:oddHBand="0" w:evenHBand="0" w:firstRowFirstColumn="0" w:firstRowLastColumn="0" w:lastRowFirstColumn="0" w:lastRowLastColumn="0"/>
+            </w:pPr>
             <w:r>
               <w:t>{$p.asesmen[3].bentuk}</w:t>
             </w:r>
@@ -5231,7 +5446,9 @@
             <w:tcW w:w="5659" w:type="dxa"/>
           </w:tcPr>
           <w:p>
-            <w:r/>
+            <w:pPr>
+              <w:cnfStyle w:val="000000000000" w:firstRow="0" w:lastRow="0" w:firstColumn="0" w:lastColumn="0" w:oddVBand="0" w:evenVBand="0" w:oddHBand="0" w:evenHBand="0" w:firstRowFirstColumn="0" w:firstRowLastColumn="0" w:lastRowFirstColumn="0" w:lastRowLastColumn="0"/>
+            </w:pPr>
             <w:r>
               <w:rPr>
                 <w:b/>
@@ -5562,6 +5779,7 @@
         <w:rPr>
           <w:lang w:val="id-ID"/>
         </w:rPr>
+        <w:lastRenderedPageBreak/>
         <w:br w:type="page"/>
       </w:r>
     </w:p>
@@ -5595,6 +5813,12 @@
         <w:br w:type="page"/>
       </w:r>
     </w:p>
+    <w:sectPr>
+      <w:pgSz w:w="11906" w:h="16838"/>
+      <w:pgMar w:top="1440" w:right="1440" w:bottom="1440" w:left="1440" w:header="708" w:footer="708" w:gutter="0"/>
+      <w:cols w:space="708"/>
+      <w:docGrid w:linePitch="360"/>
+    </w:sectPr>
   </w:body>
 </w:document>
 </file>

</xml_diff>

<commit_message>
feat: make meeting headers bold, tighten spacing in loop, and format Lintas Disiplin concepts as bold
</commit_message>
<xml_diff>
--- a/template.docx
+++ b/template.docx
@@ -881,7 +881,6 @@
           <w:szCs w:val="40"/>
           <w:lang w:val="id-ID"/>
         </w:rPr>
-        <w:lastRenderedPageBreak/>
         <w:t>Tahun Akademik 2025-2026</w:t>
       </w:r>
     </w:p>
@@ -964,6 +963,7 @@
           <w:p>
             <w:pPr>
               <w:spacing w:beforeAutospacing="1" w:after="0" w:line="240" w:lineRule="auto"/>
+              <w:jc w:val="right"/>
               <w:outlineLvl w:val="1"/>
               <w:rPr>
                 <w:rFonts w:ascii="Arial Nova" w:eastAsia="Times New Roman" w:hAnsi="Arial Nova" w:cs="Times New Roman"/>
@@ -1038,6 +1038,7 @@
           <w:p>
             <w:pPr>
               <w:spacing w:beforeAutospacing="1" w:after="0" w:line="240" w:lineRule="auto"/>
+              <w:jc w:val="right"/>
               <w:outlineLvl w:val="1"/>
               <w:rPr>
                 <w:rFonts w:ascii="Arial Nova" w:eastAsia="Times New Roman" w:hAnsi="Arial Nova" w:cs="Times New Roman"/>
@@ -1100,6 +1101,7 @@
           <w:p>
             <w:pPr>
               <w:spacing w:beforeAutospacing="1" w:after="0" w:line="240" w:lineRule="auto"/>
+              <w:jc w:val="right"/>
               <w:outlineLvl w:val="1"/>
               <w:rPr>
                 <w:rFonts w:ascii="Arial Nova" w:eastAsia="Times New Roman" w:hAnsi="Arial Nova" w:cs="Times New Roman"/>
@@ -1165,6 +1167,7 @@
           <w:p>
             <w:pPr>
               <w:spacing w:beforeAutospacing="1" w:after="0" w:line="240" w:lineRule="auto"/>
+              <w:jc w:val="right"/>
               <w:outlineLvl w:val="1"/>
               <w:rPr>
                 <w:rFonts w:ascii="Arial Nova" w:eastAsia="Times New Roman" w:hAnsi="Arial Nova" w:cs="Times New Roman"/>
@@ -1231,6 +1234,7 @@
           <w:p>
             <w:pPr>
               <w:spacing w:beforeAutospacing="1" w:after="0" w:line="240" w:lineRule="auto"/>
+              <w:jc w:val="right"/>
               <w:outlineLvl w:val="1"/>
               <w:rPr>
                 <w:rFonts w:ascii="Arial Nova" w:eastAsia="Times New Roman" w:hAnsi="Arial Nova" w:cs="Times New Roman"/>
@@ -1256,23 +1260,7 @@
             <w:tcW w:w="7236" w:type="dxa"/>
           </w:tcPr>
           <w:p>
-            <w:pPr>
-              <w:cnfStyle w:val="000000000000" w:firstRow="0" w:lastRow="0" w:firstColumn="0" w:lastColumn="0" w:oddVBand="0" w:evenVBand="0" w:oddHBand="0" w:evenHBand="0" w:firstRowFirstColumn="0" w:firstRowLastColumn="0" w:lastRowFirstColumn="0" w:lastRowLastColumn="0"/>
-              <w:rPr>
-                <w:rFonts w:ascii="Open Sans" w:hAnsi="Open Sans" w:cs="Open Sans"/>
-                <w:b/>
-                <w:bCs/>
-              </w:rPr>
-            </w:pPr>
-            <w:r>
-              <w:rPr>
-                <w:rFonts w:ascii="Open Sans" w:hAnsi="Open Sans" w:cs="Open Sans"/>
-                <w:b/>
-                <w:bCs/>
-                <w:color w:val="EE0000"/>
-                <w:sz w:val="22"/>
-                <w:szCs w:val="22"/>
-              </w:rPr>
+            <w:r>
               <w:t>{judul_tema_subtopik}</w:t>
             </w:r>
           </w:p>
@@ -1293,6 +1281,7 @@
           <w:p>
             <w:pPr>
               <w:spacing w:beforeAutospacing="1" w:after="0" w:line="240" w:lineRule="auto"/>
+              <w:jc w:val="right"/>
               <w:outlineLvl w:val="1"/>
               <w:rPr>
                 <w:rFonts w:ascii="Arial Nova" w:eastAsia="Times New Roman" w:hAnsi="Arial Nova" w:cs="Times New Roman"/>
@@ -1355,6 +1344,7 @@
           <w:p>
             <w:pPr>
               <w:spacing w:beforeAutospacing="1" w:after="0" w:line="240" w:lineRule="auto"/>
+              <w:jc w:val="right"/>
               <w:outlineLvl w:val="1"/>
               <w:rPr>
                 <w:rFonts w:ascii="Arial Nova" w:eastAsia="Times New Roman" w:hAnsi="Arial Nova" w:cs="Times New Roman"/>
@@ -1420,6 +1410,7 @@
           <w:p>
             <w:pPr>
               <w:spacing w:beforeAutospacing="1" w:after="0" w:line="240" w:lineRule="auto"/>
+              <w:jc w:val="right"/>
               <w:outlineLvl w:val="1"/>
               <w:rPr>
                 <w:rFonts w:ascii="Arial Nova" w:eastAsia="Times New Roman" w:hAnsi="Arial Nova" w:cs="Times New Roman"/>
@@ -1482,6 +1473,7 @@
           <w:p>
             <w:pPr>
               <w:spacing w:beforeAutospacing="1" w:after="0" w:line="240" w:lineRule="auto"/>
+              <w:jc w:val="right"/>
               <w:outlineLvl w:val="1"/>
               <w:rPr>
                 <w:rFonts w:ascii="Arial Nova" w:eastAsia="Times New Roman" w:hAnsi="Arial Nova" w:cs="Times New Roman"/>
@@ -1907,26 +1899,8 @@
           <w:p>
             <w:r>
               <w:t>Latar belakang pembelajaran:</w:t>
-            </w:r>
-            <w:r>
               <w:br/>
-            </w:r>
-            <w:r>
-              <w:rPr>
-                <w:rFonts w:ascii="Arial Nova" w:hAnsi="Arial Nova"/>
-                <w:color w:val="EE0000"/>
-                <w:sz w:val="20"/>
-                <w:szCs w:val="20"/>
-              </w:rPr>
               <w:t>{FOR lb IN latar_belakang_pembelajaran}• {$lb}</w:t>
-            </w:r>
-            <w:r>
-              <w:rPr>
-                <w:rFonts w:ascii="Arial Nova" w:hAnsi="Arial Nova"/>
-                <w:color w:val="EE0000"/>
-                <w:sz w:val="20"/>
-                <w:szCs w:val="20"/>
-              </w:rPr>
               <w:br/>
               <w:t>{END-FOR lb}</w:t>
             </w:r>
@@ -2232,6 +2206,7 @@
           <w:tcPr>
             <w:tcW w:w="1667" w:type="dxa"/>
             <w:vMerge/>
+            <w:vAlign w:val="center"/>
           </w:tcPr>
           <w:p>
             <w:pPr>
@@ -2250,43 +2225,26 @@
         <w:tc>
           <w:tcPr>
             <w:tcW w:w="2080" w:type="dxa"/>
-            <w:shd w:val="clear" w:color="auto" w:fill="FFF2CC" w:themeFill="accent4" w:themeFillTint="33"/>
+          </w:tcPr>
+          <w:p>
+            <w:r>
+              <w:t>{capaian_pembelajaran}</w:t>
+            </w:r>
+          </w:p>
+        </w:tc>
+        <w:tc>
+          <w:tcPr>
+            <w:tcW w:w="2086" w:type="dxa"/>
           </w:tcPr>
           <w:p>
             <w:pPr>
               <w:spacing w:after="0" w:line="240" w:lineRule="auto"/>
-              <w:rPr>
-                <w:rFonts w:ascii="Segoe UI Symbol" w:eastAsia="Times New Roman" w:hAnsi="Segoe UI Symbol" w:cs="Segoe UI Symbol"/>
-                <w:sz w:val="16"/>
-                <w:szCs w:val="16"/>
-                <w:lang w:val="id-ID" w:eastAsia="en-ID"/>
-              </w:rPr>
-            </w:pPr>
-            <w:r>
               <w:rPr>
                 <w:rFonts w:ascii="Segoe UI Symbol" w:eastAsia="Times New Roman" w:hAnsi="Segoe UI Symbol" w:cs="Segoe UI Symbol"/>
                 <w:b/>
                 <w:bCs/>
                 <w:sz w:val="20"/>
                 <w:szCs w:val="20"/>
-                <w:lang w:eastAsia="en-ID"/>
-              </w:rPr>
-              <w:t>☐   DPL 6</w:t>
-            </w:r>
-          </w:p>
-        </w:tc>
-        <w:tc>
-          <w:tcPr>
-            <w:tcW w:w="2086" w:type="dxa"/>
-            <w:shd w:val="clear" w:color="auto" w:fill="FFF2CC" w:themeFill="accent4" w:themeFillTint="33"/>
-          </w:tcPr>
-          <w:p>
-            <w:pPr>
-              <w:spacing w:after="0" w:line="240" w:lineRule="auto"/>
-              <w:rPr>
-                <w:rFonts w:ascii="Segoe UI Symbol" w:eastAsia="Times New Roman" w:hAnsi="Segoe UI Symbol" w:cs="Segoe UI Symbol"/>
-                <w:sz w:val="16"/>
-                <w:szCs w:val="16"/>
                 <w:lang w:val="id-ID" w:eastAsia="en-ID"/>
               </w:rPr>
             </w:pPr>
@@ -2297,9 +2255,9 @@
                 <w:bCs/>
                 <w:sz w:val="20"/>
                 <w:szCs w:val="20"/>
-                <w:lang w:eastAsia="en-ID"/>
-              </w:rPr>
-              <w:t>☐   DPL 7</w:t>
+                <w:lang w:val="id-ID" w:eastAsia="en-ID"/>
+              </w:rPr>
+              <w:t>☐   DPL 6</w:t>
             </w:r>
           </w:p>
         </w:tc>
@@ -2307,15 +2265,16 @@
           <w:tcPr>
             <w:tcW w:w="2072" w:type="dxa"/>
             <w:gridSpan w:val="2"/>
-            <w:shd w:val="clear" w:color="auto" w:fill="FFF2CC" w:themeFill="accent4" w:themeFillTint="33"/>
           </w:tcPr>
           <w:p>
             <w:pPr>
               <w:spacing w:after="0" w:line="240" w:lineRule="auto"/>
               <w:rPr>
                 <w:rFonts w:ascii="Arial Nova" w:eastAsia="Times New Roman" w:hAnsi="Arial Nova" w:cs="Times New Roman"/>
-                <w:sz w:val="16"/>
-                <w:szCs w:val="16"/>
+                <w:b/>
+                <w:bCs/>
+                <w:sz w:val="20"/>
+                <w:szCs w:val="20"/>
                 <w:lang w:val="id-ID" w:eastAsia="en-ID"/>
               </w:rPr>
             </w:pPr>
@@ -2326,24 +2285,25 @@
                 <w:bCs/>
                 <w:sz w:val="20"/>
                 <w:szCs w:val="20"/>
-                <w:lang w:eastAsia="en-ID"/>
-              </w:rPr>
-              <w:t>☐   DPL 8</w:t>
+                <w:lang w:val="id-ID" w:eastAsia="en-ID"/>
+              </w:rPr>
+              <w:t>☐   DPL 7</w:t>
             </w:r>
           </w:p>
         </w:tc>
         <w:tc>
           <w:tcPr>
             <w:tcW w:w="2087" w:type="dxa"/>
-            <w:shd w:val="clear" w:color="auto" w:fill="FFF2CC" w:themeFill="accent4" w:themeFillTint="33"/>
           </w:tcPr>
           <w:p>
             <w:pPr>
               <w:spacing w:after="0" w:line="240" w:lineRule="auto"/>
               <w:rPr>
                 <w:rFonts w:ascii="Arial Nova" w:eastAsia="Times New Roman" w:hAnsi="Arial Nova" w:cs="Times New Roman"/>
-                <w:sz w:val="16"/>
-                <w:szCs w:val="16"/>
+                <w:b/>
+                <w:bCs/>
+                <w:sz w:val="20"/>
+                <w:szCs w:val="20"/>
                 <w:lang w:val="id-ID" w:eastAsia="en-ID"/>
               </w:rPr>
             </w:pPr>
@@ -2354,21 +2314,22 @@
                 <w:bCs/>
                 <w:sz w:val="20"/>
                 <w:szCs w:val="20"/>
-                <w:lang w:eastAsia="en-ID"/>
-              </w:rPr>
-              <w:t>☐   DPL 5</w:t>
+                <w:lang w:val="id-ID" w:eastAsia="en-ID"/>
+              </w:rPr>
+              <w:t>☐   DPL 8</w:t>
             </w:r>
           </w:p>
         </w:tc>
       </w:tr>
       <w:tr>
         <w:trPr>
-          <w:trHeight w:val="54"/>
+          <w:trHeight w:val="79"/>
         </w:trPr>
         <w:tc>
           <w:tcPr>
             <w:tcW w:w="1667" w:type="dxa"/>
             <w:vMerge/>
+            <w:vAlign w:val="center"/>
           </w:tcPr>
           <w:p>
             <w:pPr>
@@ -2391,28 +2352,11 @@
             <w:vAlign w:val="center"/>
           </w:tcPr>
           <w:p>
-            <w:pPr>
-              <w:spacing w:after="0" w:line="240" w:lineRule="auto"/>
-              <w:rPr>
-                <w:rFonts w:ascii="Segoe UI Symbol" w:eastAsia="Times New Roman" w:hAnsi="Segoe UI Symbol" w:cs="Segoe UI Symbol"/>
-                <w:b/>
-                <w:bCs/>
-                <w:sz w:val="20"/>
-                <w:szCs w:val="20"/>
-                <w:lang w:eastAsia="en-ID"/>
-              </w:rPr>
-            </w:pPr>
-            <w:proofErr w:type="spellStart"/>
-            <w:r>
-              <w:rPr>
-                <w:rFonts w:ascii="Arial Nova" w:eastAsia="Times New Roman" w:hAnsi="Arial Nova" w:cs="Times New Roman"/>
-                <w:sz w:val="16"/>
-                <w:szCs w:val="16"/>
-                <w:lang w:eastAsia="en-ID"/>
-              </w:rPr>
-              <w:t>Kolaborasi</w:t>
-            </w:r>
-            <w:proofErr w:type="spellEnd"/>
+            <w:r>
+              <w:t>{FOR tpu IN tujuan_pembelajaran_umum}{$tpu}</w:t>
+              <w:br/>
+              <w:t>{END-FOR tpu}</w:t>
+            </w:r>
           </w:p>
         </w:tc>
         <w:tc>
@@ -2425,25 +2369,21 @@
             <w:pPr>
               <w:spacing w:after="0" w:line="240" w:lineRule="auto"/>
               <w:rPr>
-                <w:rFonts w:ascii="Segoe UI Symbol" w:eastAsia="Times New Roman" w:hAnsi="Segoe UI Symbol" w:cs="Segoe UI Symbol"/>
-                <w:b/>
-                <w:bCs/>
-                <w:sz w:val="20"/>
-                <w:szCs w:val="20"/>
-                <w:lang w:eastAsia="en-ID"/>
-              </w:rPr>
-            </w:pPr>
-            <w:proofErr w:type="spellStart"/>
-            <w:r>
-              <w:rPr>
                 <w:rFonts w:ascii="Arial Nova" w:eastAsia="Times New Roman" w:hAnsi="Arial Nova" w:cs="Times New Roman"/>
                 <w:sz w:val="16"/>
                 <w:szCs w:val="16"/>
-                <w:lang w:eastAsia="en-ID"/>
+                <w:lang w:val="id-ID" w:eastAsia="en-ID"/>
+              </w:rPr>
+            </w:pPr>
+            <w:r>
+              <w:rPr>
+                <w:rFonts w:ascii="Arial Nova" w:eastAsia="Times New Roman" w:hAnsi="Arial Nova" w:cs="Times New Roman"/>
+                <w:sz w:val="16"/>
+                <w:szCs w:val="16"/>
+                <w:lang w:val="id-ID" w:eastAsia="en-ID"/>
               </w:rPr>
               <w:t>Kemandirian</w:t>
             </w:r>
-            <w:proofErr w:type="spellEnd"/>
           </w:p>
         </w:tc>
         <w:tc>
@@ -2457,20 +2397,18 @@
             <w:pPr>
               <w:spacing w:after="0" w:line="240" w:lineRule="auto"/>
               <w:rPr>
-                <w:rFonts w:ascii="Segoe UI Symbol" w:eastAsia="Times New Roman" w:hAnsi="Segoe UI Symbol" w:cs="Segoe UI Symbol"/>
-                <w:b/>
-                <w:bCs/>
-                <w:sz w:val="20"/>
-                <w:szCs w:val="20"/>
-                <w:lang w:eastAsia="en-ID"/>
-              </w:rPr>
-            </w:pPr>
-            <w:r>
-              <w:rPr>
                 <w:rFonts w:ascii="Arial Nova" w:eastAsia="Times New Roman" w:hAnsi="Arial Nova" w:cs="Times New Roman"/>
                 <w:sz w:val="16"/>
                 <w:szCs w:val="16"/>
-                <w:lang w:eastAsia="en-ID"/>
+                <w:lang w:val="id-ID" w:eastAsia="en-ID"/>
+              </w:rPr>
+            </w:pPr>
+            <w:r>
+              <w:rPr>
+                <w:rFonts w:ascii="Arial Nova" w:eastAsia="Times New Roman" w:hAnsi="Arial Nova" w:cs="Times New Roman"/>
+                <w:sz w:val="16"/>
+                <w:szCs w:val="16"/>
+                <w:lang w:val="id-ID" w:eastAsia="en-ID"/>
               </w:rPr>
               <w:t>Kesehatan</w:t>
             </w:r>
@@ -2486,25 +2424,21 @@
             <w:pPr>
               <w:spacing w:after="0" w:line="240" w:lineRule="auto"/>
               <w:rPr>
-                <w:rFonts w:ascii="Segoe UI Symbol" w:eastAsia="Times New Roman" w:hAnsi="Segoe UI Symbol" w:cs="Segoe UI Symbol"/>
-                <w:b/>
-                <w:bCs/>
-                <w:sz w:val="20"/>
-                <w:szCs w:val="20"/>
-                <w:lang w:eastAsia="en-ID"/>
-              </w:rPr>
-            </w:pPr>
-            <w:proofErr w:type="spellStart"/>
-            <w:r>
-              <w:rPr>
                 <w:rFonts w:ascii="Arial Nova" w:eastAsia="Times New Roman" w:hAnsi="Arial Nova" w:cs="Times New Roman"/>
                 <w:sz w:val="16"/>
                 <w:szCs w:val="16"/>
-                <w:lang w:eastAsia="en-ID"/>
+                <w:lang w:val="id-ID" w:eastAsia="en-ID"/>
+              </w:rPr>
+            </w:pPr>
+            <w:r>
+              <w:rPr>
+                <w:rFonts w:ascii="Arial Nova" w:eastAsia="Times New Roman" w:hAnsi="Arial Nova" w:cs="Times New Roman"/>
+                <w:sz w:val="16"/>
+                <w:szCs w:val="16"/>
+                <w:lang w:val="id-ID" w:eastAsia="en-ID"/>
               </w:rPr>
               <w:t>Komunikasi</w:t>
             </w:r>
-            <w:proofErr w:type="spellEnd"/>
           </w:p>
         </w:tc>
       </w:tr>
@@ -2562,34 +2496,8 @@
             <w:vAlign w:val="center"/>
           </w:tcPr>
           <w:p>
-            <w:pPr>
-              <w:rPr>
-                <w:i/>
-                <w:iCs/>
-              </w:rPr>
-            </w:pPr>
-            <w:r>
-              <w:rPr>
-                <w:i/>
-                <w:iCs/>
-              </w:rPr>
-              <w:t>{</w:t>
-            </w:r>
-            <w:proofErr w:type="spellStart"/>
-            <w:r>
-              <w:rPr>
-                <w:i/>
-                <w:iCs/>
-              </w:rPr>
-              <w:t>capaian_pembelajaran</w:t>
-            </w:r>
-            <w:proofErr w:type="spellEnd"/>
-            <w:r>
-              <w:rPr>
-                <w:i/>
-                <w:iCs/>
-              </w:rPr>
-              <w:t>}</w:t>
+            <w:r>
+              <w:t>{enduring_understanding}</w:t>
             </w:r>
           </w:p>
         </w:tc>
@@ -2649,51 +2557,7 @@
           </w:tcPr>
           <w:p>
             <w:r>
-              <w:t xml:space="preserve">{FOR </w:t>
-            </w:r>
-            <w:proofErr w:type="spellStart"/>
-            <w:r>
-              <w:t>tpu</w:t>
-            </w:r>
-            <w:proofErr w:type="spellEnd"/>
-            <w:r>
-              <w:t xml:space="preserve"> IN </w:t>
-            </w:r>
-            <w:proofErr w:type="spellStart"/>
-            <w:r>
-              <w:t>tujuan_pembelajaran_</w:t>
-            </w:r>
-            <w:proofErr w:type="gramStart"/>
-            <w:r>
-              <w:t>umum</w:t>
-            </w:r>
-            <w:proofErr w:type="spellEnd"/>
-            <w:r>
-              <w:t>}{</w:t>
-            </w:r>
-            <w:proofErr w:type="gramEnd"/>
-            <w:r>
-              <w:t>$</w:t>
-            </w:r>
-            <w:proofErr w:type="spellStart"/>
-            <w:r>
-              <w:t>tpu</w:t>
-            </w:r>
-            <w:proofErr w:type="spellEnd"/>
-            <w:r>
-              <w:t>}</w:t>
-            </w:r>
-            <w:r>
-              <w:br/>
-              <w:t xml:space="preserve">{END-FOR </w:t>
-            </w:r>
-            <w:proofErr w:type="spellStart"/>
-            <w:r>
-              <w:t>tpu</w:t>
-            </w:r>
-            <w:proofErr w:type="spellEnd"/>
-            <w:r>
-              <w:t>}</w:t>
+              <w:t>{lintas_disiplin_ilmu}</w:t>
             </w:r>
           </w:p>
         </w:tc>
@@ -2728,7 +2592,6 @@
                 <w:szCs w:val="20"/>
                 <w:lang w:val="id-ID" w:eastAsia="en-ID"/>
               </w:rPr>
-              <w:lastRenderedPageBreak/>
               <w:t>Enduring Understanding/ Pemahaman Bermakna</w:t>
             </w:r>
           </w:p>
@@ -2750,15 +2613,14 @@
               </w:rPr>
             </w:pPr>
             <w:r>
-              <w:t>{</w:t>
-            </w:r>
-            <w:proofErr w:type="spellStart"/>
-            <w:r>
-              <w:t>enduring_understanding</w:t>
-            </w:r>
-            <w:proofErr w:type="spellEnd"/>
-            <w:r>
-              <w:t>}</w:t>
+              <w:rPr>
+                <w:rFonts w:ascii="Arial" w:hAnsi="Arial" w:cs="Arial"/>
+                <w:color w:val="000000"/>
+                <w:sz w:val="20"/>
+                <w:szCs w:val="20"/>
+                <w:lang w:val="id-ID"/>
+              </w:rPr>
+              <w:t>Persamaan dan fungsi kuadrat bukan sekadar grafik melengkung atau hitungan hafalan akar, melainkan alat matematika esensial untuk memodelkan lintasan simetris, mengoptimalkan nilai maksimum/minimum, serta fondasi transisi menuju aljabar tingkat tinggi melalui manipulasi variabel tersembunyi.</w:t>
             </w:r>
           </w:p>
         </w:tc>
@@ -2814,15 +2676,88 @@
               </w:rPr>
             </w:pPr>
             <w:r>
-              <w:t>{</w:t>
-            </w:r>
-            <w:proofErr w:type="spellStart"/>
-            <w:r>
-              <w:t>lintas_disiplin_ilmu</w:t>
-            </w:r>
-            <w:proofErr w:type="spellEnd"/>
-            <w:r>
-              <w:t>}</w:t>
+              <w:rPr>
+                <w:rFonts w:ascii="Arial Nova" w:hAnsi="Arial Nova" w:cs="Segoe UI Symbol"/>
+                <w:color w:val="000000"/>
+                <w:sz w:val="20"/>
+                <w:szCs w:val="20"/>
+                <w:lang w:val="id-ID"/>
+              </w:rPr>
+              <w:t xml:space="preserve">Analisis kuadratik memiliki keterkaitan erat dengan tiga disiplin ilmu utama. Pertama, dalam </w:t>
+            </w:r>
+            <w:r>
+              <w:rPr>
+                <w:rFonts w:ascii="Arial Nova" w:hAnsi="Arial Nova" w:cs="Segoe UI Symbol"/>
+                <w:b/>
+                <w:color w:val="000000"/>
+                <w:sz w:val="20"/>
+                <w:szCs w:val="20"/>
+                <w:lang w:val="id-ID"/>
+              </w:rPr>
+              <w:t>Sains (Fisika)</w:t>
+            </w:r>
+            <w:r>
+              <w:rPr>
+                <w:rFonts w:ascii="Arial Nova" w:hAnsi="Arial Nova" w:cs="Segoe UI Symbol"/>
+                <w:color w:val="000000"/>
+                <w:sz w:val="20"/>
+                <w:szCs w:val="20"/>
+                <w:lang w:val="id-ID"/>
+              </w:rPr>
+              <w:t xml:space="preserve">, ia sangat fundamental untuk memodelkan gerak parabola (kinematika), </w:t>
+            </w:r>
+            <w:r>
+              <w:rPr>
+                <w:rFonts w:ascii="Arial Nova" w:hAnsi="Arial Nova" w:cs="Segoe UI Symbol"/>
+                <w:color w:val="000000"/>
+                <w:sz w:val="20"/>
+                <w:szCs w:val="20"/>
+                <w:lang w:val="id-ID"/>
+              </w:rPr>
+              <w:lastRenderedPageBreak/>
+              <w:t xml:space="preserve">menghitung waktu puncak, maupun jangkauan maksimum objek. Kedua, dalam </w:t>
+            </w:r>
+            <w:r>
+              <w:rPr>
+                <w:rFonts w:ascii="Arial Nova" w:hAnsi="Arial Nova" w:cs="Segoe UI Symbol"/>
+                <w:b/>
+                <w:color w:val="000000"/>
+                <w:sz w:val="20"/>
+                <w:szCs w:val="20"/>
+                <w:lang w:val="id-ID"/>
+              </w:rPr>
+              <w:t>Teknologi Informasi dan Rekayasa</w:t>
+            </w:r>
+            <w:r>
+              <w:rPr>
+                <w:rFonts w:ascii="Arial Nova" w:hAnsi="Arial Nova" w:cs="Segoe UI Symbol"/>
+                <w:color w:val="000000"/>
+                <w:sz w:val="20"/>
+                <w:szCs w:val="20"/>
+                <w:lang w:val="id-ID"/>
+              </w:rPr>
+              <w:t xml:space="preserve">, struktur kuadrat digunakan sebagai dasar algoritma optimasi, pengolahan citra digital grafik 3D, dan pemodelan kurva lengkung desain objek. Ketiga, ia berhubungan langsung dengan </w:t>
+            </w:r>
+            <w:r>
+              <w:rPr>
+                <w:rFonts w:ascii="Arial Nova" w:hAnsi="Arial Nova" w:cs="Segoe UI Symbol"/>
+                <w:b/>
+                <w:color w:val="000000"/>
+                <w:sz w:val="20"/>
+                <w:szCs w:val="20"/>
+                <w:lang w:val="id-ID"/>
+              </w:rPr>
+              <w:t>Ekonomi</w:t>
+            </w:r>
+            <w:r>
+              <w:rPr>
+                <w:rFonts w:ascii="Arial Nova" w:hAnsi="Arial Nova" w:cs="Segoe UI Symbol"/>
+                <w:color w:val="000000"/>
+                <w:sz w:val="20"/>
+                <w:szCs w:val="20"/>
+                <w:lang w:val="id-ID"/>
+              </w:rPr>
+              <w:t>, terutama dalam kalkulasi maksimalisasi keuntungan perusahaan atau minimalisasi biaya produksi berdasarkan fungsi biaya kuadratik.</w:t>
             </w:r>
           </w:p>
         </w:tc>
@@ -2857,6 +2792,7 @@
                 <w:szCs w:val="20"/>
                 <w:lang w:val="id-ID" w:eastAsia="en-ID"/>
               </w:rPr>
+              <w:lastRenderedPageBreak/>
               <w:t>Moda Pembelajaran:</w:t>
             </w:r>
           </w:p>
@@ -3843,7 +3779,6 @@
           </w:p>
           <w:p>
             <w:r>
-              <w:lastRenderedPageBreak/>
               <w:t>{fidelity_checked ? '☑' : '☐'} Fidelity</w:t>
             </w:r>
           </w:p>
@@ -3865,7 +3800,6 @@
           </w:tcPr>
           <w:p>
             <w:r>
-              <w:lastRenderedPageBreak/>
               <w:t>{FOR val IN sasaran_profil_sekolah}</w:t>
             </w:r>
           </w:p>
@@ -3967,44 +3901,12 @@
           <w:lang w:val="id-ID" w:eastAsia="en-ID"/>
         </w:rPr>
       </w:pPr>
+      <w:r/>
       <w:r>
         <w:rPr>
           <w:b/>
-          <w:bCs/>
         </w:rPr>
-        <w:t>Pertemuan {$</w:t>
-      </w:r>
-      <w:proofErr w:type="gramStart"/>
-      <w:r>
-        <w:rPr>
-          <w:b/>
-          <w:bCs/>
-        </w:rPr>
-        <w:t>p.pertemuan</w:t>
-      </w:r>
-      <w:proofErr w:type="gramEnd"/>
-      <w:r>
-        <w:rPr>
-          <w:b/>
-          <w:bCs/>
-        </w:rPr>
-        <w:t>_number} – {$</w:t>
-      </w:r>
-      <w:proofErr w:type="gramStart"/>
-      <w:r>
-        <w:rPr>
-          <w:b/>
-          <w:bCs/>
-        </w:rPr>
-        <w:t>p.model</w:t>
-      </w:r>
-      <w:proofErr w:type="gramEnd"/>
-      <w:r>
-        <w:rPr>
-          <w:b/>
-          <w:bCs/>
-        </w:rPr>
-        <w:t>_pembelajaran}</w:t>
+        <w:t>Pertemuan {$p.pertemuan_number} – {$p.model_pembelajaran}</w:t>
       </w:r>
     </w:p>
     <w:tbl>
@@ -4059,19 +3961,6 @@
         </w:tc>
       </w:tr>
     </w:tbl>
-    <w:p>
-      <w:pPr>
-        <w:spacing w:after="0" w:line="240" w:lineRule="auto"/>
-        <w:rPr>
-          <w:rFonts w:ascii="Arial Nova" w:eastAsia="Times New Roman" w:hAnsi="Arial Nova" w:cs="Times New Roman"/>
-          <w:b/>
-          <w:bCs/>
-          <w:sz w:val="20"/>
-          <w:szCs w:val="20"/>
-          <w:lang w:val="id-ID" w:eastAsia="en-ID"/>
-        </w:rPr>
-      </w:pPr>
-    </w:p>
     <w:tbl>
       <w:tblPr>
         <w:tblStyle w:val="GridTable1Light-Accent2"/>
@@ -4332,9 +4221,6 @@
             <w:tcW w:w="1307" w:type="dxa"/>
           </w:tcPr>
           <w:p>
-            <w:pPr>
-              <w:cnfStyle w:val="000000000000" w:firstRow="0" w:lastRow="0" w:firstColumn="0" w:lastColumn="0" w:oddVBand="0" w:evenVBand="0" w:oddHBand="0" w:evenHBand="0" w:firstRowFirstColumn="0" w:firstRowLastColumn="0" w:lastRowFirstColumn="0" w:lastRowLastColumn="0"/>
-            </w:pPr>
             <w:r>
               <w:t>{$p.aktivitas_pembelajaran[0].tahapan_sintaks}</w:t>
             </w:r>
@@ -4346,9 +4232,6 @@
             <w:gridSpan w:val="2"/>
           </w:tcPr>
           <w:p>
-            <w:pPr>
-              <w:cnfStyle w:val="000000000000" w:firstRow="0" w:lastRow="0" w:firstColumn="0" w:lastColumn="0" w:oddVBand="0" w:evenVBand="0" w:oddHBand="0" w:evenHBand="0" w:firstRowFirstColumn="0" w:firstRowLastColumn="0" w:lastRowFirstColumn="0" w:lastRowLastColumn="0"/>
-            </w:pPr>
             <w:r>
               <w:t>{$p.aktivitas_pembelajaran[0].prosedur_guru}</w:t>
             </w:r>
@@ -4359,9 +4242,6 @@
             <w:tcW w:w="1969" w:type="dxa"/>
           </w:tcPr>
           <w:p>
-            <w:pPr>
-              <w:cnfStyle w:val="000000000000" w:firstRow="0" w:lastRow="0" w:firstColumn="0" w:lastColumn="0" w:oddVBand="0" w:evenVBand="0" w:oddHBand="0" w:evenHBand="0" w:firstRowFirstColumn="0" w:firstRowLastColumn="0" w:lastRowFirstColumn="0" w:lastRowLastColumn="0"/>
-            </w:pPr>
             <w:r>
               <w:t>{$p.aktivitas_pembelajaran[0].prosedur_siswa}</w:t>
             </w:r>
@@ -4372,13 +4252,8 @@
             <w:tcW w:w="1294" w:type="dxa"/>
           </w:tcPr>
           <w:p>
-            <w:pPr>
-              <w:cnfStyle w:val="000000000000" w:firstRow="0" w:lastRow="0" w:firstColumn="0" w:lastColumn="0" w:oddVBand="0" w:evenVBand="0" w:oddHBand="0" w:evenHBand="0" w:firstRowFirstColumn="0" w:firstRowLastColumn="0" w:lastRowFirstColumn="0" w:lastRowLastColumn="0"/>
-            </w:pPr>
             <w:r>
               <w:t>{FOR pk IN $p.aktivitas_pembelajaran[0].pertanyaan_kunci}{$pk}</w:t>
-            </w:r>
-            <w:r>
               <w:br/>
               <w:t>{END-FOR pk}</w:t>
             </w:r>
@@ -4389,9 +4264,7 @@
             <w:tcW w:w="2418" w:type="dxa"/>
           </w:tcPr>
           <w:p>
-            <w:pPr>
-              <w:cnfStyle w:val="000000000000" w:firstRow="0" w:lastRow="0" w:firstColumn="0" w:lastColumn="0" w:oddVBand="0" w:evenVBand="0" w:oddHBand="0" w:evenHBand="0" w:firstRowFirstColumn="0" w:firstRowLastColumn="0" w:lastRowFirstColumn="0" w:lastRowLastColumn="0"/>
-            </w:pPr>
+            <w:r/>
             <w:r>
               <w:rPr>
                 <w:b/>
@@ -4417,11 +4290,7 @@
               <w:t>{$p.aktivitas_pembelajaran[0].muatan_inovatif.impactful ? 'Impactful: ' : ''}</w:t>
             </w:r>
             <w:r>
-              <w:t>{$p.aktivitas_pembelaj</w:t>
-            </w:r>
-            <w:r>
-              <w:lastRenderedPageBreak/>
-              <w:t>aran[0].muatan_inovatif.impactful || ''}</w:t>
+              <w:t>{$p.aktivitas_pembelajaran[0].muatan_inovatif.impactful || ''}</w:t>
             </w:r>
           </w:p>
         </w:tc>
@@ -4476,9 +4345,6 @@
             <w:tcW w:w="1307" w:type="dxa"/>
           </w:tcPr>
           <w:p>
-            <w:pPr>
-              <w:cnfStyle w:val="000000000000" w:firstRow="0" w:lastRow="0" w:firstColumn="0" w:lastColumn="0" w:oddVBand="0" w:evenVBand="0" w:oddHBand="0" w:evenHBand="0" w:firstRowFirstColumn="0" w:firstRowLastColumn="0" w:lastRowFirstColumn="0" w:lastRowLastColumn="0"/>
-            </w:pPr>
             <w:r>
               <w:t>{$p.aktivitas_pembelajaran[1].tahapan_sintaks}</w:t>
             </w:r>
@@ -4490,9 +4356,6 @@
             <w:gridSpan w:val="2"/>
           </w:tcPr>
           <w:p>
-            <w:pPr>
-              <w:cnfStyle w:val="000000000000" w:firstRow="0" w:lastRow="0" w:firstColumn="0" w:lastColumn="0" w:oddVBand="0" w:evenVBand="0" w:oddHBand="0" w:evenHBand="0" w:firstRowFirstColumn="0" w:firstRowLastColumn="0" w:lastRowFirstColumn="0" w:lastRowLastColumn="0"/>
-            </w:pPr>
             <w:r>
               <w:t>{$p.aktivitas_pembelajaran[1].prosedur_guru}</w:t>
             </w:r>
@@ -4503,9 +4366,6 @@
             <w:tcW w:w="1969" w:type="dxa"/>
           </w:tcPr>
           <w:p>
-            <w:pPr>
-              <w:cnfStyle w:val="000000000000" w:firstRow="0" w:lastRow="0" w:firstColumn="0" w:lastColumn="0" w:oddVBand="0" w:evenVBand="0" w:oddHBand="0" w:evenHBand="0" w:firstRowFirstColumn="0" w:firstRowLastColumn="0" w:lastRowFirstColumn="0" w:lastRowLastColumn="0"/>
-            </w:pPr>
             <w:r>
               <w:t>{$p.aktivitas_pembelajaran[1].prosedur_siswa}</w:t>
             </w:r>
@@ -4516,13 +4376,8 @@
             <w:tcW w:w="1294" w:type="dxa"/>
           </w:tcPr>
           <w:p>
-            <w:pPr>
-              <w:cnfStyle w:val="000000000000" w:firstRow="0" w:lastRow="0" w:firstColumn="0" w:lastColumn="0" w:oddVBand="0" w:evenVBand="0" w:oddHBand="0" w:evenHBand="0" w:firstRowFirstColumn="0" w:firstRowLastColumn="0" w:lastRowFirstColumn="0" w:lastRowLastColumn="0"/>
-            </w:pPr>
             <w:r>
               <w:t>{FOR pk IN $p.aktivitas_pembelajaran[1].pertanyaan_kunci}{$pk}</w:t>
-            </w:r>
-            <w:r>
               <w:br/>
               <w:t>{END-FOR pk}</w:t>
             </w:r>
@@ -4533,9 +4388,7 @@
             <w:tcW w:w="2418" w:type="dxa"/>
           </w:tcPr>
           <w:p>
-            <w:pPr>
-              <w:cnfStyle w:val="000000000000" w:firstRow="0" w:lastRow="0" w:firstColumn="0" w:lastColumn="0" w:oddVBand="0" w:evenVBand="0" w:oddHBand="0" w:evenHBand="0" w:firstRowFirstColumn="0" w:firstRowLastColumn="0" w:lastRowFirstColumn="0" w:lastRowLastColumn="0"/>
-            </w:pPr>
+            <w:r/>
             <w:r>
               <w:rPr>
                 <w:b/>
@@ -4583,9 +4436,6 @@
             <w:tcW w:w="1307" w:type="dxa"/>
           </w:tcPr>
           <w:p>
-            <w:pPr>
-              <w:cnfStyle w:val="000000000000" w:firstRow="0" w:lastRow="0" w:firstColumn="0" w:lastColumn="0" w:oddVBand="0" w:evenVBand="0" w:oddHBand="0" w:evenHBand="0" w:firstRowFirstColumn="0" w:firstRowLastColumn="0" w:lastRowFirstColumn="0" w:lastRowLastColumn="0"/>
-            </w:pPr>
             <w:r>
               <w:t>{$p.aktivitas_pembelajaran[2].tahapan_sintaks}</w:t>
             </w:r>
@@ -4597,9 +4447,6 @@
             <w:gridSpan w:val="2"/>
           </w:tcPr>
           <w:p>
-            <w:pPr>
-              <w:cnfStyle w:val="000000000000" w:firstRow="0" w:lastRow="0" w:firstColumn="0" w:lastColumn="0" w:oddVBand="0" w:evenVBand="0" w:oddHBand="0" w:evenHBand="0" w:firstRowFirstColumn="0" w:firstRowLastColumn="0" w:lastRowFirstColumn="0" w:lastRowLastColumn="0"/>
-            </w:pPr>
             <w:r>
               <w:t>{$p.aktivitas_pembelajaran[2].prosedur_guru}</w:t>
             </w:r>
@@ -4610,9 +4457,6 @@
             <w:tcW w:w="1969" w:type="dxa"/>
           </w:tcPr>
           <w:p>
-            <w:pPr>
-              <w:cnfStyle w:val="000000000000" w:firstRow="0" w:lastRow="0" w:firstColumn="0" w:lastColumn="0" w:oddVBand="0" w:evenVBand="0" w:oddHBand="0" w:evenHBand="0" w:firstRowFirstColumn="0" w:firstRowLastColumn="0" w:lastRowFirstColumn="0" w:lastRowLastColumn="0"/>
-            </w:pPr>
             <w:r>
               <w:t>{$p.aktivitas_pembelajaran[2].prosedur_siswa}</w:t>
             </w:r>
@@ -4623,13 +4467,8 @@
             <w:tcW w:w="1294" w:type="dxa"/>
           </w:tcPr>
           <w:p>
-            <w:pPr>
-              <w:cnfStyle w:val="000000000000" w:firstRow="0" w:lastRow="0" w:firstColumn="0" w:lastColumn="0" w:oddVBand="0" w:evenVBand="0" w:oddHBand="0" w:evenHBand="0" w:firstRowFirstColumn="0" w:firstRowLastColumn="0" w:lastRowFirstColumn="0" w:lastRowLastColumn="0"/>
-            </w:pPr>
             <w:r>
               <w:t>{FOR pk IN $p.aktivitas_pembelajaran[2].pertanyaan_kunci}{$pk}</w:t>
-            </w:r>
-            <w:r>
               <w:br/>
               <w:t>{END-FOR pk}</w:t>
             </w:r>
@@ -4640,9 +4479,7 @@
             <w:tcW w:w="2418" w:type="dxa"/>
           </w:tcPr>
           <w:p>
-            <w:pPr>
-              <w:cnfStyle w:val="000000000000" w:firstRow="0" w:lastRow="0" w:firstColumn="0" w:lastColumn="0" w:oddVBand="0" w:evenVBand="0" w:oddHBand="0" w:evenHBand="0" w:firstRowFirstColumn="0" w:firstRowLastColumn="0" w:lastRowFirstColumn="0" w:lastRowLastColumn="0"/>
-            </w:pPr>
+            <w:r/>
             <w:r>
               <w:rPr>
                 <w:b/>
@@ -4656,14 +4493,7 @@
               <w:rPr>
                 <w:b/>
               </w:rPr>
-              <w:t>{$p.aktivitas_pembelajaran[2].muatan_inovatif.differentiation ? 'Differentiation (' + $p.aktivitas_pembelajaran[2].muatan_inovatif.di</w:t>
-            </w:r>
-            <w:r>
-              <w:rPr>
-                <w:b/>
-              </w:rPr>
-              <w:lastRenderedPageBreak/>
-              <w:t>fferentiation.type + '): ' : ''}</w:t>
+              <w:t>{$p.aktivitas_pembelajaran[2].muatan_inovatif.differentiation ? 'Differentiation (' + $p.aktivitas_pembelajaran[2].muatan_inovatif.differentiation.type + '): ' : ''}</w:t>
             </w:r>
             <w:r>
               <w:t>{$p.aktivitas_pembelajaran[2].muatan_inovatif.differentiation ? $p.aktivitas_pembelajaran[2].muatan_inovatif.differentiation.deskripsi : ''}</w:t>
@@ -4688,7 +4518,6 @@
           </w:tcPr>
           <w:p>
             <w:r>
-              <w:lastRenderedPageBreak/>
               <w:t>{$p.aktivitas_pembelajaran[3].waktu_menit}'</w:t>
             </w:r>
           </w:p>
@@ -4698,9 +4527,6 @@
             <w:tcW w:w="1307" w:type="dxa"/>
           </w:tcPr>
           <w:p>
-            <w:pPr>
-              <w:cnfStyle w:val="000000000000" w:firstRow="0" w:lastRow="0" w:firstColumn="0" w:lastColumn="0" w:oddVBand="0" w:evenVBand="0" w:oddHBand="0" w:evenHBand="0" w:firstRowFirstColumn="0" w:firstRowLastColumn="0" w:lastRowFirstColumn="0" w:lastRowLastColumn="0"/>
-            </w:pPr>
             <w:r>
               <w:t>{$p.aktivitas_pembelajaran[3].tahapan_sintaks}</w:t>
             </w:r>
@@ -4712,9 +4538,6 @@
             <w:gridSpan w:val="2"/>
           </w:tcPr>
           <w:p>
-            <w:pPr>
-              <w:cnfStyle w:val="000000000000" w:firstRow="0" w:lastRow="0" w:firstColumn="0" w:lastColumn="0" w:oddVBand="0" w:evenVBand="0" w:oddHBand="0" w:evenHBand="0" w:firstRowFirstColumn="0" w:firstRowLastColumn="0" w:lastRowFirstColumn="0" w:lastRowLastColumn="0"/>
-            </w:pPr>
             <w:r>
               <w:t>{$p.aktivitas_pembelajaran[3].prosedur_guru}</w:t>
             </w:r>
@@ -4725,9 +4548,6 @@
             <w:tcW w:w="1969" w:type="dxa"/>
           </w:tcPr>
           <w:p>
-            <w:pPr>
-              <w:cnfStyle w:val="000000000000" w:firstRow="0" w:lastRow="0" w:firstColumn="0" w:lastColumn="0" w:oddVBand="0" w:evenVBand="0" w:oddHBand="0" w:evenHBand="0" w:firstRowFirstColumn="0" w:firstRowLastColumn="0" w:lastRowFirstColumn="0" w:lastRowLastColumn="0"/>
-            </w:pPr>
             <w:r>
               <w:t>{$p.aktivitas_pembelajaran[3].prosedur_siswa}</w:t>
             </w:r>
@@ -4738,13 +4558,8 @@
             <w:tcW w:w="1294" w:type="dxa"/>
           </w:tcPr>
           <w:p>
-            <w:pPr>
-              <w:cnfStyle w:val="000000000000" w:firstRow="0" w:lastRow="0" w:firstColumn="0" w:lastColumn="0" w:oddVBand="0" w:evenVBand="0" w:oddHBand="0" w:evenHBand="0" w:firstRowFirstColumn="0" w:firstRowLastColumn="0" w:lastRowFirstColumn="0" w:lastRowLastColumn="0"/>
-            </w:pPr>
             <w:r>
               <w:t>{FOR pk IN $p.aktivitas_pembelajaran[3].pertanyaan_kunci}{$pk}</w:t>
-            </w:r>
-            <w:r>
               <w:br/>
               <w:t>{END-FOR pk}</w:t>
             </w:r>
@@ -4755,9 +4570,7 @@
             <w:tcW w:w="2418" w:type="dxa"/>
           </w:tcPr>
           <w:p>
-            <w:pPr>
-              <w:cnfStyle w:val="000000000000" w:firstRow="0" w:lastRow="0" w:firstColumn="0" w:lastColumn="0" w:oddVBand="0" w:evenVBand="0" w:oddHBand="0" w:evenHBand="0" w:firstRowFirstColumn="0" w:firstRowLastColumn="0" w:lastRowFirstColumn="0" w:lastRowLastColumn="0"/>
-            </w:pPr>
+            <w:r/>
             <w:r>
               <w:rPr>
                 <w:b/>
@@ -4826,7 +4639,6 @@
           </w:tcPr>
           <w:p>
             <w:r>
-              <w:lastRenderedPageBreak/>
               <w:t>{$p.aktivitas_pembelajaran[4].waktu_menit}'</w:t>
             </w:r>
           </w:p>
@@ -4836,9 +4648,6 @@
             <w:tcW w:w="1307" w:type="dxa"/>
           </w:tcPr>
           <w:p>
-            <w:pPr>
-              <w:cnfStyle w:val="000000000000" w:firstRow="0" w:lastRow="0" w:firstColumn="0" w:lastColumn="0" w:oddVBand="0" w:evenVBand="0" w:oddHBand="0" w:evenHBand="0" w:firstRowFirstColumn="0" w:firstRowLastColumn="0" w:lastRowFirstColumn="0" w:lastRowLastColumn="0"/>
-            </w:pPr>
             <w:r>
               <w:t>{$p.aktivitas_pembelajaran[4].tahapan_sintaks}</w:t>
             </w:r>
@@ -4850,9 +4659,6 @@
             <w:gridSpan w:val="2"/>
           </w:tcPr>
           <w:p>
-            <w:pPr>
-              <w:cnfStyle w:val="000000000000" w:firstRow="0" w:lastRow="0" w:firstColumn="0" w:lastColumn="0" w:oddVBand="0" w:evenVBand="0" w:oddHBand="0" w:evenHBand="0" w:firstRowFirstColumn="0" w:firstRowLastColumn="0" w:lastRowFirstColumn="0" w:lastRowLastColumn="0"/>
-            </w:pPr>
             <w:r>
               <w:t>{$p.aktivitas_pembelajaran[4].prosedur_guru}</w:t>
             </w:r>
@@ -4863,9 +4669,6 @@
             <w:tcW w:w="1969" w:type="dxa"/>
           </w:tcPr>
           <w:p>
-            <w:pPr>
-              <w:cnfStyle w:val="000000000000" w:firstRow="0" w:lastRow="0" w:firstColumn="0" w:lastColumn="0" w:oddVBand="0" w:evenVBand="0" w:oddHBand="0" w:evenHBand="0" w:firstRowFirstColumn="0" w:firstRowLastColumn="0" w:lastRowFirstColumn="0" w:lastRowLastColumn="0"/>
-            </w:pPr>
             <w:r>
               <w:t>{$p.aktivitas_pembelajaran[4].prosedur_siswa}</w:t>
             </w:r>
@@ -4876,13 +4679,8 @@
             <w:tcW w:w="1294" w:type="dxa"/>
           </w:tcPr>
           <w:p>
-            <w:pPr>
-              <w:cnfStyle w:val="000000000000" w:firstRow="0" w:lastRow="0" w:firstColumn="0" w:lastColumn="0" w:oddVBand="0" w:evenVBand="0" w:oddHBand="0" w:evenHBand="0" w:firstRowFirstColumn="0" w:firstRowLastColumn="0" w:lastRowFirstColumn="0" w:lastRowLastColumn="0"/>
-            </w:pPr>
             <w:r>
               <w:t>{FOR pk IN $p.aktivitas_pembelajaran[4].pertanyaan_kunci}{$pk}</w:t>
-            </w:r>
-            <w:r>
               <w:br/>
               <w:t>{END-FOR pk}</w:t>
             </w:r>
@@ -4893,9 +4691,7 @@
             <w:tcW w:w="2418" w:type="dxa"/>
           </w:tcPr>
           <w:p>
-            <w:pPr>
-              <w:cnfStyle w:val="000000000000" w:firstRow="0" w:lastRow="0" w:firstColumn="0" w:lastColumn="0" w:oddVBand="0" w:evenVBand="0" w:oddHBand="0" w:evenHBand="0" w:firstRowFirstColumn="0" w:firstRowLastColumn="0" w:lastRowFirstColumn="0" w:lastRowLastColumn="0"/>
-            </w:pPr>
+            <w:r/>
             <w:r>
               <w:rPr>
                 <w:b/>
@@ -4949,9 +4745,6 @@
             </w:tcBorders>
           </w:tcPr>
           <w:p>
-            <w:pPr>
-              <w:cnfStyle w:val="000000000000" w:firstRow="0" w:lastRow="0" w:firstColumn="0" w:lastColumn="0" w:oddVBand="0" w:evenVBand="0" w:oddHBand="0" w:evenHBand="0" w:firstRowFirstColumn="0" w:firstRowLastColumn="0" w:lastRowFirstColumn="0" w:lastRowLastColumn="0"/>
-            </w:pPr>
             <w:r>
               <w:t>{$p.aktivitas_pembelajaran[5].tahapan_sintaks}</w:t>
             </w:r>
@@ -4966,9 +4759,6 @@
             </w:tcBorders>
           </w:tcPr>
           <w:p>
-            <w:pPr>
-              <w:cnfStyle w:val="000000000000" w:firstRow="0" w:lastRow="0" w:firstColumn="0" w:lastColumn="0" w:oddVBand="0" w:evenVBand="0" w:oddHBand="0" w:evenHBand="0" w:firstRowFirstColumn="0" w:firstRowLastColumn="0" w:lastRowFirstColumn="0" w:lastRowLastColumn="0"/>
-            </w:pPr>
             <w:r>
               <w:t>{$p.aktivitas_pembelajaran[5].prosedur_guru}</w:t>
             </w:r>
@@ -4982,9 +4772,6 @@
             </w:tcBorders>
           </w:tcPr>
           <w:p>
-            <w:pPr>
-              <w:cnfStyle w:val="000000000000" w:firstRow="0" w:lastRow="0" w:firstColumn="0" w:lastColumn="0" w:oddVBand="0" w:evenVBand="0" w:oddHBand="0" w:evenHBand="0" w:firstRowFirstColumn="0" w:firstRowLastColumn="0" w:lastRowFirstColumn="0" w:lastRowLastColumn="0"/>
-            </w:pPr>
             <w:r>
               <w:t>{$p.aktivitas_pembelajaran[5].prosedur_siswa}</w:t>
             </w:r>
@@ -4998,13 +4785,8 @@
             </w:tcBorders>
           </w:tcPr>
           <w:p>
-            <w:pPr>
-              <w:cnfStyle w:val="000000000000" w:firstRow="0" w:lastRow="0" w:firstColumn="0" w:lastColumn="0" w:oddVBand="0" w:evenVBand="0" w:oddHBand="0" w:evenHBand="0" w:firstRowFirstColumn="0" w:firstRowLastColumn="0" w:lastRowFirstColumn="0" w:lastRowLastColumn="0"/>
-            </w:pPr>
             <w:r>
               <w:t>{FOR pk IN $p.aktivitas_pembelajaran[5].pertanyaan_kunci}{$pk}</w:t>
-            </w:r>
-            <w:r>
               <w:br/>
               <w:t>{END-FOR pk}</w:t>
             </w:r>
@@ -5018,9 +4800,7 @@
             </w:tcBorders>
           </w:tcPr>
           <w:p>
-            <w:pPr>
-              <w:cnfStyle w:val="000000000000" w:firstRow="0" w:lastRow="0" w:firstColumn="0" w:lastColumn="0" w:oddVBand="0" w:evenVBand="0" w:oddHBand="0" w:evenHBand="0" w:firstRowFirstColumn="0" w:firstRowLastColumn="0" w:lastRowFirstColumn="0" w:lastRowLastColumn="0"/>
-            </w:pPr>
+            <w:r/>
             <w:r>
               <w:rPr>
                 <w:b/>
@@ -5037,11 +4817,7 @@
               <w:t>{$p.aktivitas_pembelajaran[5].muatan_inovatif.differentiation ? 'Differentiation (' + $p.aktivitas_pembelajaran[5].muatan_inovatif.differentiation.type + '): ' : ''}</w:t>
             </w:r>
             <w:r>
-              <w:t>{$p.aktivitas_pembelajaran[5].muatan_inovatif.</w:t>
-            </w:r>
-            <w:r>
-              <w:lastRenderedPageBreak/>
-              <w:t>differentiation ? $p.aktivitas_pembelajaran[5].muatan_inovatif.differentiation.deskripsi : ''}</w:t>
+              <w:t>{$p.aktivitas_pembelajaran[5].muatan_inovatif.differentiation ? $p.aktivitas_pembelajaran[5].muatan_inovatif.differentiation.deskripsi : ''}</w:t>
             </w:r>
             <w:r>
               <w:rPr>
@@ -5056,80 +4832,6 @@
         </w:tc>
       </w:tr>
     </w:tbl>
-    <w:p>
-      <w:pPr>
-        <w:spacing w:after="0" w:line="240" w:lineRule="auto"/>
-        <w:rPr>
-          <w:rFonts w:ascii="Arial Nova" w:eastAsia="Times New Roman" w:hAnsi="Arial Nova" w:cs="Times New Roman"/>
-          <w:sz w:val="20"/>
-          <w:szCs w:val="20"/>
-          <w:lang w:val="id-ID" w:eastAsia="en-ID"/>
-        </w:rPr>
-      </w:pPr>
-      <w:r>
-        <w:rPr>
-          <w:noProof/>
-          <w:lang w:val="id-ID"/>
-        </w:rPr>
-        <w:lastRenderedPageBreak/>
-        <mc:AlternateContent>
-          <mc:Choice Requires="wps">
-            <w:drawing>
-              <wp:inline distT="0" distB="0" distL="0" distR="0" wp14:anchorId="28D172A5" wp14:editId="0627F6BE">
-                <wp:extent cx="635" cy="19050"/>
-                <wp:effectExtent l="0" t="0" r="0" b="0"/>
-                <wp:docPr id="3" name="Shape1"/>
-                <wp:cNvGraphicFramePr/>
-                <a:graphic xmlns:a="http://schemas.openxmlformats.org/drawingml/2006/main">
-                  <a:graphicData uri="http://schemas.microsoft.com/office/word/2010/wordprocessingShape">
-                    <wps:wsp>
-                      <wps:cNvSpPr/>
-                      <wps:spPr>
-                        <a:xfrm>
-                          <a:off x="0" y="0"/>
-                          <a:ext cx="720" cy="19080"/>
-                        </a:xfrm>
-                        <a:prstGeom prst="rect">
-                          <a:avLst/>
-                        </a:prstGeom>
-                        <a:solidFill>
-                          <a:srgbClr val="A0A0A0"/>
-                        </a:solidFill>
-                        <a:ln w="0">
-                          <a:noFill/>
-                        </a:ln>
-                      </wps:spPr>
-                      <wps:style>
-                        <a:lnRef idx="0">
-                          <a:scrgbClr r="0" g="0" b="0"/>
-                        </a:lnRef>
-                        <a:fillRef idx="0">
-                          <a:scrgbClr r="0" g="0" b="0"/>
-                        </a:fillRef>
-                        <a:effectRef idx="0">
-                          <a:scrgbClr r="0" g="0" b="0"/>
-                        </a:effectRef>
-                        <a:fontRef idx="minor"/>
-                      </wps:style>
-                      <wps:bodyPr/>
-                    </wps:wsp>
-                  </a:graphicData>
-                </a:graphic>
-              </wp:inline>
-            </w:drawing>
-          </mc:Choice>
-          <mc:Fallback xmlns:pic="http://schemas.openxmlformats.org/drawingml/2006/picture">
-            <w:pict>
-              <v:rect id="shape_0" fillcolor="#a0a0a0" stroked="f" o:allowincell="f" style="position:absolute;margin-left:0pt;margin-top:-1.55pt;width:0pt;height:1.45pt;mso-wrap-style:none;v-text-anchor:middle;mso-position-vertical:top">
-                <v:fill o:detectmouseclick="t" type="solid" color2="#5f5f5f"/>
-                <v:stroke color="#3465a4" joinstyle="round" endcap="flat"/>
-                <w10:wrap type="square"/>
-              </v:rect>
-            </w:pict>
-          </mc:Fallback>
-        </mc:AlternateContent>
-      </w:r>
-    </w:p>
     <w:p>
       <w:pPr>
         <w:spacing w:after="0" w:line="240" w:lineRule="auto"/>
@@ -5194,6 +4896,7 @@
                 <w:rFonts w:ascii="Arial Nova" w:eastAsia="Times New Roman" w:hAnsi="Arial Nova" w:cs="Times New Roman"/>
                 <w:b w:val="0"/>
                 <w:bCs w:val="0"/>
+                <w:color w:val="FFFFFF" w:themeColor="background1"/>
                 <w:sz w:val="20"/>
                 <w:szCs w:val="20"/>
                 <w:lang w:val="id-ID" w:eastAsia="en-ID"/>
@@ -5230,6 +4933,7 @@
                 <w:rFonts w:ascii="Arial Nova" w:eastAsia="Times New Roman" w:hAnsi="Arial Nova" w:cs="Times New Roman"/>
                 <w:b w:val="0"/>
                 <w:bCs w:val="0"/>
+                <w:color w:val="FFFFFF" w:themeColor="background1"/>
                 <w:sz w:val="20"/>
                 <w:szCs w:val="20"/>
                 <w:lang w:val="id-ID" w:eastAsia="en-ID"/>
@@ -5266,6 +4970,7 @@
                 <w:rFonts w:ascii="Arial Nova" w:eastAsia="Times New Roman" w:hAnsi="Arial Nova" w:cs="Times New Roman"/>
                 <w:b w:val="0"/>
                 <w:bCs w:val="0"/>
+                <w:color w:val="FFFFFF" w:themeColor="background1"/>
                 <w:sz w:val="20"/>
                 <w:szCs w:val="20"/>
                 <w:lang w:val="id-ID" w:eastAsia="en-ID"/>
@@ -5285,7 +4990,11 @@
             <w:tcW w:w="1279" w:type="dxa"/>
           </w:tcPr>
           <w:p>
-            <w:r>
+            <w:r/>
+            <w:r>
+              <w:rPr>
+                <w:b/>
+              </w:rPr>
               <w:t>{$p.asesmen[0].jenis}</w:t>
             </w:r>
           </w:p>
@@ -5295,9 +5004,6 @@
             <w:tcW w:w="3029" w:type="dxa"/>
           </w:tcPr>
           <w:p>
-            <w:pPr>
-              <w:cnfStyle w:val="000000100000" w:firstRow="0" w:lastRow="0" w:firstColumn="0" w:lastColumn="0" w:oddVBand="0" w:evenVBand="0" w:oddHBand="1" w:evenHBand="0" w:firstRowFirstColumn="0" w:firstRowLastColumn="0" w:lastRowFirstColumn="0" w:lastRowLastColumn="0"/>
-            </w:pPr>
             <w:r>
               <w:t>{$p.asesmen[0].bentuk}</w:t>
             </w:r>
@@ -5308,9 +5014,7 @@
             <w:tcW w:w="5659" w:type="dxa"/>
           </w:tcPr>
           <w:p>
-            <w:pPr>
-              <w:cnfStyle w:val="000000100000" w:firstRow="0" w:lastRow="0" w:firstColumn="0" w:lastColumn="0" w:oddVBand="0" w:evenVBand="0" w:oddHBand="1" w:evenHBand="0" w:firstRowFirstColumn="0" w:firstRowLastColumn="0" w:lastRowFirstColumn="0" w:lastRowLastColumn="0"/>
-            </w:pPr>
+            <w:r/>
             <w:r>
               <w:rPr>
                 <w:b/>
@@ -5330,7 +5034,11 @@
             <w:tcW w:w="1279" w:type="dxa"/>
           </w:tcPr>
           <w:p>
-            <w:r>
+            <w:r/>
+            <w:r>
+              <w:rPr>
+                <w:b/>
+              </w:rPr>
               <w:t>{$p.asesmen[1].jenis}</w:t>
             </w:r>
           </w:p>
@@ -5340,9 +5048,6 @@
             <w:tcW w:w="3029" w:type="dxa"/>
           </w:tcPr>
           <w:p>
-            <w:pPr>
-              <w:cnfStyle w:val="000000000000" w:firstRow="0" w:lastRow="0" w:firstColumn="0" w:lastColumn="0" w:oddVBand="0" w:evenVBand="0" w:oddHBand="0" w:evenHBand="0" w:firstRowFirstColumn="0" w:firstRowLastColumn="0" w:lastRowFirstColumn="0" w:lastRowLastColumn="0"/>
-            </w:pPr>
             <w:r>
               <w:t>{$p.asesmen[1].bentuk}</w:t>
             </w:r>
@@ -5353,9 +5058,7 @@
             <w:tcW w:w="5659" w:type="dxa"/>
           </w:tcPr>
           <w:p>
-            <w:pPr>
-              <w:cnfStyle w:val="000000000000" w:firstRow="0" w:lastRow="0" w:firstColumn="0" w:lastColumn="0" w:oddVBand="0" w:evenVBand="0" w:oddHBand="0" w:evenHBand="0" w:firstRowFirstColumn="0" w:firstRowLastColumn="0" w:lastRowFirstColumn="0" w:lastRowLastColumn="0"/>
-            </w:pPr>
+            <w:r/>
             <w:r>
               <w:rPr>
                 <w:b/>
@@ -5378,7 +5081,11 @@
             <w:tcW w:w="1279" w:type="dxa"/>
           </w:tcPr>
           <w:p>
-            <w:r>
+            <w:r/>
+            <w:r>
+              <w:rPr>
+                <w:b/>
+              </w:rPr>
               <w:t>{$p.asesmen[2].jenis}</w:t>
             </w:r>
           </w:p>
@@ -5388,9 +5095,6 @@
             <w:tcW w:w="3029" w:type="dxa"/>
           </w:tcPr>
           <w:p>
-            <w:pPr>
-              <w:cnfStyle w:val="000000100000" w:firstRow="0" w:lastRow="0" w:firstColumn="0" w:lastColumn="0" w:oddVBand="0" w:evenVBand="0" w:oddHBand="1" w:evenHBand="0" w:firstRowFirstColumn="0" w:firstRowLastColumn="0" w:lastRowFirstColumn="0" w:lastRowLastColumn="0"/>
-            </w:pPr>
             <w:r>
               <w:t>{$p.asesmen[2].bentuk}</w:t>
             </w:r>
@@ -5401,9 +5105,7 @@
             <w:tcW w:w="5659" w:type="dxa"/>
           </w:tcPr>
           <w:p>
-            <w:pPr>
-              <w:cnfStyle w:val="000000100000" w:firstRow="0" w:lastRow="0" w:firstColumn="0" w:lastColumn="0" w:oddVBand="0" w:evenVBand="0" w:oddHBand="1" w:evenHBand="0" w:firstRowFirstColumn="0" w:firstRowLastColumn="0" w:lastRowFirstColumn="0" w:lastRowLastColumn="0"/>
-            </w:pPr>
+            <w:r/>
             <w:r>
               <w:rPr>
                 <w:b/>
@@ -5423,7 +5125,11 @@
             <w:tcW w:w="1279" w:type="dxa"/>
           </w:tcPr>
           <w:p>
-            <w:r>
+            <w:r/>
+            <w:r>
+              <w:rPr>
+                <w:b/>
+              </w:rPr>
               <w:t>{$p.asesmen[3].jenis}</w:t>
             </w:r>
           </w:p>
@@ -5433,9 +5139,6 @@
             <w:tcW w:w="3029" w:type="dxa"/>
           </w:tcPr>
           <w:p>
-            <w:pPr>
-              <w:cnfStyle w:val="000000000000" w:firstRow="0" w:lastRow="0" w:firstColumn="0" w:lastColumn="0" w:oddVBand="0" w:evenVBand="0" w:oddHBand="0" w:evenHBand="0" w:firstRowFirstColumn="0" w:firstRowLastColumn="0" w:lastRowFirstColumn="0" w:lastRowLastColumn="0"/>
-            </w:pPr>
             <w:r>
               <w:t>{$p.asesmen[3].bentuk}</w:t>
             </w:r>
@@ -5446,9 +5149,7 @@
             <w:tcW w:w="5659" w:type="dxa"/>
           </w:tcPr>
           <w:p>
-            <w:pPr>
-              <w:cnfStyle w:val="000000000000" w:firstRow="0" w:lastRow="0" w:firstColumn="0" w:lastColumn="0" w:oddVBand="0" w:evenVBand="0" w:oddHBand="0" w:evenHBand="0" w:firstRowFirstColumn="0" w:firstRowLastColumn="0" w:lastRowFirstColumn="0" w:lastRowLastColumn="0"/>
-            </w:pPr>
+            <w:r/>
             <w:r>
               <w:rPr>
                 <w:b/>
@@ -5462,17 +5163,6 @@
         </w:tc>
       </w:tr>
     </w:tbl>
-    <w:p>
-      <w:pPr>
-        <w:spacing w:after="0" w:line="240" w:lineRule="auto"/>
-        <w:rPr>
-          <w:rFonts w:ascii="Arial Nova" w:eastAsia="Times New Roman" w:hAnsi="Arial Nova" w:cs="Times New Roman"/>
-          <w:sz w:val="20"/>
-          <w:szCs w:val="20"/>
-          <w:lang w:val="id-ID" w:eastAsia="en-ID"/>
-        </w:rPr>
-      </w:pPr>
-    </w:p>
     <w:p>
       <w:r>
         <w:t>{END-FOR p}</w:t>
@@ -5779,7 +5469,6 @@
         <w:rPr>
           <w:lang w:val="id-ID"/>
         </w:rPr>
-        <w:lastRenderedPageBreak/>
         <w:br w:type="page"/>
       </w:r>
     </w:p>
@@ -5813,12 +5502,6 @@
         <w:br w:type="page"/>
       </w:r>
     </w:p>
-    <w:sectPr>
-      <w:pgSz w:w="11906" w:h="16838"/>
-      <w:pgMar w:top="1440" w:right="1440" w:bottom="1440" w:left="1440" w:header="708" w:footer="708" w:gutter="0"/>
-      <w:cols w:space="708"/>
-      <w:docGrid w:linePitch="360"/>
-    </w:sectPr>
   </w:body>
 </w:document>
 </file>

</xml_diff>

<commit_message>
feat: tighten template.docx spacing in-place and make meeting header bold
</commit_message>
<xml_diff>
--- a/template.docx
+++ b/template.docx
@@ -881,6 +881,7 @@
           <w:szCs w:val="40"/>
           <w:lang w:val="id-ID"/>
         </w:rPr>
+        <w:lastRenderedPageBreak/>
         <w:t>Tahun Akademik 2025-2026</w:t>
       </w:r>
     </w:p>
@@ -963,7 +964,6 @@
           <w:p>
             <w:pPr>
               <w:spacing w:beforeAutospacing="1" w:after="0" w:line="240" w:lineRule="auto"/>
-              <w:jc w:val="right"/>
               <w:outlineLvl w:val="1"/>
               <w:rPr>
                 <w:rFonts w:ascii="Arial Nova" w:eastAsia="Times New Roman" w:hAnsi="Arial Nova" w:cs="Times New Roman"/>
@@ -1038,7 +1038,6 @@
           <w:p>
             <w:pPr>
               <w:spacing w:beforeAutospacing="1" w:after="0" w:line="240" w:lineRule="auto"/>
-              <w:jc w:val="right"/>
               <w:outlineLvl w:val="1"/>
               <w:rPr>
                 <w:rFonts w:ascii="Arial Nova" w:eastAsia="Times New Roman" w:hAnsi="Arial Nova" w:cs="Times New Roman"/>
@@ -1101,7 +1100,6 @@
           <w:p>
             <w:pPr>
               <w:spacing w:beforeAutospacing="1" w:after="0" w:line="240" w:lineRule="auto"/>
-              <w:jc w:val="right"/>
               <w:outlineLvl w:val="1"/>
               <w:rPr>
                 <w:rFonts w:ascii="Arial Nova" w:eastAsia="Times New Roman" w:hAnsi="Arial Nova" w:cs="Times New Roman"/>
@@ -1167,7 +1165,6 @@
           <w:p>
             <w:pPr>
               <w:spacing w:beforeAutospacing="1" w:after="0" w:line="240" w:lineRule="auto"/>
-              <w:jc w:val="right"/>
               <w:outlineLvl w:val="1"/>
               <w:rPr>
                 <w:rFonts w:ascii="Arial Nova" w:eastAsia="Times New Roman" w:hAnsi="Arial Nova" w:cs="Times New Roman"/>
@@ -1234,7 +1231,6 @@
           <w:p>
             <w:pPr>
               <w:spacing w:beforeAutospacing="1" w:after="0" w:line="240" w:lineRule="auto"/>
-              <w:jc w:val="right"/>
               <w:outlineLvl w:val="1"/>
               <w:rPr>
                 <w:rFonts w:ascii="Arial Nova" w:eastAsia="Times New Roman" w:hAnsi="Arial Nova" w:cs="Times New Roman"/>
@@ -1260,7 +1256,23 @@
             <w:tcW w:w="7236" w:type="dxa"/>
           </w:tcPr>
           <w:p>
-            <w:r>
+            <w:pPr>
+              <w:cnfStyle w:val="000000000000" w:firstRow="0" w:lastRow="0" w:firstColumn="0" w:lastColumn="0" w:oddVBand="0" w:evenVBand="0" w:oddHBand="0" w:evenHBand="0" w:firstRowFirstColumn="0" w:firstRowLastColumn="0" w:lastRowFirstColumn="0" w:lastRowLastColumn="0"/>
+              <w:rPr>
+                <w:rFonts w:ascii="Open Sans" w:hAnsi="Open Sans" w:cs="Open Sans"/>
+                <w:b/>
+                <w:bCs/>
+              </w:rPr>
+            </w:pPr>
+            <w:r>
+              <w:rPr>
+                <w:rFonts w:ascii="Open Sans" w:hAnsi="Open Sans" w:cs="Open Sans"/>
+                <w:b/>
+                <w:bCs/>
+                <w:color w:val="EE0000"/>
+                <w:sz w:val="22"/>
+                <w:szCs w:val="22"/>
+              </w:rPr>
               <w:t>{judul_tema_subtopik}</w:t>
             </w:r>
           </w:p>
@@ -1281,7 +1293,6 @@
           <w:p>
             <w:pPr>
               <w:spacing w:beforeAutospacing="1" w:after="0" w:line="240" w:lineRule="auto"/>
-              <w:jc w:val="right"/>
               <w:outlineLvl w:val="1"/>
               <w:rPr>
                 <w:rFonts w:ascii="Arial Nova" w:eastAsia="Times New Roman" w:hAnsi="Arial Nova" w:cs="Times New Roman"/>
@@ -1344,7 +1355,6 @@
           <w:p>
             <w:pPr>
               <w:spacing w:beforeAutospacing="1" w:after="0" w:line="240" w:lineRule="auto"/>
-              <w:jc w:val="right"/>
               <w:outlineLvl w:val="1"/>
               <w:rPr>
                 <w:rFonts w:ascii="Arial Nova" w:eastAsia="Times New Roman" w:hAnsi="Arial Nova" w:cs="Times New Roman"/>
@@ -1410,7 +1420,6 @@
           <w:p>
             <w:pPr>
               <w:spacing w:beforeAutospacing="1" w:after="0" w:line="240" w:lineRule="auto"/>
-              <w:jc w:val="right"/>
               <w:outlineLvl w:val="1"/>
               <w:rPr>
                 <w:rFonts w:ascii="Arial Nova" w:eastAsia="Times New Roman" w:hAnsi="Arial Nova" w:cs="Times New Roman"/>
@@ -1473,7 +1482,6 @@
           <w:p>
             <w:pPr>
               <w:spacing w:beforeAutospacing="1" w:after="0" w:line="240" w:lineRule="auto"/>
-              <w:jc w:val="right"/>
               <w:outlineLvl w:val="1"/>
               <w:rPr>
                 <w:rFonts w:ascii="Arial Nova" w:eastAsia="Times New Roman" w:hAnsi="Arial Nova" w:cs="Times New Roman"/>
@@ -1899,8 +1907,26 @@
           <w:p>
             <w:r>
               <w:t>Latar belakang pembelajaran:</w:t>
+            </w:r>
+            <w:r>
               <w:br/>
+            </w:r>
+            <w:r>
+              <w:rPr>
+                <w:rFonts w:ascii="Arial Nova" w:hAnsi="Arial Nova"/>
+                <w:color w:val="EE0000"/>
+                <w:sz w:val="20"/>
+                <w:szCs w:val="20"/>
+              </w:rPr>
               <w:t>{FOR lb IN latar_belakang_pembelajaran}• {$lb}</w:t>
+            </w:r>
+            <w:r>
+              <w:rPr>
+                <w:rFonts w:ascii="Arial Nova" w:hAnsi="Arial Nova"/>
+                <w:color w:val="EE0000"/>
+                <w:sz w:val="20"/>
+                <w:szCs w:val="20"/>
+              </w:rPr>
               <w:br/>
               <w:t>{END-FOR lb}</w:t>
             </w:r>
@@ -2206,7 +2232,6 @@
           <w:tcPr>
             <w:tcW w:w="1667" w:type="dxa"/>
             <w:vMerge/>
-            <w:vAlign w:val="center"/>
           </w:tcPr>
           <w:p>
             <w:pPr>
@@ -2225,26 +2250,43 @@
         <w:tc>
           <w:tcPr>
             <w:tcW w:w="2080" w:type="dxa"/>
-          </w:tcPr>
-          <w:p>
-            <w:r>
-              <w:t>{capaian_pembelajaran}</w:t>
-            </w:r>
-          </w:p>
-        </w:tc>
-        <w:tc>
-          <w:tcPr>
-            <w:tcW w:w="2086" w:type="dxa"/>
+            <w:shd w:val="clear" w:color="auto" w:fill="FFF2CC" w:themeFill="accent4" w:themeFillTint="33"/>
           </w:tcPr>
           <w:p>
             <w:pPr>
               <w:spacing w:after="0" w:line="240" w:lineRule="auto"/>
+              <w:rPr>
+                <w:rFonts w:ascii="Segoe UI Symbol" w:eastAsia="Times New Roman" w:hAnsi="Segoe UI Symbol" w:cs="Segoe UI Symbol"/>
+                <w:sz w:val="16"/>
+                <w:szCs w:val="16"/>
+                <w:lang w:val="id-ID" w:eastAsia="en-ID"/>
+              </w:rPr>
+            </w:pPr>
+            <w:r>
               <w:rPr>
                 <w:rFonts w:ascii="Segoe UI Symbol" w:eastAsia="Times New Roman" w:hAnsi="Segoe UI Symbol" w:cs="Segoe UI Symbol"/>
                 <w:b/>
                 <w:bCs/>
                 <w:sz w:val="20"/>
                 <w:szCs w:val="20"/>
+                <w:lang w:eastAsia="en-ID"/>
+              </w:rPr>
+              <w:t>☐   DPL 6</w:t>
+            </w:r>
+          </w:p>
+        </w:tc>
+        <w:tc>
+          <w:tcPr>
+            <w:tcW w:w="2086" w:type="dxa"/>
+            <w:shd w:val="clear" w:color="auto" w:fill="FFF2CC" w:themeFill="accent4" w:themeFillTint="33"/>
+          </w:tcPr>
+          <w:p>
+            <w:pPr>
+              <w:spacing w:after="0" w:line="240" w:lineRule="auto"/>
+              <w:rPr>
+                <w:rFonts w:ascii="Segoe UI Symbol" w:eastAsia="Times New Roman" w:hAnsi="Segoe UI Symbol" w:cs="Segoe UI Symbol"/>
+                <w:sz w:val="16"/>
+                <w:szCs w:val="16"/>
                 <w:lang w:val="id-ID" w:eastAsia="en-ID"/>
               </w:rPr>
             </w:pPr>
@@ -2255,9 +2297,9 @@
                 <w:bCs/>
                 <w:sz w:val="20"/>
                 <w:szCs w:val="20"/>
-                <w:lang w:val="id-ID" w:eastAsia="en-ID"/>
-              </w:rPr>
-              <w:t>☐   DPL 6</w:t>
+                <w:lang w:eastAsia="en-ID"/>
+              </w:rPr>
+              <w:t>☐   DPL 7</w:t>
             </w:r>
           </w:p>
         </w:tc>
@@ -2265,16 +2307,15 @@
           <w:tcPr>
             <w:tcW w:w="2072" w:type="dxa"/>
             <w:gridSpan w:val="2"/>
+            <w:shd w:val="clear" w:color="auto" w:fill="FFF2CC" w:themeFill="accent4" w:themeFillTint="33"/>
           </w:tcPr>
           <w:p>
             <w:pPr>
               <w:spacing w:after="0" w:line="240" w:lineRule="auto"/>
               <w:rPr>
                 <w:rFonts w:ascii="Arial Nova" w:eastAsia="Times New Roman" w:hAnsi="Arial Nova" w:cs="Times New Roman"/>
-                <w:b/>
-                <w:bCs/>
-                <w:sz w:val="20"/>
-                <w:szCs w:val="20"/>
+                <w:sz w:val="16"/>
+                <w:szCs w:val="16"/>
                 <w:lang w:val="id-ID" w:eastAsia="en-ID"/>
               </w:rPr>
             </w:pPr>
@@ -2285,25 +2326,24 @@
                 <w:bCs/>
                 <w:sz w:val="20"/>
                 <w:szCs w:val="20"/>
-                <w:lang w:val="id-ID" w:eastAsia="en-ID"/>
-              </w:rPr>
-              <w:t>☐   DPL 7</w:t>
+                <w:lang w:eastAsia="en-ID"/>
+              </w:rPr>
+              <w:t>☐   DPL 8</w:t>
             </w:r>
           </w:p>
         </w:tc>
         <w:tc>
           <w:tcPr>
             <w:tcW w:w="2087" w:type="dxa"/>
+            <w:shd w:val="clear" w:color="auto" w:fill="FFF2CC" w:themeFill="accent4" w:themeFillTint="33"/>
           </w:tcPr>
           <w:p>
             <w:pPr>
               <w:spacing w:after="0" w:line="240" w:lineRule="auto"/>
               <w:rPr>
                 <w:rFonts w:ascii="Arial Nova" w:eastAsia="Times New Roman" w:hAnsi="Arial Nova" w:cs="Times New Roman"/>
-                <w:b/>
-                <w:bCs/>
-                <w:sz w:val="20"/>
-                <w:szCs w:val="20"/>
+                <w:sz w:val="16"/>
+                <w:szCs w:val="16"/>
                 <w:lang w:val="id-ID" w:eastAsia="en-ID"/>
               </w:rPr>
             </w:pPr>
@@ -2314,22 +2354,21 @@
                 <w:bCs/>
                 <w:sz w:val="20"/>
                 <w:szCs w:val="20"/>
-                <w:lang w:val="id-ID" w:eastAsia="en-ID"/>
-              </w:rPr>
-              <w:t>☐   DPL 8</w:t>
+                <w:lang w:eastAsia="en-ID"/>
+              </w:rPr>
+              <w:t>☐   DPL 5</w:t>
             </w:r>
           </w:p>
         </w:tc>
       </w:tr>
       <w:tr>
         <w:trPr>
-          <w:trHeight w:val="79"/>
+          <w:trHeight w:val="54"/>
         </w:trPr>
         <w:tc>
           <w:tcPr>
             <w:tcW w:w="1667" w:type="dxa"/>
             <w:vMerge/>
-            <w:vAlign w:val="center"/>
           </w:tcPr>
           <w:p>
             <w:pPr>
@@ -2352,11 +2391,28 @@
             <w:vAlign w:val="center"/>
           </w:tcPr>
           <w:p>
-            <w:r>
-              <w:t>{FOR tpu IN tujuan_pembelajaran_umum}{$tpu}</w:t>
-              <w:br/>
-              <w:t>{END-FOR tpu}</w:t>
-            </w:r>
+            <w:pPr>
+              <w:spacing w:after="0" w:line="240" w:lineRule="auto"/>
+              <w:rPr>
+                <w:rFonts w:ascii="Segoe UI Symbol" w:eastAsia="Times New Roman" w:hAnsi="Segoe UI Symbol" w:cs="Segoe UI Symbol"/>
+                <w:b/>
+                <w:bCs/>
+                <w:sz w:val="20"/>
+                <w:szCs w:val="20"/>
+                <w:lang w:eastAsia="en-ID"/>
+              </w:rPr>
+            </w:pPr>
+            <w:proofErr w:type="spellStart"/>
+            <w:r>
+              <w:rPr>
+                <w:rFonts w:ascii="Arial Nova" w:eastAsia="Times New Roman" w:hAnsi="Arial Nova" w:cs="Times New Roman"/>
+                <w:sz w:val="16"/>
+                <w:szCs w:val="16"/>
+                <w:lang w:eastAsia="en-ID"/>
+              </w:rPr>
+              <w:t>Kolaborasi</w:t>
+            </w:r>
+            <w:proofErr w:type="spellEnd"/>
           </w:p>
         </w:tc>
         <w:tc>
@@ -2369,21 +2425,25 @@
             <w:pPr>
               <w:spacing w:after="0" w:line="240" w:lineRule="auto"/>
               <w:rPr>
+                <w:rFonts w:ascii="Segoe UI Symbol" w:eastAsia="Times New Roman" w:hAnsi="Segoe UI Symbol" w:cs="Segoe UI Symbol"/>
+                <w:b/>
+                <w:bCs/>
+                <w:sz w:val="20"/>
+                <w:szCs w:val="20"/>
+                <w:lang w:eastAsia="en-ID"/>
+              </w:rPr>
+            </w:pPr>
+            <w:proofErr w:type="spellStart"/>
+            <w:r>
+              <w:rPr>
                 <w:rFonts w:ascii="Arial Nova" w:eastAsia="Times New Roman" w:hAnsi="Arial Nova" w:cs="Times New Roman"/>
                 <w:sz w:val="16"/>
                 <w:szCs w:val="16"/>
-                <w:lang w:val="id-ID" w:eastAsia="en-ID"/>
-              </w:rPr>
-            </w:pPr>
-            <w:r>
-              <w:rPr>
-                <w:rFonts w:ascii="Arial Nova" w:eastAsia="Times New Roman" w:hAnsi="Arial Nova" w:cs="Times New Roman"/>
-                <w:sz w:val="16"/>
-                <w:szCs w:val="16"/>
-                <w:lang w:val="id-ID" w:eastAsia="en-ID"/>
+                <w:lang w:eastAsia="en-ID"/>
               </w:rPr>
               <w:t>Kemandirian</w:t>
             </w:r>
+            <w:proofErr w:type="spellEnd"/>
           </w:p>
         </w:tc>
         <w:tc>
@@ -2397,18 +2457,20 @@
             <w:pPr>
               <w:spacing w:after="0" w:line="240" w:lineRule="auto"/>
               <w:rPr>
+                <w:rFonts w:ascii="Segoe UI Symbol" w:eastAsia="Times New Roman" w:hAnsi="Segoe UI Symbol" w:cs="Segoe UI Symbol"/>
+                <w:b/>
+                <w:bCs/>
+                <w:sz w:val="20"/>
+                <w:szCs w:val="20"/>
+                <w:lang w:eastAsia="en-ID"/>
+              </w:rPr>
+            </w:pPr>
+            <w:r>
+              <w:rPr>
                 <w:rFonts w:ascii="Arial Nova" w:eastAsia="Times New Roman" w:hAnsi="Arial Nova" w:cs="Times New Roman"/>
                 <w:sz w:val="16"/>
                 <w:szCs w:val="16"/>
-                <w:lang w:val="id-ID" w:eastAsia="en-ID"/>
-              </w:rPr>
-            </w:pPr>
-            <w:r>
-              <w:rPr>
-                <w:rFonts w:ascii="Arial Nova" w:eastAsia="Times New Roman" w:hAnsi="Arial Nova" w:cs="Times New Roman"/>
-                <w:sz w:val="16"/>
-                <w:szCs w:val="16"/>
-                <w:lang w:val="id-ID" w:eastAsia="en-ID"/>
+                <w:lang w:eastAsia="en-ID"/>
               </w:rPr>
               <w:t>Kesehatan</w:t>
             </w:r>
@@ -2424,21 +2486,25 @@
             <w:pPr>
               <w:spacing w:after="0" w:line="240" w:lineRule="auto"/>
               <w:rPr>
+                <w:rFonts w:ascii="Segoe UI Symbol" w:eastAsia="Times New Roman" w:hAnsi="Segoe UI Symbol" w:cs="Segoe UI Symbol"/>
+                <w:b/>
+                <w:bCs/>
+                <w:sz w:val="20"/>
+                <w:szCs w:val="20"/>
+                <w:lang w:eastAsia="en-ID"/>
+              </w:rPr>
+            </w:pPr>
+            <w:proofErr w:type="spellStart"/>
+            <w:r>
+              <w:rPr>
                 <w:rFonts w:ascii="Arial Nova" w:eastAsia="Times New Roman" w:hAnsi="Arial Nova" w:cs="Times New Roman"/>
                 <w:sz w:val="16"/>
                 <w:szCs w:val="16"/>
-                <w:lang w:val="id-ID" w:eastAsia="en-ID"/>
-              </w:rPr>
-            </w:pPr>
-            <w:r>
-              <w:rPr>
-                <w:rFonts w:ascii="Arial Nova" w:eastAsia="Times New Roman" w:hAnsi="Arial Nova" w:cs="Times New Roman"/>
-                <w:sz w:val="16"/>
-                <w:szCs w:val="16"/>
-                <w:lang w:val="id-ID" w:eastAsia="en-ID"/>
+                <w:lang w:eastAsia="en-ID"/>
               </w:rPr>
               <w:t>Komunikasi</w:t>
             </w:r>
+            <w:proofErr w:type="spellEnd"/>
           </w:p>
         </w:tc>
       </w:tr>
@@ -2496,8 +2562,34 @@
             <w:vAlign w:val="center"/>
           </w:tcPr>
           <w:p>
-            <w:r>
-              <w:t>{enduring_understanding}</w:t>
+            <w:pPr>
+              <w:rPr>
+                <w:i/>
+                <w:iCs/>
+              </w:rPr>
+            </w:pPr>
+            <w:r>
+              <w:rPr>
+                <w:i/>
+                <w:iCs/>
+              </w:rPr>
+              <w:t>{</w:t>
+            </w:r>
+            <w:proofErr w:type="spellStart"/>
+            <w:r>
+              <w:rPr>
+                <w:i/>
+                <w:iCs/>
+              </w:rPr>
+              <w:t>capaian_pembelajaran</w:t>
+            </w:r>
+            <w:proofErr w:type="spellEnd"/>
+            <w:r>
+              <w:rPr>
+                <w:i/>
+                <w:iCs/>
+              </w:rPr>
+              <w:t>}</w:t>
             </w:r>
           </w:p>
         </w:tc>
@@ -2557,7 +2649,51 @@
           </w:tcPr>
           <w:p>
             <w:r>
-              <w:t>{lintas_disiplin_ilmu}</w:t>
+              <w:t xml:space="preserve">{FOR </w:t>
+            </w:r>
+            <w:proofErr w:type="spellStart"/>
+            <w:r>
+              <w:t>tpu</w:t>
+            </w:r>
+            <w:proofErr w:type="spellEnd"/>
+            <w:r>
+              <w:t xml:space="preserve"> IN </w:t>
+            </w:r>
+            <w:proofErr w:type="spellStart"/>
+            <w:r>
+              <w:t>tujuan_pembelajaran_</w:t>
+            </w:r>
+            <w:proofErr w:type="gramStart"/>
+            <w:r>
+              <w:t>umum</w:t>
+            </w:r>
+            <w:proofErr w:type="spellEnd"/>
+            <w:r>
+              <w:t>}{</w:t>
+            </w:r>
+            <w:proofErr w:type="gramEnd"/>
+            <w:r>
+              <w:t>$</w:t>
+            </w:r>
+            <w:proofErr w:type="spellStart"/>
+            <w:r>
+              <w:t>tpu</w:t>
+            </w:r>
+            <w:proofErr w:type="spellEnd"/>
+            <w:r>
+              <w:t>}</w:t>
+            </w:r>
+            <w:r>
+              <w:br/>
+              <w:t xml:space="preserve">{END-FOR </w:t>
+            </w:r>
+            <w:proofErr w:type="spellStart"/>
+            <w:r>
+              <w:t>tpu</w:t>
+            </w:r>
+            <w:proofErr w:type="spellEnd"/>
+            <w:r>
+              <w:t>}</w:t>
             </w:r>
           </w:p>
         </w:tc>
@@ -2592,6 +2728,7 @@
                 <w:szCs w:val="20"/>
                 <w:lang w:val="id-ID" w:eastAsia="en-ID"/>
               </w:rPr>
+              <w:lastRenderedPageBreak/>
               <w:t>Enduring Understanding/ Pemahaman Bermakna</w:t>
             </w:r>
           </w:p>
@@ -2613,14 +2750,15 @@
               </w:rPr>
             </w:pPr>
             <w:r>
-              <w:rPr>
-                <w:rFonts w:ascii="Arial" w:hAnsi="Arial" w:cs="Arial"/>
-                <w:color w:val="000000"/>
-                <w:sz w:val="20"/>
-                <w:szCs w:val="20"/>
-                <w:lang w:val="id-ID"/>
-              </w:rPr>
-              <w:t>Persamaan dan fungsi kuadrat bukan sekadar grafik melengkung atau hitungan hafalan akar, melainkan alat matematika esensial untuk memodelkan lintasan simetris, mengoptimalkan nilai maksimum/minimum, serta fondasi transisi menuju aljabar tingkat tinggi melalui manipulasi variabel tersembunyi.</w:t>
+              <w:t>{</w:t>
+            </w:r>
+            <w:proofErr w:type="spellStart"/>
+            <w:r>
+              <w:t>enduring_understanding</w:t>
+            </w:r>
+            <w:proofErr w:type="spellEnd"/>
+            <w:r>
+              <w:t>}</w:t>
             </w:r>
           </w:p>
         </w:tc>
@@ -2676,88 +2814,15 @@
               </w:rPr>
             </w:pPr>
             <w:r>
-              <w:rPr>
-                <w:rFonts w:ascii="Arial Nova" w:hAnsi="Arial Nova" w:cs="Segoe UI Symbol"/>
-                <w:color w:val="000000"/>
-                <w:sz w:val="20"/>
-                <w:szCs w:val="20"/>
-                <w:lang w:val="id-ID"/>
-              </w:rPr>
-              <w:t xml:space="preserve">Analisis kuadratik memiliki keterkaitan erat dengan tiga disiplin ilmu utama. Pertama, dalam </w:t>
-            </w:r>
-            <w:r>
-              <w:rPr>
-                <w:rFonts w:ascii="Arial Nova" w:hAnsi="Arial Nova" w:cs="Segoe UI Symbol"/>
-                <w:b/>
-                <w:color w:val="000000"/>
-                <w:sz w:val="20"/>
-                <w:szCs w:val="20"/>
-                <w:lang w:val="id-ID"/>
-              </w:rPr>
-              <w:t>Sains (Fisika)</w:t>
-            </w:r>
-            <w:r>
-              <w:rPr>
-                <w:rFonts w:ascii="Arial Nova" w:hAnsi="Arial Nova" w:cs="Segoe UI Symbol"/>
-                <w:color w:val="000000"/>
-                <w:sz w:val="20"/>
-                <w:szCs w:val="20"/>
-                <w:lang w:val="id-ID"/>
-              </w:rPr>
-              <w:t xml:space="preserve">, ia sangat fundamental untuk memodelkan gerak parabola (kinematika), </w:t>
-            </w:r>
-            <w:r>
-              <w:rPr>
-                <w:rFonts w:ascii="Arial Nova" w:hAnsi="Arial Nova" w:cs="Segoe UI Symbol"/>
-                <w:color w:val="000000"/>
-                <w:sz w:val="20"/>
-                <w:szCs w:val="20"/>
-                <w:lang w:val="id-ID"/>
-              </w:rPr>
-              <w:lastRenderedPageBreak/>
-              <w:t xml:space="preserve">menghitung waktu puncak, maupun jangkauan maksimum objek. Kedua, dalam </w:t>
-            </w:r>
-            <w:r>
-              <w:rPr>
-                <w:rFonts w:ascii="Arial Nova" w:hAnsi="Arial Nova" w:cs="Segoe UI Symbol"/>
-                <w:b/>
-                <w:color w:val="000000"/>
-                <w:sz w:val="20"/>
-                <w:szCs w:val="20"/>
-                <w:lang w:val="id-ID"/>
-              </w:rPr>
-              <w:t>Teknologi Informasi dan Rekayasa</w:t>
-            </w:r>
-            <w:r>
-              <w:rPr>
-                <w:rFonts w:ascii="Arial Nova" w:hAnsi="Arial Nova" w:cs="Segoe UI Symbol"/>
-                <w:color w:val="000000"/>
-                <w:sz w:val="20"/>
-                <w:szCs w:val="20"/>
-                <w:lang w:val="id-ID"/>
-              </w:rPr>
-              <w:t xml:space="preserve">, struktur kuadrat digunakan sebagai dasar algoritma optimasi, pengolahan citra digital grafik 3D, dan pemodelan kurva lengkung desain objek. Ketiga, ia berhubungan langsung dengan </w:t>
-            </w:r>
-            <w:r>
-              <w:rPr>
-                <w:rFonts w:ascii="Arial Nova" w:hAnsi="Arial Nova" w:cs="Segoe UI Symbol"/>
-                <w:b/>
-                <w:color w:val="000000"/>
-                <w:sz w:val="20"/>
-                <w:szCs w:val="20"/>
-                <w:lang w:val="id-ID"/>
-              </w:rPr>
-              <w:t>Ekonomi</w:t>
-            </w:r>
-            <w:r>
-              <w:rPr>
-                <w:rFonts w:ascii="Arial Nova" w:hAnsi="Arial Nova" w:cs="Segoe UI Symbol"/>
-                <w:color w:val="000000"/>
-                <w:sz w:val="20"/>
-                <w:szCs w:val="20"/>
-                <w:lang w:val="id-ID"/>
-              </w:rPr>
-              <w:t>, terutama dalam kalkulasi maksimalisasi keuntungan perusahaan atau minimalisasi biaya produksi berdasarkan fungsi biaya kuadratik.</w:t>
+              <w:t>{</w:t>
+            </w:r>
+            <w:proofErr w:type="spellStart"/>
+            <w:r>
+              <w:t>lintas_disiplin_ilmu</w:t>
+            </w:r>
+            <w:proofErr w:type="spellEnd"/>
+            <w:r>
+              <w:t>}</w:t>
             </w:r>
           </w:p>
         </w:tc>
@@ -2792,7 +2857,6 @@
                 <w:szCs w:val="20"/>
                 <w:lang w:val="id-ID" w:eastAsia="en-ID"/>
               </w:rPr>
-              <w:lastRenderedPageBreak/>
               <w:t>Moda Pembelajaran:</w:t>
             </w:r>
           </w:p>
@@ -3779,6 +3843,7 @@
           </w:p>
           <w:p>
             <w:r>
+              <w:lastRenderedPageBreak/>
               <w:t>{fidelity_checked ? '☑' : '☐'} Fidelity</w:t>
             </w:r>
           </w:p>
@@ -3800,6 +3865,7 @@
           </w:tcPr>
           <w:p>
             <w:r>
+              <w:lastRenderedPageBreak/>
               <w:t>{FOR val IN sasaran_profil_sekolah}</w:t>
             </w:r>
           </w:p>
@@ -4221,6 +4287,9 @@
             <w:tcW w:w="1307" w:type="dxa"/>
           </w:tcPr>
           <w:p>
+            <w:pPr>
+              <w:cnfStyle w:val="000000000000" w:firstRow="0" w:lastRow="0" w:firstColumn="0" w:lastColumn="0" w:oddVBand="0" w:evenVBand="0" w:oddHBand="0" w:evenHBand="0" w:firstRowFirstColumn="0" w:firstRowLastColumn="0" w:lastRowFirstColumn="0" w:lastRowLastColumn="0"/>
+            </w:pPr>
             <w:r>
               <w:t>{$p.aktivitas_pembelajaran[0].tahapan_sintaks}</w:t>
             </w:r>
@@ -4232,6 +4301,9 @@
             <w:gridSpan w:val="2"/>
           </w:tcPr>
           <w:p>
+            <w:pPr>
+              <w:cnfStyle w:val="000000000000" w:firstRow="0" w:lastRow="0" w:firstColumn="0" w:lastColumn="0" w:oddVBand="0" w:evenVBand="0" w:oddHBand="0" w:evenHBand="0" w:firstRowFirstColumn="0" w:firstRowLastColumn="0" w:lastRowFirstColumn="0" w:lastRowLastColumn="0"/>
+            </w:pPr>
             <w:r>
               <w:t>{$p.aktivitas_pembelajaran[0].prosedur_guru}</w:t>
             </w:r>
@@ -4242,6 +4314,9 @@
             <w:tcW w:w="1969" w:type="dxa"/>
           </w:tcPr>
           <w:p>
+            <w:pPr>
+              <w:cnfStyle w:val="000000000000" w:firstRow="0" w:lastRow="0" w:firstColumn="0" w:lastColumn="0" w:oddVBand="0" w:evenVBand="0" w:oddHBand="0" w:evenHBand="0" w:firstRowFirstColumn="0" w:firstRowLastColumn="0" w:lastRowFirstColumn="0" w:lastRowLastColumn="0"/>
+            </w:pPr>
             <w:r>
               <w:t>{$p.aktivitas_pembelajaran[0].prosedur_siswa}</w:t>
             </w:r>
@@ -4252,8 +4327,13 @@
             <w:tcW w:w="1294" w:type="dxa"/>
           </w:tcPr>
           <w:p>
+            <w:pPr>
+              <w:cnfStyle w:val="000000000000" w:firstRow="0" w:lastRow="0" w:firstColumn="0" w:lastColumn="0" w:oddVBand="0" w:evenVBand="0" w:oddHBand="0" w:evenHBand="0" w:firstRowFirstColumn="0" w:firstRowLastColumn="0" w:lastRowFirstColumn="0" w:lastRowLastColumn="0"/>
+            </w:pPr>
             <w:r>
               <w:t>{FOR pk IN $p.aktivitas_pembelajaran[0].pertanyaan_kunci}{$pk}</w:t>
+            </w:r>
+            <w:r>
               <w:br/>
               <w:t>{END-FOR pk}</w:t>
             </w:r>
@@ -4264,7 +4344,9 @@
             <w:tcW w:w="2418" w:type="dxa"/>
           </w:tcPr>
           <w:p>
-            <w:r/>
+            <w:pPr>
+              <w:cnfStyle w:val="000000000000" w:firstRow="0" w:lastRow="0" w:firstColumn="0" w:lastColumn="0" w:oddVBand="0" w:evenVBand="0" w:oddHBand="0" w:evenHBand="0" w:firstRowFirstColumn="0" w:firstRowLastColumn="0" w:lastRowFirstColumn="0" w:lastRowLastColumn="0"/>
+            </w:pPr>
             <w:r>
               <w:rPr>
                 <w:b/>
@@ -4290,7 +4372,11 @@
               <w:t>{$p.aktivitas_pembelajaran[0].muatan_inovatif.impactful ? 'Impactful: ' : ''}</w:t>
             </w:r>
             <w:r>
-              <w:t>{$p.aktivitas_pembelajaran[0].muatan_inovatif.impactful || ''}</w:t>
+              <w:t>{$p.aktivitas_pembelaj</w:t>
+            </w:r>
+            <w:r>
+              <w:lastRenderedPageBreak/>
+              <w:t>aran[0].muatan_inovatif.impactful || ''}</w:t>
             </w:r>
           </w:p>
         </w:tc>
@@ -4345,6 +4431,9 @@
             <w:tcW w:w="1307" w:type="dxa"/>
           </w:tcPr>
           <w:p>
+            <w:pPr>
+              <w:cnfStyle w:val="000000000000" w:firstRow="0" w:lastRow="0" w:firstColumn="0" w:lastColumn="0" w:oddVBand="0" w:evenVBand="0" w:oddHBand="0" w:evenHBand="0" w:firstRowFirstColumn="0" w:firstRowLastColumn="0" w:lastRowFirstColumn="0" w:lastRowLastColumn="0"/>
+            </w:pPr>
             <w:r>
               <w:t>{$p.aktivitas_pembelajaran[1].tahapan_sintaks}</w:t>
             </w:r>
@@ -4356,6 +4445,9 @@
             <w:gridSpan w:val="2"/>
           </w:tcPr>
           <w:p>
+            <w:pPr>
+              <w:cnfStyle w:val="000000000000" w:firstRow="0" w:lastRow="0" w:firstColumn="0" w:lastColumn="0" w:oddVBand="0" w:evenVBand="0" w:oddHBand="0" w:evenHBand="0" w:firstRowFirstColumn="0" w:firstRowLastColumn="0" w:lastRowFirstColumn="0" w:lastRowLastColumn="0"/>
+            </w:pPr>
             <w:r>
               <w:t>{$p.aktivitas_pembelajaran[1].prosedur_guru}</w:t>
             </w:r>
@@ -4366,6 +4458,9 @@
             <w:tcW w:w="1969" w:type="dxa"/>
           </w:tcPr>
           <w:p>
+            <w:pPr>
+              <w:cnfStyle w:val="000000000000" w:firstRow="0" w:lastRow="0" w:firstColumn="0" w:lastColumn="0" w:oddVBand="0" w:evenVBand="0" w:oddHBand="0" w:evenHBand="0" w:firstRowFirstColumn="0" w:firstRowLastColumn="0" w:lastRowFirstColumn="0" w:lastRowLastColumn="0"/>
+            </w:pPr>
             <w:r>
               <w:t>{$p.aktivitas_pembelajaran[1].prosedur_siswa}</w:t>
             </w:r>
@@ -4376,8 +4471,13 @@
             <w:tcW w:w="1294" w:type="dxa"/>
           </w:tcPr>
           <w:p>
+            <w:pPr>
+              <w:cnfStyle w:val="000000000000" w:firstRow="0" w:lastRow="0" w:firstColumn="0" w:lastColumn="0" w:oddVBand="0" w:evenVBand="0" w:oddHBand="0" w:evenHBand="0" w:firstRowFirstColumn="0" w:firstRowLastColumn="0" w:lastRowFirstColumn="0" w:lastRowLastColumn="0"/>
+            </w:pPr>
             <w:r>
               <w:t>{FOR pk IN $p.aktivitas_pembelajaran[1].pertanyaan_kunci}{$pk}</w:t>
+            </w:r>
+            <w:r>
               <w:br/>
               <w:t>{END-FOR pk}</w:t>
             </w:r>
@@ -4388,7 +4488,9 @@
             <w:tcW w:w="2418" w:type="dxa"/>
           </w:tcPr>
           <w:p>
-            <w:r/>
+            <w:pPr>
+              <w:cnfStyle w:val="000000000000" w:firstRow="0" w:lastRow="0" w:firstColumn="0" w:lastColumn="0" w:oddVBand="0" w:evenVBand="0" w:oddHBand="0" w:evenHBand="0" w:firstRowFirstColumn="0" w:firstRowLastColumn="0" w:lastRowFirstColumn="0" w:lastRowLastColumn="0"/>
+            </w:pPr>
             <w:r>
               <w:rPr>
                 <w:b/>
@@ -4436,6 +4538,9 @@
             <w:tcW w:w="1307" w:type="dxa"/>
           </w:tcPr>
           <w:p>
+            <w:pPr>
+              <w:cnfStyle w:val="000000000000" w:firstRow="0" w:lastRow="0" w:firstColumn="0" w:lastColumn="0" w:oddVBand="0" w:evenVBand="0" w:oddHBand="0" w:evenHBand="0" w:firstRowFirstColumn="0" w:firstRowLastColumn="0" w:lastRowFirstColumn="0" w:lastRowLastColumn="0"/>
+            </w:pPr>
             <w:r>
               <w:t>{$p.aktivitas_pembelajaran[2].tahapan_sintaks}</w:t>
             </w:r>
@@ -4447,6 +4552,9 @@
             <w:gridSpan w:val="2"/>
           </w:tcPr>
           <w:p>
+            <w:pPr>
+              <w:cnfStyle w:val="000000000000" w:firstRow="0" w:lastRow="0" w:firstColumn="0" w:lastColumn="0" w:oddVBand="0" w:evenVBand="0" w:oddHBand="0" w:evenHBand="0" w:firstRowFirstColumn="0" w:firstRowLastColumn="0" w:lastRowFirstColumn="0" w:lastRowLastColumn="0"/>
+            </w:pPr>
             <w:r>
               <w:t>{$p.aktivitas_pembelajaran[2].prosedur_guru}</w:t>
             </w:r>
@@ -4457,6 +4565,9 @@
             <w:tcW w:w="1969" w:type="dxa"/>
           </w:tcPr>
           <w:p>
+            <w:pPr>
+              <w:cnfStyle w:val="000000000000" w:firstRow="0" w:lastRow="0" w:firstColumn="0" w:lastColumn="0" w:oddVBand="0" w:evenVBand="0" w:oddHBand="0" w:evenHBand="0" w:firstRowFirstColumn="0" w:firstRowLastColumn="0" w:lastRowFirstColumn="0" w:lastRowLastColumn="0"/>
+            </w:pPr>
             <w:r>
               <w:t>{$p.aktivitas_pembelajaran[2].prosedur_siswa}</w:t>
             </w:r>
@@ -4467,8 +4578,13 @@
             <w:tcW w:w="1294" w:type="dxa"/>
           </w:tcPr>
           <w:p>
+            <w:pPr>
+              <w:cnfStyle w:val="000000000000" w:firstRow="0" w:lastRow="0" w:firstColumn="0" w:lastColumn="0" w:oddVBand="0" w:evenVBand="0" w:oddHBand="0" w:evenHBand="0" w:firstRowFirstColumn="0" w:firstRowLastColumn="0" w:lastRowFirstColumn="0" w:lastRowLastColumn="0"/>
+            </w:pPr>
             <w:r>
               <w:t>{FOR pk IN $p.aktivitas_pembelajaran[2].pertanyaan_kunci}{$pk}</w:t>
+            </w:r>
+            <w:r>
               <w:br/>
               <w:t>{END-FOR pk}</w:t>
             </w:r>
@@ -4479,7 +4595,9 @@
             <w:tcW w:w="2418" w:type="dxa"/>
           </w:tcPr>
           <w:p>
-            <w:r/>
+            <w:pPr>
+              <w:cnfStyle w:val="000000000000" w:firstRow="0" w:lastRow="0" w:firstColumn="0" w:lastColumn="0" w:oddVBand="0" w:evenVBand="0" w:oddHBand="0" w:evenHBand="0" w:firstRowFirstColumn="0" w:firstRowLastColumn="0" w:lastRowFirstColumn="0" w:lastRowLastColumn="0"/>
+            </w:pPr>
             <w:r>
               <w:rPr>
                 <w:b/>
@@ -4493,7 +4611,14 @@
               <w:rPr>
                 <w:b/>
               </w:rPr>
-              <w:t>{$p.aktivitas_pembelajaran[2].muatan_inovatif.differentiation ? 'Differentiation (' + $p.aktivitas_pembelajaran[2].muatan_inovatif.differentiation.type + '): ' : ''}</w:t>
+              <w:t>{$p.aktivitas_pembelajaran[2].muatan_inovatif.differentiation ? 'Differentiation (' + $p.aktivitas_pembelajaran[2].muatan_inovatif.di</w:t>
+            </w:r>
+            <w:r>
+              <w:rPr>
+                <w:b/>
+              </w:rPr>
+              <w:lastRenderedPageBreak/>
+              <w:t>fferentiation.type + '): ' : ''}</w:t>
             </w:r>
             <w:r>
               <w:t>{$p.aktivitas_pembelajaran[2].muatan_inovatif.differentiation ? $p.aktivitas_pembelajaran[2].muatan_inovatif.differentiation.deskripsi : ''}</w:t>
@@ -4518,6 +4643,7 @@
           </w:tcPr>
           <w:p>
             <w:r>
+              <w:lastRenderedPageBreak/>
               <w:t>{$p.aktivitas_pembelajaran[3].waktu_menit}'</w:t>
             </w:r>
           </w:p>
@@ -4527,6 +4653,9 @@
             <w:tcW w:w="1307" w:type="dxa"/>
           </w:tcPr>
           <w:p>
+            <w:pPr>
+              <w:cnfStyle w:val="000000000000" w:firstRow="0" w:lastRow="0" w:firstColumn="0" w:lastColumn="0" w:oddVBand="0" w:evenVBand="0" w:oddHBand="0" w:evenHBand="0" w:firstRowFirstColumn="0" w:firstRowLastColumn="0" w:lastRowFirstColumn="0" w:lastRowLastColumn="0"/>
+            </w:pPr>
             <w:r>
               <w:t>{$p.aktivitas_pembelajaran[3].tahapan_sintaks}</w:t>
             </w:r>
@@ -4538,6 +4667,9 @@
             <w:gridSpan w:val="2"/>
           </w:tcPr>
           <w:p>
+            <w:pPr>
+              <w:cnfStyle w:val="000000000000" w:firstRow="0" w:lastRow="0" w:firstColumn="0" w:lastColumn="0" w:oddVBand="0" w:evenVBand="0" w:oddHBand="0" w:evenHBand="0" w:firstRowFirstColumn="0" w:firstRowLastColumn="0" w:lastRowFirstColumn="0" w:lastRowLastColumn="0"/>
+            </w:pPr>
             <w:r>
               <w:t>{$p.aktivitas_pembelajaran[3].prosedur_guru}</w:t>
             </w:r>
@@ -4548,6 +4680,9 @@
             <w:tcW w:w="1969" w:type="dxa"/>
           </w:tcPr>
           <w:p>
+            <w:pPr>
+              <w:cnfStyle w:val="000000000000" w:firstRow="0" w:lastRow="0" w:firstColumn="0" w:lastColumn="0" w:oddVBand="0" w:evenVBand="0" w:oddHBand="0" w:evenHBand="0" w:firstRowFirstColumn="0" w:firstRowLastColumn="0" w:lastRowFirstColumn="0" w:lastRowLastColumn="0"/>
+            </w:pPr>
             <w:r>
               <w:t>{$p.aktivitas_pembelajaran[3].prosedur_siswa}</w:t>
             </w:r>
@@ -4558,8 +4693,13 @@
             <w:tcW w:w="1294" w:type="dxa"/>
           </w:tcPr>
           <w:p>
+            <w:pPr>
+              <w:cnfStyle w:val="000000000000" w:firstRow="0" w:lastRow="0" w:firstColumn="0" w:lastColumn="0" w:oddVBand="0" w:evenVBand="0" w:oddHBand="0" w:evenHBand="0" w:firstRowFirstColumn="0" w:firstRowLastColumn="0" w:lastRowFirstColumn="0" w:lastRowLastColumn="0"/>
+            </w:pPr>
             <w:r>
               <w:t>{FOR pk IN $p.aktivitas_pembelajaran[3].pertanyaan_kunci}{$pk}</w:t>
+            </w:r>
+            <w:r>
               <w:br/>
               <w:t>{END-FOR pk}</w:t>
             </w:r>
@@ -4570,7 +4710,9 @@
             <w:tcW w:w="2418" w:type="dxa"/>
           </w:tcPr>
           <w:p>
-            <w:r/>
+            <w:pPr>
+              <w:cnfStyle w:val="000000000000" w:firstRow="0" w:lastRow="0" w:firstColumn="0" w:lastColumn="0" w:oddVBand="0" w:evenVBand="0" w:oddHBand="0" w:evenHBand="0" w:firstRowFirstColumn="0" w:firstRowLastColumn="0" w:lastRowFirstColumn="0" w:lastRowLastColumn="0"/>
+            </w:pPr>
             <w:r>
               <w:rPr>
                 <w:b/>
@@ -4639,6 +4781,7 @@
           </w:tcPr>
           <w:p>
             <w:r>
+              <w:lastRenderedPageBreak/>
               <w:t>{$p.aktivitas_pembelajaran[4].waktu_menit}'</w:t>
             </w:r>
           </w:p>
@@ -4648,6 +4791,9 @@
             <w:tcW w:w="1307" w:type="dxa"/>
           </w:tcPr>
           <w:p>
+            <w:pPr>
+              <w:cnfStyle w:val="000000000000" w:firstRow="0" w:lastRow="0" w:firstColumn="0" w:lastColumn="0" w:oddVBand="0" w:evenVBand="0" w:oddHBand="0" w:evenHBand="0" w:firstRowFirstColumn="0" w:firstRowLastColumn="0" w:lastRowFirstColumn="0" w:lastRowLastColumn="0"/>
+            </w:pPr>
             <w:r>
               <w:t>{$p.aktivitas_pembelajaran[4].tahapan_sintaks}</w:t>
             </w:r>
@@ -4659,6 +4805,9 @@
             <w:gridSpan w:val="2"/>
           </w:tcPr>
           <w:p>
+            <w:pPr>
+              <w:cnfStyle w:val="000000000000" w:firstRow="0" w:lastRow="0" w:firstColumn="0" w:lastColumn="0" w:oddVBand="0" w:evenVBand="0" w:oddHBand="0" w:evenHBand="0" w:firstRowFirstColumn="0" w:firstRowLastColumn="0" w:lastRowFirstColumn="0" w:lastRowLastColumn="0"/>
+            </w:pPr>
             <w:r>
               <w:t>{$p.aktivitas_pembelajaran[4].prosedur_guru}</w:t>
             </w:r>
@@ -4669,6 +4818,9 @@
             <w:tcW w:w="1969" w:type="dxa"/>
           </w:tcPr>
           <w:p>
+            <w:pPr>
+              <w:cnfStyle w:val="000000000000" w:firstRow="0" w:lastRow="0" w:firstColumn="0" w:lastColumn="0" w:oddVBand="0" w:evenVBand="0" w:oddHBand="0" w:evenHBand="0" w:firstRowFirstColumn="0" w:firstRowLastColumn="0" w:lastRowFirstColumn="0" w:lastRowLastColumn="0"/>
+            </w:pPr>
             <w:r>
               <w:t>{$p.aktivitas_pembelajaran[4].prosedur_siswa}</w:t>
             </w:r>
@@ -4679,8 +4831,13 @@
             <w:tcW w:w="1294" w:type="dxa"/>
           </w:tcPr>
           <w:p>
+            <w:pPr>
+              <w:cnfStyle w:val="000000000000" w:firstRow="0" w:lastRow="0" w:firstColumn="0" w:lastColumn="0" w:oddVBand="0" w:evenVBand="0" w:oddHBand="0" w:evenHBand="0" w:firstRowFirstColumn="0" w:firstRowLastColumn="0" w:lastRowFirstColumn="0" w:lastRowLastColumn="0"/>
+            </w:pPr>
             <w:r>
               <w:t>{FOR pk IN $p.aktivitas_pembelajaran[4].pertanyaan_kunci}{$pk}</w:t>
+            </w:r>
+            <w:r>
               <w:br/>
               <w:t>{END-FOR pk}</w:t>
             </w:r>
@@ -4691,7 +4848,9 @@
             <w:tcW w:w="2418" w:type="dxa"/>
           </w:tcPr>
           <w:p>
-            <w:r/>
+            <w:pPr>
+              <w:cnfStyle w:val="000000000000" w:firstRow="0" w:lastRow="0" w:firstColumn="0" w:lastColumn="0" w:oddVBand="0" w:evenVBand="0" w:oddHBand="0" w:evenHBand="0" w:firstRowFirstColumn="0" w:firstRowLastColumn="0" w:lastRowFirstColumn="0" w:lastRowLastColumn="0"/>
+            </w:pPr>
             <w:r>
               <w:rPr>
                 <w:b/>
@@ -4745,6 +4904,9 @@
             </w:tcBorders>
           </w:tcPr>
           <w:p>
+            <w:pPr>
+              <w:cnfStyle w:val="000000000000" w:firstRow="0" w:lastRow="0" w:firstColumn="0" w:lastColumn="0" w:oddVBand="0" w:evenVBand="0" w:oddHBand="0" w:evenHBand="0" w:firstRowFirstColumn="0" w:firstRowLastColumn="0" w:lastRowFirstColumn="0" w:lastRowLastColumn="0"/>
+            </w:pPr>
             <w:r>
               <w:t>{$p.aktivitas_pembelajaran[5].tahapan_sintaks}</w:t>
             </w:r>
@@ -4759,6 +4921,9 @@
             </w:tcBorders>
           </w:tcPr>
           <w:p>
+            <w:pPr>
+              <w:cnfStyle w:val="000000000000" w:firstRow="0" w:lastRow="0" w:firstColumn="0" w:lastColumn="0" w:oddVBand="0" w:evenVBand="0" w:oddHBand="0" w:evenHBand="0" w:firstRowFirstColumn="0" w:firstRowLastColumn="0" w:lastRowFirstColumn="0" w:lastRowLastColumn="0"/>
+            </w:pPr>
             <w:r>
               <w:t>{$p.aktivitas_pembelajaran[5].prosedur_guru}</w:t>
             </w:r>
@@ -4772,6 +4937,9 @@
             </w:tcBorders>
           </w:tcPr>
           <w:p>
+            <w:pPr>
+              <w:cnfStyle w:val="000000000000" w:firstRow="0" w:lastRow="0" w:firstColumn="0" w:lastColumn="0" w:oddVBand="0" w:evenVBand="0" w:oddHBand="0" w:evenHBand="0" w:firstRowFirstColumn="0" w:firstRowLastColumn="0" w:lastRowFirstColumn="0" w:lastRowLastColumn="0"/>
+            </w:pPr>
             <w:r>
               <w:t>{$p.aktivitas_pembelajaran[5].prosedur_siswa}</w:t>
             </w:r>
@@ -4785,8 +4953,13 @@
             </w:tcBorders>
           </w:tcPr>
           <w:p>
+            <w:pPr>
+              <w:cnfStyle w:val="000000000000" w:firstRow="0" w:lastRow="0" w:firstColumn="0" w:lastColumn="0" w:oddVBand="0" w:evenVBand="0" w:oddHBand="0" w:evenHBand="0" w:firstRowFirstColumn="0" w:firstRowLastColumn="0" w:lastRowFirstColumn="0" w:lastRowLastColumn="0"/>
+            </w:pPr>
             <w:r>
               <w:t>{FOR pk IN $p.aktivitas_pembelajaran[5].pertanyaan_kunci}{$pk}</w:t>
+            </w:r>
+            <w:r>
               <w:br/>
               <w:t>{END-FOR pk}</w:t>
             </w:r>
@@ -4800,7 +4973,9 @@
             </w:tcBorders>
           </w:tcPr>
           <w:p>
-            <w:r/>
+            <w:pPr>
+              <w:cnfStyle w:val="000000000000" w:firstRow="0" w:lastRow="0" w:firstColumn="0" w:lastColumn="0" w:oddVBand="0" w:evenVBand="0" w:oddHBand="0" w:evenHBand="0" w:firstRowFirstColumn="0" w:firstRowLastColumn="0" w:lastRowFirstColumn="0" w:lastRowLastColumn="0"/>
+            </w:pPr>
             <w:r>
               <w:rPr>
                 <w:b/>
@@ -4817,7 +4992,11 @@
               <w:t>{$p.aktivitas_pembelajaran[5].muatan_inovatif.differentiation ? 'Differentiation (' + $p.aktivitas_pembelajaran[5].muatan_inovatif.differentiation.type + '): ' : ''}</w:t>
             </w:r>
             <w:r>
-              <w:t>{$p.aktivitas_pembelajaran[5].muatan_inovatif.differentiation ? $p.aktivitas_pembelajaran[5].muatan_inovatif.differentiation.deskripsi : ''}</w:t>
+              <w:t>{$p.aktivitas_pembelajaran[5].muatan_inovatif.</w:t>
+            </w:r>
+            <w:r>
+              <w:lastRenderedPageBreak/>
+              <w:t>differentiation ? $p.aktivitas_pembelajaran[5].muatan_inovatif.differentiation.deskripsi : ''}</w:t>
             </w:r>
             <w:r>
               <w:rPr>
@@ -4896,7 +5075,6 @@
                 <w:rFonts w:ascii="Arial Nova" w:eastAsia="Times New Roman" w:hAnsi="Arial Nova" w:cs="Times New Roman"/>
                 <w:b w:val="0"/>
                 <w:bCs w:val="0"/>
-                <w:color w:val="FFFFFF" w:themeColor="background1"/>
                 <w:sz w:val="20"/>
                 <w:szCs w:val="20"/>
                 <w:lang w:val="id-ID" w:eastAsia="en-ID"/>
@@ -4933,7 +5111,6 @@
                 <w:rFonts w:ascii="Arial Nova" w:eastAsia="Times New Roman" w:hAnsi="Arial Nova" w:cs="Times New Roman"/>
                 <w:b w:val="0"/>
                 <w:bCs w:val="0"/>
-                <w:color w:val="FFFFFF" w:themeColor="background1"/>
                 <w:sz w:val="20"/>
                 <w:szCs w:val="20"/>
                 <w:lang w:val="id-ID" w:eastAsia="en-ID"/>
@@ -4970,7 +5147,6 @@
                 <w:rFonts w:ascii="Arial Nova" w:eastAsia="Times New Roman" w:hAnsi="Arial Nova" w:cs="Times New Roman"/>
                 <w:b w:val="0"/>
                 <w:bCs w:val="0"/>
-                <w:color w:val="FFFFFF" w:themeColor="background1"/>
                 <w:sz w:val="20"/>
                 <w:szCs w:val="20"/>
                 <w:lang w:val="id-ID" w:eastAsia="en-ID"/>
@@ -4990,11 +5166,7 @@
             <w:tcW w:w="1279" w:type="dxa"/>
           </w:tcPr>
           <w:p>
-            <w:r/>
-            <w:r>
-              <w:rPr>
-                <w:b/>
-              </w:rPr>
+            <w:r>
               <w:t>{$p.asesmen[0].jenis}</w:t>
             </w:r>
           </w:p>
@@ -5004,6 +5176,9 @@
             <w:tcW w:w="3029" w:type="dxa"/>
           </w:tcPr>
           <w:p>
+            <w:pPr>
+              <w:cnfStyle w:val="000000100000" w:firstRow="0" w:lastRow="0" w:firstColumn="0" w:lastColumn="0" w:oddVBand="0" w:evenVBand="0" w:oddHBand="1" w:evenHBand="0" w:firstRowFirstColumn="0" w:firstRowLastColumn="0" w:lastRowFirstColumn="0" w:lastRowLastColumn="0"/>
+            </w:pPr>
             <w:r>
               <w:t>{$p.asesmen[0].bentuk}</w:t>
             </w:r>
@@ -5014,7 +5189,9 @@
             <w:tcW w:w="5659" w:type="dxa"/>
           </w:tcPr>
           <w:p>
-            <w:r/>
+            <w:pPr>
+              <w:cnfStyle w:val="000000100000" w:firstRow="0" w:lastRow="0" w:firstColumn="0" w:lastColumn="0" w:oddVBand="0" w:evenVBand="0" w:oddHBand="1" w:evenHBand="0" w:firstRowFirstColumn="0" w:firstRowLastColumn="0" w:lastRowFirstColumn="0" w:lastRowLastColumn="0"/>
+            </w:pPr>
             <w:r>
               <w:rPr>
                 <w:b/>
@@ -5034,11 +5211,7 @@
             <w:tcW w:w="1279" w:type="dxa"/>
           </w:tcPr>
           <w:p>
-            <w:r/>
-            <w:r>
-              <w:rPr>
-                <w:b/>
-              </w:rPr>
+            <w:r>
               <w:t>{$p.asesmen[1].jenis}</w:t>
             </w:r>
           </w:p>
@@ -5048,6 +5221,9 @@
             <w:tcW w:w="3029" w:type="dxa"/>
           </w:tcPr>
           <w:p>
+            <w:pPr>
+              <w:cnfStyle w:val="000000000000" w:firstRow="0" w:lastRow="0" w:firstColumn="0" w:lastColumn="0" w:oddVBand="0" w:evenVBand="0" w:oddHBand="0" w:evenHBand="0" w:firstRowFirstColumn="0" w:firstRowLastColumn="0" w:lastRowFirstColumn="0" w:lastRowLastColumn="0"/>
+            </w:pPr>
             <w:r>
               <w:t>{$p.asesmen[1].bentuk}</w:t>
             </w:r>
@@ -5058,7 +5234,9 @@
             <w:tcW w:w="5659" w:type="dxa"/>
           </w:tcPr>
           <w:p>
-            <w:r/>
+            <w:pPr>
+              <w:cnfStyle w:val="000000000000" w:firstRow="0" w:lastRow="0" w:firstColumn="0" w:lastColumn="0" w:oddVBand="0" w:evenVBand="0" w:oddHBand="0" w:evenHBand="0" w:firstRowFirstColumn="0" w:firstRowLastColumn="0" w:lastRowFirstColumn="0" w:lastRowLastColumn="0"/>
+            </w:pPr>
             <w:r>
               <w:rPr>
                 <w:b/>
@@ -5081,11 +5259,7 @@
             <w:tcW w:w="1279" w:type="dxa"/>
           </w:tcPr>
           <w:p>
-            <w:r/>
-            <w:r>
-              <w:rPr>
-                <w:b/>
-              </w:rPr>
+            <w:r>
               <w:t>{$p.asesmen[2].jenis}</w:t>
             </w:r>
           </w:p>
@@ -5095,6 +5269,9 @@
             <w:tcW w:w="3029" w:type="dxa"/>
           </w:tcPr>
           <w:p>
+            <w:pPr>
+              <w:cnfStyle w:val="000000100000" w:firstRow="0" w:lastRow="0" w:firstColumn="0" w:lastColumn="0" w:oddVBand="0" w:evenVBand="0" w:oddHBand="1" w:evenHBand="0" w:firstRowFirstColumn="0" w:firstRowLastColumn="0" w:lastRowFirstColumn="0" w:lastRowLastColumn="0"/>
+            </w:pPr>
             <w:r>
               <w:t>{$p.asesmen[2].bentuk}</w:t>
             </w:r>
@@ -5105,7 +5282,9 @@
             <w:tcW w:w="5659" w:type="dxa"/>
           </w:tcPr>
           <w:p>
-            <w:r/>
+            <w:pPr>
+              <w:cnfStyle w:val="000000100000" w:firstRow="0" w:lastRow="0" w:firstColumn="0" w:lastColumn="0" w:oddVBand="0" w:evenVBand="0" w:oddHBand="1" w:evenHBand="0" w:firstRowFirstColumn="0" w:firstRowLastColumn="0" w:lastRowFirstColumn="0" w:lastRowLastColumn="0"/>
+            </w:pPr>
             <w:r>
               <w:rPr>
                 <w:b/>
@@ -5125,11 +5304,7 @@
             <w:tcW w:w="1279" w:type="dxa"/>
           </w:tcPr>
           <w:p>
-            <w:r/>
-            <w:r>
-              <w:rPr>
-                <w:b/>
-              </w:rPr>
+            <w:r>
               <w:t>{$p.asesmen[3].jenis}</w:t>
             </w:r>
           </w:p>
@@ -5139,6 +5314,9 @@
             <w:tcW w:w="3029" w:type="dxa"/>
           </w:tcPr>
           <w:p>
+            <w:pPr>
+              <w:cnfStyle w:val="000000000000" w:firstRow="0" w:lastRow="0" w:firstColumn="0" w:lastColumn="0" w:oddVBand="0" w:evenVBand="0" w:oddHBand="0" w:evenHBand="0" w:firstRowFirstColumn="0" w:firstRowLastColumn="0" w:lastRowFirstColumn="0" w:lastRowLastColumn="0"/>
+            </w:pPr>
             <w:r>
               <w:t>{$p.asesmen[3].bentuk}</w:t>
             </w:r>
@@ -5149,7 +5327,9 @@
             <w:tcW w:w="5659" w:type="dxa"/>
           </w:tcPr>
           <w:p>
-            <w:r/>
+            <w:pPr>
+              <w:cnfStyle w:val="000000000000" w:firstRow="0" w:lastRow="0" w:firstColumn="0" w:lastColumn="0" w:oddVBand="0" w:evenVBand="0" w:oddHBand="0" w:evenHBand="0" w:firstRowFirstColumn="0" w:firstRowLastColumn="0" w:lastRowFirstColumn="0" w:lastRowLastColumn="0"/>
+            </w:pPr>
             <w:r>
               <w:rPr>
                 <w:b/>
@@ -5469,6 +5649,7 @@
         <w:rPr>
           <w:lang w:val="id-ID"/>
         </w:rPr>
+        <w:lastRenderedPageBreak/>
         <w:br w:type="page"/>
       </w:r>
     </w:p>
@@ -5502,6 +5683,12 @@
         <w:br w:type="page"/>
       </w:r>
     </w:p>
+    <w:sectPr>
+      <w:pgSz w:w="11906" w:h="16838"/>
+      <w:pgMar w:top="1440" w:right="1440" w:bottom="1440" w:left="1440" w:header="708" w:footer="708" w:gutter="0"/>
+      <w:cols w:space="708"/>
+      <w:docGrid w:linePitch="360"/>
+    </w:sectPr>
   </w:body>
 </w:document>
 </file>

</xml_diff>

<commit_message>
feat: adopt newest template.docx from user, make meeting header bold, and rebuild compiler
</commit_message>
<xml_diff>
--- a/template.docx
+++ b/template.docx
@@ -2402,7 +2402,6 @@
                 <w:lang w:eastAsia="en-ID"/>
               </w:rPr>
             </w:pPr>
-            <w:proofErr w:type="spellStart"/>
             <w:r>
               <w:rPr>
                 <w:rFonts w:ascii="Arial Nova" w:eastAsia="Times New Roman" w:hAnsi="Arial Nova" w:cs="Times New Roman"/>
@@ -2412,7 +2411,6 @@
               </w:rPr>
               <w:t>Kolaborasi</w:t>
             </w:r>
-            <w:proofErr w:type="spellEnd"/>
           </w:p>
         </w:tc>
         <w:tc>
@@ -2433,7 +2431,6 @@
                 <w:lang w:eastAsia="en-ID"/>
               </w:rPr>
             </w:pPr>
-            <w:proofErr w:type="spellStart"/>
             <w:r>
               <w:rPr>
                 <w:rFonts w:ascii="Arial Nova" w:eastAsia="Times New Roman" w:hAnsi="Arial Nova" w:cs="Times New Roman"/>
@@ -2443,7 +2440,6 @@
               </w:rPr>
               <w:t>Kemandirian</w:t>
             </w:r>
-            <w:proofErr w:type="spellEnd"/>
           </w:p>
         </w:tc>
         <w:tc>
@@ -2494,7 +2490,6 @@
                 <w:lang w:eastAsia="en-ID"/>
               </w:rPr>
             </w:pPr>
-            <w:proofErr w:type="spellStart"/>
             <w:r>
               <w:rPr>
                 <w:rFonts w:ascii="Arial Nova" w:eastAsia="Times New Roman" w:hAnsi="Arial Nova" w:cs="Times New Roman"/>
@@ -2504,7 +2499,6 @@
               </w:rPr>
               <w:t>Komunikasi</w:t>
             </w:r>
-            <w:proofErr w:type="spellEnd"/>
           </w:p>
         </w:tc>
       </w:tr>
@@ -2573,23 +2567,7 @@
                 <w:i/>
                 <w:iCs/>
               </w:rPr>
-              <w:t>{</w:t>
-            </w:r>
-            <w:proofErr w:type="spellStart"/>
-            <w:r>
-              <w:rPr>
-                <w:i/>
-                <w:iCs/>
-              </w:rPr>
-              <w:t>capaian_pembelajaran</w:t>
-            </w:r>
-            <w:proofErr w:type="spellEnd"/>
-            <w:r>
-              <w:rPr>
-                <w:i/>
-                <w:iCs/>
-              </w:rPr>
-              <w:t>}</w:t>
+              <w:t>{capaian_pembelajaran}</w:t>
             </w:r>
           </w:p>
         </w:tc>
@@ -2649,51 +2627,11 @@
           </w:tcPr>
           <w:p>
             <w:r>
-              <w:t xml:space="preserve">{FOR </w:t>
-            </w:r>
-            <w:proofErr w:type="spellStart"/>
-            <w:r>
-              <w:t>tpu</w:t>
-            </w:r>
-            <w:proofErr w:type="spellEnd"/>
-            <w:r>
-              <w:t xml:space="preserve"> IN </w:t>
-            </w:r>
-            <w:proofErr w:type="spellStart"/>
-            <w:r>
-              <w:t>tujuan_pembelajaran_</w:t>
-            </w:r>
-            <w:proofErr w:type="gramStart"/>
-            <w:r>
-              <w:t>umum</w:t>
-            </w:r>
-            <w:proofErr w:type="spellEnd"/>
-            <w:r>
-              <w:t>}{</w:t>
-            </w:r>
-            <w:proofErr w:type="gramEnd"/>
-            <w:r>
-              <w:t>$</w:t>
-            </w:r>
-            <w:proofErr w:type="spellStart"/>
-            <w:r>
-              <w:t>tpu</w:t>
-            </w:r>
-            <w:proofErr w:type="spellEnd"/>
-            <w:r>
-              <w:t>}</w:t>
+              <w:t>{FOR tpu IN tujuan_pembelajaran_umum}{$tpu}</w:t>
             </w:r>
             <w:r>
               <w:br/>
-              <w:t xml:space="preserve">{END-FOR </w:t>
-            </w:r>
-            <w:proofErr w:type="spellStart"/>
-            <w:r>
-              <w:t>tpu</w:t>
-            </w:r>
-            <w:proofErr w:type="spellEnd"/>
-            <w:r>
-              <w:t>}</w:t>
+              <w:t>{END-FOR tpu}</w:t>
             </w:r>
           </w:p>
         </w:tc>
@@ -2750,15 +2688,7 @@
               </w:rPr>
             </w:pPr>
             <w:r>
-              <w:t>{</w:t>
-            </w:r>
-            <w:proofErr w:type="spellStart"/>
-            <w:r>
-              <w:t>enduring_understanding</w:t>
-            </w:r>
-            <w:proofErr w:type="spellEnd"/>
-            <w:r>
-              <w:t>}</w:t>
+              <w:t>{enduring_understanding}</w:t>
             </w:r>
           </w:p>
         </w:tc>
@@ -2814,15 +2744,7 @@
               </w:rPr>
             </w:pPr>
             <w:r>
-              <w:t>{</w:t>
-            </w:r>
-            <w:proofErr w:type="spellStart"/>
-            <w:r>
-              <w:t>lintas_disiplin_ilmu</w:t>
-            </w:r>
-            <w:proofErr w:type="spellEnd"/>
-            <w:r>
-              <w:t>}</w:t>
+              <w:t>{lintas_disiplin_ilmu}</w:t>
             </w:r>
           </w:p>
         </w:tc>
@@ -3951,7 +3873,17 @@
       </w:pPr>
     </w:p>
     <w:p>
+      <w:pPr>
+        <w:rPr>
+          <w:b/>
+          <w:bCs/>
+        </w:rPr>
+      </w:pPr>
       <w:r>
+        <w:rPr>
+          <w:b/>
+          <w:bCs/>
+        </w:rPr>
         <w:t>{FOR p IN pertemuan_list}</w:t>
       </w:r>
     </w:p>
@@ -3959,12 +3891,7 @@
       <w:pPr>
         <w:spacing w:after="0" w:line="240" w:lineRule="auto"/>
         <w:rPr>
-          <w:rFonts w:ascii="Arial Nova" w:eastAsia="Times New Roman" w:hAnsi="Arial Nova" w:cs="Times New Roman"/>
           <w:b/>
-          <w:bCs/>
-          <w:sz w:val="20"/>
-          <w:szCs w:val="20"/>
-          <w:lang w:val="id-ID" w:eastAsia="en-ID"/>
         </w:rPr>
       </w:pPr>
       <w:r/>
@@ -3978,6 +3905,7 @@
     <w:tbl>
       <w:tblPr>
         <w:tblStyle w:val="TableGrid"/>
+        <w:tblpPr w:leftFromText="180" w:rightFromText="180" w:vertAnchor="text" w:horzAnchor="margin" w:tblpY="83"/>
         <w:tblW w:w="9967" w:type="dxa"/>
         <w:tblLayout w:type="fixed"/>
         <w:tblLook w:val="04A0" w:firstRow="1" w:lastRow="0" w:firstColumn="1" w:lastColumn="0" w:noHBand="0" w:noVBand="1"/>
@@ -3993,6 +3921,9 @@
         <w:tc>
           <w:tcPr>
             <w:tcW w:w="562" w:type="dxa"/>
+            <w:tcBorders>
+              <w:bottom w:val="single" w:sz="4" w:space="0" w:color="auto"/>
+            </w:tcBorders>
           </w:tcPr>
           <w:p>
             <w:pPr>
@@ -4018,6 +3949,9 @@
         <w:tc>
           <w:tcPr>
             <w:tcW w:w="9405" w:type="dxa"/>
+            <w:tcBorders>
+              <w:bottom w:val="single" w:sz="4" w:space="0" w:color="auto"/>
+            </w:tcBorders>
           </w:tcPr>
           <w:p>
             <w:r>
@@ -4027,6 +3961,19 @@
         </w:tc>
       </w:tr>
     </w:tbl>
+    <w:p>
+      <w:pPr>
+        <w:spacing w:after="0" w:line="240" w:lineRule="auto"/>
+        <w:rPr>
+          <w:rFonts w:ascii="Arial Nova" w:eastAsia="Times New Roman" w:hAnsi="Arial Nova" w:cs="Times New Roman"/>
+          <w:b/>
+          <w:bCs/>
+          <w:sz w:val="20"/>
+          <w:szCs w:val="20"/>
+          <w:lang w:val="id-ID" w:eastAsia="en-ID"/>
+        </w:rPr>
+      </w:pPr>
+    </w:p>
     <w:tbl>
       <w:tblPr>
         <w:tblStyle w:val="GridTable1Light-Accent2"/>
@@ -5016,6 +4963,8 @@
         <w:spacing w:after="0" w:line="240" w:lineRule="auto"/>
         <w:rPr>
           <w:rFonts w:ascii="Arial Nova" w:eastAsia="Times New Roman" w:hAnsi="Arial Nova" w:cs="Times New Roman"/>
+          <w:b/>
+          <w:bCs/>
           <w:sz w:val="20"/>
           <w:szCs w:val="20"/>
           <w:lang w:val="id-ID" w:eastAsia="en-ID"/>
@@ -5028,7 +4977,30 @@
           <w:szCs w:val="20"/>
           <w:lang w:val="id-ID" w:eastAsia="en-ID"/>
         </w:rPr>
+        <w:lastRenderedPageBreak/>
+        <w:br/>
+      </w:r>
+      <w:r>
+        <w:rPr>
+          <w:rFonts w:ascii="Arial Nova" w:eastAsia="Times New Roman" w:hAnsi="Arial Nova" w:cs="Times New Roman"/>
+          <w:b/>
+          <w:bCs/>
+          <w:sz w:val="20"/>
+          <w:szCs w:val="20"/>
+          <w:lang w:val="id-ID" w:eastAsia="en-ID"/>
+        </w:rPr>
         <w:t>Asesmen</w:t>
+      </w:r>
+      <w:r>
+        <w:rPr>
+          <w:rFonts w:ascii="Arial Nova" w:eastAsia="Times New Roman" w:hAnsi="Arial Nova" w:cs="Times New Roman"/>
+          <w:b/>
+          <w:bCs/>
+          <w:sz w:val="20"/>
+          <w:szCs w:val="20"/>
+          <w:lang w:val="id-ID" w:eastAsia="en-ID"/>
+        </w:rPr>
+        <w:br/>
       </w:r>
     </w:p>
     <w:tbl>
@@ -5063,18 +5035,14 @@
               <w:spacing w:after="0" w:line="240" w:lineRule="auto"/>
               <w:rPr>
                 <w:rFonts w:ascii="Arial Nova" w:eastAsia="Times New Roman" w:hAnsi="Arial Nova" w:cs="Times New Roman"/>
-                <w:b w:val="0"/>
-                <w:bCs w:val="0"/>
-                <w:sz w:val="20"/>
-                <w:szCs w:val="20"/>
-                <w:lang w:val="id-ID" w:eastAsia="en-ID"/>
-              </w:rPr>
-            </w:pPr>
-            <w:r>
-              <w:rPr>
-                <w:rFonts w:ascii="Arial Nova" w:eastAsia="Times New Roman" w:hAnsi="Arial Nova" w:cs="Times New Roman"/>
-                <w:b w:val="0"/>
-                <w:bCs w:val="0"/>
+                <w:sz w:val="20"/>
+                <w:szCs w:val="20"/>
+                <w:lang w:val="id-ID" w:eastAsia="en-ID"/>
+              </w:rPr>
+            </w:pPr>
+            <w:r>
+              <w:rPr>
+                <w:rFonts w:ascii="Arial Nova" w:eastAsia="Times New Roman" w:hAnsi="Arial Nova" w:cs="Times New Roman"/>
                 <w:sz w:val="20"/>
                 <w:szCs w:val="20"/>
                 <w:lang w:val="id-ID" w:eastAsia="en-ID"/>
@@ -5099,18 +5067,14 @@
               <w:cnfStyle w:val="100000000000" w:firstRow="1" w:lastRow="0" w:firstColumn="0" w:lastColumn="0" w:oddVBand="0" w:evenVBand="0" w:oddHBand="0" w:evenHBand="0" w:firstRowFirstColumn="0" w:firstRowLastColumn="0" w:lastRowFirstColumn="0" w:lastRowLastColumn="0"/>
               <w:rPr>
                 <w:rFonts w:ascii="Arial Nova" w:eastAsia="Times New Roman" w:hAnsi="Arial Nova" w:cs="Times New Roman"/>
-                <w:b w:val="0"/>
-                <w:bCs w:val="0"/>
-                <w:sz w:val="20"/>
-                <w:szCs w:val="20"/>
-                <w:lang w:val="id-ID" w:eastAsia="en-ID"/>
-              </w:rPr>
-            </w:pPr>
-            <w:r>
-              <w:rPr>
-                <w:rFonts w:ascii="Arial Nova" w:eastAsia="Times New Roman" w:hAnsi="Arial Nova" w:cs="Times New Roman"/>
-                <w:b w:val="0"/>
-                <w:bCs w:val="0"/>
+                <w:sz w:val="20"/>
+                <w:szCs w:val="20"/>
+                <w:lang w:val="id-ID" w:eastAsia="en-ID"/>
+              </w:rPr>
+            </w:pPr>
+            <w:r>
+              <w:rPr>
+                <w:rFonts w:ascii="Arial Nova" w:eastAsia="Times New Roman" w:hAnsi="Arial Nova" w:cs="Times New Roman"/>
                 <w:sz w:val="20"/>
                 <w:szCs w:val="20"/>
                 <w:lang w:val="id-ID" w:eastAsia="en-ID"/>
@@ -5135,18 +5099,14 @@
               <w:cnfStyle w:val="100000000000" w:firstRow="1" w:lastRow="0" w:firstColumn="0" w:lastColumn="0" w:oddVBand="0" w:evenVBand="0" w:oddHBand="0" w:evenHBand="0" w:firstRowFirstColumn="0" w:firstRowLastColumn="0" w:lastRowFirstColumn="0" w:lastRowLastColumn="0"/>
               <w:rPr>
                 <w:rFonts w:ascii="Arial Nova" w:eastAsia="Times New Roman" w:hAnsi="Arial Nova" w:cs="Times New Roman"/>
-                <w:b w:val="0"/>
-                <w:bCs w:val="0"/>
-                <w:sz w:val="20"/>
-                <w:szCs w:val="20"/>
-                <w:lang w:val="id-ID" w:eastAsia="en-ID"/>
-              </w:rPr>
-            </w:pPr>
-            <w:r>
-              <w:rPr>
-                <w:rFonts w:ascii="Arial Nova" w:eastAsia="Times New Roman" w:hAnsi="Arial Nova" w:cs="Times New Roman"/>
-                <w:b w:val="0"/>
-                <w:bCs w:val="0"/>
+                <w:sz w:val="20"/>
+                <w:szCs w:val="20"/>
+                <w:lang w:val="id-ID" w:eastAsia="en-ID"/>
+              </w:rPr>
+            </w:pPr>
+            <w:r>
+              <w:rPr>
+                <w:rFonts w:ascii="Arial Nova" w:eastAsia="Times New Roman" w:hAnsi="Arial Nova" w:cs="Times New Roman"/>
                 <w:sz w:val="20"/>
                 <w:szCs w:val="20"/>
                 <w:lang w:val="id-ID" w:eastAsia="en-ID"/>

</xml_diff>